<commit_message>
IADB: lab2 in progress. Views done
</commit_message>
<xml_diff>
--- a/IADB/Code/Lab_2/Report.docx
+++ b/IADB/Code/Lab_2/Report.docx
@@ -649,14 +649,7 @@
           <w:sz w:val="28"/>
           <w:szCs w:val="28"/>
         </w:rPr>
-        <w:t xml:space="preserve">имеющего одиночные склады и </w:t>
-      </w:r>
-      <w:r>
-        <w:rPr>
-          <w:sz w:val="28"/>
-          <w:szCs w:val="28"/>
-        </w:rPr>
-        <w:t>нуждающихся в автоматизации процессов инвентаризации, поиска и оформления отчётности, а также упрощения работы сотрудников. С помощью данного приложения сотрудники могут вести учёт своих задач, инвентаризировать и находить товары, а также работать с заказами.</w:t>
+        <w:t>имеющего одиночные склады и нуждающихся в автоматизации процессов инвентаризации, поиска и оформления отчётности, а также упрощения работы сотрудников. С помощью данного приложения сотрудники могут вести учёт своих задач, инвентаризировать и находить товары, а также работать с заказами.</w:t>
       </w:r>
       <w:r>
         <w:rPr>
@@ -716,10 +709,7 @@
         <w:ind w:left="723"/>
       </w:pPr>
       <w:r>
-        <w:t xml:space="preserve"> </w:t>
-      </w:r>
-      <w:r>
-        <w:t>Список таблиц с указанием атрибутов</w:t>
+        <w:t xml:space="preserve"> Список таблиц с указанием атрибутов</w:t>
       </w:r>
     </w:p>
     <w:p/>
@@ -1222,7 +1212,6 @@
               </w:rPr>
             </w:pPr>
             <w:proofErr w:type="spellStart"/>
-            <w:proofErr w:type="gramStart"/>
             <w:r>
               <w:rPr>
                 <w:sz w:val="28"/>
@@ -1238,16 +1227,7 @@
                 <w:szCs w:val="28"/>
                 <w:lang w:val="en-US"/>
               </w:rPr>
-              <w:t>(</w:t>
-            </w:r>
-            <w:proofErr w:type="gramEnd"/>
-            <w:r>
-              <w:rPr>
-                <w:sz w:val="28"/>
-                <w:szCs w:val="28"/>
-                <w:lang w:val="en-US"/>
-              </w:rPr>
-              <w:t>100)</w:t>
+              <w:t>(100)</w:t>
             </w:r>
           </w:p>
         </w:tc>
@@ -1595,23 +1575,13 @@
                 <w:lang w:val="en-US"/>
               </w:rPr>
             </w:pPr>
-            <w:proofErr w:type="gramStart"/>
-            <w:r>
-              <w:rPr>
-                <w:sz w:val="28"/>
-                <w:szCs w:val="28"/>
-                <w:lang w:val="en-US"/>
-              </w:rPr>
-              <w:t>VARCHAR(</w:t>
-            </w:r>
-            <w:proofErr w:type="gramEnd"/>
-            <w:r>
-              <w:rPr>
-                <w:sz w:val="28"/>
-                <w:szCs w:val="28"/>
-                <w:lang w:val="en-US"/>
-              </w:rPr>
-              <w:t>255)</w:t>
+            <w:r>
+              <w:rPr>
+                <w:sz w:val="28"/>
+                <w:szCs w:val="28"/>
+                <w:lang w:val="en-US"/>
+              </w:rPr>
+              <w:t>VARCHAR(255)</w:t>
             </w:r>
           </w:p>
         </w:tc>
@@ -1697,23 +1667,13 @@
                 <w:lang w:val="en-US"/>
               </w:rPr>
             </w:pPr>
-            <w:proofErr w:type="gramStart"/>
-            <w:r>
-              <w:rPr>
-                <w:sz w:val="28"/>
-                <w:szCs w:val="28"/>
-                <w:lang w:val="en-US"/>
-              </w:rPr>
-              <w:t>VARCHAR(</w:t>
-            </w:r>
-            <w:proofErr w:type="gramEnd"/>
-            <w:r>
-              <w:rPr>
-                <w:sz w:val="28"/>
-                <w:szCs w:val="28"/>
-                <w:lang w:val="en-US"/>
-              </w:rPr>
-              <w:t>30)</w:t>
+            <w:r>
+              <w:rPr>
+                <w:sz w:val="28"/>
+                <w:szCs w:val="28"/>
+                <w:lang w:val="en-US"/>
+              </w:rPr>
+              <w:t>VARCHAR(30)</w:t>
             </w:r>
           </w:p>
         </w:tc>
@@ -1810,23 +1770,13 @@
                 <w:lang w:val="en-US"/>
               </w:rPr>
             </w:pPr>
-            <w:proofErr w:type="gramStart"/>
-            <w:r>
-              <w:rPr>
-                <w:sz w:val="28"/>
-                <w:szCs w:val="28"/>
-                <w:lang w:val="en-US"/>
-              </w:rPr>
-              <w:t>VARBINARY(</w:t>
-            </w:r>
-            <w:proofErr w:type="gramEnd"/>
-            <w:r>
-              <w:rPr>
-                <w:sz w:val="28"/>
-                <w:szCs w:val="28"/>
-                <w:lang w:val="en-US"/>
-              </w:rPr>
-              <w:t>64)</w:t>
+            <w:r>
+              <w:rPr>
+                <w:sz w:val="28"/>
+                <w:szCs w:val="28"/>
+                <w:lang w:val="en-US"/>
+              </w:rPr>
+              <w:t>VARBINARY(64)</w:t>
             </w:r>
           </w:p>
         </w:tc>
@@ -2067,25 +2017,7 @@
                 <w:szCs w:val="28"/>
                 <w:lang w:val="en-US"/>
               </w:rPr>
-              <w:t xml:space="preserve">Default, </w:t>
-            </w:r>
-            <w:proofErr w:type="gramStart"/>
-            <w:r>
-              <w:rPr>
-                <w:sz w:val="28"/>
-                <w:szCs w:val="28"/>
-                <w:lang w:val="en-US"/>
-              </w:rPr>
-              <w:t>GETDATE(</w:t>
-            </w:r>
-            <w:proofErr w:type="gramEnd"/>
-            <w:r>
-              <w:rPr>
-                <w:sz w:val="28"/>
-                <w:szCs w:val="28"/>
-                <w:lang w:val="en-US"/>
-              </w:rPr>
-              <w:t>)</w:t>
+              <w:t>Default, GETDATE()</w:t>
             </w:r>
           </w:p>
         </w:tc>
@@ -2433,25 +2365,7 @@
                 <w:szCs w:val="28"/>
                 <w:lang w:val="en-US"/>
               </w:rPr>
-              <w:t xml:space="preserve">Not null, </w:t>
-            </w:r>
-            <w:proofErr w:type="gramStart"/>
-            <w:r>
-              <w:rPr>
-                <w:sz w:val="28"/>
-                <w:szCs w:val="28"/>
-                <w:lang w:val="en-US"/>
-              </w:rPr>
-              <w:t>Foreign</w:t>
-            </w:r>
-            <w:proofErr w:type="gramEnd"/>
-            <w:r>
-              <w:rPr>
-                <w:sz w:val="28"/>
-                <w:szCs w:val="28"/>
-                <w:lang w:val="en-US"/>
-              </w:rPr>
-              <w:t xml:space="preserve"> key</w:t>
+              <w:t>Not null, Foreign key</w:t>
             </w:r>
           </w:p>
         </w:tc>
@@ -2511,23 +2425,13 @@
                 <w:lang w:val="en-US"/>
               </w:rPr>
             </w:pPr>
-            <w:proofErr w:type="gramStart"/>
-            <w:r>
-              <w:rPr>
-                <w:sz w:val="28"/>
-                <w:szCs w:val="28"/>
-                <w:lang w:val="en-US"/>
-              </w:rPr>
-              <w:t>NVARCHAR(</w:t>
-            </w:r>
-            <w:proofErr w:type="gramEnd"/>
-            <w:r>
-              <w:rPr>
-                <w:sz w:val="28"/>
-                <w:szCs w:val="28"/>
-                <w:lang w:val="en-US"/>
-              </w:rPr>
-              <w:t>200)</w:t>
+            <w:r>
+              <w:rPr>
+                <w:sz w:val="28"/>
+                <w:szCs w:val="28"/>
+                <w:lang w:val="en-US"/>
+              </w:rPr>
+              <w:t>NVARCHAR(200)</w:t>
             </w:r>
           </w:p>
         </w:tc>
@@ -2609,23 +2513,13 @@
                 <w:lang w:val="en-US"/>
               </w:rPr>
             </w:pPr>
-            <w:proofErr w:type="gramStart"/>
-            <w:r>
-              <w:rPr>
-                <w:sz w:val="28"/>
-                <w:szCs w:val="28"/>
-                <w:lang w:val="en-US"/>
-              </w:rPr>
-              <w:t>DECIMAL(</w:t>
-            </w:r>
-            <w:proofErr w:type="gramEnd"/>
-            <w:r>
-              <w:rPr>
-                <w:sz w:val="28"/>
-                <w:szCs w:val="28"/>
-                <w:lang w:val="en-US"/>
-              </w:rPr>
-              <w:t>19,4)</w:t>
+            <w:r>
+              <w:rPr>
+                <w:sz w:val="28"/>
+                <w:szCs w:val="28"/>
+                <w:lang w:val="en-US"/>
+              </w:rPr>
+              <w:t>DECIMAL(19,4)</w:t>
             </w:r>
           </w:p>
         </w:tc>
@@ -3247,23 +3141,13 @@
                 <w:lang w:val="en-US"/>
               </w:rPr>
             </w:pPr>
-            <w:proofErr w:type="gramStart"/>
-            <w:r>
-              <w:rPr>
-                <w:sz w:val="28"/>
-                <w:szCs w:val="28"/>
-                <w:lang w:val="en-US"/>
-              </w:rPr>
-              <w:t>VARCHAR(</w:t>
-            </w:r>
-            <w:proofErr w:type="gramEnd"/>
-            <w:r>
-              <w:rPr>
-                <w:sz w:val="28"/>
-                <w:szCs w:val="28"/>
-                <w:lang w:val="en-US"/>
-              </w:rPr>
-              <w:t>30)</w:t>
+            <w:r>
+              <w:rPr>
+                <w:sz w:val="28"/>
+                <w:szCs w:val="28"/>
+                <w:lang w:val="en-US"/>
+              </w:rPr>
+              <w:t>VARCHAR(30)</w:t>
             </w:r>
           </w:p>
         </w:tc>
@@ -4036,23 +3920,13 @@
                 <w:lang w:val="en-US"/>
               </w:rPr>
             </w:pPr>
-            <w:proofErr w:type="gramStart"/>
-            <w:r>
-              <w:rPr>
-                <w:sz w:val="28"/>
-                <w:szCs w:val="28"/>
-                <w:lang w:val="en-US"/>
-              </w:rPr>
-              <w:t>VARCHAR(</w:t>
-            </w:r>
-            <w:proofErr w:type="gramEnd"/>
-            <w:r>
-              <w:rPr>
-                <w:sz w:val="28"/>
-                <w:szCs w:val="28"/>
-                <w:lang w:val="en-US"/>
-              </w:rPr>
-              <w:t>50)</w:t>
+            <w:r>
+              <w:rPr>
+                <w:sz w:val="28"/>
+                <w:szCs w:val="28"/>
+                <w:lang w:val="en-US"/>
+              </w:rPr>
+              <w:t>VARCHAR(50)</w:t>
             </w:r>
           </w:p>
         </w:tc>
@@ -4140,23 +4014,13 @@
                 <w:lang w:val="en-US"/>
               </w:rPr>
             </w:pPr>
-            <w:proofErr w:type="gramStart"/>
-            <w:r>
-              <w:rPr>
-                <w:sz w:val="28"/>
-                <w:szCs w:val="28"/>
-                <w:lang w:val="en-US"/>
-              </w:rPr>
-              <w:t>DECIMAL(</w:t>
-            </w:r>
-            <w:proofErr w:type="gramEnd"/>
-            <w:r>
-              <w:rPr>
-                <w:sz w:val="28"/>
-                <w:szCs w:val="28"/>
-                <w:lang w:val="en-US"/>
-              </w:rPr>
-              <w:t>19,4)</w:t>
+            <w:r>
+              <w:rPr>
+                <w:sz w:val="28"/>
+                <w:szCs w:val="28"/>
+                <w:lang w:val="en-US"/>
+              </w:rPr>
+              <w:t>DECIMAL(19,4)</w:t>
             </w:r>
           </w:p>
         </w:tc>
@@ -5382,23 +5246,13 @@
                 <w:lang w:val="en-US"/>
               </w:rPr>
             </w:pPr>
-            <w:proofErr w:type="gramStart"/>
-            <w:r>
-              <w:rPr>
-                <w:sz w:val="28"/>
-                <w:szCs w:val="28"/>
-                <w:lang w:val="en-US"/>
-              </w:rPr>
-              <w:t>VARCHAR(</w:t>
-            </w:r>
-            <w:proofErr w:type="gramEnd"/>
-            <w:r>
-              <w:rPr>
-                <w:sz w:val="28"/>
-                <w:szCs w:val="28"/>
-                <w:lang w:val="en-US"/>
-              </w:rPr>
-              <w:t>50)</w:t>
+            <w:r>
+              <w:rPr>
+                <w:sz w:val="28"/>
+                <w:szCs w:val="28"/>
+                <w:lang w:val="en-US"/>
+              </w:rPr>
+              <w:t>VARCHAR(50)</w:t>
             </w:r>
           </w:p>
         </w:tc>
@@ -5532,26 +5386,38 @@
         <w:rPr>
           <w:sz w:val="28"/>
           <w:szCs w:val="28"/>
+        </w:rPr>
+      </w:pPr>
+      <w:r>
+        <w:rPr>
+          <w:sz w:val="28"/>
+          <w:szCs w:val="28"/>
+        </w:rPr>
+        <w:t xml:space="preserve">Таблица 2.8 – Структура таблицы </w:t>
+      </w:r>
+      <w:r>
+        <w:rPr>
+          <w:sz w:val="28"/>
+          <w:szCs w:val="28"/>
           <w:lang w:val="en-US"/>
         </w:rPr>
-      </w:pPr>
-      <w:r>
-        <w:rPr>
-          <w:sz w:val="28"/>
-          <w:szCs w:val="28"/>
-        </w:rPr>
-        <w:t xml:space="preserve">Таблица 2.8 – Структура таблицы </w:t>
-      </w:r>
-      <w:proofErr w:type="spellStart"/>
+        <w:t>Pack</w:t>
+      </w:r>
+      <w:r>
+        <w:rPr>
+          <w:sz w:val="28"/>
+          <w:szCs w:val="28"/>
+        </w:rPr>
+        <w:t>_</w:t>
+      </w:r>
       <w:r>
         <w:rPr>
           <w:sz w:val="28"/>
           <w:szCs w:val="28"/>
           <w:lang w:val="en-US"/>
         </w:rPr>
-        <w:t>Pack_items</w:t>
-      </w:r>
-      <w:proofErr w:type="spellEnd"/>
+        <w:t>items</w:t>
+      </w:r>
     </w:p>
     <w:tbl>
       <w:tblPr>
@@ -5843,101 +5709,6 @@
           </w:p>
         </w:tc>
       </w:tr>
-      <w:tr>
-        <w:tc>
-          <w:tcPr>
-            <w:tcW w:w="2506" w:type="dxa"/>
-          </w:tcPr>
-          <w:p>
-            <w:pPr>
-              <w:jc w:val="both"/>
-              <w:rPr>
-                <w:sz w:val="28"/>
-                <w:szCs w:val="28"/>
-                <w:lang w:val="en-US"/>
-              </w:rPr>
-            </w:pPr>
-            <w:proofErr w:type="spellStart"/>
-            <w:r>
-              <w:rPr>
-                <w:sz w:val="28"/>
-                <w:szCs w:val="28"/>
-                <w:lang w:val="en-US"/>
-              </w:rPr>
-              <w:lastRenderedPageBreak/>
-              <w:t>Product_ID</w:t>
-            </w:r>
-            <w:proofErr w:type="spellEnd"/>
-          </w:p>
-        </w:tc>
-        <w:tc>
-          <w:tcPr>
-            <w:tcW w:w="2506" w:type="dxa"/>
-          </w:tcPr>
-          <w:p>
-            <w:pPr>
-              <w:jc w:val="both"/>
-              <w:rPr>
-                <w:sz w:val="28"/>
-                <w:szCs w:val="28"/>
-                <w:lang w:val="en-US"/>
-              </w:rPr>
-            </w:pPr>
-            <w:r>
-              <w:rPr>
-                <w:sz w:val="28"/>
-                <w:szCs w:val="28"/>
-                <w:lang w:val="en-US"/>
-              </w:rPr>
-              <w:t>INT</w:t>
-            </w:r>
-          </w:p>
-        </w:tc>
-        <w:tc>
-          <w:tcPr>
-            <w:tcW w:w="2506" w:type="dxa"/>
-          </w:tcPr>
-          <w:p>
-            <w:pPr>
-              <w:jc w:val="both"/>
-              <w:rPr>
-                <w:sz w:val="28"/>
-                <w:szCs w:val="28"/>
-                <w:lang w:val="en-US"/>
-              </w:rPr>
-            </w:pPr>
-            <w:r>
-              <w:rPr>
-                <w:sz w:val="28"/>
-                <w:szCs w:val="28"/>
-                <w:lang w:val="en-US"/>
-              </w:rPr>
-              <w:t>Not Null, Foreign key</w:t>
-            </w:r>
-          </w:p>
-        </w:tc>
-        <w:tc>
-          <w:tcPr>
-            <w:tcW w:w="2507" w:type="dxa"/>
-          </w:tcPr>
-          <w:p>
-            <w:pPr>
-              <w:jc w:val="both"/>
-              <w:rPr>
-                <w:sz w:val="28"/>
-                <w:szCs w:val="28"/>
-              </w:rPr>
-            </w:pPr>
-            <w:r>
-              <w:rPr>
-                <w:sz w:val="28"/>
-                <w:szCs w:val="28"/>
-              </w:rPr>
-              <w:t>Товар, собираемый в данный заказ</w:t>
-            </w:r>
-          </w:p>
-        </w:tc>
-      </w:tr>
     </w:tbl>
     <w:p>
       <w:pPr>
@@ -5947,21 +5718,12 @@
           <w:szCs w:val="28"/>
         </w:rPr>
       </w:pPr>
-    </w:p>
-    <w:p>
-      <w:pPr>
-        <w:jc w:val="both"/>
-        <w:rPr>
-          <w:sz w:val="28"/>
-          <w:szCs w:val="28"/>
-          <w:lang w:val="en-US"/>
-        </w:rPr>
-      </w:pPr>
-      <w:r>
-        <w:rPr>
-          <w:sz w:val="28"/>
-          <w:szCs w:val="28"/>
-        </w:rPr>
+      <w:r>
+        <w:rPr>
+          <w:sz w:val="28"/>
+          <w:szCs w:val="28"/>
+        </w:rPr>
+        <w:lastRenderedPageBreak/>
         <w:t xml:space="preserve">Продолжение таблицы 2.8 – Структура таблицы </w:t>
       </w:r>
       <w:r>
@@ -6217,23 +5979,13 @@
                 <w:lang w:val="en-US"/>
               </w:rPr>
             </w:pPr>
-            <w:proofErr w:type="gramStart"/>
-            <w:r>
-              <w:rPr>
-                <w:sz w:val="28"/>
-                <w:szCs w:val="28"/>
-                <w:lang w:val="en-US"/>
-              </w:rPr>
-              <w:t>DECIMAL(</w:t>
-            </w:r>
-            <w:proofErr w:type="gramEnd"/>
-            <w:r>
-              <w:rPr>
-                <w:sz w:val="28"/>
-                <w:szCs w:val="28"/>
-                <w:lang w:val="en-US"/>
-              </w:rPr>
-              <w:t>19,4)</w:t>
+            <w:r>
+              <w:rPr>
+                <w:sz w:val="28"/>
+                <w:szCs w:val="28"/>
+                <w:lang w:val="en-US"/>
+              </w:rPr>
+              <w:t>DECIMAL(19,4)</w:t>
             </w:r>
           </w:p>
         </w:tc>
@@ -6278,6 +6030,108 @@
                 <w:szCs w:val="28"/>
               </w:rPr>
               <w:t>Цена собираемого элемента заказа</w:t>
+            </w:r>
+          </w:p>
+        </w:tc>
+      </w:tr>
+      <w:tr>
+        <w:tc>
+          <w:tcPr>
+            <w:tcW w:w="2506" w:type="dxa"/>
+          </w:tcPr>
+          <w:p>
+            <w:pPr>
+              <w:jc w:val="both"/>
+              <w:rPr>
+                <w:sz w:val="28"/>
+                <w:szCs w:val="28"/>
+                <w:lang w:val="en-US"/>
+              </w:rPr>
+            </w:pPr>
+            <w:proofErr w:type="spellStart"/>
+            <w:r>
+              <w:rPr>
+                <w:sz w:val="28"/>
+                <w:szCs w:val="28"/>
+                <w:lang w:val="en-US"/>
+              </w:rPr>
+              <w:t>Product_ID</w:t>
+            </w:r>
+            <w:r>
+              <w:rPr>
+                <w:sz w:val="28"/>
+                <w:szCs w:val="28"/>
+                <w:lang w:val="en-US"/>
+              </w:rPr>
+              <w:t>s</w:t>
+            </w:r>
+            <w:proofErr w:type="spellEnd"/>
+          </w:p>
+        </w:tc>
+        <w:tc>
+          <w:tcPr>
+            <w:tcW w:w="2506" w:type="dxa"/>
+          </w:tcPr>
+          <w:p>
+            <w:pPr>
+              <w:jc w:val="both"/>
+              <w:rPr>
+                <w:sz w:val="28"/>
+                <w:szCs w:val="28"/>
+                <w:lang w:val="en-US"/>
+              </w:rPr>
+            </w:pPr>
+            <w:r>
+              <w:rPr>
+                <w:sz w:val="28"/>
+                <w:szCs w:val="28"/>
+                <w:lang w:val="en-US"/>
+              </w:rPr>
+              <w:t>INT</w:t>
+            </w:r>
+          </w:p>
+        </w:tc>
+        <w:tc>
+          <w:tcPr>
+            <w:tcW w:w="2506" w:type="dxa"/>
+          </w:tcPr>
+          <w:p>
+            <w:pPr>
+              <w:jc w:val="both"/>
+              <w:rPr>
+                <w:sz w:val="28"/>
+                <w:szCs w:val="28"/>
+                <w:lang w:val="en-US"/>
+              </w:rPr>
+            </w:pPr>
+            <w:r>
+              <w:rPr>
+                <w:sz w:val="28"/>
+                <w:szCs w:val="28"/>
+                <w:lang w:val="en-US"/>
+              </w:rPr>
+              <w:t>Not Null, Foreign key</w:t>
+            </w:r>
+          </w:p>
+        </w:tc>
+        <w:tc>
+          <w:tcPr>
+            <w:tcW w:w="2507" w:type="dxa"/>
+          </w:tcPr>
+          <w:p>
+            <w:pPr>
+              <w:jc w:val="both"/>
+              <w:rPr>
+                <w:sz w:val="28"/>
+                <w:szCs w:val="28"/>
+              </w:rPr>
+            </w:pPr>
+            <w:r>
+              <w:rPr>
+                <w:sz w:val="28"/>
+                <w:szCs w:val="28"/>
+              </w:rPr>
+              <w:t>Товар, собираемый в данный заказ</w:t>
             </w:r>
           </w:p>
         </w:tc>
@@ -6312,10 +6166,7 @@
         <w:ind w:left="723"/>
       </w:pPr>
       <w:r>
-        <w:t xml:space="preserve"> </w:t>
-      </w:r>
-      <w:r>
-        <w:t xml:space="preserve">Список </w:t>
+        <w:t xml:space="preserve"> Список </w:t>
       </w:r>
       <w:r>
         <w:t>прочих объектов</w:t>

</xml_diff>

<commit_message>
IADB: lab2 in progress. Indecies creation started
</commit_message>
<xml_diff>
--- a/IADB/Code/Lab_2/Report.docx
+++ b/IADB/Code/Lab_2/Report.docx
@@ -442,25 +442,7 @@
           <w:sz w:val="28"/>
           <w:szCs w:val="28"/>
         </w:rPr>
-        <w:t xml:space="preserve">Преподаватель: </w:t>
-      </w:r>
-      <w:proofErr w:type="spellStart"/>
-      <w:r>
-        <w:rPr>
-          <w:color w:val="000000"/>
-          <w:sz w:val="28"/>
-          <w:szCs w:val="28"/>
-        </w:rPr>
-        <w:t>Нистюк</w:t>
-      </w:r>
-      <w:proofErr w:type="spellEnd"/>
-      <w:r>
-        <w:rPr>
-          <w:color w:val="000000"/>
-          <w:sz w:val="28"/>
-          <w:szCs w:val="28"/>
-        </w:rPr>
-        <w:t xml:space="preserve"> О.А.</w:t>
+        <w:t>Преподаватель: Нистюк О.А.</w:t>
       </w:r>
     </w:p>
     <w:p>
@@ -890,7 +872,6 @@
                 <w:lang w:val="en-US"/>
               </w:rPr>
             </w:pPr>
-            <w:proofErr w:type="spellStart"/>
             <w:r>
               <w:rPr>
                 <w:sz w:val="28"/>
@@ -899,7 +880,6 @@
               </w:rPr>
               <w:t>Stock_ID</w:t>
             </w:r>
-            <w:proofErr w:type="spellEnd"/>
           </w:p>
         </w:tc>
         <w:tc>
@@ -1076,7 +1056,6 @@
                 <w:lang w:val="en-US"/>
               </w:rPr>
             </w:pPr>
-            <w:proofErr w:type="spellStart"/>
             <w:r>
               <w:rPr>
                 <w:sz w:val="28"/>
@@ -1085,7 +1064,6 @@
               </w:rPr>
               <w:t>Filled_part</w:t>
             </w:r>
-            <w:proofErr w:type="spellEnd"/>
           </w:p>
         </w:tc>
         <w:tc>
@@ -1211,23 +1189,13 @@
                 <w:lang w:val="en-US"/>
               </w:rPr>
             </w:pPr>
-            <w:proofErr w:type="spellStart"/>
-            <w:r>
-              <w:rPr>
-                <w:sz w:val="28"/>
-                <w:szCs w:val="28"/>
-                <w:lang w:val="en-US"/>
-              </w:rPr>
-              <w:t>Nvarchar</w:t>
-            </w:r>
-            <w:proofErr w:type="spellEnd"/>
-            <w:r>
-              <w:rPr>
-                <w:sz w:val="28"/>
-                <w:szCs w:val="28"/>
-                <w:lang w:val="en-US"/>
-              </w:rPr>
-              <w:t>(100)</w:t>
+            <w:r>
+              <w:rPr>
+                <w:sz w:val="28"/>
+                <w:szCs w:val="28"/>
+                <w:lang w:val="en-US"/>
+              </w:rPr>
+              <w:t>Nvarchar(100)</w:t>
             </w:r>
           </w:p>
         </w:tc>
@@ -1458,7 +1426,6 @@
                 <w:lang w:val="en-US"/>
               </w:rPr>
             </w:pPr>
-            <w:proofErr w:type="spellStart"/>
             <w:r>
               <w:rPr>
                 <w:sz w:val="28"/>
@@ -1467,7 +1434,6 @@
               </w:rPr>
               <w:t>User_ID</w:t>
             </w:r>
-            <w:proofErr w:type="spellEnd"/>
           </w:p>
         </w:tc>
         <w:tc>
@@ -1726,101 +1692,6 @@
                 <w:szCs w:val="28"/>
               </w:rPr>
               <w:t>Роль пользователя в системе</w:t>
-            </w:r>
-          </w:p>
-        </w:tc>
-      </w:tr>
-      <w:tr>
-        <w:tc>
-          <w:tcPr>
-            <w:tcW w:w="2506" w:type="dxa"/>
-          </w:tcPr>
-          <w:p>
-            <w:pPr>
-              <w:jc w:val="both"/>
-              <w:rPr>
-                <w:sz w:val="28"/>
-                <w:szCs w:val="28"/>
-                <w:lang w:val="en-US"/>
-              </w:rPr>
-            </w:pPr>
-            <w:proofErr w:type="spellStart"/>
-            <w:r>
-              <w:rPr>
-                <w:sz w:val="28"/>
-                <w:szCs w:val="28"/>
-                <w:lang w:val="en-US"/>
-              </w:rPr>
-              <w:lastRenderedPageBreak/>
-              <w:t>Password_hash</w:t>
-            </w:r>
-            <w:proofErr w:type="spellEnd"/>
-          </w:p>
-        </w:tc>
-        <w:tc>
-          <w:tcPr>
-            <w:tcW w:w="2506" w:type="dxa"/>
-          </w:tcPr>
-          <w:p>
-            <w:pPr>
-              <w:jc w:val="both"/>
-              <w:rPr>
-                <w:sz w:val="28"/>
-                <w:szCs w:val="28"/>
-                <w:lang w:val="en-US"/>
-              </w:rPr>
-            </w:pPr>
-            <w:r>
-              <w:rPr>
-                <w:sz w:val="28"/>
-                <w:szCs w:val="28"/>
-                <w:lang w:val="en-US"/>
-              </w:rPr>
-              <w:t>VARBINARY(64)</w:t>
-            </w:r>
-          </w:p>
-        </w:tc>
-        <w:tc>
-          <w:tcPr>
-            <w:tcW w:w="2506" w:type="dxa"/>
-          </w:tcPr>
-          <w:p>
-            <w:pPr>
-              <w:jc w:val="both"/>
-              <w:rPr>
-                <w:sz w:val="28"/>
-                <w:szCs w:val="28"/>
-                <w:lang w:val="en-US"/>
-              </w:rPr>
-            </w:pPr>
-            <w:r>
-              <w:rPr>
-                <w:sz w:val="28"/>
-                <w:szCs w:val="28"/>
-                <w:lang w:val="en-US"/>
-              </w:rPr>
-              <w:t>Not Null, Unique</w:t>
-            </w:r>
-          </w:p>
-        </w:tc>
-        <w:tc>
-          <w:tcPr>
-            <w:tcW w:w="2507" w:type="dxa"/>
-          </w:tcPr>
-          <w:p>
-            <w:pPr>
-              <w:jc w:val="both"/>
-              <w:rPr>
-                <w:sz w:val="28"/>
-                <w:szCs w:val="28"/>
-              </w:rPr>
-            </w:pPr>
-            <w:r>
-              <w:rPr>
-                <w:sz w:val="28"/>
-                <w:szCs w:val="28"/>
-              </w:rPr>
-              <w:t>Хэш пароля пользователя</w:t>
             </w:r>
           </w:p>
         </w:tc>
@@ -1831,14 +1702,22 @@
         <w:rPr>
           <w:sz w:val="28"/>
           <w:szCs w:val="28"/>
-          <w:lang w:val="en-US"/>
-        </w:rPr>
-      </w:pPr>
-      <w:r>
-        <w:rPr>
-          <w:sz w:val="28"/>
-          <w:szCs w:val="28"/>
-        </w:rPr>
+        </w:rPr>
+      </w:pPr>
+    </w:p>
+    <w:p>
+      <w:pPr>
+        <w:rPr>
+          <w:sz w:val="28"/>
+          <w:szCs w:val="28"/>
+        </w:rPr>
+      </w:pPr>
+      <w:r>
+        <w:rPr>
+          <w:sz w:val="28"/>
+          <w:szCs w:val="28"/>
+        </w:rPr>
+        <w:lastRenderedPageBreak/>
         <w:t xml:space="preserve">Продолжение таблицы 2.2 – Структура таблицы </w:t>
       </w:r>
       <w:r>
@@ -1965,7 +1844,6 @@
                 <w:lang w:val="en-US"/>
               </w:rPr>
             </w:pPr>
-            <w:proofErr w:type="spellStart"/>
             <w:r>
               <w:rPr>
                 <w:sz w:val="28"/>
@@ -1974,7 +1852,6 @@
               </w:rPr>
               <w:t>Created_at</w:t>
             </w:r>
-            <w:proofErr w:type="spellEnd"/>
           </w:p>
         </w:tc>
         <w:tc>
@@ -2038,6 +1915,94 @@
                 <w:szCs w:val="28"/>
               </w:rPr>
               <w:t>Отметка о времени создания записи в таблице пользователей</w:t>
+            </w:r>
+          </w:p>
+        </w:tc>
+      </w:tr>
+      <w:tr>
+        <w:tc>
+          <w:tcPr>
+            <w:tcW w:w="2506" w:type="dxa"/>
+          </w:tcPr>
+          <w:p>
+            <w:pPr>
+              <w:rPr>
+                <w:sz w:val="28"/>
+                <w:szCs w:val="28"/>
+                <w:lang w:val="en-US"/>
+              </w:rPr>
+            </w:pPr>
+            <w:r>
+              <w:rPr>
+                <w:sz w:val="28"/>
+                <w:szCs w:val="28"/>
+                <w:lang w:val="en-US"/>
+              </w:rPr>
+              <w:t>Password_hash</w:t>
+            </w:r>
+          </w:p>
+        </w:tc>
+        <w:tc>
+          <w:tcPr>
+            <w:tcW w:w="2506" w:type="dxa"/>
+          </w:tcPr>
+          <w:p>
+            <w:pPr>
+              <w:rPr>
+                <w:sz w:val="28"/>
+                <w:szCs w:val="28"/>
+                <w:lang w:val="en-US"/>
+              </w:rPr>
+            </w:pPr>
+            <w:r>
+              <w:rPr>
+                <w:sz w:val="28"/>
+                <w:szCs w:val="28"/>
+                <w:lang w:val="en-US"/>
+              </w:rPr>
+              <w:t>VARBINARY(64)</w:t>
+            </w:r>
+          </w:p>
+        </w:tc>
+        <w:tc>
+          <w:tcPr>
+            <w:tcW w:w="2506" w:type="dxa"/>
+          </w:tcPr>
+          <w:p>
+            <w:pPr>
+              <w:rPr>
+                <w:sz w:val="28"/>
+                <w:szCs w:val="28"/>
+                <w:lang w:val="en-US"/>
+              </w:rPr>
+            </w:pPr>
+            <w:r>
+              <w:rPr>
+                <w:sz w:val="28"/>
+                <w:szCs w:val="28"/>
+                <w:lang w:val="en-US"/>
+              </w:rPr>
+              <w:t>Not Null, Unique</w:t>
+            </w:r>
+          </w:p>
+        </w:tc>
+        <w:tc>
+          <w:tcPr>
+            <w:tcW w:w="2507" w:type="dxa"/>
+          </w:tcPr>
+          <w:p>
+            <w:pPr>
+              <w:rPr>
+                <w:sz w:val="28"/>
+                <w:szCs w:val="28"/>
+              </w:rPr>
+            </w:pPr>
+            <w:r>
+              <w:rPr>
+                <w:sz w:val="28"/>
+                <w:szCs w:val="28"/>
+              </w:rPr>
+              <w:t>Хэш пароля пользователя</w:t>
             </w:r>
           </w:p>
         </w:tc>
@@ -2223,7 +2188,6 @@
                 <w:lang w:val="en-US"/>
               </w:rPr>
             </w:pPr>
-            <w:proofErr w:type="spellStart"/>
             <w:r>
               <w:rPr>
                 <w:sz w:val="28"/>
@@ -2232,7 +2196,6 @@
               </w:rPr>
               <w:t>Product_ID</w:t>
             </w:r>
-            <w:proofErr w:type="spellEnd"/>
           </w:p>
         </w:tc>
         <w:tc>
@@ -2313,7 +2276,6 @@
                 <w:lang w:val="en-US"/>
               </w:rPr>
             </w:pPr>
-            <w:proofErr w:type="spellStart"/>
             <w:r>
               <w:rPr>
                 <w:sz w:val="28"/>
@@ -2322,7 +2284,6 @@
               </w:rPr>
               <w:t>Stock_ID</w:t>
             </w:r>
-            <w:proofErr w:type="spellEnd"/>
           </w:p>
         </w:tc>
         <w:tc>
@@ -2835,7 +2796,6 @@
                 <w:lang w:val="en-US"/>
               </w:rPr>
             </w:pPr>
-            <w:proofErr w:type="spellStart"/>
             <w:r>
               <w:rPr>
                 <w:sz w:val="28"/>
@@ -2844,7 +2804,6 @@
               </w:rPr>
               <w:t>Task_ID</w:t>
             </w:r>
-            <w:proofErr w:type="spellEnd"/>
           </w:p>
         </w:tc>
         <w:tc>
@@ -2929,7 +2888,6 @@
                 <w:lang w:val="en-US"/>
               </w:rPr>
             </w:pPr>
-            <w:proofErr w:type="spellStart"/>
             <w:r>
               <w:rPr>
                 <w:sz w:val="28"/>
@@ -2938,7 +2896,6 @@
               </w:rPr>
               <w:t>User_ID</w:t>
             </w:r>
-            <w:proofErr w:type="spellEnd"/>
           </w:p>
         </w:tc>
         <w:tc>
@@ -3023,7 +2980,6 @@
                 <w:lang w:val="en-US"/>
               </w:rPr>
             </w:pPr>
-            <w:proofErr w:type="spellStart"/>
             <w:r>
               <w:rPr>
                 <w:sz w:val="28"/>
@@ -3032,7 +2988,6 @@
               </w:rPr>
               <w:t>Due_date</w:t>
             </w:r>
-            <w:proofErr w:type="spellEnd"/>
           </w:p>
         </w:tc>
         <w:tc>
@@ -3099,99 +3054,6 @@
                 <w:szCs w:val="28"/>
               </w:rPr>
               <w:t>Дата и время, к которым задача должна быть выполнена</w:t>
-            </w:r>
-          </w:p>
-        </w:tc>
-      </w:tr>
-      <w:tr>
-        <w:tc>
-          <w:tcPr>
-            <w:tcW w:w="2506" w:type="dxa"/>
-          </w:tcPr>
-          <w:p>
-            <w:pPr>
-              <w:jc w:val="both"/>
-              <w:rPr>
-                <w:sz w:val="28"/>
-                <w:szCs w:val="28"/>
-                <w:lang w:val="en-US"/>
-              </w:rPr>
-            </w:pPr>
-            <w:r>
-              <w:rPr>
-                <w:sz w:val="28"/>
-                <w:szCs w:val="28"/>
-                <w:lang w:val="en-US"/>
-              </w:rPr>
-              <w:lastRenderedPageBreak/>
-              <w:t>Priority</w:t>
-            </w:r>
-          </w:p>
-        </w:tc>
-        <w:tc>
-          <w:tcPr>
-            <w:tcW w:w="2506" w:type="dxa"/>
-          </w:tcPr>
-          <w:p>
-            <w:pPr>
-              <w:jc w:val="both"/>
-              <w:rPr>
-                <w:sz w:val="28"/>
-                <w:szCs w:val="28"/>
-                <w:lang w:val="en-US"/>
-              </w:rPr>
-            </w:pPr>
-            <w:r>
-              <w:rPr>
-                <w:sz w:val="28"/>
-                <w:szCs w:val="28"/>
-                <w:lang w:val="en-US"/>
-              </w:rPr>
-              <w:t>VARCHAR(30)</w:t>
-            </w:r>
-          </w:p>
-        </w:tc>
-        <w:tc>
-          <w:tcPr>
-            <w:tcW w:w="2506" w:type="dxa"/>
-          </w:tcPr>
-          <w:p>
-            <w:pPr>
-              <w:jc w:val="both"/>
-              <w:rPr>
-                <w:sz w:val="28"/>
-                <w:szCs w:val="28"/>
-                <w:lang w:val="en-US"/>
-              </w:rPr>
-            </w:pPr>
-            <w:r>
-              <w:rPr>
-                <w:sz w:val="28"/>
-                <w:szCs w:val="28"/>
-                <w:lang w:val="en-US"/>
-              </w:rPr>
-              <w:t>Not Null, Check</w:t>
-            </w:r>
-          </w:p>
-        </w:tc>
-        <w:tc>
-          <w:tcPr>
-            <w:tcW w:w="2507" w:type="dxa"/>
-          </w:tcPr>
-          <w:p>
-            <w:pPr>
-              <w:jc w:val="both"/>
-              <w:rPr>
-                <w:sz w:val="28"/>
-                <w:szCs w:val="28"/>
-              </w:rPr>
-            </w:pPr>
-            <w:r>
-              <w:rPr>
-                <w:sz w:val="28"/>
-                <w:szCs w:val="28"/>
-              </w:rPr>
-              <w:t>Приоритет данной задачи</w:t>
             </w:r>
           </w:p>
         </w:tc>
@@ -3203,21 +3065,20 @@
         <w:rPr>
           <w:sz w:val="28"/>
           <w:szCs w:val="28"/>
-          <w:lang w:val="en-US"/>
-        </w:rPr>
-      </w:pPr>
-      <w:r>
-        <w:rPr>
-          <w:sz w:val="28"/>
-          <w:szCs w:val="28"/>
-        </w:rPr>
+        </w:rPr>
+      </w:pPr>
+      <w:r>
+        <w:rPr>
+          <w:sz w:val="28"/>
+          <w:szCs w:val="28"/>
+        </w:rPr>
+        <w:lastRenderedPageBreak/>
         <w:t>Продолжение таблицы 2.</w:t>
       </w:r>
       <w:r>
         <w:rPr>
           <w:sz w:val="28"/>
           <w:szCs w:val="28"/>
-          <w:lang w:val="en-US"/>
         </w:rPr>
         <w:t>4</w:t>
       </w:r>
@@ -3252,7 +3113,7 @@
       <w:tr>
         <w:tc>
           <w:tcPr>
-            <w:tcW w:w="2506" w:type="dxa"/>
+            <w:tcW w:w="2467" w:type="dxa"/>
           </w:tcPr>
           <w:p>
             <w:pPr>
@@ -3274,7 +3135,7 @@
         </w:tc>
         <w:tc>
           <w:tcPr>
-            <w:tcW w:w="2506" w:type="dxa"/>
+            <w:tcW w:w="2628" w:type="dxa"/>
           </w:tcPr>
           <w:p>
             <w:pPr>
@@ -3296,7 +3157,7 @@
         </w:tc>
         <w:tc>
           <w:tcPr>
-            <w:tcW w:w="2506" w:type="dxa"/>
+            <w:tcW w:w="2469" w:type="dxa"/>
           </w:tcPr>
           <w:p>
             <w:pPr>
@@ -3318,7 +3179,7 @@
         </w:tc>
         <w:tc>
           <w:tcPr>
-            <w:tcW w:w="2507" w:type="dxa"/>
+            <w:tcW w:w="2461" w:type="dxa"/>
           </w:tcPr>
           <w:p>
             <w:pPr>
@@ -3342,7 +3203,7 @@
       <w:tr>
         <w:tc>
           <w:tcPr>
-            <w:tcW w:w="2506" w:type="dxa"/>
+            <w:tcW w:w="2467" w:type="dxa"/>
           </w:tcPr>
           <w:p>
             <w:pPr>
@@ -3365,7 +3226,7 @@
         </w:tc>
         <w:tc>
           <w:tcPr>
-            <w:tcW w:w="2506" w:type="dxa"/>
+            <w:tcW w:w="2628" w:type="dxa"/>
           </w:tcPr>
           <w:p>
             <w:pPr>
@@ -3388,7 +3249,7 @@
         </w:tc>
         <w:tc>
           <w:tcPr>
-            <w:tcW w:w="2506" w:type="dxa"/>
+            <w:tcW w:w="2469" w:type="dxa"/>
           </w:tcPr>
           <w:p>
             <w:pPr>
@@ -3411,7 +3272,7 @@
         </w:tc>
         <w:tc>
           <w:tcPr>
-            <w:tcW w:w="2507" w:type="dxa"/>
+            <w:tcW w:w="2461" w:type="dxa"/>
           </w:tcPr>
           <w:p>
             <w:pPr>
@@ -3434,18 +3295,17 @@
       <w:tr>
         <w:tc>
           <w:tcPr>
-            <w:tcW w:w="2506" w:type="dxa"/>
-          </w:tcPr>
-          <w:p>
-            <w:pPr>
-              <w:jc w:val="both"/>
-              <w:rPr>
-                <w:sz w:val="28"/>
-                <w:szCs w:val="28"/>
-                <w:lang w:val="en-US"/>
-              </w:rPr>
-            </w:pPr>
-            <w:proofErr w:type="spellStart"/>
+            <w:tcW w:w="2467" w:type="dxa"/>
+          </w:tcPr>
+          <w:p>
+            <w:pPr>
+              <w:jc w:val="both"/>
+              <w:rPr>
+                <w:sz w:val="28"/>
+                <w:szCs w:val="28"/>
+                <w:lang w:val="en-US"/>
+              </w:rPr>
+            </w:pPr>
             <w:r>
               <w:rPr>
                 <w:sz w:val="28"/>
@@ -3454,12 +3314,11 @@
               </w:rPr>
               <w:t>Is_completed</w:t>
             </w:r>
-            <w:proofErr w:type="spellEnd"/>
-          </w:p>
-        </w:tc>
-        <w:tc>
-          <w:tcPr>
-            <w:tcW w:w="2506" w:type="dxa"/>
+          </w:p>
+        </w:tc>
+        <w:tc>
+          <w:tcPr>
+            <w:tcW w:w="2628" w:type="dxa"/>
           </w:tcPr>
           <w:p>
             <w:pPr>
@@ -3482,7 +3341,7 @@
         </w:tc>
         <w:tc>
           <w:tcPr>
-            <w:tcW w:w="2506" w:type="dxa"/>
+            <w:tcW w:w="2469" w:type="dxa"/>
           </w:tcPr>
           <w:p>
             <w:pPr>
@@ -3505,7 +3364,7 @@
         </w:tc>
         <w:tc>
           <w:tcPr>
-            <w:tcW w:w="2507" w:type="dxa"/>
+            <w:tcW w:w="2461" w:type="dxa"/>
           </w:tcPr>
           <w:p>
             <w:pPr>
@@ -3521,6 +3380,107 @@
                 <w:szCs w:val="28"/>
               </w:rPr>
               <w:t>Отметка о статусе задачи</w:t>
+            </w:r>
+          </w:p>
+          <w:p>
+            <w:pPr>
+              <w:jc w:val="both"/>
+              <w:rPr>
+                <w:sz w:val="28"/>
+                <w:szCs w:val="28"/>
+              </w:rPr>
+            </w:pPr>
+          </w:p>
+        </w:tc>
+      </w:tr>
+      <w:tr>
+        <w:tc>
+          <w:tcPr>
+            <w:tcW w:w="2467" w:type="dxa"/>
+          </w:tcPr>
+          <w:p>
+            <w:pPr>
+              <w:jc w:val="both"/>
+              <w:rPr>
+                <w:sz w:val="28"/>
+                <w:szCs w:val="28"/>
+                <w:lang w:val="en-US"/>
+              </w:rPr>
+            </w:pPr>
+            <w:r>
+              <w:rPr>
+                <w:sz w:val="28"/>
+                <w:szCs w:val="28"/>
+                <w:lang w:val="en-US"/>
+              </w:rPr>
+              <w:t>Priority</w:t>
+            </w:r>
+          </w:p>
+        </w:tc>
+        <w:tc>
+          <w:tcPr>
+            <w:tcW w:w="2628" w:type="dxa"/>
+          </w:tcPr>
+          <w:p>
+            <w:pPr>
+              <w:jc w:val="both"/>
+              <w:rPr>
+                <w:sz w:val="28"/>
+                <w:szCs w:val="28"/>
+                <w:lang w:val="en-US"/>
+              </w:rPr>
+            </w:pPr>
+            <w:r>
+              <w:rPr>
+                <w:sz w:val="28"/>
+                <w:szCs w:val="28"/>
+                <w:lang w:val="en-US"/>
+              </w:rPr>
+              <w:t>VARCHAR(30)</w:t>
+            </w:r>
+          </w:p>
+        </w:tc>
+        <w:tc>
+          <w:tcPr>
+            <w:tcW w:w="2469" w:type="dxa"/>
+          </w:tcPr>
+          <w:p>
+            <w:pPr>
+              <w:jc w:val="both"/>
+              <w:rPr>
+                <w:sz w:val="28"/>
+                <w:szCs w:val="28"/>
+                <w:lang w:val="en-US"/>
+              </w:rPr>
+            </w:pPr>
+            <w:r>
+              <w:rPr>
+                <w:sz w:val="28"/>
+                <w:szCs w:val="28"/>
+                <w:lang w:val="en-US"/>
+              </w:rPr>
+              <w:t>Not Null, Check</w:t>
+            </w:r>
+          </w:p>
+        </w:tc>
+        <w:tc>
+          <w:tcPr>
+            <w:tcW w:w="2461" w:type="dxa"/>
+          </w:tcPr>
+          <w:p>
+            <w:pPr>
+              <w:jc w:val="both"/>
+              <w:rPr>
+                <w:sz w:val="28"/>
+                <w:szCs w:val="28"/>
+              </w:rPr>
+            </w:pPr>
+            <w:r>
+              <w:rPr>
+                <w:sz w:val="28"/>
+                <w:szCs w:val="28"/>
+              </w:rPr>
+              <w:t>Приоритет данной задачи</w:t>
             </w:r>
           </w:p>
         </w:tc>
@@ -3707,7 +3667,6 @@
                 <w:lang w:val="en-US"/>
               </w:rPr>
             </w:pPr>
-            <w:proofErr w:type="spellStart"/>
             <w:r>
               <w:rPr>
                 <w:sz w:val="28"/>
@@ -3716,7 +3675,6 @@
               </w:rPr>
               <w:t>Order_ID</w:t>
             </w:r>
-            <w:proofErr w:type="spellEnd"/>
           </w:p>
         </w:tc>
         <w:tc>
@@ -3801,7 +3759,6 @@
                 <w:lang w:val="en-US"/>
               </w:rPr>
             </w:pPr>
-            <w:proofErr w:type="spellStart"/>
             <w:r>
               <w:rPr>
                 <w:sz w:val="28"/>
@@ -3810,7 +3767,6 @@
               </w:rPr>
               <w:t>Order_date</w:t>
             </w:r>
-            <w:proofErr w:type="spellEnd"/>
           </w:p>
         </w:tc>
         <w:tc>
@@ -3895,7 +3851,6 @@
                 <w:lang w:val="en-US"/>
               </w:rPr>
             </w:pPr>
-            <w:proofErr w:type="spellStart"/>
             <w:r>
               <w:rPr>
                 <w:sz w:val="28"/>
@@ -3904,7 +3859,6 @@
               </w:rPr>
               <w:t>Order_status</w:t>
             </w:r>
-            <w:proofErr w:type="spellEnd"/>
           </w:p>
         </w:tc>
         <w:tc>
@@ -3989,7 +3943,6 @@
                 <w:lang w:val="en-US"/>
               </w:rPr>
             </w:pPr>
-            <w:proofErr w:type="spellStart"/>
             <w:r>
               <w:rPr>
                 <w:sz w:val="28"/>
@@ -3998,7 +3951,6 @@
               </w:rPr>
               <w:t>Total_amount</w:t>
             </w:r>
-            <w:proofErr w:type="spellEnd"/>
           </w:p>
         </w:tc>
         <w:tc>
@@ -4302,7 +4254,6 @@
                 <w:lang w:val="en-US"/>
               </w:rPr>
             </w:pPr>
-            <w:proofErr w:type="spellStart"/>
             <w:r>
               <w:rPr>
                 <w:sz w:val="28"/>
@@ -4311,7 +4262,6 @@
               </w:rPr>
               <w:t>Item_ID</w:t>
             </w:r>
-            <w:proofErr w:type="spellEnd"/>
           </w:p>
         </w:tc>
         <w:tc>
@@ -4396,7 +4346,6 @@
                 <w:lang w:val="en-US"/>
               </w:rPr>
             </w:pPr>
-            <w:proofErr w:type="spellStart"/>
             <w:r>
               <w:rPr>
                 <w:sz w:val="28"/>
@@ -4405,7 +4354,6 @@
               </w:rPr>
               <w:t>Order_ID</w:t>
             </w:r>
-            <w:proofErr w:type="spellEnd"/>
           </w:p>
         </w:tc>
         <w:tc>
@@ -4490,7 +4438,6 @@
                 <w:lang w:val="en-US"/>
               </w:rPr>
             </w:pPr>
-            <w:proofErr w:type="spellStart"/>
             <w:r>
               <w:rPr>
                 <w:sz w:val="28"/>
@@ -4499,7 +4446,6 @@
               </w:rPr>
               <w:t>Product_ID</w:t>
             </w:r>
-            <w:proofErr w:type="spellEnd"/>
           </w:p>
         </w:tc>
         <w:tc>
@@ -4566,99 +4512,6 @@
                 <w:szCs w:val="28"/>
               </w:rPr>
               <w:t>Уникальный числовой идентификатор товара на складе</w:t>
-            </w:r>
-          </w:p>
-        </w:tc>
-      </w:tr>
-      <w:tr>
-        <w:tc>
-          <w:tcPr>
-            <w:tcW w:w="2506" w:type="dxa"/>
-          </w:tcPr>
-          <w:p>
-            <w:pPr>
-              <w:jc w:val="both"/>
-              <w:rPr>
-                <w:sz w:val="28"/>
-                <w:szCs w:val="28"/>
-                <w:lang w:val="en-US"/>
-              </w:rPr>
-            </w:pPr>
-            <w:r>
-              <w:rPr>
-                <w:sz w:val="28"/>
-                <w:szCs w:val="28"/>
-                <w:lang w:val="en-US"/>
-              </w:rPr>
-              <w:lastRenderedPageBreak/>
-              <w:t>Quantity</w:t>
-            </w:r>
-          </w:p>
-        </w:tc>
-        <w:tc>
-          <w:tcPr>
-            <w:tcW w:w="2506" w:type="dxa"/>
-          </w:tcPr>
-          <w:p>
-            <w:pPr>
-              <w:jc w:val="both"/>
-              <w:rPr>
-                <w:sz w:val="28"/>
-                <w:szCs w:val="28"/>
-                <w:lang w:val="en-US"/>
-              </w:rPr>
-            </w:pPr>
-            <w:r>
-              <w:rPr>
-                <w:sz w:val="28"/>
-                <w:szCs w:val="28"/>
-                <w:lang w:val="en-US"/>
-              </w:rPr>
-              <w:t>INT</w:t>
-            </w:r>
-          </w:p>
-        </w:tc>
-        <w:tc>
-          <w:tcPr>
-            <w:tcW w:w="2506" w:type="dxa"/>
-          </w:tcPr>
-          <w:p>
-            <w:pPr>
-              <w:jc w:val="both"/>
-              <w:rPr>
-                <w:sz w:val="28"/>
-                <w:szCs w:val="28"/>
-                <w:lang w:val="en-US"/>
-              </w:rPr>
-            </w:pPr>
-            <w:r>
-              <w:rPr>
-                <w:sz w:val="28"/>
-                <w:szCs w:val="28"/>
-                <w:lang w:val="en-US"/>
-              </w:rPr>
-              <w:t>Not Null, Default, Check</w:t>
-            </w:r>
-          </w:p>
-        </w:tc>
-        <w:tc>
-          <w:tcPr>
-            <w:tcW w:w="2507" w:type="dxa"/>
-          </w:tcPr>
-          <w:p>
-            <w:pPr>
-              <w:jc w:val="both"/>
-              <w:rPr>
-                <w:sz w:val="28"/>
-                <w:szCs w:val="28"/>
-              </w:rPr>
-            </w:pPr>
-            <w:r>
-              <w:rPr>
-                <w:sz w:val="28"/>
-                <w:szCs w:val="28"/>
-              </w:rPr>
-              <w:t>Количество заказываемого товара</w:t>
             </w:r>
           </w:p>
         </w:tc>
@@ -4666,59 +4519,35 @@
     </w:tbl>
     <w:p>
       <w:pPr>
-        <w:ind w:firstLine="708"/>
         <w:jc w:val="both"/>
         <w:rPr>
           <w:sz w:val="28"/>
           <w:szCs w:val="28"/>
-        </w:rPr>
-      </w:pPr>
-      <w:r>
-        <w:rPr>
-          <w:sz w:val="28"/>
-          <w:szCs w:val="28"/>
-        </w:rPr>
-        <w:t xml:space="preserve">Таблица </w:t>
-      </w:r>
-      <w:r>
-        <w:rPr>
-          <w:sz w:val="28"/>
-          <w:szCs w:val="28"/>
           <w:lang w:val="en-US"/>
         </w:rPr>
-        <w:t>Pack</w:t>
-      </w:r>
-      <w:r>
-        <w:rPr>
-          <w:sz w:val="28"/>
-          <w:szCs w:val="28"/>
-        </w:rPr>
-        <w:t xml:space="preserve"> </w:t>
-      </w:r>
-      <w:r>
-        <w:rPr>
-          <w:sz w:val="28"/>
-          <w:szCs w:val="28"/>
-        </w:rPr>
-        <w:t>содержит информацию о собираемых операторами склада заказах. Структура данной таблицы представлена в таблице 2.7.</w:t>
-      </w:r>
-    </w:p>
-    <w:p>
-      <w:pPr>
-        <w:spacing w:before="240"/>
-        <w:jc w:val="both"/>
+      </w:pPr>
+      <w:r>
+        <w:rPr>
+          <w:sz w:val="28"/>
+          <w:szCs w:val="28"/>
+        </w:rPr>
+        <w:lastRenderedPageBreak/>
+        <w:t xml:space="preserve">Продолжение таблицы 2.6 – Структура таблицы </w:t>
+      </w:r>
+      <w:r>
         <w:rPr>
           <w:sz w:val="28"/>
           <w:szCs w:val="28"/>
           <w:lang w:val="en-US"/>
         </w:rPr>
-      </w:pPr>
-      <w:r>
-        <w:rPr>
-          <w:sz w:val="28"/>
-          <w:szCs w:val="28"/>
-        </w:rPr>
-        <w:t xml:space="preserve">Таблица 2.7 – Структура таблицы </w:t>
+        <w:t>Order</w:t>
+      </w:r>
+      <w:r>
+        <w:rPr>
+          <w:sz w:val="28"/>
+          <w:szCs w:val="28"/>
+        </w:rPr>
+        <w:t>_</w:t>
       </w:r>
       <w:r>
         <w:rPr>
@@ -4726,7 +4555,7 @@
           <w:szCs w:val="28"/>
           <w:lang w:val="en-US"/>
         </w:rPr>
-        <w:t>Pack</w:t>
+        <w:t>items</w:t>
       </w:r>
     </w:p>
     <w:tbl>
@@ -4752,7 +4581,6 @@
               <w:rPr>
                 <w:sz w:val="28"/>
                 <w:szCs w:val="28"/>
-                <w:lang w:val="en-US"/>
               </w:rPr>
             </w:pPr>
             <w:r>
@@ -4774,7 +4602,6 @@
               <w:rPr>
                 <w:sz w:val="28"/>
                 <w:szCs w:val="28"/>
-                <w:lang w:val="en-US"/>
               </w:rPr>
             </w:pPr>
             <w:r>
@@ -4796,7 +4623,6 @@
               <w:rPr>
                 <w:sz w:val="28"/>
                 <w:szCs w:val="28"/>
-                <w:lang w:val="en-US"/>
               </w:rPr>
             </w:pPr>
             <w:r>
@@ -4818,7 +4644,6 @@
               <w:rPr>
                 <w:sz w:val="28"/>
                 <w:szCs w:val="28"/>
-                <w:lang w:val="en-US"/>
               </w:rPr>
             </w:pPr>
             <w:r>
@@ -4842,32 +4667,28 @@
               <w:rPr>
                 <w:sz w:val="28"/>
                 <w:szCs w:val="28"/>
-                <w:lang w:val="en-US"/>
-              </w:rPr>
-            </w:pPr>
-            <w:proofErr w:type="spellStart"/>
-            <w:r>
-              <w:rPr>
-                <w:sz w:val="28"/>
-                <w:szCs w:val="28"/>
-                <w:lang w:val="en-US"/>
-              </w:rPr>
-              <w:t>Pack_ID</w:t>
-            </w:r>
-            <w:proofErr w:type="spellEnd"/>
-          </w:p>
-        </w:tc>
-        <w:tc>
-          <w:tcPr>
-            <w:tcW w:w="2506" w:type="dxa"/>
-          </w:tcPr>
-          <w:p>
-            <w:pPr>
-              <w:jc w:val="both"/>
-              <w:rPr>
-                <w:sz w:val="28"/>
-                <w:szCs w:val="28"/>
-                <w:lang w:val="en-US"/>
+              </w:rPr>
+            </w:pPr>
+            <w:r>
+              <w:rPr>
+                <w:sz w:val="28"/>
+                <w:szCs w:val="28"/>
+                <w:lang w:val="en-US"/>
+              </w:rPr>
+              <w:t>Quantity</w:t>
+            </w:r>
+          </w:p>
+        </w:tc>
+        <w:tc>
+          <w:tcPr>
+            <w:tcW w:w="2506" w:type="dxa"/>
+          </w:tcPr>
+          <w:p>
+            <w:pPr>
+              <w:jc w:val="both"/>
+              <w:rPr>
+                <w:sz w:val="28"/>
+                <w:szCs w:val="28"/>
               </w:rPr>
             </w:pPr>
             <w:r>
@@ -4890,16 +4711,15 @@
               <w:rPr>
                 <w:sz w:val="28"/>
                 <w:szCs w:val="28"/>
-                <w:lang w:val="en-US"/>
-              </w:rPr>
-            </w:pPr>
-            <w:r>
-              <w:rPr>
-                <w:sz w:val="28"/>
-                <w:szCs w:val="28"/>
-                <w:lang w:val="en-US"/>
-              </w:rPr>
-              <w:t>Primary key</w:t>
+              </w:rPr>
+            </w:pPr>
+            <w:r>
+              <w:rPr>
+                <w:sz w:val="28"/>
+                <w:szCs w:val="28"/>
+                <w:lang w:val="en-US"/>
+              </w:rPr>
+              <w:t>Not Null, Default, Check</w:t>
             </w:r>
           </w:p>
         </w:tc>
@@ -4920,383 +4740,7 @@
                 <w:sz w:val="28"/>
                 <w:szCs w:val="28"/>
               </w:rPr>
-              <w:t>Уникальный числовой идентификатор собираемого заказа</w:t>
-            </w:r>
-          </w:p>
-        </w:tc>
-      </w:tr>
-      <w:tr>
-        <w:tc>
-          <w:tcPr>
-            <w:tcW w:w="2506" w:type="dxa"/>
-          </w:tcPr>
-          <w:p>
-            <w:pPr>
-              <w:jc w:val="both"/>
-              <w:rPr>
-                <w:sz w:val="28"/>
-                <w:szCs w:val="28"/>
-                <w:lang w:val="en-US"/>
-              </w:rPr>
-            </w:pPr>
-            <w:proofErr w:type="spellStart"/>
-            <w:r>
-              <w:rPr>
-                <w:sz w:val="28"/>
-                <w:szCs w:val="28"/>
-                <w:lang w:val="en-US"/>
-              </w:rPr>
-              <w:t>User_ID</w:t>
-            </w:r>
-            <w:proofErr w:type="spellEnd"/>
-          </w:p>
-        </w:tc>
-        <w:tc>
-          <w:tcPr>
-            <w:tcW w:w="2506" w:type="dxa"/>
-          </w:tcPr>
-          <w:p>
-            <w:pPr>
-              <w:jc w:val="both"/>
-              <w:rPr>
-                <w:sz w:val="28"/>
-                <w:szCs w:val="28"/>
-                <w:lang w:val="en-US"/>
-              </w:rPr>
-            </w:pPr>
-            <w:r>
-              <w:rPr>
-                <w:sz w:val="28"/>
-                <w:szCs w:val="28"/>
-                <w:lang w:val="en-US"/>
-              </w:rPr>
-              <w:t>INT</w:t>
-            </w:r>
-          </w:p>
-        </w:tc>
-        <w:tc>
-          <w:tcPr>
-            <w:tcW w:w="2506" w:type="dxa"/>
-          </w:tcPr>
-          <w:p>
-            <w:pPr>
-              <w:jc w:val="both"/>
-              <w:rPr>
-                <w:sz w:val="28"/>
-                <w:szCs w:val="28"/>
-                <w:lang w:val="en-US"/>
-              </w:rPr>
-            </w:pPr>
-            <w:r>
-              <w:rPr>
-                <w:sz w:val="28"/>
-                <w:szCs w:val="28"/>
-                <w:lang w:val="en-US"/>
-              </w:rPr>
-              <w:t>Not Null, Foreign Key</w:t>
-            </w:r>
-          </w:p>
-        </w:tc>
-        <w:tc>
-          <w:tcPr>
-            <w:tcW w:w="2507" w:type="dxa"/>
-          </w:tcPr>
-          <w:p>
-            <w:pPr>
-              <w:jc w:val="both"/>
-              <w:rPr>
-                <w:sz w:val="28"/>
-                <w:szCs w:val="28"/>
-              </w:rPr>
-            </w:pPr>
-            <w:r>
-              <w:rPr>
-                <w:sz w:val="28"/>
-                <w:szCs w:val="28"/>
-              </w:rPr>
-              <w:t>Уникальный числовой идентификатор пользователя, собирающего заказ</w:t>
-            </w:r>
-          </w:p>
-        </w:tc>
-      </w:tr>
-      <w:tr>
-        <w:tc>
-          <w:tcPr>
-            <w:tcW w:w="2506" w:type="dxa"/>
-          </w:tcPr>
-          <w:p>
-            <w:pPr>
-              <w:jc w:val="both"/>
-              <w:rPr>
-                <w:sz w:val="28"/>
-                <w:szCs w:val="28"/>
-                <w:lang w:val="en-US"/>
-              </w:rPr>
-            </w:pPr>
-            <w:proofErr w:type="spellStart"/>
-            <w:r>
-              <w:rPr>
-                <w:sz w:val="28"/>
-                <w:szCs w:val="28"/>
-                <w:lang w:val="en-US"/>
-              </w:rPr>
-              <w:t>Order_ID</w:t>
-            </w:r>
-            <w:proofErr w:type="spellEnd"/>
-          </w:p>
-        </w:tc>
-        <w:tc>
-          <w:tcPr>
-            <w:tcW w:w="2506" w:type="dxa"/>
-          </w:tcPr>
-          <w:p>
-            <w:pPr>
-              <w:jc w:val="both"/>
-              <w:rPr>
-                <w:sz w:val="28"/>
-                <w:szCs w:val="28"/>
-                <w:lang w:val="en-US"/>
-              </w:rPr>
-            </w:pPr>
-            <w:r>
-              <w:rPr>
-                <w:sz w:val="28"/>
-                <w:szCs w:val="28"/>
-                <w:lang w:val="en-US"/>
-              </w:rPr>
-              <w:t>INT</w:t>
-            </w:r>
-          </w:p>
-        </w:tc>
-        <w:tc>
-          <w:tcPr>
-            <w:tcW w:w="2506" w:type="dxa"/>
-          </w:tcPr>
-          <w:p>
-            <w:pPr>
-              <w:jc w:val="both"/>
-              <w:rPr>
-                <w:sz w:val="28"/>
-                <w:szCs w:val="28"/>
-                <w:lang w:val="en-US"/>
-              </w:rPr>
-            </w:pPr>
-            <w:r>
-              <w:rPr>
-                <w:sz w:val="28"/>
-                <w:szCs w:val="28"/>
-                <w:lang w:val="en-US"/>
-              </w:rPr>
-              <w:t>Not Null, Foreign Key</w:t>
-            </w:r>
-          </w:p>
-        </w:tc>
-        <w:tc>
-          <w:tcPr>
-            <w:tcW w:w="2507" w:type="dxa"/>
-          </w:tcPr>
-          <w:p>
-            <w:pPr>
-              <w:jc w:val="both"/>
-              <w:rPr>
-                <w:sz w:val="28"/>
-                <w:szCs w:val="28"/>
-              </w:rPr>
-            </w:pPr>
-            <w:r>
-              <w:rPr>
-                <w:sz w:val="28"/>
-                <w:szCs w:val="28"/>
-              </w:rPr>
-              <w:t>Уникальный числовой идентификатор заказа, для которого собираются товары</w:t>
-            </w:r>
-          </w:p>
-        </w:tc>
-      </w:tr>
-      <w:tr>
-        <w:tc>
-          <w:tcPr>
-            <w:tcW w:w="2506" w:type="dxa"/>
-          </w:tcPr>
-          <w:p>
-            <w:pPr>
-              <w:jc w:val="both"/>
-              <w:rPr>
-                <w:sz w:val="28"/>
-                <w:szCs w:val="28"/>
-                <w:lang w:val="en-US"/>
-              </w:rPr>
-            </w:pPr>
-            <w:proofErr w:type="spellStart"/>
-            <w:r>
-              <w:rPr>
-                <w:sz w:val="28"/>
-                <w:szCs w:val="28"/>
-                <w:lang w:val="en-US"/>
-              </w:rPr>
-              <w:t>Pack_date</w:t>
-            </w:r>
-            <w:proofErr w:type="spellEnd"/>
-          </w:p>
-        </w:tc>
-        <w:tc>
-          <w:tcPr>
-            <w:tcW w:w="2506" w:type="dxa"/>
-          </w:tcPr>
-          <w:p>
-            <w:pPr>
-              <w:jc w:val="both"/>
-              <w:rPr>
-                <w:sz w:val="28"/>
-                <w:szCs w:val="28"/>
-                <w:lang w:val="en-US"/>
-              </w:rPr>
-            </w:pPr>
-            <w:r>
-              <w:rPr>
-                <w:sz w:val="28"/>
-                <w:szCs w:val="28"/>
-                <w:lang w:val="en-US"/>
-              </w:rPr>
-              <w:t>DATETIME2</w:t>
-            </w:r>
-          </w:p>
-        </w:tc>
-        <w:tc>
-          <w:tcPr>
-            <w:tcW w:w="2506" w:type="dxa"/>
-          </w:tcPr>
-          <w:p>
-            <w:pPr>
-              <w:jc w:val="both"/>
-              <w:rPr>
-                <w:sz w:val="28"/>
-                <w:szCs w:val="28"/>
-                <w:lang w:val="en-US"/>
-              </w:rPr>
-            </w:pPr>
-            <w:r>
-              <w:rPr>
-                <w:sz w:val="28"/>
-                <w:szCs w:val="28"/>
-                <w:lang w:val="en-US"/>
-              </w:rPr>
-              <w:t>Not Null, Default, GETDATE</w:t>
-            </w:r>
-          </w:p>
-        </w:tc>
-        <w:tc>
-          <w:tcPr>
-            <w:tcW w:w="2507" w:type="dxa"/>
-          </w:tcPr>
-          <w:p>
-            <w:pPr>
-              <w:jc w:val="both"/>
-              <w:rPr>
-                <w:sz w:val="28"/>
-                <w:szCs w:val="28"/>
-              </w:rPr>
-            </w:pPr>
-            <w:r>
-              <w:rPr>
-                <w:sz w:val="28"/>
-                <w:szCs w:val="28"/>
-              </w:rPr>
-              <w:t>Дата поступления заказа в сборку</w:t>
-            </w:r>
-          </w:p>
-        </w:tc>
-      </w:tr>
-      <w:tr>
-        <w:tc>
-          <w:tcPr>
-            <w:tcW w:w="2506" w:type="dxa"/>
-          </w:tcPr>
-          <w:p>
-            <w:pPr>
-              <w:jc w:val="both"/>
-              <w:rPr>
-                <w:sz w:val="28"/>
-                <w:szCs w:val="28"/>
-                <w:lang w:val="en-US"/>
-              </w:rPr>
-            </w:pPr>
-            <w:proofErr w:type="spellStart"/>
-            <w:r>
-              <w:rPr>
-                <w:sz w:val="28"/>
-                <w:szCs w:val="28"/>
-                <w:lang w:val="en-US"/>
-              </w:rPr>
-              <w:t>Pack_status</w:t>
-            </w:r>
-            <w:proofErr w:type="spellEnd"/>
-          </w:p>
-        </w:tc>
-        <w:tc>
-          <w:tcPr>
-            <w:tcW w:w="2506" w:type="dxa"/>
-          </w:tcPr>
-          <w:p>
-            <w:pPr>
-              <w:jc w:val="both"/>
-              <w:rPr>
-                <w:sz w:val="28"/>
-                <w:szCs w:val="28"/>
-                <w:lang w:val="en-US"/>
-              </w:rPr>
-            </w:pPr>
-            <w:r>
-              <w:rPr>
-                <w:sz w:val="28"/>
-                <w:szCs w:val="28"/>
-                <w:lang w:val="en-US"/>
-              </w:rPr>
-              <w:t>VARCHAR(50)</w:t>
-            </w:r>
-          </w:p>
-        </w:tc>
-        <w:tc>
-          <w:tcPr>
-            <w:tcW w:w="2506" w:type="dxa"/>
-          </w:tcPr>
-          <w:p>
-            <w:pPr>
-              <w:jc w:val="both"/>
-              <w:rPr>
-                <w:sz w:val="28"/>
-                <w:szCs w:val="28"/>
-                <w:lang w:val="en-US"/>
-              </w:rPr>
-            </w:pPr>
-            <w:r>
-              <w:rPr>
-                <w:sz w:val="28"/>
-                <w:szCs w:val="28"/>
-                <w:lang w:val="en-US"/>
-              </w:rPr>
-              <w:t>Check, Default</w:t>
-            </w:r>
-          </w:p>
-        </w:tc>
-        <w:tc>
-          <w:tcPr>
-            <w:tcW w:w="2507" w:type="dxa"/>
-          </w:tcPr>
-          <w:p>
-            <w:pPr>
-              <w:jc w:val="both"/>
-              <w:rPr>
-                <w:sz w:val="28"/>
-                <w:szCs w:val="28"/>
-              </w:rPr>
-            </w:pPr>
-            <w:r>
-              <w:rPr>
-                <w:sz w:val="28"/>
-                <w:szCs w:val="28"/>
-              </w:rPr>
-              <w:t>Статус сборки заказа</w:t>
+              <w:t>Количество заказываемого товара</w:t>
             </w:r>
           </w:p>
         </w:tc>
@@ -5304,7 +4748,15 @@
     </w:tbl>
     <w:p>
       <w:pPr>
-        <w:spacing w:before="240" w:after="240"/>
+        <w:jc w:val="both"/>
+        <w:rPr>
+          <w:sz w:val="28"/>
+          <w:szCs w:val="28"/>
+        </w:rPr>
+      </w:pPr>
+    </w:p>
+    <w:p>
+      <w:pPr>
         <w:ind w:firstLine="708"/>
         <w:jc w:val="both"/>
         <w:rPr>
@@ -5332,21 +4784,6 @@
           <w:sz w:val="28"/>
           <w:szCs w:val="28"/>
         </w:rPr>
-        <w:t>_</w:t>
-      </w:r>
-      <w:r>
-        <w:rPr>
-          <w:sz w:val="28"/>
-          <w:szCs w:val="28"/>
-          <w:lang w:val="en-US"/>
-        </w:rPr>
-        <w:t>items</w:t>
-      </w:r>
-      <w:r>
-        <w:rPr>
-          <w:sz w:val="28"/>
-          <w:szCs w:val="28"/>
-        </w:rPr>
         <w:t xml:space="preserve"> </w:t>
       </w:r>
       <w:r>
@@ -5354,29 +4791,7 @@
           <w:sz w:val="28"/>
           <w:szCs w:val="28"/>
         </w:rPr>
-        <w:t xml:space="preserve">является вспомогательной для таблицы </w:t>
-      </w:r>
-      <w:r>
-        <w:rPr>
-          <w:sz w:val="28"/>
-          <w:szCs w:val="28"/>
-          <w:lang w:val="en-US"/>
-        </w:rPr>
-        <w:t>Pack</w:t>
-      </w:r>
-      <w:r>
-        <w:rPr>
-          <w:sz w:val="28"/>
-          <w:szCs w:val="28"/>
-        </w:rPr>
-        <w:t xml:space="preserve"> </w:t>
-      </w:r>
-      <w:r>
-        <w:rPr>
-          <w:sz w:val="28"/>
-          <w:szCs w:val="28"/>
-        </w:rPr>
-        <w:t>и содержит информацию о товарах, собираемых оператором в заказ. Структура данной таблицы представлена в таблице 2.8.</w:t>
+        <w:t>содержит информацию о собираемых операторами склада заказах. Структура данной таблицы представлена в таблице 2.7.</w:t>
       </w:r>
     </w:p>
     <w:p>
@@ -5386,37 +4801,23 @@
         <w:rPr>
           <w:sz w:val="28"/>
           <w:szCs w:val="28"/>
-        </w:rPr>
-      </w:pPr>
-      <w:r>
-        <w:rPr>
-          <w:sz w:val="28"/>
-          <w:szCs w:val="28"/>
-        </w:rPr>
-        <w:t xml:space="preserve">Таблица 2.8 – Структура таблицы </w:t>
-      </w:r>
-      <w:r>
-        <w:rPr>
-          <w:sz w:val="28"/>
-          <w:szCs w:val="28"/>
           <w:lang w:val="en-US"/>
         </w:rPr>
+      </w:pPr>
+      <w:r>
+        <w:rPr>
+          <w:sz w:val="28"/>
+          <w:szCs w:val="28"/>
+        </w:rPr>
+        <w:t xml:space="preserve">Таблица 2.7 – Структура таблицы </w:t>
+      </w:r>
+      <w:r>
+        <w:rPr>
+          <w:sz w:val="28"/>
+          <w:szCs w:val="28"/>
+          <w:lang w:val="en-US"/>
+        </w:rPr>
         <w:t>Pack</w:t>
-      </w:r>
-      <w:r>
-        <w:rPr>
-          <w:sz w:val="28"/>
-          <w:szCs w:val="28"/>
-        </w:rPr>
-        <w:t>_</w:t>
-      </w:r>
-      <w:r>
-        <w:rPr>
-          <w:sz w:val="28"/>
-          <w:szCs w:val="28"/>
-          <w:lang w:val="en-US"/>
-        </w:rPr>
-        <w:t>items</w:t>
       </w:r>
     </w:p>
     <w:tbl>
@@ -5535,16 +4936,14 @@
                 <w:lang w:val="en-US"/>
               </w:rPr>
             </w:pPr>
-            <w:proofErr w:type="spellStart"/>
-            <w:r>
-              <w:rPr>
-                <w:sz w:val="28"/>
-                <w:szCs w:val="28"/>
-                <w:lang w:val="en-US"/>
-              </w:rPr>
-              <w:t>Item_ID</w:t>
-            </w:r>
-            <w:proofErr w:type="spellEnd"/>
+            <w:r>
+              <w:rPr>
+                <w:sz w:val="28"/>
+                <w:szCs w:val="28"/>
+                <w:lang w:val="en-US"/>
+              </w:rPr>
+              <w:t>Pack_ID</w:t>
+            </w:r>
           </w:p>
         </w:tc>
         <w:tc>
@@ -5610,7 +5009,7 @@
                 <w:sz w:val="28"/>
                 <w:szCs w:val="28"/>
               </w:rPr>
-              <w:t>Уникальный числовой идентификатора товара в собираемом заказе</w:t>
+              <w:t>Уникальный числовой идентификатор собираемого заказа</w:t>
             </w:r>
           </w:p>
         </w:tc>
@@ -5629,16 +5028,14 @@
                 <w:lang w:val="en-US"/>
               </w:rPr>
             </w:pPr>
-            <w:proofErr w:type="spellStart"/>
-            <w:r>
-              <w:rPr>
-                <w:sz w:val="28"/>
-                <w:szCs w:val="28"/>
-                <w:lang w:val="en-US"/>
-              </w:rPr>
-              <w:t>Pack_ID</w:t>
-            </w:r>
-            <w:proofErr w:type="spellEnd"/>
+            <w:r>
+              <w:rPr>
+                <w:sz w:val="28"/>
+                <w:szCs w:val="28"/>
+                <w:lang w:val="en-US"/>
+              </w:rPr>
+              <w:t>User_ID</w:t>
+            </w:r>
           </w:p>
         </w:tc>
         <w:tc>
@@ -5683,7 +5080,7 @@
                 <w:szCs w:val="28"/>
                 <w:lang w:val="en-US"/>
               </w:rPr>
-              <w:t>Not Null, Foreign key</w:t>
+              <w:t>Not Null, Foreign Key</w:t>
             </w:r>
           </w:p>
         </w:tc>
@@ -5704,7 +5101,283 @@
                 <w:sz w:val="28"/>
                 <w:szCs w:val="28"/>
               </w:rPr>
-              <w:t>Уникальный числовой идентификатор собираемого заказа</w:t>
+              <w:t>Уникальный числовой идентификатор пользователя, собирающего заказ</w:t>
+            </w:r>
+          </w:p>
+        </w:tc>
+      </w:tr>
+      <w:tr>
+        <w:tc>
+          <w:tcPr>
+            <w:tcW w:w="2506" w:type="dxa"/>
+          </w:tcPr>
+          <w:p>
+            <w:pPr>
+              <w:jc w:val="both"/>
+              <w:rPr>
+                <w:sz w:val="28"/>
+                <w:szCs w:val="28"/>
+                <w:lang w:val="en-US"/>
+              </w:rPr>
+            </w:pPr>
+            <w:r>
+              <w:rPr>
+                <w:sz w:val="28"/>
+                <w:szCs w:val="28"/>
+                <w:lang w:val="en-US"/>
+              </w:rPr>
+              <w:t>Order_ID</w:t>
+            </w:r>
+          </w:p>
+        </w:tc>
+        <w:tc>
+          <w:tcPr>
+            <w:tcW w:w="2506" w:type="dxa"/>
+          </w:tcPr>
+          <w:p>
+            <w:pPr>
+              <w:jc w:val="both"/>
+              <w:rPr>
+                <w:sz w:val="28"/>
+                <w:szCs w:val="28"/>
+                <w:lang w:val="en-US"/>
+              </w:rPr>
+            </w:pPr>
+            <w:r>
+              <w:rPr>
+                <w:sz w:val="28"/>
+                <w:szCs w:val="28"/>
+                <w:lang w:val="en-US"/>
+              </w:rPr>
+              <w:t>INT</w:t>
+            </w:r>
+          </w:p>
+        </w:tc>
+        <w:tc>
+          <w:tcPr>
+            <w:tcW w:w="2506" w:type="dxa"/>
+          </w:tcPr>
+          <w:p>
+            <w:pPr>
+              <w:jc w:val="both"/>
+              <w:rPr>
+                <w:sz w:val="28"/>
+                <w:szCs w:val="28"/>
+                <w:lang w:val="en-US"/>
+              </w:rPr>
+            </w:pPr>
+            <w:r>
+              <w:rPr>
+                <w:sz w:val="28"/>
+                <w:szCs w:val="28"/>
+                <w:lang w:val="en-US"/>
+              </w:rPr>
+              <w:t>Not Null, Foreign Key</w:t>
+            </w:r>
+          </w:p>
+        </w:tc>
+        <w:tc>
+          <w:tcPr>
+            <w:tcW w:w="2507" w:type="dxa"/>
+          </w:tcPr>
+          <w:p>
+            <w:pPr>
+              <w:jc w:val="both"/>
+              <w:rPr>
+                <w:sz w:val="28"/>
+                <w:szCs w:val="28"/>
+              </w:rPr>
+            </w:pPr>
+            <w:r>
+              <w:rPr>
+                <w:sz w:val="28"/>
+                <w:szCs w:val="28"/>
+              </w:rPr>
+              <w:t>Уникальный числовой идентификатор заказа, для которого собираются товары</w:t>
+            </w:r>
+          </w:p>
+        </w:tc>
+      </w:tr>
+      <w:tr>
+        <w:tc>
+          <w:tcPr>
+            <w:tcW w:w="2506" w:type="dxa"/>
+          </w:tcPr>
+          <w:p>
+            <w:pPr>
+              <w:jc w:val="both"/>
+              <w:rPr>
+                <w:sz w:val="28"/>
+                <w:szCs w:val="28"/>
+                <w:lang w:val="en-US"/>
+              </w:rPr>
+            </w:pPr>
+            <w:r>
+              <w:rPr>
+                <w:sz w:val="28"/>
+                <w:szCs w:val="28"/>
+                <w:lang w:val="en-US"/>
+              </w:rPr>
+              <w:t>Pack_date</w:t>
+            </w:r>
+          </w:p>
+        </w:tc>
+        <w:tc>
+          <w:tcPr>
+            <w:tcW w:w="2506" w:type="dxa"/>
+          </w:tcPr>
+          <w:p>
+            <w:pPr>
+              <w:jc w:val="both"/>
+              <w:rPr>
+                <w:sz w:val="28"/>
+                <w:szCs w:val="28"/>
+                <w:lang w:val="en-US"/>
+              </w:rPr>
+            </w:pPr>
+            <w:r>
+              <w:rPr>
+                <w:sz w:val="28"/>
+                <w:szCs w:val="28"/>
+                <w:lang w:val="en-US"/>
+              </w:rPr>
+              <w:t>DATETIME2</w:t>
+            </w:r>
+          </w:p>
+        </w:tc>
+        <w:tc>
+          <w:tcPr>
+            <w:tcW w:w="2506" w:type="dxa"/>
+          </w:tcPr>
+          <w:p>
+            <w:pPr>
+              <w:jc w:val="both"/>
+              <w:rPr>
+                <w:sz w:val="28"/>
+                <w:szCs w:val="28"/>
+                <w:lang w:val="en-US"/>
+              </w:rPr>
+            </w:pPr>
+            <w:r>
+              <w:rPr>
+                <w:sz w:val="28"/>
+                <w:szCs w:val="28"/>
+                <w:lang w:val="en-US"/>
+              </w:rPr>
+              <w:t>Not Null, Default, GETDATE</w:t>
+            </w:r>
+          </w:p>
+        </w:tc>
+        <w:tc>
+          <w:tcPr>
+            <w:tcW w:w="2507" w:type="dxa"/>
+          </w:tcPr>
+          <w:p>
+            <w:pPr>
+              <w:jc w:val="both"/>
+              <w:rPr>
+                <w:sz w:val="28"/>
+                <w:szCs w:val="28"/>
+              </w:rPr>
+            </w:pPr>
+            <w:r>
+              <w:rPr>
+                <w:sz w:val="28"/>
+                <w:szCs w:val="28"/>
+              </w:rPr>
+              <w:t>Дата поступления заказа в сборку</w:t>
+            </w:r>
+          </w:p>
+        </w:tc>
+      </w:tr>
+      <w:tr>
+        <w:tc>
+          <w:tcPr>
+            <w:tcW w:w="2506" w:type="dxa"/>
+          </w:tcPr>
+          <w:p>
+            <w:pPr>
+              <w:jc w:val="both"/>
+              <w:rPr>
+                <w:sz w:val="28"/>
+                <w:szCs w:val="28"/>
+                <w:lang w:val="en-US"/>
+              </w:rPr>
+            </w:pPr>
+            <w:r>
+              <w:rPr>
+                <w:sz w:val="28"/>
+                <w:szCs w:val="28"/>
+                <w:lang w:val="en-US"/>
+              </w:rPr>
+              <w:t>Pack_status</w:t>
+            </w:r>
+          </w:p>
+        </w:tc>
+        <w:tc>
+          <w:tcPr>
+            <w:tcW w:w="2506" w:type="dxa"/>
+          </w:tcPr>
+          <w:p>
+            <w:pPr>
+              <w:jc w:val="both"/>
+              <w:rPr>
+                <w:sz w:val="28"/>
+                <w:szCs w:val="28"/>
+                <w:lang w:val="en-US"/>
+              </w:rPr>
+            </w:pPr>
+            <w:r>
+              <w:rPr>
+                <w:sz w:val="28"/>
+                <w:szCs w:val="28"/>
+                <w:lang w:val="en-US"/>
+              </w:rPr>
+              <w:t>VARCHAR(50)</w:t>
+            </w:r>
+          </w:p>
+        </w:tc>
+        <w:tc>
+          <w:tcPr>
+            <w:tcW w:w="2506" w:type="dxa"/>
+          </w:tcPr>
+          <w:p>
+            <w:pPr>
+              <w:jc w:val="both"/>
+              <w:rPr>
+                <w:sz w:val="28"/>
+                <w:szCs w:val="28"/>
+                <w:lang w:val="en-US"/>
+              </w:rPr>
+            </w:pPr>
+            <w:r>
+              <w:rPr>
+                <w:sz w:val="28"/>
+                <w:szCs w:val="28"/>
+                <w:lang w:val="en-US"/>
+              </w:rPr>
+              <w:t>Check, Default</w:t>
+            </w:r>
+          </w:p>
+        </w:tc>
+        <w:tc>
+          <w:tcPr>
+            <w:tcW w:w="2507" w:type="dxa"/>
+          </w:tcPr>
+          <w:p>
+            <w:pPr>
+              <w:jc w:val="both"/>
+              <w:rPr>
+                <w:sz w:val="28"/>
+                <w:szCs w:val="28"/>
+              </w:rPr>
+            </w:pPr>
+            <w:r>
+              <w:rPr>
+                <w:sz w:val="28"/>
+                <w:szCs w:val="28"/>
+              </w:rPr>
+              <w:t>Статус сборки заказа</w:t>
             </w:r>
           </w:p>
         </w:tc>
@@ -5712,6 +5385,8 @@
     </w:tbl>
     <w:p>
       <w:pPr>
+        <w:spacing w:before="240" w:after="240"/>
+        <w:ind w:firstLine="708"/>
         <w:jc w:val="both"/>
         <w:rPr>
           <w:sz w:val="28"/>
@@ -5723,8 +5398,83 @@
           <w:sz w:val="28"/>
           <w:szCs w:val="28"/>
         </w:rPr>
-        <w:lastRenderedPageBreak/>
-        <w:t xml:space="preserve">Продолжение таблицы 2.8 – Структура таблицы </w:t>
+        <w:t xml:space="preserve">Таблица </w:t>
+      </w:r>
+      <w:r>
+        <w:rPr>
+          <w:sz w:val="28"/>
+          <w:szCs w:val="28"/>
+          <w:lang w:val="en-US"/>
+        </w:rPr>
+        <w:t>Pack</w:t>
+      </w:r>
+      <w:r>
+        <w:rPr>
+          <w:sz w:val="28"/>
+          <w:szCs w:val="28"/>
+        </w:rPr>
+        <w:t>_</w:t>
+      </w:r>
+      <w:r>
+        <w:rPr>
+          <w:sz w:val="28"/>
+          <w:szCs w:val="28"/>
+          <w:lang w:val="en-US"/>
+        </w:rPr>
+        <w:t>items</w:t>
+      </w:r>
+      <w:r>
+        <w:rPr>
+          <w:sz w:val="28"/>
+          <w:szCs w:val="28"/>
+        </w:rPr>
+        <w:t xml:space="preserve"> </w:t>
+      </w:r>
+      <w:r>
+        <w:rPr>
+          <w:sz w:val="28"/>
+          <w:szCs w:val="28"/>
+        </w:rPr>
+        <w:t xml:space="preserve">является вспомогательной для таблицы </w:t>
+      </w:r>
+      <w:r>
+        <w:rPr>
+          <w:sz w:val="28"/>
+          <w:szCs w:val="28"/>
+          <w:lang w:val="en-US"/>
+        </w:rPr>
+        <w:t>Pack</w:t>
+      </w:r>
+      <w:r>
+        <w:rPr>
+          <w:sz w:val="28"/>
+          <w:szCs w:val="28"/>
+        </w:rPr>
+        <w:t xml:space="preserve"> </w:t>
+      </w:r>
+      <w:r>
+        <w:rPr>
+          <w:sz w:val="28"/>
+          <w:szCs w:val="28"/>
+        </w:rPr>
+        <w:t>и содержит информацию о товарах, собираемых оператором в заказ. Структура данной таблицы представлена в таблице 2.8.</w:t>
+      </w:r>
+    </w:p>
+    <w:p>
+      <w:pPr>
+        <w:spacing w:before="240"/>
+        <w:jc w:val="both"/>
+        <w:rPr>
+          <w:sz w:val="28"/>
+          <w:szCs w:val="28"/>
+        </w:rPr>
+      </w:pPr>
+      <w:r>
+        <w:rPr>
+          <w:sz w:val="28"/>
+          <w:szCs w:val="28"/>
+        </w:rPr>
+        <w:t xml:space="preserve">Таблица 2.8 – Структура таблицы </w:t>
       </w:r>
       <w:r>
         <w:rPr>
@@ -5773,6 +5523,7 @@
               <w:rPr>
                 <w:sz w:val="28"/>
                 <w:szCs w:val="28"/>
+                <w:lang w:val="en-US"/>
               </w:rPr>
             </w:pPr>
             <w:r>
@@ -5794,6 +5545,7 @@
               <w:rPr>
                 <w:sz w:val="28"/>
                 <w:szCs w:val="28"/>
+                <w:lang w:val="en-US"/>
               </w:rPr>
             </w:pPr>
             <w:r>
@@ -5815,6 +5567,7 @@
               <w:rPr>
                 <w:sz w:val="28"/>
                 <w:szCs w:val="28"/>
+                <w:lang w:val="en-US"/>
               </w:rPr>
             </w:pPr>
             <w:r>
@@ -5836,6 +5589,7 @@
               <w:rPr>
                 <w:sz w:val="28"/>
                 <w:szCs w:val="28"/>
+                <w:lang w:val="en-US"/>
               </w:rPr>
             </w:pPr>
             <w:r>
@@ -5868,7 +5622,7 @@
                 <w:szCs w:val="28"/>
                 <w:lang w:val="en-US"/>
               </w:rPr>
-              <w:t>Quantity</w:t>
+              <w:t>Item_ID</w:t>
             </w:r>
           </w:p>
         </w:tc>
@@ -5914,7 +5668,7 @@
                 <w:szCs w:val="28"/>
                 <w:lang w:val="en-US"/>
               </w:rPr>
-              <w:t>Not Null, Default, Check</w:t>
+              <w:t>Primary key</w:t>
             </w:r>
           </w:p>
         </w:tc>
@@ -5935,7 +5689,7 @@
                 <w:sz w:val="28"/>
                 <w:szCs w:val="28"/>
               </w:rPr>
-              <w:t>Количество товаров, собираемых в заказ</w:t>
+              <w:t>Уникальный числовой идентификатора товара в собираемом заказе</w:t>
             </w:r>
           </w:p>
         </w:tc>
@@ -5954,61 +5708,59 @@
                 <w:lang w:val="en-US"/>
               </w:rPr>
             </w:pPr>
-            <w:proofErr w:type="spellStart"/>
-            <w:r>
-              <w:rPr>
-                <w:sz w:val="28"/>
-                <w:szCs w:val="28"/>
-                <w:lang w:val="en-US"/>
-              </w:rPr>
-              <w:t>Unit_price</w:t>
-            </w:r>
-            <w:proofErr w:type="spellEnd"/>
-          </w:p>
-        </w:tc>
-        <w:tc>
-          <w:tcPr>
-            <w:tcW w:w="2506" w:type="dxa"/>
-          </w:tcPr>
-          <w:p>
-            <w:pPr>
-              <w:jc w:val="both"/>
-              <w:rPr>
-                <w:sz w:val="28"/>
-                <w:szCs w:val="28"/>
-                <w:lang w:val="en-US"/>
-              </w:rPr>
-            </w:pPr>
-            <w:r>
-              <w:rPr>
-                <w:sz w:val="28"/>
-                <w:szCs w:val="28"/>
-                <w:lang w:val="en-US"/>
-              </w:rPr>
-              <w:t>DECIMAL(19,4)</w:t>
-            </w:r>
-          </w:p>
-        </w:tc>
-        <w:tc>
-          <w:tcPr>
-            <w:tcW w:w="2506" w:type="dxa"/>
-          </w:tcPr>
-          <w:p>
-            <w:pPr>
-              <w:jc w:val="both"/>
-              <w:rPr>
-                <w:sz w:val="28"/>
-                <w:szCs w:val="28"/>
-                <w:lang w:val="en-US"/>
-              </w:rPr>
-            </w:pPr>
-            <w:r>
-              <w:rPr>
-                <w:sz w:val="28"/>
-                <w:szCs w:val="28"/>
-                <w:lang w:val="en-US"/>
-              </w:rPr>
-              <w:t>Not Null, Check</w:t>
+            <w:r>
+              <w:rPr>
+                <w:sz w:val="28"/>
+                <w:szCs w:val="28"/>
+                <w:lang w:val="en-US"/>
+              </w:rPr>
+              <w:t>Pack_ID</w:t>
+            </w:r>
+          </w:p>
+        </w:tc>
+        <w:tc>
+          <w:tcPr>
+            <w:tcW w:w="2506" w:type="dxa"/>
+          </w:tcPr>
+          <w:p>
+            <w:pPr>
+              <w:jc w:val="both"/>
+              <w:rPr>
+                <w:sz w:val="28"/>
+                <w:szCs w:val="28"/>
+                <w:lang w:val="en-US"/>
+              </w:rPr>
+            </w:pPr>
+            <w:r>
+              <w:rPr>
+                <w:sz w:val="28"/>
+                <w:szCs w:val="28"/>
+                <w:lang w:val="en-US"/>
+              </w:rPr>
+              <w:t>INT</w:t>
+            </w:r>
+          </w:p>
+        </w:tc>
+        <w:tc>
+          <w:tcPr>
+            <w:tcW w:w="2506" w:type="dxa"/>
+          </w:tcPr>
+          <w:p>
+            <w:pPr>
+              <w:jc w:val="both"/>
+              <w:rPr>
+                <w:sz w:val="28"/>
+                <w:szCs w:val="28"/>
+                <w:lang w:val="en-US"/>
+              </w:rPr>
+            </w:pPr>
+            <w:r>
+              <w:rPr>
+                <w:sz w:val="28"/>
+                <w:szCs w:val="28"/>
+                <w:lang w:val="en-US"/>
+              </w:rPr>
+              <w:t>Not Null, Foreign key</w:t>
             </w:r>
           </w:p>
         </w:tc>
@@ -6029,7 +5781,146 @@
                 <w:sz w:val="28"/>
                 <w:szCs w:val="28"/>
               </w:rPr>
-              <w:t>Цена собираемого элемента заказа</w:t>
+              <w:t>Идентификатор сборки</w:t>
+            </w:r>
+          </w:p>
+        </w:tc>
+      </w:tr>
+    </w:tbl>
+    <w:p>
+      <w:pPr>
+        <w:jc w:val="both"/>
+        <w:rPr>
+          <w:sz w:val="28"/>
+          <w:szCs w:val="28"/>
+        </w:rPr>
+      </w:pPr>
+      <w:r>
+        <w:rPr>
+          <w:sz w:val="28"/>
+          <w:szCs w:val="28"/>
+        </w:rPr>
+        <w:lastRenderedPageBreak/>
+        <w:t xml:space="preserve">Продолжение таблицы 2.8 – Структура таблицы </w:t>
+      </w:r>
+      <w:r>
+        <w:rPr>
+          <w:sz w:val="28"/>
+          <w:szCs w:val="28"/>
+          <w:lang w:val="en-US"/>
+        </w:rPr>
+        <w:t>Pack</w:t>
+      </w:r>
+      <w:r>
+        <w:rPr>
+          <w:sz w:val="28"/>
+          <w:szCs w:val="28"/>
+        </w:rPr>
+        <w:t>_</w:t>
+      </w:r>
+      <w:r>
+        <w:rPr>
+          <w:sz w:val="28"/>
+          <w:szCs w:val="28"/>
+          <w:lang w:val="en-US"/>
+        </w:rPr>
+        <w:t>items</w:t>
+      </w:r>
+    </w:p>
+    <w:tbl>
+      <w:tblPr>
+        <w:tblStyle w:val="a7"/>
+        <w:tblW w:w="0" w:type="auto"/>
+        <w:tblLook w:val="04A0" w:firstRow="1" w:lastRow="0" w:firstColumn="1" w:lastColumn="0" w:noHBand="0" w:noVBand="1"/>
+      </w:tblPr>
+      <w:tblGrid>
+        <w:gridCol w:w="2506"/>
+        <w:gridCol w:w="2506"/>
+        <w:gridCol w:w="2506"/>
+        <w:gridCol w:w="2507"/>
+      </w:tblGrid>
+      <w:tr>
+        <w:tc>
+          <w:tcPr>
+            <w:tcW w:w="2506" w:type="dxa"/>
+          </w:tcPr>
+          <w:p>
+            <w:pPr>
+              <w:jc w:val="center"/>
+              <w:rPr>
+                <w:sz w:val="28"/>
+                <w:szCs w:val="28"/>
+              </w:rPr>
+            </w:pPr>
+            <w:r>
+              <w:rPr>
+                <w:sz w:val="28"/>
+                <w:szCs w:val="28"/>
+              </w:rPr>
+              <w:t>Название</w:t>
+            </w:r>
+          </w:p>
+        </w:tc>
+        <w:tc>
+          <w:tcPr>
+            <w:tcW w:w="2506" w:type="dxa"/>
+          </w:tcPr>
+          <w:p>
+            <w:pPr>
+              <w:jc w:val="center"/>
+              <w:rPr>
+                <w:sz w:val="28"/>
+                <w:szCs w:val="28"/>
+              </w:rPr>
+            </w:pPr>
+            <w:r>
+              <w:rPr>
+                <w:sz w:val="28"/>
+                <w:szCs w:val="28"/>
+              </w:rPr>
+              <w:t>Тип данных</w:t>
+            </w:r>
+          </w:p>
+        </w:tc>
+        <w:tc>
+          <w:tcPr>
+            <w:tcW w:w="2506" w:type="dxa"/>
+          </w:tcPr>
+          <w:p>
+            <w:pPr>
+              <w:jc w:val="center"/>
+              <w:rPr>
+                <w:sz w:val="28"/>
+                <w:szCs w:val="28"/>
+              </w:rPr>
+            </w:pPr>
+            <w:r>
+              <w:rPr>
+                <w:sz w:val="28"/>
+                <w:szCs w:val="28"/>
+              </w:rPr>
+              <w:t>Ограничения</w:t>
+            </w:r>
+          </w:p>
+        </w:tc>
+        <w:tc>
+          <w:tcPr>
+            <w:tcW w:w="2507" w:type="dxa"/>
+          </w:tcPr>
+          <w:p>
+            <w:pPr>
+              <w:jc w:val="center"/>
+              <w:rPr>
+                <w:sz w:val="28"/>
+                <w:szCs w:val="28"/>
+              </w:rPr>
+            </w:pPr>
+            <w:r>
+              <w:rPr>
+                <w:sz w:val="28"/>
+                <w:szCs w:val="28"/>
+              </w:rPr>
+              <w:t>Назначение</w:t>
             </w:r>
           </w:p>
         </w:tc>
@@ -6048,7 +5939,190 @@
                 <w:lang w:val="en-US"/>
               </w:rPr>
             </w:pPr>
-            <w:proofErr w:type="spellStart"/>
+            <w:r>
+              <w:rPr>
+                <w:sz w:val="28"/>
+                <w:szCs w:val="28"/>
+                <w:lang w:val="en-US"/>
+              </w:rPr>
+              <w:t>Quantity</w:t>
+            </w:r>
+          </w:p>
+        </w:tc>
+        <w:tc>
+          <w:tcPr>
+            <w:tcW w:w="2506" w:type="dxa"/>
+          </w:tcPr>
+          <w:p>
+            <w:pPr>
+              <w:jc w:val="both"/>
+              <w:rPr>
+                <w:sz w:val="28"/>
+                <w:szCs w:val="28"/>
+                <w:lang w:val="en-US"/>
+              </w:rPr>
+            </w:pPr>
+            <w:r>
+              <w:rPr>
+                <w:sz w:val="28"/>
+                <w:szCs w:val="28"/>
+                <w:lang w:val="en-US"/>
+              </w:rPr>
+              <w:t>INT</w:t>
+            </w:r>
+          </w:p>
+        </w:tc>
+        <w:tc>
+          <w:tcPr>
+            <w:tcW w:w="2506" w:type="dxa"/>
+          </w:tcPr>
+          <w:p>
+            <w:pPr>
+              <w:jc w:val="both"/>
+              <w:rPr>
+                <w:sz w:val="28"/>
+                <w:szCs w:val="28"/>
+                <w:lang w:val="en-US"/>
+              </w:rPr>
+            </w:pPr>
+            <w:r>
+              <w:rPr>
+                <w:sz w:val="28"/>
+                <w:szCs w:val="28"/>
+                <w:lang w:val="en-US"/>
+              </w:rPr>
+              <w:t>Not Null, Default, Check</w:t>
+            </w:r>
+          </w:p>
+        </w:tc>
+        <w:tc>
+          <w:tcPr>
+            <w:tcW w:w="2507" w:type="dxa"/>
+          </w:tcPr>
+          <w:p>
+            <w:pPr>
+              <w:jc w:val="both"/>
+              <w:rPr>
+                <w:sz w:val="28"/>
+                <w:szCs w:val="28"/>
+              </w:rPr>
+            </w:pPr>
+            <w:r>
+              <w:rPr>
+                <w:sz w:val="28"/>
+                <w:szCs w:val="28"/>
+              </w:rPr>
+              <w:t>Количество товаров, собираемых в заказ</w:t>
+            </w:r>
+          </w:p>
+        </w:tc>
+      </w:tr>
+      <w:tr>
+        <w:tc>
+          <w:tcPr>
+            <w:tcW w:w="2506" w:type="dxa"/>
+          </w:tcPr>
+          <w:p>
+            <w:pPr>
+              <w:jc w:val="both"/>
+              <w:rPr>
+                <w:sz w:val="28"/>
+                <w:szCs w:val="28"/>
+                <w:lang w:val="en-US"/>
+              </w:rPr>
+            </w:pPr>
+            <w:r>
+              <w:rPr>
+                <w:sz w:val="28"/>
+                <w:szCs w:val="28"/>
+                <w:lang w:val="en-US"/>
+              </w:rPr>
+              <w:t>Unit_price</w:t>
+            </w:r>
+          </w:p>
+        </w:tc>
+        <w:tc>
+          <w:tcPr>
+            <w:tcW w:w="2506" w:type="dxa"/>
+          </w:tcPr>
+          <w:p>
+            <w:pPr>
+              <w:jc w:val="both"/>
+              <w:rPr>
+                <w:sz w:val="28"/>
+                <w:szCs w:val="28"/>
+                <w:lang w:val="en-US"/>
+              </w:rPr>
+            </w:pPr>
+            <w:r>
+              <w:rPr>
+                <w:sz w:val="28"/>
+                <w:szCs w:val="28"/>
+                <w:lang w:val="en-US"/>
+              </w:rPr>
+              <w:t>DECIMAL(19,4)</w:t>
+            </w:r>
+          </w:p>
+        </w:tc>
+        <w:tc>
+          <w:tcPr>
+            <w:tcW w:w="2506" w:type="dxa"/>
+          </w:tcPr>
+          <w:p>
+            <w:pPr>
+              <w:jc w:val="both"/>
+              <w:rPr>
+                <w:sz w:val="28"/>
+                <w:szCs w:val="28"/>
+                <w:lang w:val="en-US"/>
+              </w:rPr>
+            </w:pPr>
+            <w:r>
+              <w:rPr>
+                <w:sz w:val="28"/>
+                <w:szCs w:val="28"/>
+                <w:lang w:val="en-US"/>
+              </w:rPr>
+              <w:t>Not Null, Check</w:t>
+            </w:r>
+          </w:p>
+        </w:tc>
+        <w:tc>
+          <w:tcPr>
+            <w:tcW w:w="2507" w:type="dxa"/>
+          </w:tcPr>
+          <w:p>
+            <w:pPr>
+              <w:jc w:val="both"/>
+              <w:rPr>
+                <w:sz w:val="28"/>
+                <w:szCs w:val="28"/>
+              </w:rPr>
+            </w:pPr>
+            <w:r>
+              <w:rPr>
+                <w:sz w:val="28"/>
+                <w:szCs w:val="28"/>
+              </w:rPr>
+              <w:t>Цена собираемого элемента заказа</w:t>
+            </w:r>
+          </w:p>
+        </w:tc>
+      </w:tr>
+      <w:tr>
+        <w:tc>
+          <w:tcPr>
+            <w:tcW w:w="2506" w:type="dxa"/>
+          </w:tcPr>
+          <w:p>
+            <w:pPr>
+              <w:jc w:val="both"/>
+              <w:rPr>
+                <w:sz w:val="28"/>
+                <w:szCs w:val="28"/>
+                <w:lang w:val="en-US"/>
+              </w:rPr>
+            </w:pPr>
             <w:r>
               <w:rPr>
                 <w:sz w:val="28"/>
@@ -6065,7 +6139,6 @@
               </w:rPr>
               <w:t>s</w:t>
             </w:r>
-            <w:proofErr w:type="spellEnd"/>
           </w:p>
         </w:tc>
         <w:tc>
@@ -6174,7 +6247,7 @@
     </w:p>
     <w:p>
       <w:pPr>
-        <w:ind w:firstLine="360"/>
+        <w:ind w:firstLine="363"/>
         <w:jc w:val="both"/>
         <w:rPr>
           <w:sz w:val="28"/>
@@ -6201,11 +6274,827 @@
           <w:szCs w:val="28"/>
         </w:rPr>
         <w:t xml:space="preserve"> Так как в данной система бухгалтеры могут формировать финансовые отчёты и отчёты эффективности, то создадим представления, способствующие решению данных задач.</w:t>
+      </w:r>
+      <w:r>
+        <w:rPr>
+          <w:sz w:val="28"/>
+          <w:szCs w:val="28"/>
+        </w:rPr>
+        <w:t xml:space="preserve"> </w:t>
+      </w:r>
+      <w:r>
+        <w:rPr>
+          <w:sz w:val="28"/>
+          <w:szCs w:val="28"/>
+        </w:rPr>
+        <w:t>Информация о представлениях представлена в таблице 2.9.</w:t>
       </w:r>
     </w:p>
     <w:p>
       <w:pPr>
-        <w:ind w:firstLine="360"/>
+        <w:spacing w:before="240"/>
+        <w:jc w:val="both"/>
+        <w:rPr>
+          <w:sz w:val="28"/>
+          <w:szCs w:val="28"/>
+        </w:rPr>
+      </w:pPr>
+      <w:r>
+        <w:rPr>
+          <w:sz w:val="28"/>
+          <w:szCs w:val="28"/>
+        </w:rPr>
+        <w:t>Таблица 2.9 – Информация о представлениях</w:t>
+      </w:r>
+    </w:p>
+    <w:tbl>
+      <w:tblPr>
+        <w:tblStyle w:val="a7"/>
+        <w:tblW w:w="0" w:type="auto"/>
+        <w:tblLook w:val="04A0" w:firstRow="1" w:lastRow="0" w:firstColumn="1" w:lastColumn="0" w:noHBand="0" w:noVBand="1"/>
+      </w:tblPr>
+      <w:tblGrid>
+        <w:gridCol w:w="2114"/>
+        <w:gridCol w:w="3312"/>
+        <w:gridCol w:w="2375"/>
+        <w:gridCol w:w="2224"/>
+      </w:tblGrid>
+      <w:tr>
+        <w:tc>
+          <w:tcPr>
+            <w:tcW w:w="2114" w:type="dxa"/>
+          </w:tcPr>
+          <w:p>
+            <w:pPr>
+              <w:jc w:val="center"/>
+              <w:rPr>
+                <w:sz w:val="28"/>
+                <w:szCs w:val="28"/>
+              </w:rPr>
+            </w:pPr>
+            <w:r>
+              <w:rPr>
+                <w:sz w:val="28"/>
+                <w:szCs w:val="28"/>
+              </w:rPr>
+              <w:t>Тип объекта</w:t>
+            </w:r>
+          </w:p>
+        </w:tc>
+        <w:tc>
+          <w:tcPr>
+            <w:tcW w:w="3312" w:type="dxa"/>
+          </w:tcPr>
+          <w:p>
+            <w:pPr>
+              <w:jc w:val="center"/>
+              <w:rPr>
+                <w:sz w:val="28"/>
+                <w:szCs w:val="28"/>
+              </w:rPr>
+            </w:pPr>
+            <w:r>
+              <w:rPr>
+                <w:sz w:val="28"/>
+                <w:szCs w:val="28"/>
+              </w:rPr>
+              <w:t>Наименование</w:t>
+            </w:r>
+          </w:p>
+        </w:tc>
+        <w:tc>
+          <w:tcPr>
+            <w:tcW w:w="2375" w:type="dxa"/>
+          </w:tcPr>
+          <w:p>
+            <w:pPr>
+              <w:jc w:val="center"/>
+              <w:rPr>
+                <w:sz w:val="28"/>
+                <w:szCs w:val="28"/>
+              </w:rPr>
+            </w:pPr>
+            <w:r>
+              <w:rPr>
+                <w:sz w:val="28"/>
+                <w:szCs w:val="28"/>
+              </w:rPr>
+              <w:t>Назначение</w:t>
+            </w:r>
+          </w:p>
+        </w:tc>
+        <w:tc>
+          <w:tcPr>
+            <w:tcW w:w="2224" w:type="dxa"/>
+          </w:tcPr>
+          <w:p>
+            <w:pPr>
+              <w:jc w:val="center"/>
+              <w:rPr>
+                <w:sz w:val="28"/>
+                <w:szCs w:val="28"/>
+              </w:rPr>
+            </w:pPr>
+            <w:r>
+              <w:rPr>
+                <w:sz w:val="28"/>
+                <w:szCs w:val="28"/>
+              </w:rPr>
+              <w:t>Зависимые объекты</w:t>
+            </w:r>
+          </w:p>
+        </w:tc>
+      </w:tr>
+      <w:tr>
+        <w:tc>
+          <w:tcPr>
+            <w:tcW w:w="2114" w:type="dxa"/>
+          </w:tcPr>
+          <w:p>
+            <w:pPr>
+              <w:jc w:val="both"/>
+              <w:rPr>
+                <w:sz w:val="28"/>
+                <w:szCs w:val="28"/>
+                <w:lang w:val="en-US"/>
+              </w:rPr>
+            </w:pPr>
+            <w:r>
+              <w:rPr>
+                <w:sz w:val="28"/>
+                <w:szCs w:val="28"/>
+                <w:lang w:val="en-US"/>
+              </w:rPr>
+              <w:t>VIEW</w:t>
+            </w:r>
+          </w:p>
+        </w:tc>
+        <w:tc>
+          <w:tcPr>
+            <w:tcW w:w="3312" w:type="dxa"/>
+          </w:tcPr>
+          <w:p>
+            <w:pPr>
+              <w:jc w:val="both"/>
+              <w:rPr>
+                <w:sz w:val="28"/>
+                <w:szCs w:val="28"/>
+                <w:lang w:val="en-US"/>
+              </w:rPr>
+            </w:pPr>
+            <w:r>
+              <w:rPr>
+                <w:sz w:val="28"/>
+                <w:szCs w:val="28"/>
+                <w:lang w:val="en-US"/>
+              </w:rPr>
+              <w:t>CompletedOperatorTasks</w:t>
+            </w:r>
+          </w:p>
+        </w:tc>
+        <w:tc>
+          <w:tcPr>
+            <w:tcW w:w="2375" w:type="dxa"/>
+          </w:tcPr>
+          <w:p>
+            <w:pPr>
+              <w:jc w:val="both"/>
+              <w:rPr>
+                <w:sz w:val="28"/>
+                <w:szCs w:val="28"/>
+              </w:rPr>
+            </w:pPr>
+            <w:r>
+              <w:rPr>
+                <w:sz w:val="28"/>
+                <w:szCs w:val="28"/>
+              </w:rPr>
+              <w:t>Получение эффективности работы операторов склада из расчёты выполненных ими задач</w:t>
+            </w:r>
+          </w:p>
+        </w:tc>
+        <w:tc>
+          <w:tcPr>
+            <w:tcW w:w="2224" w:type="dxa"/>
+          </w:tcPr>
+          <w:p>
+            <w:pPr>
+              <w:jc w:val="both"/>
+              <w:rPr>
+                <w:sz w:val="28"/>
+                <w:szCs w:val="28"/>
+                <w:lang w:val="en-US"/>
+              </w:rPr>
+            </w:pPr>
+            <w:r>
+              <w:rPr>
+                <w:sz w:val="28"/>
+                <w:szCs w:val="28"/>
+                <w:lang w:val="en-US"/>
+              </w:rPr>
+              <w:t>Users, Tasks</w:t>
+            </w:r>
+          </w:p>
+        </w:tc>
+      </w:tr>
+      <w:tr>
+        <w:tc>
+          <w:tcPr>
+            <w:tcW w:w="2114" w:type="dxa"/>
+          </w:tcPr>
+          <w:p>
+            <w:pPr>
+              <w:jc w:val="both"/>
+              <w:rPr>
+                <w:sz w:val="28"/>
+                <w:szCs w:val="28"/>
+                <w:lang w:val="en-US"/>
+              </w:rPr>
+            </w:pPr>
+            <w:r>
+              <w:rPr>
+                <w:sz w:val="28"/>
+                <w:szCs w:val="28"/>
+                <w:lang w:val="en-US"/>
+              </w:rPr>
+              <w:t>VIEW</w:t>
+            </w:r>
+          </w:p>
+        </w:tc>
+        <w:tc>
+          <w:tcPr>
+            <w:tcW w:w="3312" w:type="dxa"/>
+          </w:tcPr>
+          <w:p>
+            <w:pPr>
+              <w:jc w:val="both"/>
+              <w:rPr>
+                <w:sz w:val="28"/>
+                <w:szCs w:val="28"/>
+                <w:lang w:val="en-US"/>
+              </w:rPr>
+            </w:pPr>
+            <w:r>
+              <w:rPr>
+                <w:sz w:val="28"/>
+                <w:szCs w:val="28"/>
+                <w:lang w:val="en-US"/>
+              </w:rPr>
+              <w:t>MonthlyFinancialSummary</w:t>
+            </w:r>
+          </w:p>
+        </w:tc>
+        <w:tc>
+          <w:tcPr>
+            <w:tcW w:w="2375" w:type="dxa"/>
+          </w:tcPr>
+          <w:p>
+            <w:pPr>
+              <w:jc w:val="both"/>
+              <w:rPr>
+                <w:sz w:val="28"/>
+                <w:szCs w:val="28"/>
+              </w:rPr>
+            </w:pPr>
+            <w:r>
+              <w:rPr>
+                <w:sz w:val="28"/>
+                <w:szCs w:val="28"/>
+              </w:rPr>
+              <w:t>Получение финансового отчёта за прошедший месяц</w:t>
+            </w:r>
+          </w:p>
+        </w:tc>
+        <w:tc>
+          <w:tcPr>
+            <w:tcW w:w="2224" w:type="dxa"/>
+          </w:tcPr>
+          <w:p>
+            <w:pPr>
+              <w:jc w:val="both"/>
+              <w:rPr>
+                <w:sz w:val="28"/>
+                <w:szCs w:val="28"/>
+                <w:lang w:val="en-US"/>
+              </w:rPr>
+            </w:pPr>
+            <w:r>
+              <w:rPr>
+                <w:sz w:val="28"/>
+                <w:szCs w:val="28"/>
+                <w:lang w:val="en-US"/>
+              </w:rPr>
+              <w:t>Products, Pack, Pack_items</w:t>
+            </w:r>
+          </w:p>
+        </w:tc>
+      </w:tr>
+    </w:tbl>
+    <w:p>
+      <w:pPr>
+        <w:spacing w:before="240"/>
+        <w:jc w:val="both"/>
+        <w:rPr>
+          <w:sz w:val="28"/>
+          <w:szCs w:val="28"/>
+        </w:rPr>
+      </w:pPr>
+      <w:r>
+        <w:rPr>
+          <w:sz w:val="28"/>
+          <w:szCs w:val="28"/>
+        </w:rPr>
+        <w:t>Так как в базе данных имеются таблицы, в которых планируется наличие достаточно большого количества данных и поиск в них также планируется осуществлять часто</w:t>
+      </w:r>
+      <w:r>
+        <w:rPr>
+          <w:sz w:val="28"/>
+          <w:szCs w:val="28"/>
+        </w:rPr>
+        <w:t xml:space="preserve">, например таблицы </w:t>
+      </w:r>
+      <w:r>
+        <w:rPr>
+          <w:sz w:val="28"/>
+          <w:szCs w:val="28"/>
+          <w:lang w:val="en-US"/>
+        </w:rPr>
+        <w:t>Products</w:t>
+      </w:r>
+      <w:r>
+        <w:rPr>
+          <w:sz w:val="28"/>
+          <w:szCs w:val="28"/>
+        </w:rPr>
+        <w:t xml:space="preserve">, </w:t>
+      </w:r>
+      <w:r>
+        <w:rPr>
+          <w:sz w:val="28"/>
+          <w:szCs w:val="28"/>
+          <w:lang w:val="en-US"/>
+        </w:rPr>
+        <w:t>Tasks</w:t>
+      </w:r>
+      <w:r>
+        <w:rPr>
+          <w:sz w:val="28"/>
+          <w:szCs w:val="28"/>
+        </w:rPr>
+        <w:t xml:space="preserve">, </w:t>
+      </w:r>
+      <w:r>
+        <w:rPr>
+          <w:sz w:val="28"/>
+          <w:szCs w:val="28"/>
+          <w:lang w:val="en-US"/>
+        </w:rPr>
+        <w:t>Orders</w:t>
+      </w:r>
+      <w:r>
+        <w:rPr>
+          <w:sz w:val="28"/>
+          <w:szCs w:val="28"/>
+        </w:rPr>
+        <w:t xml:space="preserve">, </w:t>
+      </w:r>
+      <w:r>
+        <w:rPr>
+          <w:sz w:val="28"/>
+          <w:szCs w:val="28"/>
+          <w:lang w:val="en-US"/>
+        </w:rPr>
+        <w:t>Pack</w:t>
+      </w:r>
+      <w:r>
+        <w:rPr>
+          <w:sz w:val="28"/>
+          <w:szCs w:val="28"/>
+        </w:rPr>
+        <w:t>, то для таких таблиц необходимо создать индексы. Индексы призваны ускорить поиск в таких таблицах. Информация о создаваемых индексах представлена в таблице 2.10.</w:t>
+      </w:r>
+    </w:p>
+    <w:p>
+      <w:pPr>
+        <w:jc w:val="both"/>
+        <w:rPr>
+          <w:sz w:val="28"/>
+          <w:szCs w:val="28"/>
+        </w:rPr>
+      </w:pPr>
+    </w:p>
+    <w:p>
+      <w:pPr>
+        <w:jc w:val="both"/>
+        <w:rPr>
+          <w:sz w:val="28"/>
+          <w:szCs w:val="28"/>
+        </w:rPr>
+      </w:pPr>
+      <w:r>
+        <w:rPr>
+          <w:sz w:val="28"/>
+          <w:szCs w:val="28"/>
+        </w:rPr>
+        <w:lastRenderedPageBreak/>
+        <w:t>Таблица 2.10 – Информация о индексах</w:t>
+      </w:r>
+    </w:p>
+    <w:tbl>
+      <w:tblPr>
+        <w:tblStyle w:val="a7"/>
+        <w:tblW w:w="0" w:type="auto"/>
+        <w:tblLook w:val="04A0" w:firstRow="1" w:lastRow="0" w:firstColumn="1" w:lastColumn="0" w:noHBand="0" w:noVBand="1"/>
+      </w:tblPr>
+      <w:tblGrid>
+        <w:gridCol w:w="2506"/>
+        <w:gridCol w:w="2506"/>
+        <w:gridCol w:w="2506"/>
+        <w:gridCol w:w="2507"/>
+      </w:tblGrid>
+      <w:tr>
+        <w:tc>
+          <w:tcPr>
+            <w:tcW w:w="2506" w:type="dxa"/>
+          </w:tcPr>
+          <w:p>
+            <w:pPr>
+              <w:ind w:left="708" w:hanging="708"/>
+              <w:jc w:val="center"/>
+              <w:rPr>
+                <w:sz w:val="28"/>
+                <w:szCs w:val="28"/>
+              </w:rPr>
+            </w:pPr>
+            <w:r>
+              <w:rPr>
+                <w:sz w:val="28"/>
+                <w:szCs w:val="28"/>
+              </w:rPr>
+              <w:t>Тип объекта</w:t>
+            </w:r>
+          </w:p>
+        </w:tc>
+        <w:tc>
+          <w:tcPr>
+            <w:tcW w:w="2506" w:type="dxa"/>
+          </w:tcPr>
+          <w:p>
+            <w:pPr>
+              <w:ind w:left="708" w:hanging="708"/>
+              <w:jc w:val="center"/>
+              <w:rPr>
+                <w:sz w:val="28"/>
+                <w:szCs w:val="28"/>
+              </w:rPr>
+            </w:pPr>
+            <w:r>
+              <w:rPr>
+                <w:sz w:val="28"/>
+                <w:szCs w:val="28"/>
+              </w:rPr>
+              <w:t>Наименование</w:t>
+            </w:r>
+          </w:p>
+        </w:tc>
+        <w:tc>
+          <w:tcPr>
+            <w:tcW w:w="2506" w:type="dxa"/>
+          </w:tcPr>
+          <w:p>
+            <w:pPr>
+              <w:ind w:left="708" w:hanging="708"/>
+              <w:jc w:val="center"/>
+              <w:rPr>
+                <w:sz w:val="28"/>
+                <w:szCs w:val="28"/>
+              </w:rPr>
+            </w:pPr>
+            <w:r>
+              <w:rPr>
+                <w:sz w:val="28"/>
+                <w:szCs w:val="28"/>
+              </w:rPr>
+              <w:t>Назначение</w:t>
+            </w:r>
+          </w:p>
+        </w:tc>
+        <w:tc>
+          <w:tcPr>
+            <w:tcW w:w="2507" w:type="dxa"/>
+          </w:tcPr>
+          <w:p>
+            <w:pPr>
+              <w:ind w:left="708" w:hanging="708"/>
+              <w:jc w:val="center"/>
+              <w:rPr>
+                <w:sz w:val="28"/>
+                <w:szCs w:val="28"/>
+              </w:rPr>
+            </w:pPr>
+            <w:r>
+              <w:rPr>
+                <w:sz w:val="28"/>
+                <w:szCs w:val="28"/>
+              </w:rPr>
+              <w:t>Зависимые объекты</w:t>
+            </w:r>
+          </w:p>
+        </w:tc>
+      </w:tr>
+      <w:tr>
+        <w:tc>
+          <w:tcPr>
+            <w:tcW w:w="2506" w:type="dxa"/>
+          </w:tcPr>
+          <w:p>
+            <w:pPr>
+              <w:jc w:val="both"/>
+              <w:rPr>
+                <w:sz w:val="28"/>
+                <w:szCs w:val="28"/>
+              </w:rPr>
+            </w:pPr>
+          </w:p>
+        </w:tc>
+        <w:tc>
+          <w:tcPr>
+            <w:tcW w:w="2506" w:type="dxa"/>
+          </w:tcPr>
+          <w:p>
+            <w:pPr>
+              <w:jc w:val="both"/>
+              <w:rPr>
+                <w:sz w:val="28"/>
+                <w:szCs w:val="28"/>
+              </w:rPr>
+            </w:pPr>
+          </w:p>
+        </w:tc>
+        <w:tc>
+          <w:tcPr>
+            <w:tcW w:w="2506" w:type="dxa"/>
+          </w:tcPr>
+          <w:p>
+            <w:pPr>
+              <w:jc w:val="both"/>
+              <w:rPr>
+                <w:sz w:val="28"/>
+                <w:szCs w:val="28"/>
+              </w:rPr>
+            </w:pPr>
+          </w:p>
+        </w:tc>
+        <w:tc>
+          <w:tcPr>
+            <w:tcW w:w="2507" w:type="dxa"/>
+          </w:tcPr>
+          <w:p>
+            <w:pPr>
+              <w:jc w:val="both"/>
+              <w:rPr>
+                <w:sz w:val="28"/>
+                <w:szCs w:val="28"/>
+              </w:rPr>
+            </w:pPr>
+          </w:p>
+        </w:tc>
+      </w:tr>
+      <w:tr>
+        <w:tc>
+          <w:tcPr>
+            <w:tcW w:w="2506" w:type="dxa"/>
+          </w:tcPr>
+          <w:p>
+            <w:pPr>
+              <w:jc w:val="both"/>
+              <w:rPr>
+                <w:sz w:val="28"/>
+                <w:szCs w:val="28"/>
+              </w:rPr>
+            </w:pPr>
+          </w:p>
+        </w:tc>
+        <w:tc>
+          <w:tcPr>
+            <w:tcW w:w="2506" w:type="dxa"/>
+          </w:tcPr>
+          <w:p>
+            <w:pPr>
+              <w:jc w:val="both"/>
+              <w:rPr>
+                <w:sz w:val="28"/>
+                <w:szCs w:val="28"/>
+              </w:rPr>
+            </w:pPr>
+          </w:p>
+        </w:tc>
+        <w:tc>
+          <w:tcPr>
+            <w:tcW w:w="2506" w:type="dxa"/>
+          </w:tcPr>
+          <w:p>
+            <w:pPr>
+              <w:jc w:val="both"/>
+              <w:rPr>
+                <w:sz w:val="28"/>
+                <w:szCs w:val="28"/>
+              </w:rPr>
+            </w:pPr>
+          </w:p>
+        </w:tc>
+        <w:tc>
+          <w:tcPr>
+            <w:tcW w:w="2507" w:type="dxa"/>
+          </w:tcPr>
+          <w:p>
+            <w:pPr>
+              <w:jc w:val="both"/>
+              <w:rPr>
+                <w:sz w:val="28"/>
+                <w:szCs w:val="28"/>
+              </w:rPr>
+            </w:pPr>
+          </w:p>
+        </w:tc>
+      </w:tr>
+      <w:tr>
+        <w:tc>
+          <w:tcPr>
+            <w:tcW w:w="2506" w:type="dxa"/>
+          </w:tcPr>
+          <w:p>
+            <w:pPr>
+              <w:jc w:val="both"/>
+              <w:rPr>
+                <w:sz w:val="28"/>
+                <w:szCs w:val="28"/>
+              </w:rPr>
+            </w:pPr>
+          </w:p>
+        </w:tc>
+        <w:tc>
+          <w:tcPr>
+            <w:tcW w:w="2506" w:type="dxa"/>
+          </w:tcPr>
+          <w:p>
+            <w:pPr>
+              <w:jc w:val="both"/>
+              <w:rPr>
+                <w:sz w:val="28"/>
+                <w:szCs w:val="28"/>
+              </w:rPr>
+            </w:pPr>
+          </w:p>
+        </w:tc>
+        <w:tc>
+          <w:tcPr>
+            <w:tcW w:w="2506" w:type="dxa"/>
+          </w:tcPr>
+          <w:p>
+            <w:pPr>
+              <w:jc w:val="both"/>
+              <w:rPr>
+                <w:sz w:val="28"/>
+                <w:szCs w:val="28"/>
+              </w:rPr>
+            </w:pPr>
+          </w:p>
+        </w:tc>
+        <w:tc>
+          <w:tcPr>
+            <w:tcW w:w="2507" w:type="dxa"/>
+          </w:tcPr>
+          <w:p>
+            <w:pPr>
+              <w:jc w:val="both"/>
+              <w:rPr>
+                <w:sz w:val="28"/>
+                <w:szCs w:val="28"/>
+              </w:rPr>
+            </w:pPr>
+          </w:p>
+        </w:tc>
+      </w:tr>
+      <w:tr>
+        <w:tc>
+          <w:tcPr>
+            <w:tcW w:w="2506" w:type="dxa"/>
+          </w:tcPr>
+          <w:p>
+            <w:pPr>
+              <w:jc w:val="both"/>
+              <w:rPr>
+                <w:sz w:val="28"/>
+                <w:szCs w:val="28"/>
+              </w:rPr>
+            </w:pPr>
+          </w:p>
+        </w:tc>
+        <w:tc>
+          <w:tcPr>
+            <w:tcW w:w="2506" w:type="dxa"/>
+          </w:tcPr>
+          <w:p>
+            <w:pPr>
+              <w:jc w:val="both"/>
+              <w:rPr>
+                <w:sz w:val="28"/>
+                <w:szCs w:val="28"/>
+              </w:rPr>
+            </w:pPr>
+          </w:p>
+        </w:tc>
+        <w:tc>
+          <w:tcPr>
+            <w:tcW w:w="2506" w:type="dxa"/>
+          </w:tcPr>
+          <w:p>
+            <w:pPr>
+              <w:jc w:val="both"/>
+              <w:rPr>
+                <w:sz w:val="28"/>
+                <w:szCs w:val="28"/>
+              </w:rPr>
+            </w:pPr>
+          </w:p>
+        </w:tc>
+        <w:tc>
+          <w:tcPr>
+            <w:tcW w:w="2507" w:type="dxa"/>
+          </w:tcPr>
+          <w:p>
+            <w:pPr>
+              <w:jc w:val="both"/>
+              <w:rPr>
+                <w:sz w:val="28"/>
+                <w:szCs w:val="28"/>
+              </w:rPr>
+            </w:pPr>
+          </w:p>
+        </w:tc>
+      </w:tr>
+      <w:tr>
+        <w:tc>
+          <w:tcPr>
+            <w:tcW w:w="2506" w:type="dxa"/>
+          </w:tcPr>
+          <w:p>
+            <w:pPr>
+              <w:jc w:val="both"/>
+              <w:rPr>
+                <w:sz w:val="28"/>
+                <w:szCs w:val="28"/>
+              </w:rPr>
+            </w:pPr>
+          </w:p>
+        </w:tc>
+        <w:tc>
+          <w:tcPr>
+            <w:tcW w:w="2506" w:type="dxa"/>
+          </w:tcPr>
+          <w:p>
+            <w:pPr>
+              <w:jc w:val="both"/>
+              <w:rPr>
+                <w:sz w:val="28"/>
+                <w:szCs w:val="28"/>
+              </w:rPr>
+            </w:pPr>
+          </w:p>
+        </w:tc>
+        <w:tc>
+          <w:tcPr>
+            <w:tcW w:w="2506" w:type="dxa"/>
+          </w:tcPr>
+          <w:p>
+            <w:pPr>
+              <w:jc w:val="both"/>
+              <w:rPr>
+                <w:sz w:val="28"/>
+                <w:szCs w:val="28"/>
+              </w:rPr>
+            </w:pPr>
+          </w:p>
+        </w:tc>
+        <w:tc>
+          <w:tcPr>
+            <w:tcW w:w="2507" w:type="dxa"/>
+          </w:tcPr>
+          <w:p>
+            <w:pPr>
+              <w:jc w:val="both"/>
+              <w:rPr>
+                <w:sz w:val="28"/>
+                <w:szCs w:val="28"/>
+              </w:rPr>
+            </w:pPr>
+          </w:p>
+        </w:tc>
+      </w:tr>
+    </w:tbl>
+    <w:p>
+      <w:pPr>
         <w:jc w:val="both"/>
         <w:rPr>
           <w:sz w:val="28"/>

</xml_diff>

<commit_message>
IADB: lab2 in progress. Functions and procedures creation started
</commit_message>
<xml_diff>
--- a/IADB/Code/Lab_2/Report.docx
+++ b/IADB/Code/Lab_2/Report.docx
@@ -6538,15 +6538,14 @@
         <w:tblLook w:val="04A0" w:firstRow="1" w:lastRow="0" w:firstColumn="1" w:lastColumn="0" w:noHBand="0" w:noVBand="1"/>
       </w:tblPr>
       <w:tblGrid>
-        <w:gridCol w:w="2114"/>
-        <w:gridCol w:w="3312"/>
-        <w:gridCol w:w="2375"/>
-        <w:gridCol w:w="2224"/>
+        <w:gridCol w:w="3341"/>
+        <w:gridCol w:w="3342"/>
+        <w:gridCol w:w="3342"/>
       </w:tblGrid>
       <w:tr>
         <w:tc>
           <w:tcPr>
-            <w:tcW w:w="2114" w:type="dxa"/>
+            <w:tcW w:w="3341" w:type="dxa"/>
           </w:tcPr>
           <w:p>
             <w:pPr>
@@ -6561,13 +6560,13 @@
                 <w:sz w:val="28"/>
                 <w:szCs w:val="28"/>
               </w:rPr>
-              <w:t>Тип объекта</w:t>
-            </w:r>
-          </w:p>
-        </w:tc>
-        <w:tc>
-          <w:tcPr>
-            <w:tcW w:w="3312" w:type="dxa"/>
+              <w:t>Наименование</w:t>
+            </w:r>
+          </w:p>
+        </w:tc>
+        <w:tc>
+          <w:tcPr>
+            <w:tcW w:w="3342" w:type="dxa"/>
           </w:tcPr>
           <w:p>
             <w:pPr>
@@ -6582,34 +6581,13 @@
                 <w:sz w:val="28"/>
                 <w:szCs w:val="28"/>
               </w:rPr>
-              <w:t>Наименование</w:t>
-            </w:r>
-          </w:p>
-        </w:tc>
-        <w:tc>
-          <w:tcPr>
-            <w:tcW w:w="2375" w:type="dxa"/>
-          </w:tcPr>
-          <w:p>
-            <w:pPr>
-              <w:jc w:val="center"/>
-              <w:rPr>
-                <w:sz w:val="28"/>
-                <w:szCs w:val="28"/>
-              </w:rPr>
-            </w:pPr>
-            <w:r>
-              <w:rPr>
-                <w:sz w:val="28"/>
-                <w:szCs w:val="28"/>
-              </w:rPr>
               <w:t>Назначение</w:t>
             </w:r>
           </w:p>
         </w:tc>
         <w:tc>
           <w:tcPr>
-            <w:tcW w:w="2224" w:type="dxa"/>
+            <w:tcW w:w="3342" w:type="dxa"/>
           </w:tcPr>
           <w:p>
             <w:pPr>
@@ -6632,38 +6610,14 @@
       <w:tr>
         <w:tc>
           <w:tcPr>
-            <w:tcW w:w="2114" w:type="dxa"/>
-          </w:tcPr>
-          <w:p>
-            <w:pPr>
-              <w:jc w:val="both"/>
-              <w:rPr>
-                <w:sz w:val="28"/>
-                <w:szCs w:val="28"/>
-                <w:lang w:val="en-US"/>
-              </w:rPr>
-            </w:pPr>
-            <w:r>
-              <w:rPr>
-                <w:sz w:val="28"/>
-                <w:szCs w:val="28"/>
-                <w:lang w:val="en-US"/>
-              </w:rPr>
-              <w:t>VIEW</w:t>
-            </w:r>
-          </w:p>
-        </w:tc>
-        <w:tc>
-          <w:tcPr>
-            <w:tcW w:w="3312" w:type="dxa"/>
-          </w:tcPr>
-          <w:p>
-            <w:pPr>
-              <w:jc w:val="both"/>
-              <w:rPr>
-                <w:sz w:val="28"/>
-                <w:szCs w:val="28"/>
-                <w:lang w:val="en-US"/>
+            <w:tcW w:w="3341" w:type="dxa"/>
+          </w:tcPr>
+          <w:p>
+            <w:pPr>
+              <w:jc w:val="both"/>
+              <w:rPr>
+                <w:sz w:val="28"/>
+                <w:szCs w:val="28"/>
               </w:rPr>
             </w:pPr>
             <w:proofErr w:type="spellStart"/>
@@ -6680,7 +6634,7 @@
         </w:tc>
         <w:tc>
           <w:tcPr>
-            <w:tcW w:w="2375" w:type="dxa"/>
+            <w:tcW w:w="3342" w:type="dxa"/>
           </w:tcPr>
           <w:p>
             <w:pPr>
@@ -6701,15 +6655,14 @@
         </w:tc>
         <w:tc>
           <w:tcPr>
-            <w:tcW w:w="2224" w:type="dxa"/>
-          </w:tcPr>
-          <w:p>
-            <w:pPr>
-              <w:jc w:val="both"/>
-              <w:rPr>
-                <w:sz w:val="28"/>
-                <w:szCs w:val="28"/>
-                <w:lang w:val="en-US"/>
+            <w:tcW w:w="3342" w:type="dxa"/>
+          </w:tcPr>
+          <w:p>
+            <w:pPr>
+              <w:jc w:val="both"/>
+              <w:rPr>
+                <w:sz w:val="28"/>
+                <w:szCs w:val="28"/>
               </w:rPr>
             </w:pPr>
             <w:r>
@@ -6726,30 +6679,7 @@
       <w:tr>
         <w:tc>
           <w:tcPr>
-            <w:tcW w:w="2114" w:type="dxa"/>
-          </w:tcPr>
-          <w:p>
-            <w:pPr>
-              <w:jc w:val="both"/>
-              <w:rPr>
-                <w:sz w:val="28"/>
-                <w:szCs w:val="28"/>
-                <w:lang w:val="en-US"/>
-              </w:rPr>
-            </w:pPr>
-            <w:r>
-              <w:rPr>
-                <w:sz w:val="28"/>
-                <w:szCs w:val="28"/>
-                <w:lang w:val="en-US"/>
-              </w:rPr>
-              <w:t>VIEW</w:t>
-            </w:r>
-          </w:p>
-        </w:tc>
-        <w:tc>
-          <w:tcPr>
-            <w:tcW w:w="3312" w:type="dxa"/>
+            <w:tcW w:w="3341" w:type="dxa"/>
           </w:tcPr>
           <w:p>
             <w:pPr>
@@ -6774,7 +6704,7 @@
         </w:tc>
         <w:tc>
           <w:tcPr>
-            <w:tcW w:w="2375" w:type="dxa"/>
+            <w:tcW w:w="3342" w:type="dxa"/>
           </w:tcPr>
           <w:p>
             <w:pPr>
@@ -6795,7 +6725,7 @@
         </w:tc>
         <w:tc>
           <w:tcPr>
-            <w:tcW w:w="2224" w:type="dxa"/>
+            <w:tcW w:w="3342" w:type="dxa"/>
           </w:tcPr>
           <w:p>
             <w:pPr>
@@ -6830,6 +6760,15 @@
     </w:tbl>
     <w:p>
       <w:pPr>
+        <w:jc w:val="both"/>
+        <w:rPr>
+          <w:sz w:val="28"/>
+          <w:szCs w:val="28"/>
+        </w:rPr>
+      </w:pPr>
+    </w:p>
+    <w:p>
+      <w:pPr>
         <w:spacing w:before="240"/>
         <w:ind w:firstLine="708"/>
         <w:jc w:val="both"/>
@@ -6935,8 +6874,832 @@
           <w:sz w:val="28"/>
           <w:szCs w:val="28"/>
         </w:rPr>
-        <w:lastRenderedPageBreak/>
         <w:t>Таблица 2.10 – Информация о индексах</w:t>
+      </w:r>
+    </w:p>
+    <w:tbl>
+      <w:tblPr>
+        <w:tblStyle w:val="a7"/>
+        <w:tblW w:w="0" w:type="auto"/>
+        <w:tblLook w:val="04A0" w:firstRow="1" w:lastRow="0" w:firstColumn="1" w:lastColumn="0" w:noHBand="0" w:noVBand="1"/>
+      </w:tblPr>
+      <w:tblGrid>
+        <w:gridCol w:w="3452"/>
+        <w:gridCol w:w="3298"/>
+        <w:gridCol w:w="3275"/>
+      </w:tblGrid>
+      <w:tr>
+        <w:tc>
+          <w:tcPr>
+            <w:tcW w:w="3452" w:type="dxa"/>
+          </w:tcPr>
+          <w:p>
+            <w:pPr>
+              <w:jc w:val="center"/>
+              <w:rPr>
+                <w:sz w:val="28"/>
+                <w:szCs w:val="28"/>
+              </w:rPr>
+            </w:pPr>
+            <w:r>
+              <w:rPr>
+                <w:sz w:val="28"/>
+                <w:szCs w:val="28"/>
+              </w:rPr>
+              <w:t>Наименование</w:t>
+            </w:r>
+          </w:p>
+        </w:tc>
+        <w:tc>
+          <w:tcPr>
+            <w:tcW w:w="3298" w:type="dxa"/>
+          </w:tcPr>
+          <w:p>
+            <w:pPr>
+              <w:jc w:val="center"/>
+              <w:rPr>
+                <w:sz w:val="28"/>
+                <w:szCs w:val="28"/>
+              </w:rPr>
+            </w:pPr>
+            <w:r>
+              <w:rPr>
+                <w:sz w:val="28"/>
+                <w:szCs w:val="28"/>
+              </w:rPr>
+              <w:t>Назначение</w:t>
+            </w:r>
+          </w:p>
+        </w:tc>
+        <w:tc>
+          <w:tcPr>
+            <w:tcW w:w="3275" w:type="dxa"/>
+          </w:tcPr>
+          <w:p>
+            <w:pPr>
+              <w:jc w:val="center"/>
+              <w:rPr>
+                <w:sz w:val="28"/>
+                <w:szCs w:val="28"/>
+              </w:rPr>
+            </w:pPr>
+            <w:r>
+              <w:rPr>
+                <w:sz w:val="28"/>
+                <w:szCs w:val="28"/>
+              </w:rPr>
+              <w:t>Зависимые объекты</w:t>
+            </w:r>
+          </w:p>
+        </w:tc>
+      </w:tr>
+      <w:tr>
+        <w:tc>
+          <w:tcPr>
+            <w:tcW w:w="3452" w:type="dxa"/>
+          </w:tcPr>
+          <w:p>
+            <w:pPr>
+              <w:jc w:val="both"/>
+              <w:rPr>
+                <w:sz w:val="28"/>
+                <w:szCs w:val="28"/>
+              </w:rPr>
+            </w:pPr>
+            <w:proofErr w:type="spellStart"/>
+            <w:r>
+              <w:rPr>
+                <w:sz w:val="28"/>
+                <w:szCs w:val="28"/>
+                <w:lang w:val="en-US"/>
+              </w:rPr>
+              <w:t>IX_Users_Email</w:t>
+            </w:r>
+            <w:proofErr w:type="spellEnd"/>
+          </w:p>
+        </w:tc>
+        <w:tc>
+          <w:tcPr>
+            <w:tcW w:w="3298" w:type="dxa"/>
+          </w:tcPr>
+          <w:p>
+            <w:pPr>
+              <w:jc w:val="both"/>
+              <w:rPr>
+                <w:sz w:val="28"/>
+                <w:szCs w:val="28"/>
+              </w:rPr>
+            </w:pPr>
+            <w:r>
+              <w:rPr>
+                <w:sz w:val="28"/>
+                <w:szCs w:val="28"/>
+              </w:rPr>
+              <w:t>Ускорение поиска пользователя по логину</w:t>
+            </w:r>
+          </w:p>
+        </w:tc>
+        <w:tc>
+          <w:tcPr>
+            <w:tcW w:w="3275" w:type="dxa"/>
+          </w:tcPr>
+          <w:p>
+            <w:pPr>
+              <w:ind w:left="708" w:hanging="708"/>
+              <w:jc w:val="center"/>
+              <w:rPr>
+                <w:sz w:val="28"/>
+                <w:szCs w:val="28"/>
+              </w:rPr>
+            </w:pPr>
+            <w:r>
+              <w:rPr>
+                <w:sz w:val="28"/>
+                <w:szCs w:val="28"/>
+                <w:lang w:val="en-US"/>
+              </w:rPr>
+              <w:t>Users</w:t>
+            </w:r>
+          </w:p>
+        </w:tc>
+      </w:tr>
+      <w:tr>
+        <w:tc>
+          <w:tcPr>
+            <w:tcW w:w="3452" w:type="dxa"/>
+          </w:tcPr>
+          <w:p>
+            <w:pPr>
+              <w:jc w:val="both"/>
+              <w:rPr>
+                <w:sz w:val="28"/>
+                <w:szCs w:val="28"/>
+                <w:lang w:val="en-US"/>
+              </w:rPr>
+            </w:pPr>
+            <w:proofErr w:type="spellStart"/>
+            <w:r>
+              <w:rPr>
+                <w:sz w:val="28"/>
+                <w:szCs w:val="28"/>
+                <w:lang w:val="en-US"/>
+              </w:rPr>
+              <w:lastRenderedPageBreak/>
+              <w:t>IX_Users_Role</w:t>
+            </w:r>
+            <w:proofErr w:type="spellEnd"/>
+          </w:p>
+        </w:tc>
+        <w:tc>
+          <w:tcPr>
+            <w:tcW w:w="3298" w:type="dxa"/>
+          </w:tcPr>
+          <w:p>
+            <w:pPr>
+              <w:jc w:val="both"/>
+              <w:rPr>
+                <w:sz w:val="28"/>
+                <w:szCs w:val="28"/>
+              </w:rPr>
+            </w:pPr>
+            <w:r>
+              <w:rPr>
+                <w:sz w:val="28"/>
+                <w:szCs w:val="28"/>
+              </w:rPr>
+              <w:t>Ускорение поиска пользователя по роли</w:t>
+            </w:r>
+          </w:p>
+        </w:tc>
+        <w:tc>
+          <w:tcPr>
+            <w:tcW w:w="3275" w:type="dxa"/>
+          </w:tcPr>
+          <w:p>
+            <w:pPr>
+              <w:ind w:left="708" w:hanging="708"/>
+              <w:jc w:val="center"/>
+              <w:rPr>
+                <w:sz w:val="28"/>
+                <w:szCs w:val="28"/>
+                <w:lang w:val="en-US"/>
+              </w:rPr>
+            </w:pPr>
+            <w:r>
+              <w:rPr>
+                <w:sz w:val="28"/>
+                <w:szCs w:val="28"/>
+                <w:lang w:val="en-US"/>
+              </w:rPr>
+              <w:t>Users</w:t>
+            </w:r>
+          </w:p>
+        </w:tc>
+      </w:tr>
+      <w:tr>
+        <w:tc>
+          <w:tcPr>
+            <w:tcW w:w="3452" w:type="dxa"/>
+          </w:tcPr>
+          <w:p>
+            <w:pPr>
+              <w:jc w:val="both"/>
+              <w:rPr>
+                <w:sz w:val="28"/>
+                <w:szCs w:val="28"/>
+                <w:lang w:val="en-US"/>
+              </w:rPr>
+            </w:pPr>
+            <w:proofErr w:type="spellStart"/>
+            <w:r>
+              <w:rPr>
+                <w:sz w:val="28"/>
+                <w:szCs w:val="28"/>
+                <w:lang w:val="en-US"/>
+              </w:rPr>
+              <w:t>IX_Products_StockID</w:t>
+            </w:r>
+            <w:proofErr w:type="spellEnd"/>
+          </w:p>
+        </w:tc>
+        <w:tc>
+          <w:tcPr>
+            <w:tcW w:w="3298" w:type="dxa"/>
+          </w:tcPr>
+          <w:p>
+            <w:pPr>
+              <w:jc w:val="both"/>
+              <w:rPr>
+                <w:sz w:val="28"/>
+                <w:szCs w:val="28"/>
+              </w:rPr>
+            </w:pPr>
+            <w:r>
+              <w:rPr>
+                <w:sz w:val="28"/>
+                <w:szCs w:val="28"/>
+              </w:rPr>
+              <w:t>Ускорение поиска товаров, находящихся в определённом стоке</w:t>
+            </w:r>
+          </w:p>
+        </w:tc>
+        <w:tc>
+          <w:tcPr>
+            <w:tcW w:w="3275" w:type="dxa"/>
+          </w:tcPr>
+          <w:p>
+            <w:pPr>
+              <w:ind w:left="708" w:hanging="708"/>
+              <w:jc w:val="center"/>
+              <w:rPr>
+                <w:sz w:val="28"/>
+                <w:szCs w:val="28"/>
+                <w:lang w:val="en-US"/>
+              </w:rPr>
+            </w:pPr>
+            <w:r>
+              <w:rPr>
+                <w:sz w:val="28"/>
+                <w:szCs w:val="28"/>
+                <w:lang w:val="en-US"/>
+              </w:rPr>
+              <w:t>Products</w:t>
+            </w:r>
+          </w:p>
+        </w:tc>
+      </w:tr>
+      <w:tr>
+        <w:tc>
+          <w:tcPr>
+            <w:tcW w:w="3452" w:type="dxa"/>
+          </w:tcPr>
+          <w:p>
+            <w:pPr>
+              <w:jc w:val="both"/>
+              <w:rPr>
+                <w:sz w:val="28"/>
+                <w:szCs w:val="28"/>
+                <w:lang w:val="en-US"/>
+              </w:rPr>
+            </w:pPr>
+            <w:proofErr w:type="spellStart"/>
+            <w:r>
+              <w:rPr>
+                <w:sz w:val="28"/>
+                <w:szCs w:val="28"/>
+                <w:lang w:val="en-US"/>
+              </w:rPr>
+              <w:t>IX_Products_Name</w:t>
+            </w:r>
+            <w:proofErr w:type="spellEnd"/>
+          </w:p>
+        </w:tc>
+        <w:tc>
+          <w:tcPr>
+            <w:tcW w:w="3298" w:type="dxa"/>
+          </w:tcPr>
+          <w:p>
+            <w:pPr>
+              <w:jc w:val="both"/>
+              <w:rPr>
+                <w:sz w:val="28"/>
+                <w:szCs w:val="28"/>
+              </w:rPr>
+            </w:pPr>
+            <w:r>
+              <w:rPr>
+                <w:sz w:val="28"/>
+                <w:szCs w:val="28"/>
+              </w:rPr>
+              <w:t>Ускорение поиска товаров по их наименованию</w:t>
+            </w:r>
+          </w:p>
+        </w:tc>
+        <w:tc>
+          <w:tcPr>
+            <w:tcW w:w="3275" w:type="dxa"/>
+          </w:tcPr>
+          <w:p>
+            <w:pPr>
+              <w:ind w:left="708" w:hanging="708"/>
+              <w:jc w:val="center"/>
+              <w:rPr>
+                <w:sz w:val="28"/>
+                <w:szCs w:val="28"/>
+                <w:lang w:val="en-US"/>
+              </w:rPr>
+            </w:pPr>
+            <w:r>
+              <w:rPr>
+                <w:sz w:val="28"/>
+                <w:szCs w:val="28"/>
+                <w:lang w:val="en-US"/>
+              </w:rPr>
+              <w:t>Products</w:t>
+            </w:r>
+          </w:p>
+        </w:tc>
+      </w:tr>
+      <w:tr>
+        <w:tc>
+          <w:tcPr>
+            <w:tcW w:w="3452" w:type="dxa"/>
+          </w:tcPr>
+          <w:p>
+            <w:pPr>
+              <w:jc w:val="both"/>
+              <w:rPr>
+                <w:sz w:val="28"/>
+                <w:szCs w:val="28"/>
+                <w:lang w:val="en-US"/>
+              </w:rPr>
+            </w:pPr>
+            <w:proofErr w:type="spellStart"/>
+            <w:r>
+              <w:rPr>
+                <w:sz w:val="28"/>
+                <w:szCs w:val="28"/>
+                <w:lang w:val="en-US"/>
+              </w:rPr>
+              <w:t>IX_Tasks_Users_Completed</w:t>
+            </w:r>
+            <w:proofErr w:type="spellEnd"/>
+          </w:p>
+        </w:tc>
+        <w:tc>
+          <w:tcPr>
+            <w:tcW w:w="3298" w:type="dxa"/>
+          </w:tcPr>
+          <w:p>
+            <w:pPr>
+              <w:jc w:val="both"/>
+              <w:rPr>
+                <w:sz w:val="28"/>
+                <w:szCs w:val="28"/>
+              </w:rPr>
+            </w:pPr>
+            <w:r>
+              <w:rPr>
+                <w:sz w:val="28"/>
+                <w:szCs w:val="28"/>
+              </w:rPr>
+              <w:t>Ускорение поиска задач по полю статуса задачи</w:t>
+            </w:r>
+          </w:p>
+        </w:tc>
+        <w:tc>
+          <w:tcPr>
+            <w:tcW w:w="3275" w:type="dxa"/>
+          </w:tcPr>
+          <w:p>
+            <w:pPr>
+              <w:ind w:left="708" w:hanging="708"/>
+              <w:jc w:val="center"/>
+              <w:rPr>
+                <w:sz w:val="28"/>
+                <w:szCs w:val="28"/>
+                <w:lang w:val="en-US"/>
+              </w:rPr>
+            </w:pPr>
+            <w:r>
+              <w:rPr>
+                <w:sz w:val="28"/>
+                <w:szCs w:val="28"/>
+                <w:lang w:val="en-US"/>
+              </w:rPr>
+              <w:t>Tasks</w:t>
+            </w:r>
+          </w:p>
+        </w:tc>
+      </w:tr>
+      <w:tr>
+        <w:tc>
+          <w:tcPr>
+            <w:tcW w:w="3452" w:type="dxa"/>
+          </w:tcPr>
+          <w:p>
+            <w:pPr>
+              <w:jc w:val="both"/>
+              <w:rPr>
+                <w:sz w:val="28"/>
+                <w:szCs w:val="28"/>
+                <w:lang w:val="en-US"/>
+              </w:rPr>
+            </w:pPr>
+            <w:proofErr w:type="spellStart"/>
+            <w:r>
+              <w:rPr>
+                <w:sz w:val="28"/>
+                <w:szCs w:val="28"/>
+                <w:lang w:val="de-DE"/>
+              </w:rPr>
+              <w:t>IX_OrderItems_OrderID</w:t>
+            </w:r>
+            <w:proofErr w:type="spellEnd"/>
+          </w:p>
+        </w:tc>
+        <w:tc>
+          <w:tcPr>
+            <w:tcW w:w="3298" w:type="dxa"/>
+          </w:tcPr>
+          <w:p>
+            <w:pPr>
+              <w:jc w:val="both"/>
+              <w:rPr>
+                <w:sz w:val="28"/>
+                <w:szCs w:val="28"/>
+              </w:rPr>
+            </w:pPr>
+            <w:r>
+              <w:rPr>
+                <w:sz w:val="28"/>
+                <w:szCs w:val="28"/>
+              </w:rPr>
+              <w:t>Ускорение поиска товара по идентификатору заказа</w:t>
+            </w:r>
+          </w:p>
+        </w:tc>
+        <w:tc>
+          <w:tcPr>
+            <w:tcW w:w="3275" w:type="dxa"/>
+          </w:tcPr>
+          <w:p>
+            <w:pPr>
+              <w:ind w:left="708" w:hanging="708"/>
+              <w:jc w:val="center"/>
+              <w:rPr>
+                <w:sz w:val="28"/>
+                <w:szCs w:val="28"/>
+                <w:lang w:val="en-US"/>
+              </w:rPr>
+            </w:pPr>
+            <w:proofErr w:type="spellStart"/>
+            <w:r>
+              <w:rPr>
+                <w:sz w:val="28"/>
+                <w:szCs w:val="28"/>
+                <w:lang w:val="en-US"/>
+              </w:rPr>
+              <w:t>Order_items</w:t>
+            </w:r>
+            <w:proofErr w:type="spellEnd"/>
+          </w:p>
+        </w:tc>
+      </w:tr>
+      <w:tr>
+        <w:tc>
+          <w:tcPr>
+            <w:tcW w:w="3452" w:type="dxa"/>
+          </w:tcPr>
+          <w:p>
+            <w:pPr>
+              <w:jc w:val="both"/>
+              <w:rPr>
+                <w:sz w:val="28"/>
+                <w:szCs w:val="28"/>
+                <w:lang w:val="de-DE"/>
+              </w:rPr>
+            </w:pPr>
+            <w:proofErr w:type="spellStart"/>
+            <w:r>
+              <w:rPr>
+                <w:sz w:val="28"/>
+                <w:szCs w:val="28"/>
+                <w:lang w:val="de-DE"/>
+              </w:rPr>
+              <w:t>IX_OrderItems_ProductID</w:t>
+            </w:r>
+            <w:proofErr w:type="spellEnd"/>
+          </w:p>
+        </w:tc>
+        <w:tc>
+          <w:tcPr>
+            <w:tcW w:w="3298" w:type="dxa"/>
+          </w:tcPr>
+          <w:p>
+            <w:pPr>
+              <w:jc w:val="both"/>
+              <w:rPr>
+                <w:sz w:val="28"/>
+                <w:szCs w:val="28"/>
+              </w:rPr>
+            </w:pPr>
+            <w:r>
+              <w:rPr>
+                <w:sz w:val="28"/>
+                <w:szCs w:val="28"/>
+              </w:rPr>
+              <w:t>Ускорение поиска товара в заказе по идентификатору товара на складе</w:t>
+            </w:r>
+          </w:p>
+        </w:tc>
+        <w:tc>
+          <w:tcPr>
+            <w:tcW w:w="3275" w:type="dxa"/>
+          </w:tcPr>
+          <w:p>
+            <w:pPr>
+              <w:ind w:left="708" w:hanging="708"/>
+              <w:jc w:val="center"/>
+              <w:rPr>
+                <w:sz w:val="28"/>
+                <w:szCs w:val="28"/>
+                <w:lang w:val="en-US"/>
+              </w:rPr>
+            </w:pPr>
+            <w:proofErr w:type="spellStart"/>
+            <w:r>
+              <w:rPr>
+                <w:sz w:val="28"/>
+                <w:szCs w:val="28"/>
+                <w:lang w:val="en-US"/>
+              </w:rPr>
+              <w:t>Order_items</w:t>
+            </w:r>
+            <w:proofErr w:type="spellEnd"/>
+          </w:p>
+        </w:tc>
+      </w:tr>
+    </w:tbl>
+    <w:p>
+      <w:pPr>
+        <w:jc w:val="both"/>
+        <w:rPr>
+          <w:sz w:val="28"/>
+          <w:szCs w:val="28"/>
+        </w:rPr>
+      </w:pPr>
+    </w:p>
+    <w:p>
+      <w:pPr>
+        <w:spacing w:before="240"/>
+        <w:ind w:firstLine="708"/>
+        <w:jc w:val="both"/>
+        <w:rPr>
+          <w:sz w:val="28"/>
+          <w:szCs w:val="28"/>
+        </w:rPr>
+      </w:pPr>
+      <w:r>
+        <w:rPr>
+          <w:sz w:val="28"/>
+          <w:szCs w:val="28"/>
+        </w:rPr>
+        <w:t>Также целесообразно создать триггеры, который могут помочь отслеживать</w:t>
+      </w:r>
+      <w:r>
+        <w:rPr>
+          <w:sz w:val="28"/>
+          <w:szCs w:val="28"/>
+        </w:rPr>
+        <w:t>, например, заполняемость стока товарами или отслеживать иные чувствительные изменения данных в таблицах. Информация о триггерах представлена в таблице 2.11.</w:t>
+      </w:r>
+    </w:p>
+    <w:p>
+      <w:pPr>
+        <w:spacing w:before="240"/>
+        <w:jc w:val="both"/>
+        <w:rPr>
+          <w:sz w:val="28"/>
+          <w:szCs w:val="28"/>
+        </w:rPr>
+      </w:pPr>
+      <w:r>
+        <w:rPr>
+          <w:sz w:val="28"/>
+          <w:szCs w:val="28"/>
+        </w:rPr>
+        <w:t>Таблица 2.11 – Информация о триггерах</w:t>
+      </w:r>
+    </w:p>
+    <w:tbl>
+      <w:tblPr>
+        <w:tblStyle w:val="a7"/>
+        <w:tblW w:w="0" w:type="auto"/>
+        <w:tblLook w:val="04A0" w:firstRow="1" w:lastRow="0" w:firstColumn="1" w:lastColumn="0" w:noHBand="0" w:noVBand="1"/>
+      </w:tblPr>
+      <w:tblGrid>
+        <w:gridCol w:w="3341"/>
+        <w:gridCol w:w="3342"/>
+        <w:gridCol w:w="3342"/>
+      </w:tblGrid>
+      <w:tr>
+        <w:tc>
+          <w:tcPr>
+            <w:tcW w:w="3341" w:type="dxa"/>
+          </w:tcPr>
+          <w:p>
+            <w:pPr>
+              <w:jc w:val="center"/>
+              <w:rPr>
+                <w:sz w:val="28"/>
+                <w:szCs w:val="28"/>
+              </w:rPr>
+            </w:pPr>
+            <w:r>
+              <w:rPr>
+                <w:sz w:val="28"/>
+                <w:szCs w:val="28"/>
+              </w:rPr>
+              <w:t>Наименование</w:t>
+            </w:r>
+          </w:p>
+        </w:tc>
+        <w:tc>
+          <w:tcPr>
+            <w:tcW w:w="3342" w:type="dxa"/>
+          </w:tcPr>
+          <w:p>
+            <w:pPr>
+              <w:jc w:val="center"/>
+              <w:rPr>
+                <w:sz w:val="28"/>
+                <w:szCs w:val="28"/>
+              </w:rPr>
+            </w:pPr>
+            <w:r>
+              <w:rPr>
+                <w:sz w:val="28"/>
+                <w:szCs w:val="28"/>
+              </w:rPr>
+              <w:t>Назначение</w:t>
+            </w:r>
+          </w:p>
+        </w:tc>
+        <w:tc>
+          <w:tcPr>
+            <w:tcW w:w="3342" w:type="dxa"/>
+          </w:tcPr>
+          <w:p>
+            <w:pPr>
+              <w:jc w:val="center"/>
+              <w:rPr>
+                <w:sz w:val="28"/>
+                <w:szCs w:val="28"/>
+              </w:rPr>
+            </w:pPr>
+            <w:r>
+              <w:rPr>
+                <w:sz w:val="28"/>
+                <w:szCs w:val="28"/>
+              </w:rPr>
+              <w:t>Зависимые объекты</w:t>
+            </w:r>
+          </w:p>
+        </w:tc>
+      </w:tr>
+      <w:tr>
+        <w:tc>
+          <w:tcPr>
+            <w:tcW w:w="3341" w:type="dxa"/>
+          </w:tcPr>
+          <w:p>
+            <w:pPr>
+              <w:jc w:val="both"/>
+              <w:rPr>
+                <w:sz w:val="28"/>
+                <w:szCs w:val="28"/>
+              </w:rPr>
+            </w:pPr>
+            <w:proofErr w:type="spellStart"/>
+            <w:r>
+              <w:rPr>
+                <w:rFonts w:eastAsiaTheme="minorHAnsi"/>
+                <w:color w:val="000000"/>
+                <w:sz w:val="28"/>
+                <w:szCs w:val="28"/>
+                <w:lang w:eastAsia="en-US"/>
+              </w:rPr>
+              <w:t>trg_UpdateStockCapacity</w:t>
+            </w:r>
+            <w:proofErr w:type="spellEnd"/>
+          </w:p>
+        </w:tc>
+        <w:tc>
+          <w:tcPr>
+            <w:tcW w:w="3342" w:type="dxa"/>
+          </w:tcPr>
+          <w:p>
+            <w:pPr>
+              <w:jc w:val="both"/>
+              <w:rPr>
+                <w:sz w:val="28"/>
+                <w:szCs w:val="28"/>
+              </w:rPr>
+            </w:pPr>
+            <w:r>
+              <w:rPr>
+                <w:sz w:val="28"/>
+                <w:szCs w:val="28"/>
+              </w:rPr>
+              <w:t>Отслеживание заполняемости стока товарами</w:t>
+            </w:r>
+          </w:p>
+        </w:tc>
+        <w:tc>
+          <w:tcPr>
+            <w:tcW w:w="3342" w:type="dxa"/>
+          </w:tcPr>
+          <w:p>
+            <w:pPr>
+              <w:jc w:val="both"/>
+              <w:rPr>
+                <w:sz w:val="28"/>
+                <w:szCs w:val="28"/>
+              </w:rPr>
+            </w:pPr>
+            <w:r>
+              <w:rPr>
+                <w:sz w:val="28"/>
+                <w:szCs w:val="28"/>
+                <w:lang w:val="en-US"/>
+              </w:rPr>
+              <w:t>Products, Stocks</w:t>
+            </w:r>
+          </w:p>
+        </w:tc>
+      </w:tr>
+    </w:tbl>
+    <w:p>
+      <w:pPr>
+        <w:spacing w:before="240"/>
+        <w:ind w:firstLine="708"/>
+        <w:jc w:val="both"/>
+        <w:rPr>
+          <w:sz w:val="28"/>
+          <w:szCs w:val="28"/>
+        </w:rPr>
+      </w:pPr>
+      <w:r>
+        <w:rPr>
+          <w:sz w:val="28"/>
+          <w:szCs w:val="28"/>
+        </w:rPr>
+        <w:t xml:space="preserve">Наконец, </w:t>
+      </w:r>
+      <w:r>
+        <w:rPr>
+          <w:sz w:val="28"/>
+          <w:szCs w:val="28"/>
+        </w:rPr>
+        <w:t>для выполнения специфических задач, отличных от добавления, изменения и удаления и для другой работы с данными в БД необходимо создать соответствующие процедуры и функции. Информация о них представлена в таблице 2.12.</w:t>
+      </w:r>
+    </w:p>
+    <w:p>
+      <w:pPr>
+        <w:spacing w:before="240"/>
+        <w:jc w:val="both"/>
+        <w:rPr>
+          <w:sz w:val="28"/>
+          <w:szCs w:val="28"/>
+        </w:rPr>
+      </w:pPr>
+      <w:r>
+        <w:rPr>
+          <w:sz w:val="28"/>
+          <w:szCs w:val="28"/>
+        </w:rPr>
+        <w:t>Таблица 2.12 – Информация о процедурах и функциях</w:t>
       </w:r>
     </w:p>
     <w:tbl>
@@ -6958,7 +7721,6 @@
           </w:tcPr>
           <w:p>
             <w:pPr>
-              <w:ind w:left="708" w:hanging="708"/>
               <w:jc w:val="center"/>
               <w:rPr>
                 <w:sz w:val="28"/>
@@ -6980,7 +7742,6 @@
           </w:tcPr>
           <w:p>
             <w:pPr>
-              <w:ind w:left="708" w:hanging="708"/>
               <w:jc w:val="center"/>
               <w:rPr>
                 <w:sz w:val="28"/>
@@ -7002,7 +7763,6 @@
           </w:tcPr>
           <w:p>
             <w:pPr>
-              <w:ind w:left="708" w:hanging="708"/>
               <w:jc w:val="center"/>
               <w:rPr>
                 <w:sz w:val="28"/>
@@ -7024,7 +7784,6 @@
           </w:tcPr>
           <w:p>
             <w:pPr>
-              <w:ind w:left="708" w:hanging="708"/>
               <w:jc w:val="center"/>
               <w:rPr>
                 <w:sz w:val="28"/>
@@ -7036,24 +7795,7 @@
                 <w:sz w:val="28"/>
                 <w:szCs w:val="28"/>
               </w:rPr>
-              <w:t>Зависимые</w:t>
-            </w:r>
-          </w:p>
-          <w:p>
-            <w:pPr>
-              <w:ind w:left="708" w:hanging="708"/>
-              <w:jc w:val="center"/>
-              <w:rPr>
-                <w:sz w:val="28"/>
-                <w:szCs w:val="28"/>
-              </w:rPr>
-            </w:pPr>
-            <w:r>
-              <w:rPr>
-                <w:sz w:val="28"/>
-                <w:szCs w:val="28"/>
-              </w:rPr>
-              <w:t>объекты</w:t>
+              <w:t>Зависимые объекты</w:t>
             </w:r>
           </w:p>
         </w:tc>
@@ -7069,55 +7811,34 @@
               <w:rPr>
                 <w:sz w:val="28"/>
                 <w:szCs w:val="28"/>
-                <w:lang w:val="en-US"/>
-              </w:rPr>
-            </w:pPr>
-            <w:r>
-              <w:rPr>
-                <w:sz w:val="28"/>
-                <w:szCs w:val="28"/>
-                <w:lang w:val="en-US"/>
-              </w:rPr>
-              <w:t>INDEX</w:t>
-            </w:r>
-          </w:p>
-        </w:tc>
-        <w:tc>
-          <w:tcPr>
-            <w:tcW w:w="2506" w:type="dxa"/>
-          </w:tcPr>
-          <w:p>
-            <w:pPr>
-              <w:jc w:val="both"/>
-              <w:rPr>
-                <w:sz w:val="28"/>
-                <w:szCs w:val="28"/>
-                <w:lang w:val="en-US"/>
-              </w:rPr>
-            </w:pPr>
-            <w:proofErr w:type="spellStart"/>
-            <w:r>
-              <w:rPr>
-                <w:sz w:val="28"/>
-                <w:szCs w:val="28"/>
-                <w:lang w:val="en-US"/>
-              </w:rPr>
-              <w:t>IX_Users_Email</w:t>
-            </w:r>
-            <w:proofErr w:type="spellEnd"/>
-          </w:p>
-        </w:tc>
-        <w:tc>
-          <w:tcPr>
-            <w:tcW w:w="2506" w:type="dxa"/>
-          </w:tcPr>
-          <w:p>
-            <w:pPr>
-              <w:jc w:val="both"/>
-              <w:rPr>
-                <w:sz w:val="28"/>
-                <w:szCs w:val="28"/>
-                <w:lang w:val="de-DE"/>
+              </w:rPr>
+            </w:pPr>
+          </w:p>
+        </w:tc>
+        <w:tc>
+          <w:tcPr>
+            <w:tcW w:w="2506" w:type="dxa"/>
+          </w:tcPr>
+          <w:p>
+            <w:pPr>
+              <w:jc w:val="center"/>
+              <w:rPr>
+                <w:sz w:val="28"/>
+                <w:szCs w:val="28"/>
+              </w:rPr>
+            </w:pPr>
+          </w:p>
+        </w:tc>
+        <w:tc>
+          <w:tcPr>
+            <w:tcW w:w="2506" w:type="dxa"/>
+          </w:tcPr>
+          <w:p>
+            <w:pPr>
+              <w:jc w:val="center"/>
+              <w:rPr>
+                <w:sz w:val="28"/>
+                <w:szCs w:val="28"/>
               </w:rPr>
             </w:pPr>
           </w:p>
@@ -7128,239 +7849,7 @@
           </w:tcPr>
           <w:p>
             <w:pPr>
-              <w:jc w:val="both"/>
-              <w:rPr>
-                <w:sz w:val="28"/>
-                <w:szCs w:val="28"/>
-              </w:rPr>
-            </w:pPr>
-          </w:p>
-        </w:tc>
-      </w:tr>
-      <w:tr>
-        <w:tc>
-          <w:tcPr>
-            <w:tcW w:w="2506" w:type="dxa"/>
-          </w:tcPr>
-          <w:p>
-            <w:pPr>
-              <w:jc w:val="both"/>
-              <w:rPr>
-                <w:sz w:val="28"/>
-                <w:szCs w:val="28"/>
-              </w:rPr>
-            </w:pPr>
-          </w:p>
-        </w:tc>
-        <w:tc>
-          <w:tcPr>
-            <w:tcW w:w="2506" w:type="dxa"/>
-          </w:tcPr>
-          <w:p>
-            <w:pPr>
-              <w:jc w:val="both"/>
-              <w:rPr>
-                <w:sz w:val="28"/>
-                <w:szCs w:val="28"/>
-              </w:rPr>
-            </w:pPr>
-          </w:p>
-        </w:tc>
-        <w:tc>
-          <w:tcPr>
-            <w:tcW w:w="2506" w:type="dxa"/>
-          </w:tcPr>
-          <w:p>
-            <w:pPr>
-              <w:jc w:val="both"/>
-              <w:rPr>
-                <w:sz w:val="28"/>
-                <w:szCs w:val="28"/>
-              </w:rPr>
-            </w:pPr>
-          </w:p>
-        </w:tc>
-        <w:tc>
-          <w:tcPr>
-            <w:tcW w:w="2507" w:type="dxa"/>
-          </w:tcPr>
-          <w:p>
-            <w:pPr>
-              <w:jc w:val="both"/>
-              <w:rPr>
-                <w:sz w:val="28"/>
-                <w:szCs w:val="28"/>
-              </w:rPr>
-            </w:pPr>
-          </w:p>
-        </w:tc>
-      </w:tr>
-      <w:tr>
-        <w:tc>
-          <w:tcPr>
-            <w:tcW w:w="2506" w:type="dxa"/>
-          </w:tcPr>
-          <w:p>
-            <w:pPr>
-              <w:jc w:val="both"/>
-              <w:rPr>
-                <w:sz w:val="28"/>
-                <w:szCs w:val="28"/>
-              </w:rPr>
-            </w:pPr>
-          </w:p>
-        </w:tc>
-        <w:tc>
-          <w:tcPr>
-            <w:tcW w:w="2506" w:type="dxa"/>
-          </w:tcPr>
-          <w:p>
-            <w:pPr>
-              <w:jc w:val="both"/>
-              <w:rPr>
-                <w:sz w:val="28"/>
-                <w:szCs w:val="28"/>
-              </w:rPr>
-            </w:pPr>
-          </w:p>
-        </w:tc>
-        <w:tc>
-          <w:tcPr>
-            <w:tcW w:w="2506" w:type="dxa"/>
-          </w:tcPr>
-          <w:p>
-            <w:pPr>
-              <w:jc w:val="both"/>
-              <w:rPr>
-                <w:sz w:val="28"/>
-                <w:szCs w:val="28"/>
-              </w:rPr>
-            </w:pPr>
-          </w:p>
-        </w:tc>
-        <w:tc>
-          <w:tcPr>
-            <w:tcW w:w="2507" w:type="dxa"/>
-          </w:tcPr>
-          <w:p>
-            <w:pPr>
-              <w:jc w:val="both"/>
-              <w:rPr>
-                <w:sz w:val="28"/>
-                <w:szCs w:val="28"/>
-              </w:rPr>
-            </w:pPr>
-          </w:p>
-        </w:tc>
-      </w:tr>
-      <w:tr>
-        <w:tc>
-          <w:tcPr>
-            <w:tcW w:w="2506" w:type="dxa"/>
-          </w:tcPr>
-          <w:p>
-            <w:pPr>
-              <w:jc w:val="both"/>
-              <w:rPr>
-                <w:sz w:val="28"/>
-                <w:szCs w:val="28"/>
-              </w:rPr>
-            </w:pPr>
-          </w:p>
-        </w:tc>
-        <w:tc>
-          <w:tcPr>
-            <w:tcW w:w="2506" w:type="dxa"/>
-          </w:tcPr>
-          <w:p>
-            <w:pPr>
-              <w:jc w:val="both"/>
-              <w:rPr>
-                <w:sz w:val="28"/>
-                <w:szCs w:val="28"/>
-              </w:rPr>
-            </w:pPr>
-          </w:p>
-        </w:tc>
-        <w:tc>
-          <w:tcPr>
-            <w:tcW w:w="2506" w:type="dxa"/>
-          </w:tcPr>
-          <w:p>
-            <w:pPr>
-              <w:jc w:val="both"/>
-              <w:rPr>
-                <w:sz w:val="28"/>
-                <w:szCs w:val="28"/>
-              </w:rPr>
-            </w:pPr>
-          </w:p>
-        </w:tc>
-        <w:tc>
-          <w:tcPr>
-            <w:tcW w:w="2507" w:type="dxa"/>
-          </w:tcPr>
-          <w:p>
-            <w:pPr>
-              <w:jc w:val="both"/>
-              <w:rPr>
-                <w:sz w:val="28"/>
-                <w:szCs w:val="28"/>
-              </w:rPr>
-            </w:pPr>
-          </w:p>
-        </w:tc>
-      </w:tr>
-      <w:tr>
-        <w:tc>
-          <w:tcPr>
-            <w:tcW w:w="2506" w:type="dxa"/>
-          </w:tcPr>
-          <w:p>
-            <w:pPr>
-              <w:jc w:val="both"/>
-              <w:rPr>
-                <w:sz w:val="28"/>
-                <w:szCs w:val="28"/>
-              </w:rPr>
-            </w:pPr>
-          </w:p>
-        </w:tc>
-        <w:tc>
-          <w:tcPr>
-            <w:tcW w:w="2506" w:type="dxa"/>
-          </w:tcPr>
-          <w:p>
-            <w:pPr>
-              <w:jc w:val="both"/>
-              <w:rPr>
-                <w:sz w:val="28"/>
-                <w:szCs w:val="28"/>
-              </w:rPr>
-            </w:pPr>
-          </w:p>
-        </w:tc>
-        <w:tc>
-          <w:tcPr>
-            <w:tcW w:w="2506" w:type="dxa"/>
-          </w:tcPr>
-          <w:p>
-            <w:pPr>
-              <w:jc w:val="both"/>
-              <w:rPr>
-                <w:sz w:val="28"/>
-                <w:szCs w:val="28"/>
-              </w:rPr>
-            </w:pPr>
-          </w:p>
-        </w:tc>
-        <w:tc>
-          <w:tcPr>
-            <w:tcW w:w="2507" w:type="dxa"/>
-          </w:tcPr>
-          <w:p>
-            <w:pPr>
-              <w:jc w:val="both"/>
+              <w:jc w:val="center"/>
               <w:rPr>
                 <w:sz w:val="28"/>
                 <w:szCs w:val="28"/>

</xml_diff>

<commit_message>
IADB:lab2 in progress. functions added
</commit_message>
<xml_diff>
--- a/IADB/Code/Lab_2/Report.docx
+++ b/IADB/Code/Lab_2/Report.docx
@@ -442,25 +442,7 @@
           <w:sz w:val="28"/>
           <w:szCs w:val="28"/>
         </w:rPr>
-        <w:t xml:space="preserve">Преподаватель: </w:t>
-      </w:r>
-      <w:proofErr w:type="spellStart"/>
-      <w:r>
-        <w:rPr>
-          <w:color w:val="000000"/>
-          <w:sz w:val="28"/>
-          <w:szCs w:val="28"/>
-        </w:rPr>
-        <w:t>Нистюк</w:t>
-      </w:r>
-      <w:proofErr w:type="spellEnd"/>
-      <w:r>
-        <w:rPr>
-          <w:color w:val="000000"/>
-          <w:sz w:val="28"/>
-          <w:szCs w:val="28"/>
-        </w:rPr>
-        <w:t xml:space="preserve"> О.А.</w:t>
+        <w:t>Преподаватель: Нистюк О.А.</w:t>
       </w:r>
     </w:p>
     <w:p>
@@ -887,7 +869,6 @@
                 <w:lang w:val="en-US"/>
               </w:rPr>
             </w:pPr>
-            <w:proofErr w:type="spellStart"/>
             <w:r>
               <w:rPr>
                 <w:sz w:val="28"/>
@@ -896,7 +877,6 @@
               </w:rPr>
               <w:t>Stock_ID</w:t>
             </w:r>
-            <w:proofErr w:type="spellEnd"/>
           </w:p>
         </w:tc>
         <w:tc>
@@ -1073,7 +1053,6 @@
                 <w:lang w:val="en-US"/>
               </w:rPr>
             </w:pPr>
-            <w:proofErr w:type="spellStart"/>
             <w:r>
               <w:rPr>
                 <w:sz w:val="28"/>
@@ -1082,7 +1061,6 @@
               </w:rPr>
               <w:t>Filled_part</w:t>
             </w:r>
-            <w:proofErr w:type="spellEnd"/>
           </w:p>
         </w:tc>
         <w:tc>
@@ -1208,33 +1186,13 @@
                 <w:lang w:val="en-US"/>
               </w:rPr>
             </w:pPr>
-            <w:proofErr w:type="spellStart"/>
-            <w:proofErr w:type="gramStart"/>
-            <w:r>
-              <w:rPr>
-                <w:sz w:val="28"/>
-                <w:szCs w:val="28"/>
-                <w:lang w:val="en-US"/>
-              </w:rPr>
-              <w:t>Nvarchar</w:t>
-            </w:r>
-            <w:proofErr w:type="spellEnd"/>
-            <w:r>
-              <w:rPr>
-                <w:sz w:val="28"/>
-                <w:szCs w:val="28"/>
-                <w:lang w:val="en-US"/>
-              </w:rPr>
-              <w:t>(</w:t>
-            </w:r>
-            <w:proofErr w:type="gramEnd"/>
-            <w:r>
-              <w:rPr>
-                <w:sz w:val="28"/>
-                <w:szCs w:val="28"/>
-                <w:lang w:val="en-US"/>
-              </w:rPr>
-              <w:t>100)</w:t>
+            <w:r>
+              <w:rPr>
+                <w:sz w:val="28"/>
+                <w:szCs w:val="28"/>
+                <w:lang w:val="en-US"/>
+              </w:rPr>
+              <w:t>Nvarchar(100)</w:t>
             </w:r>
           </w:p>
         </w:tc>
@@ -1465,7 +1423,6 @@
                 <w:lang w:val="en-US"/>
               </w:rPr>
             </w:pPr>
-            <w:proofErr w:type="spellStart"/>
             <w:r>
               <w:rPr>
                 <w:sz w:val="28"/>
@@ -1474,7 +1431,6 @@
               </w:rPr>
               <w:t>User_ID</w:t>
             </w:r>
-            <w:proofErr w:type="spellEnd"/>
           </w:p>
         </w:tc>
         <w:tc>
@@ -1582,23 +1538,13 @@
                 <w:lang w:val="en-US"/>
               </w:rPr>
             </w:pPr>
-            <w:proofErr w:type="gramStart"/>
-            <w:r>
-              <w:rPr>
-                <w:sz w:val="28"/>
-                <w:szCs w:val="28"/>
-                <w:lang w:val="en-US"/>
-              </w:rPr>
-              <w:t>VARCHAR(</w:t>
-            </w:r>
-            <w:proofErr w:type="gramEnd"/>
-            <w:r>
-              <w:rPr>
-                <w:sz w:val="28"/>
-                <w:szCs w:val="28"/>
-                <w:lang w:val="en-US"/>
-              </w:rPr>
-              <w:t>255)</w:t>
+            <w:r>
+              <w:rPr>
+                <w:sz w:val="28"/>
+                <w:szCs w:val="28"/>
+                <w:lang w:val="en-US"/>
+              </w:rPr>
+              <w:t>VARCHAR(255)</w:t>
             </w:r>
           </w:p>
         </w:tc>
@@ -1684,23 +1630,13 @@
                 <w:lang w:val="en-US"/>
               </w:rPr>
             </w:pPr>
-            <w:proofErr w:type="gramStart"/>
-            <w:r>
-              <w:rPr>
-                <w:sz w:val="28"/>
-                <w:szCs w:val="28"/>
-                <w:lang w:val="en-US"/>
-              </w:rPr>
-              <w:t>VARCHAR(</w:t>
-            </w:r>
-            <w:proofErr w:type="gramEnd"/>
-            <w:r>
-              <w:rPr>
-                <w:sz w:val="28"/>
-                <w:szCs w:val="28"/>
-                <w:lang w:val="en-US"/>
-              </w:rPr>
-              <w:t>30)</w:t>
+            <w:r>
+              <w:rPr>
+                <w:sz w:val="28"/>
+                <w:szCs w:val="28"/>
+                <w:lang w:val="en-US"/>
+              </w:rPr>
+              <w:t>VARCHAR(30)</w:t>
             </w:r>
           </w:p>
         </w:tc>
@@ -1905,7 +1841,6 @@
                 <w:lang w:val="en-US"/>
               </w:rPr>
             </w:pPr>
-            <w:proofErr w:type="spellStart"/>
             <w:r>
               <w:rPr>
                 <w:sz w:val="28"/>
@@ -1914,7 +1849,6 @@
               </w:rPr>
               <w:t>Created_at</w:t>
             </w:r>
-            <w:proofErr w:type="spellEnd"/>
           </w:p>
         </w:tc>
         <w:tc>
@@ -1957,25 +1891,7 @@
                 <w:szCs w:val="28"/>
                 <w:lang w:val="en-US"/>
               </w:rPr>
-              <w:t xml:space="preserve">Default, </w:t>
-            </w:r>
-            <w:proofErr w:type="gramStart"/>
-            <w:r>
-              <w:rPr>
-                <w:sz w:val="28"/>
-                <w:szCs w:val="28"/>
-                <w:lang w:val="en-US"/>
-              </w:rPr>
-              <w:t>GETDATE(</w:t>
-            </w:r>
-            <w:proofErr w:type="gramEnd"/>
-            <w:r>
-              <w:rPr>
-                <w:sz w:val="28"/>
-                <w:szCs w:val="28"/>
-                <w:lang w:val="en-US"/>
-              </w:rPr>
-              <w:t>)</w:t>
+              <w:t>Default, GETDATE()</w:t>
             </w:r>
           </w:p>
         </w:tc>
@@ -2013,7 +1929,6 @@
                 <w:lang w:val="en-US"/>
               </w:rPr>
             </w:pPr>
-            <w:proofErr w:type="spellStart"/>
             <w:r>
               <w:rPr>
                 <w:sz w:val="28"/>
@@ -2022,38 +1937,27 @@
               </w:rPr>
               <w:t>Password_hash</w:t>
             </w:r>
-            <w:proofErr w:type="spellEnd"/>
-          </w:p>
-        </w:tc>
-        <w:tc>
-          <w:tcPr>
-            <w:tcW w:w="2506" w:type="dxa"/>
-          </w:tcPr>
-          <w:p>
-            <w:pPr>
-              <w:rPr>
-                <w:sz w:val="28"/>
-                <w:szCs w:val="28"/>
-                <w:lang w:val="en-US"/>
-              </w:rPr>
-            </w:pPr>
-            <w:proofErr w:type="gramStart"/>
-            <w:r>
-              <w:rPr>
-                <w:sz w:val="28"/>
-                <w:szCs w:val="28"/>
-                <w:lang w:val="en-US"/>
-              </w:rPr>
-              <w:t>VARBINARY(</w:t>
-            </w:r>
-            <w:proofErr w:type="gramEnd"/>
-            <w:r>
-              <w:rPr>
-                <w:sz w:val="28"/>
-                <w:szCs w:val="28"/>
-                <w:lang w:val="en-US"/>
-              </w:rPr>
-              <w:t>64)</w:t>
+          </w:p>
+        </w:tc>
+        <w:tc>
+          <w:tcPr>
+            <w:tcW w:w="2506" w:type="dxa"/>
+          </w:tcPr>
+          <w:p>
+            <w:pPr>
+              <w:rPr>
+                <w:sz w:val="28"/>
+                <w:szCs w:val="28"/>
+                <w:lang w:val="en-US"/>
+              </w:rPr>
+            </w:pPr>
+            <w:r>
+              <w:rPr>
+                <w:sz w:val="28"/>
+                <w:szCs w:val="28"/>
+                <w:lang w:val="en-US"/>
+              </w:rPr>
+              <w:t>VARBINARY(64)</w:t>
             </w:r>
           </w:p>
         </w:tc>
@@ -2281,7 +2185,6 @@
                 <w:lang w:val="en-US"/>
               </w:rPr>
             </w:pPr>
-            <w:proofErr w:type="spellStart"/>
             <w:r>
               <w:rPr>
                 <w:sz w:val="28"/>
@@ -2290,7 +2193,6 @@
               </w:rPr>
               <w:t>Product_ID</w:t>
             </w:r>
-            <w:proofErr w:type="spellEnd"/>
           </w:p>
         </w:tc>
         <w:tc>
@@ -2371,7 +2273,6 @@
                 <w:lang w:val="en-US"/>
               </w:rPr>
             </w:pPr>
-            <w:proofErr w:type="spellStart"/>
             <w:r>
               <w:rPr>
                 <w:sz w:val="28"/>
@@ -2380,7 +2281,6 @@
               </w:rPr>
               <w:t>Stock_ID</w:t>
             </w:r>
-            <w:proofErr w:type="spellEnd"/>
           </w:p>
         </w:tc>
         <w:tc>
@@ -2423,25 +2323,7 @@
                 <w:szCs w:val="28"/>
                 <w:lang w:val="en-US"/>
               </w:rPr>
-              <w:t xml:space="preserve">Not null, </w:t>
-            </w:r>
-            <w:proofErr w:type="gramStart"/>
-            <w:r>
-              <w:rPr>
-                <w:sz w:val="28"/>
-                <w:szCs w:val="28"/>
-                <w:lang w:val="en-US"/>
-              </w:rPr>
-              <w:t>Foreign</w:t>
-            </w:r>
-            <w:proofErr w:type="gramEnd"/>
-            <w:r>
-              <w:rPr>
-                <w:sz w:val="28"/>
-                <w:szCs w:val="28"/>
-                <w:lang w:val="en-US"/>
-              </w:rPr>
-              <w:t xml:space="preserve"> key</w:t>
+              <w:t>Not null, Foreign key</w:t>
             </w:r>
           </w:p>
         </w:tc>
@@ -2501,23 +2383,13 @@
                 <w:lang w:val="en-US"/>
               </w:rPr>
             </w:pPr>
-            <w:proofErr w:type="gramStart"/>
-            <w:r>
-              <w:rPr>
-                <w:sz w:val="28"/>
-                <w:szCs w:val="28"/>
-                <w:lang w:val="en-US"/>
-              </w:rPr>
-              <w:t>NVARCHAR(</w:t>
-            </w:r>
-            <w:proofErr w:type="gramEnd"/>
-            <w:r>
-              <w:rPr>
-                <w:sz w:val="28"/>
-                <w:szCs w:val="28"/>
-                <w:lang w:val="en-US"/>
-              </w:rPr>
-              <w:t>200)</w:t>
+            <w:r>
+              <w:rPr>
+                <w:sz w:val="28"/>
+                <w:szCs w:val="28"/>
+                <w:lang w:val="en-US"/>
+              </w:rPr>
+              <w:t>NVARCHAR(200)</w:t>
             </w:r>
           </w:p>
         </w:tc>
@@ -2599,23 +2471,13 @@
                 <w:lang w:val="en-US"/>
               </w:rPr>
             </w:pPr>
-            <w:proofErr w:type="gramStart"/>
-            <w:r>
-              <w:rPr>
-                <w:sz w:val="28"/>
-                <w:szCs w:val="28"/>
-                <w:lang w:val="en-US"/>
-              </w:rPr>
-              <w:t>DECIMAL(</w:t>
-            </w:r>
-            <w:proofErr w:type="gramEnd"/>
-            <w:r>
-              <w:rPr>
-                <w:sz w:val="28"/>
-                <w:szCs w:val="28"/>
-                <w:lang w:val="en-US"/>
-              </w:rPr>
-              <w:t>19,4)</w:t>
+            <w:r>
+              <w:rPr>
+                <w:sz w:val="28"/>
+                <w:szCs w:val="28"/>
+                <w:lang w:val="en-US"/>
+              </w:rPr>
+              <w:t>DECIMAL(19,4)</w:t>
             </w:r>
           </w:p>
         </w:tc>
@@ -2931,7 +2793,6 @@
                 <w:lang w:val="en-US"/>
               </w:rPr>
             </w:pPr>
-            <w:proofErr w:type="spellStart"/>
             <w:r>
               <w:rPr>
                 <w:sz w:val="28"/>
@@ -2940,7 +2801,6 @@
               </w:rPr>
               <w:t>Task_ID</w:t>
             </w:r>
-            <w:proofErr w:type="spellEnd"/>
           </w:p>
         </w:tc>
         <w:tc>
@@ -3025,7 +2885,6 @@
                 <w:lang w:val="en-US"/>
               </w:rPr>
             </w:pPr>
-            <w:proofErr w:type="spellStart"/>
             <w:r>
               <w:rPr>
                 <w:sz w:val="28"/>
@@ -3034,7 +2893,6 @@
               </w:rPr>
               <w:t>User_ID</w:t>
             </w:r>
-            <w:proofErr w:type="spellEnd"/>
           </w:p>
         </w:tc>
         <w:tc>
@@ -3119,7 +2977,6 @@
                 <w:lang w:val="en-US"/>
               </w:rPr>
             </w:pPr>
-            <w:proofErr w:type="spellStart"/>
             <w:r>
               <w:rPr>
                 <w:sz w:val="28"/>
@@ -3128,7 +2985,6 @@
               </w:rPr>
               <w:t>Due_date</w:t>
             </w:r>
-            <w:proofErr w:type="spellEnd"/>
           </w:p>
         </w:tc>
         <w:tc>
@@ -3447,7 +3303,6 @@
                 <w:lang w:val="en-US"/>
               </w:rPr>
             </w:pPr>
-            <w:proofErr w:type="spellStart"/>
             <w:r>
               <w:rPr>
                 <w:sz w:val="28"/>
@@ -3456,7 +3311,6 @@
               </w:rPr>
               <w:t>Is_completed</w:t>
             </w:r>
-            <w:proofErr w:type="spellEnd"/>
           </w:p>
         </w:tc>
         <w:tc>
@@ -3573,23 +3427,13 @@
                 <w:lang w:val="en-US"/>
               </w:rPr>
             </w:pPr>
-            <w:proofErr w:type="gramStart"/>
-            <w:r>
-              <w:rPr>
-                <w:sz w:val="28"/>
-                <w:szCs w:val="28"/>
-                <w:lang w:val="en-US"/>
-              </w:rPr>
-              <w:t>VARCHAR(</w:t>
-            </w:r>
-            <w:proofErr w:type="gramEnd"/>
-            <w:r>
-              <w:rPr>
-                <w:sz w:val="28"/>
-                <w:szCs w:val="28"/>
-                <w:lang w:val="en-US"/>
-              </w:rPr>
-              <w:t>30)</w:t>
+            <w:r>
+              <w:rPr>
+                <w:sz w:val="28"/>
+                <w:szCs w:val="28"/>
+                <w:lang w:val="en-US"/>
+              </w:rPr>
+              <w:t>VARCHAR(30)</w:t>
             </w:r>
           </w:p>
         </w:tc>
@@ -3820,7 +3664,6 @@
                 <w:lang w:val="en-US"/>
               </w:rPr>
             </w:pPr>
-            <w:proofErr w:type="spellStart"/>
             <w:r>
               <w:rPr>
                 <w:sz w:val="28"/>
@@ -3829,7 +3672,6 @@
               </w:rPr>
               <w:t>Order_ID</w:t>
             </w:r>
-            <w:proofErr w:type="spellEnd"/>
           </w:p>
         </w:tc>
         <w:tc>
@@ -3914,7 +3756,6 @@
                 <w:lang w:val="en-US"/>
               </w:rPr>
             </w:pPr>
-            <w:proofErr w:type="spellStart"/>
             <w:r>
               <w:rPr>
                 <w:sz w:val="28"/>
@@ -3923,7 +3764,6 @@
               </w:rPr>
               <w:t>Order_date</w:t>
             </w:r>
-            <w:proofErr w:type="spellEnd"/>
           </w:p>
         </w:tc>
         <w:tc>
@@ -4008,7 +3848,6 @@
                 <w:lang w:val="en-US"/>
               </w:rPr>
             </w:pPr>
-            <w:proofErr w:type="spellStart"/>
             <w:r>
               <w:rPr>
                 <w:sz w:val="28"/>
@@ -4017,39 +3856,28 @@
               </w:rPr>
               <w:t>Order_status</w:t>
             </w:r>
-            <w:proofErr w:type="spellEnd"/>
-          </w:p>
-        </w:tc>
-        <w:tc>
-          <w:tcPr>
-            <w:tcW w:w="2506" w:type="dxa"/>
-          </w:tcPr>
-          <w:p>
-            <w:pPr>
-              <w:jc w:val="both"/>
-              <w:rPr>
-                <w:sz w:val="28"/>
-                <w:szCs w:val="28"/>
-                <w:lang w:val="en-US"/>
-              </w:rPr>
-            </w:pPr>
-            <w:proofErr w:type="gramStart"/>
-            <w:r>
-              <w:rPr>
-                <w:sz w:val="28"/>
-                <w:szCs w:val="28"/>
-                <w:lang w:val="en-US"/>
-              </w:rPr>
-              <w:t>VARCHAR(</w:t>
-            </w:r>
-            <w:proofErr w:type="gramEnd"/>
-            <w:r>
-              <w:rPr>
-                <w:sz w:val="28"/>
-                <w:szCs w:val="28"/>
-                <w:lang w:val="en-US"/>
-              </w:rPr>
-              <w:t>50)</w:t>
+          </w:p>
+        </w:tc>
+        <w:tc>
+          <w:tcPr>
+            <w:tcW w:w="2506" w:type="dxa"/>
+          </w:tcPr>
+          <w:p>
+            <w:pPr>
+              <w:jc w:val="both"/>
+              <w:rPr>
+                <w:sz w:val="28"/>
+                <w:szCs w:val="28"/>
+                <w:lang w:val="en-US"/>
+              </w:rPr>
+            </w:pPr>
+            <w:r>
+              <w:rPr>
+                <w:sz w:val="28"/>
+                <w:szCs w:val="28"/>
+                <w:lang w:val="en-US"/>
+              </w:rPr>
+              <w:t>VARCHAR(50)</w:t>
             </w:r>
           </w:p>
         </w:tc>
@@ -4112,7 +3940,6 @@
                 <w:lang w:val="en-US"/>
               </w:rPr>
             </w:pPr>
-            <w:proofErr w:type="spellStart"/>
             <w:r>
               <w:rPr>
                 <w:sz w:val="28"/>
@@ -4121,39 +3948,28 @@
               </w:rPr>
               <w:t>Total_amount</w:t>
             </w:r>
-            <w:proofErr w:type="spellEnd"/>
-          </w:p>
-        </w:tc>
-        <w:tc>
-          <w:tcPr>
-            <w:tcW w:w="2506" w:type="dxa"/>
-          </w:tcPr>
-          <w:p>
-            <w:pPr>
-              <w:jc w:val="both"/>
-              <w:rPr>
-                <w:sz w:val="28"/>
-                <w:szCs w:val="28"/>
-                <w:lang w:val="en-US"/>
-              </w:rPr>
-            </w:pPr>
-            <w:proofErr w:type="gramStart"/>
-            <w:r>
-              <w:rPr>
-                <w:sz w:val="28"/>
-                <w:szCs w:val="28"/>
-                <w:lang w:val="en-US"/>
-              </w:rPr>
-              <w:t>DECIMAL(</w:t>
-            </w:r>
-            <w:proofErr w:type="gramEnd"/>
-            <w:r>
-              <w:rPr>
-                <w:sz w:val="28"/>
-                <w:szCs w:val="28"/>
-                <w:lang w:val="en-US"/>
-              </w:rPr>
-              <w:t>19,4)</w:t>
+          </w:p>
+        </w:tc>
+        <w:tc>
+          <w:tcPr>
+            <w:tcW w:w="2506" w:type="dxa"/>
+          </w:tcPr>
+          <w:p>
+            <w:pPr>
+              <w:jc w:val="both"/>
+              <w:rPr>
+                <w:sz w:val="28"/>
+                <w:szCs w:val="28"/>
+                <w:lang w:val="en-US"/>
+              </w:rPr>
+            </w:pPr>
+            <w:r>
+              <w:rPr>
+                <w:sz w:val="28"/>
+                <w:szCs w:val="28"/>
+                <w:lang w:val="en-US"/>
+              </w:rPr>
+              <w:t>DECIMAL(19,4)</w:t>
             </w:r>
           </w:p>
         </w:tc>
@@ -4435,7 +4251,6 @@
                 <w:lang w:val="en-US"/>
               </w:rPr>
             </w:pPr>
-            <w:proofErr w:type="spellStart"/>
             <w:r>
               <w:rPr>
                 <w:sz w:val="28"/>
@@ -4444,7 +4259,6 @@
               </w:rPr>
               <w:t>Item_ID</w:t>
             </w:r>
-            <w:proofErr w:type="spellEnd"/>
           </w:p>
         </w:tc>
         <w:tc>
@@ -4529,7 +4343,6 @@
                 <w:lang w:val="en-US"/>
               </w:rPr>
             </w:pPr>
-            <w:proofErr w:type="spellStart"/>
             <w:r>
               <w:rPr>
                 <w:sz w:val="28"/>
@@ -4538,7 +4351,6 @@
               </w:rPr>
               <w:t>Order_ID</w:t>
             </w:r>
-            <w:proofErr w:type="spellEnd"/>
           </w:p>
         </w:tc>
         <w:tc>
@@ -4623,7 +4435,6 @@
                 <w:lang w:val="en-US"/>
               </w:rPr>
             </w:pPr>
-            <w:proofErr w:type="spellStart"/>
             <w:r>
               <w:rPr>
                 <w:sz w:val="28"/>
@@ -4632,7 +4443,6 @@
               </w:rPr>
               <w:t>Product_ID</w:t>
             </w:r>
-            <w:proofErr w:type="spellEnd"/>
           </w:p>
         </w:tc>
         <w:tc>
@@ -5122,7 +4932,6 @@
                 <w:lang w:val="en-US"/>
               </w:rPr>
             </w:pPr>
-            <w:proofErr w:type="spellStart"/>
             <w:r>
               <w:rPr>
                 <w:sz w:val="28"/>
@@ -5131,7 +4940,6 @@
               </w:rPr>
               <w:t>Pack_ID</w:t>
             </w:r>
-            <w:proofErr w:type="spellEnd"/>
           </w:p>
         </w:tc>
         <w:tc>
@@ -5216,7 +5024,6 @@
                 <w:lang w:val="en-US"/>
               </w:rPr>
             </w:pPr>
-            <w:proofErr w:type="spellStart"/>
             <w:r>
               <w:rPr>
                 <w:sz w:val="28"/>
@@ -5225,7 +5032,6 @@
               </w:rPr>
               <w:t>User_ID</w:t>
             </w:r>
-            <w:proofErr w:type="spellEnd"/>
           </w:p>
         </w:tc>
         <w:tc>
@@ -5310,7 +5116,6 @@
                 <w:lang w:val="en-US"/>
               </w:rPr>
             </w:pPr>
-            <w:proofErr w:type="spellStart"/>
             <w:r>
               <w:rPr>
                 <w:sz w:val="28"/>
@@ -5319,7 +5124,6 @@
               </w:rPr>
               <w:t>Order_ID</w:t>
             </w:r>
-            <w:proofErr w:type="spellEnd"/>
           </w:p>
         </w:tc>
         <w:tc>
@@ -5404,7 +5208,6 @@
                 <w:lang w:val="en-US"/>
               </w:rPr>
             </w:pPr>
-            <w:proofErr w:type="spellStart"/>
             <w:r>
               <w:rPr>
                 <w:sz w:val="28"/>
@@ -5413,7 +5216,6 @@
               </w:rPr>
               <w:t>Pack_date</w:t>
             </w:r>
-            <w:proofErr w:type="spellEnd"/>
           </w:p>
         </w:tc>
         <w:tc>
@@ -5498,7 +5300,6 @@
                 <w:lang w:val="en-US"/>
               </w:rPr>
             </w:pPr>
-            <w:proofErr w:type="spellStart"/>
             <w:r>
               <w:rPr>
                 <w:sz w:val="28"/>
@@ -5507,39 +5308,28 @@
               </w:rPr>
               <w:t>Pack_status</w:t>
             </w:r>
-            <w:proofErr w:type="spellEnd"/>
-          </w:p>
-        </w:tc>
-        <w:tc>
-          <w:tcPr>
-            <w:tcW w:w="2506" w:type="dxa"/>
-          </w:tcPr>
-          <w:p>
-            <w:pPr>
-              <w:jc w:val="both"/>
-              <w:rPr>
-                <w:sz w:val="28"/>
-                <w:szCs w:val="28"/>
-                <w:lang w:val="en-US"/>
-              </w:rPr>
-            </w:pPr>
-            <w:proofErr w:type="gramStart"/>
-            <w:r>
-              <w:rPr>
-                <w:sz w:val="28"/>
-                <w:szCs w:val="28"/>
-                <w:lang w:val="en-US"/>
-              </w:rPr>
-              <w:t>VARCHAR(</w:t>
-            </w:r>
-            <w:proofErr w:type="gramEnd"/>
-            <w:r>
-              <w:rPr>
-                <w:sz w:val="28"/>
-                <w:szCs w:val="28"/>
-                <w:lang w:val="en-US"/>
-              </w:rPr>
-              <w:t>50)</w:t>
+          </w:p>
+        </w:tc>
+        <w:tc>
+          <w:tcPr>
+            <w:tcW w:w="2506" w:type="dxa"/>
+          </w:tcPr>
+          <w:p>
+            <w:pPr>
+              <w:jc w:val="both"/>
+              <w:rPr>
+                <w:sz w:val="28"/>
+                <w:szCs w:val="28"/>
+                <w:lang w:val="en-US"/>
+              </w:rPr>
+            </w:pPr>
+            <w:r>
+              <w:rPr>
+                <w:sz w:val="28"/>
+                <w:szCs w:val="28"/>
+                <w:lang w:val="en-US"/>
+              </w:rPr>
+              <w:t>VARCHAR(50)</w:t>
             </w:r>
           </w:p>
         </w:tc>
@@ -5822,7 +5612,6 @@
                 <w:lang w:val="en-US"/>
               </w:rPr>
             </w:pPr>
-            <w:proofErr w:type="spellStart"/>
             <w:r>
               <w:rPr>
                 <w:sz w:val="28"/>
@@ -5831,7 +5620,6 @@
               </w:rPr>
               <w:t>Item_ID</w:t>
             </w:r>
-            <w:proofErr w:type="spellEnd"/>
           </w:p>
         </w:tc>
         <w:tc>
@@ -5916,7 +5704,6 @@
                 <w:lang w:val="en-US"/>
               </w:rPr>
             </w:pPr>
-            <w:proofErr w:type="spellStart"/>
             <w:r>
               <w:rPr>
                 <w:sz w:val="28"/>
@@ -5925,7 +5712,6 @@
               </w:rPr>
               <w:t>Pack_ID</w:t>
             </w:r>
-            <w:proofErr w:type="spellEnd"/>
           </w:p>
         </w:tc>
         <w:tc>
@@ -6241,7 +6027,6 @@
                 <w:lang w:val="en-US"/>
               </w:rPr>
             </w:pPr>
-            <w:proofErr w:type="spellStart"/>
             <w:r>
               <w:rPr>
                 <w:sz w:val="28"/>
@@ -6250,39 +6035,28 @@
               </w:rPr>
               <w:t>Unit_price</w:t>
             </w:r>
-            <w:proofErr w:type="spellEnd"/>
-          </w:p>
-        </w:tc>
-        <w:tc>
-          <w:tcPr>
-            <w:tcW w:w="2506" w:type="dxa"/>
-          </w:tcPr>
-          <w:p>
-            <w:pPr>
-              <w:jc w:val="both"/>
-              <w:rPr>
-                <w:sz w:val="28"/>
-                <w:szCs w:val="28"/>
-                <w:lang w:val="en-US"/>
-              </w:rPr>
-            </w:pPr>
-            <w:proofErr w:type="gramStart"/>
-            <w:r>
-              <w:rPr>
-                <w:sz w:val="28"/>
-                <w:szCs w:val="28"/>
-                <w:lang w:val="en-US"/>
-              </w:rPr>
-              <w:t>DECIMAL(</w:t>
-            </w:r>
-            <w:proofErr w:type="gramEnd"/>
-            <w:r>
-              <w:rPr>
-                <w:sz w:val="28"/>
-                <w:szCs w:val="28"/>
-                <w:lang w:val="en-US"/>
-              </w:rPr>
-              <w:t>19,4)</w:t>
+          </w:p>
+        </w:tc>
+        <w:tc>
+          <w:tcPr>
+            <w:tcW w:w="2506" w:type="dxa"/>
+          </w:tcPr>
+          <w:p>
+            <w:pPr>
+              <w:jc w:val="both"/>
+              <w:rPr>
+                <w:sz w:val="28"/>
+                <w:szCs w:val="28"/>
+                <w:lang w:val="en-US"/>
+              </w:rPr>
+            </w:pPr>
+            <w:r>
+              <w:rPr>
+                <w:sz w:val="28"/>
+                <w:szCs w:val="28"/>
+                <w:lang w:val="en-US"/>
+              </w:rPr>
+              <w:t>DECIMAL(19,4)</w:t>
             </w:r>
           </w:p>
         </w:tc>
@@ -6345,7 +6119,6 @@
                 <w:lang w:val="en-US"/>
               </w:rPr>
             </w:pPr>
-            <w:proofErr w:type="spellStart"/>
             <w:r>
               <w:rPr>
                 <w:sz w:val="28"/>
@@ -6362,7 +6135,6 @@
               </w:rPr>
               <w:t>s</w:t>
             </w:r>
-            <w:proofErr w:type="spellEnd"/>
           </w:p>
         </w:tc>
         <w:tc>
@@ -6620,7 +6392,6 @@
                 <w:szCs w:val="28"/>
               </w:rPr>
             </w:pPr>
-            <w:proofErr w:type="spellStart"/>
             <w:r>
               <w:rPr>
                 <w:sz w:val="28"/>
@@ -6629,7 +6400,6 @@
               </w:rPr>
               <w:t>CompletedOperatorTasks</w:t>
             </w:r>
-            <w:proofErr w:type="spellEnd"/>
           </w:p>
         </w:tc>
         <w:tc>
@@ -6690,7 +6460,6 @@
                 <w:lang w:val="en-US"/>
               </w:rPr>
             </w:pPr>
-            <w:proofErr w:type="spellStart"/>
             <w:r>
               <w:rPr>
                 <w:sz w:val="28"/>
@@ -6699,7 +6468,6 @@
               </w:rPr>
               <w:t>MonthlyFinancialSummary</w:t>
             </w:r>
-            <w:proofErr w:type="spellEnd"/>
           </w:p>
         </w:tc>
         <w:tc>
@@ -6742,18 +6510,8 @@
                 <w:szCs w:val="28"/>
                 <w:lang w:val="en-US"/>
               </w:rPr>
-              <w:t xml:space="preserve">Products, Pack, </w:t>
-            </w:r>
-            <w:proofErr w:type="spellStart"/>
-            <w:r>
-              <w:rPr>
-                <w:sz w:val="28"/>
-                <w:szCs w:val="28"/>
-                <w:lang w:val="en-US"/>
-              </w:rPr>
-              <w:t>Pack_items</w:t>
-            </w:r>
-            <w:proofErr w:type="spellEnd"/>
+              <w:t>Products, Pack, Pack_items</w:t>
+            </w:r>
           </w:p>
         </w:tc>
       </w:tr>
@@ -6966,7 +6724,6 @@
                 <w:szCs w:val="28"/>
               </w:rPr>
             </w:pPr>
-            <w:proofErr w:type="spellStart"/>
             <w:r>
               <w:rPr>
                 <w:sz w:val="28"/>
@@ -6975,7 +6732,6 @@
               </w:rPr>
               <w:t>IX_Users_Email</w:t>
             </w:r>
-            <w:proofErr w:type="spellEnd"/>
           </w:p>
         </w:tc>
         <w:tc>
@@ -7037,7 +6793,6 @@
                 <w:lang w:val="en-US"/>
               </w:rPr>
             </w:pPr>
-            <w:proofErr w:type="spellStart"/>
             <w:r>
               <w:rPr>
                 <w:sz w:val="28"/>
@@ -7047,7 +6802,6 @@
               <w:lastRenderedPageBreak/>
               <w:t>IX_Users_Role</w:t>
             </w:r>
-            <w:proofErr w:type="spellEnd"/>
           </w:p>
         </w:tc>
         <w:tc>
@@ -7110,7 +6864,6 @@
                 <w:lang w:val="en-US"/>
               </w:rPr>
             </w:pPr>
-            <w:proofErr w:type="spellStart"/>
             <w:r>
               <w:rPr>
                 <w:sz w:val="28"/>
@@ -7119,7 +6872,6 @@
               </w:rPr>
               <w:t>IX_Products_StockID</w:t>
             </w:r>
-            <w:proofErr w:type="spellEnd"/>
           </w:p>
         </w:tc>
         <w:tc>
@@ -7182,7 +6934,6 @@
                 <w:lang w:val="en-US"/>
               </w:rPr>
             </w:pPr>
-            <w:proofErr w:type="spellStart"/>
             <w:r>
               <w:rPr>
                 <w:sz w:val="28"/>
@@ -7191,7 +6942,6 @@
               </w:rPr>
               <w:t>IX_Products_Name</w:t>
             </w:r>
-            <w:proofErr w:type="spellEnd"/>
           </w:p>
         </w:tc>
         <w:tc>
@@ -7254,7 +7004,6 @@
                 <w:lang w:val="en-US"/>
               </w:rPr>
             </w:pPr>
-            <w:proofErr w:type="spellStart"/>
             <w:r>
               <w:rPr>
                 <w:sz w:val="28"/>
@@ -7263,7 +7012,6 @@
               </w:rPr>
               <w:t>IX_Tasks_Users_Completed</w:t>
             </w:r>
-            <w:proofErr w:type="spellEnd"/>
           </w:p>
         </w:tc>
         <w:tc>
@@ -7326,7 +7074,6 @@
                 <w:lang w:val="en-US"/>
               </w:rPr>
             </w:pPr>
-            <w:proofErr w:type="spellStart"/>
             <w:r>
               <w:rPr>
                 <w:sz w:val="28"/>
@@ -7335,7 +7082,6 @@
               </w:rPr>
               <w:t>IX_OrderItems_OrderID</w:t>
             </w:r>
-            <w:proofErr w:type="spellEnd"/>
           </w:p>
         </w:tc>
         <w:tc>
@@ -7373,7 +7119,6 @@
                 <w:lang w:val="en-US"/>
               </w:rPr>
             </w:pPr>
-            <w:proofErr w:type="spellStart"/>
             <w:r>
               <w:rPr>
                 <w:sz w:val="28"/>
@@ -7382,7 +7127,6 @@
               </w:rPr>
               <w:t>Order_items</w:t>
             </w:r>
-            <w:proofErr w:type="spellEnd"/>
           </w:p>
         </w:tc>
       </w:tr>
@@ -7400,7 +7144,6 @@
                 <w:lang w:val="de-DE"/>
               </w:rPr>
             </w:pPr>
-            <w:proofErr w:type="spellStart"/>
             <w:r>
               <w:rPr>
                 <w:sz w:val="28"/>
@@ -7409,7 +7152,6 @@
               </w:rPr>
               <w:t>IX_OrderItems_ProductID</w:t>
             </w:r>
-            <w:proofErr w:type="spellEnd"/>
           </w:p>
         </w:tc>
         <w:tc>
@@ -7447,7 +7189,6 @@
                 <w:lang w:val="en-US"/>
               </w:rPr>
             </w:pPr>
-            <w:proofErr w:type="spellStart"/>
             <w:r>
               <w:rPr>
                 <w:sz w:val="28"/>
@@ -7456,7 +7197,6 @@
               </w:rPr>
               <w:t>Order_items</w:t>
             </w:r>
-            <w:proofErr w:type="spellEnd"/>
           </w:p>
         </w:tc>
       </w:tr>
@@ -7601,7 +7341,6 @@
                 <w:szCs w:val="28"/>
               </w:rPr>
             </w:pPr>
-            <w:proofErr w:type="spellStart"/>
             <w:r>
               <w:rPr>
                 <w:rFonts w:eastAsiaTheme="minorHAnsi"/>
@@ -7612,7 +7351,6 @@
               </w:rPr>
               <w:t>trg_UpdateStockCapacity</w:t>
             </w:r>
-            <w:proofErr w:type="spellEnd"/>
           </w:p>
         </w:tc>
         <w:tc>
@@ -7811,36 +7549,61 @@
               <w:rPr>
                 <w:sz w:val="28"/>
                 <w:szCs w:val="28"/>
-              </w:rPr>
-            </w:pPr>
-          </w:p>
-        </w:tc>
-        <w:tc>
-          <w:tcPr>
-            <w:tcW w:w="2506" w:type="dxa"/>
-          </w:tcPr>
-          <w:p>
-            <w:pPr>
-              <w:jc w:val="center"/>
-              <w:rPr>
-                <w:sz w:val="28"/>
-                <w:szCs w:val="28"/>
-              </w:rPr>
-            </w:pPr>
-          </w:p>
-        </w:tc>
-        <w:tc>
-          <w:tcPr>
-            <w:tcW w:w="2506" w:type="dxa"/>
-          </w:tcPr>
-          <w:p>
-            <w:pPr>
-              <w:jc w:val="center"/>
-              <w:rPr>
-                <w:sz w:val="28"/>
-                <w:szCs w:val="28"/>
-              </w:rPr>
-            </w:pPr>
+                <w:lang w:val="en-US"/>
+              </w:rPr>
+            </w:pPr>
+            <w:r>
+              <w:rPr>
+                <w:sz w:val="28"/>
+                <w:szCs w:val="28"/>
+                <w:lang w:val="en-US"/>
+              </w:rPr>
+              <w:t>FUNCTION</w:t>
+            </w:r>
+          </w:p>
+        </w:tc>
+        <w:tc>
+          <w:tcPr>
+            <w:tcW w:w="2506" w:type="dxa"/>
+          </w:tcPr>
+          <w:p>
+            <w:pPr>
+              <w:jc w:val="both"/>
+              <w:rPr>
+                <w:sz w:val="28"/>
+                <w:szCs w:val="28"/>
+                <w:lang w:val="en-US"/>
+              </w:rPr>
+            </w:pPr>
+            <w:r>
+              <w:rPr>
+                <w:sz w:val="28"/>
+                <w:szCs w:val="28"/>
+                <w:lang w:val="en-US"/>
+              </w:rPr>
+              <w:t>fn_GetStockStatus</w:t>
+            </w:r>
+          </w:p>
+        </w:tc>
+        <w:tc>
+          <w:tcPr>
+            <w:tcW w:w="2506" w:type="dxa"/>
+          </w:tcPr>
+          <w:p>
+            <w:pPr>
+              <w:jc w:val="both"/>
+              <w:rPr>
+                <w:sz w:val="28"/>
+                <w:szCs w:val="28"/>
+              </w:rPr>
+            </w:pPr>
+            <w:r>
+              <w:rPr>
+                <w:sz w:val="28"/>
+                <w:szCs w:val="28"/>
+              </w:rPr>
+              <w:t>Получать информацию о статусе заполнения стока товарами по идентификатору стока</w:t>
+            </w:r>
           </w:p>
         </w:tc>
         <w:tc>
@@ -7849,19 +7612,410 @@
           </w:tcPr>
           <w:p>
             <w:pPr>
-              <w:jc w:val="center"/>
-              <w:rPr>
-                <w:sz w:val="28"/>
-                <w:szCs w:val="28"/>
-              </w:rPr>
-            </w:pPr>
+              <w:jc w:val="both"/>
+              <w:rPr>
+                <w:sz w:val="28"/>
+                <w:szCs w:val="28"/>
+                <w:lang w:val="en-US"/>
+              </w:rPr>
+            </w:pPr>
+            <w:r>
+              <w:rPr>
+                <w:sz w:val="28"/>
+                <w:szCs w:val="28"/>
+                <w:lang w:val="en-US"/>
+              </w:rPr>
+              <w:t>Stocks</w:t>
+            </w:r>
           </w:p>
         </w:tc>
       </w:tr>
     </w:tbl>
     <w:p>
       <w:pPr>
-        <w:jc w:val="both"/>
+        <w:tabs>
+          <w:tab w:val="left" w:pos="1728"/>
+        </w:tabs>
+        <w:rPr>
+          <w:sz w:val="28"/>
+          <w:szCs w:val="28"/>
+        </w:rPr>
+      </w:pPr>
+    </w:p>
+    <w:p>
+      <w:pPr>
+        <w:tabs>
+          <w:tab w:val="left" w:pos="1728"/>
+        </w:tabs>
+        <w:rPr>
+          <w:sz w:val="28"/>
+          <w:szCs w:val="28"/>
+        </w:rPr>
+      </w:pPr>
+      <w:r>
+        <w:rPr>
+          <w:sz w:val="28"/>
+          <w:szCs w:val="28"/>
+        </w:rPr>
+        <w:lastRenderedPageBreak/>
+        <w:t>Продолжение таблица 2.12 – Информация о процедурах и функциях</w:t>
+      </w:r>
+    </w:p>
+    <w:tbl>
+      <w:tblPr>
+        <w:tblStyle w:val="a7"/>
+        <w:tblW w:w="0" w:type="auto"/>
+        <w:tblLook w:val="04A0" w:firstRow="1" w:lastRow="0" w:firstColumn="1" w:lastColumn="0" w:noHBand="0" w:noVBand="1"/>
+      </w:tblPr>
+      <w:tblGrid>
+        <w:gridCol w:w="2506"/>
+        <w:gridCol w:w="2506"/>
+        <w:gridCol w:w="2506"/>
+        <w:gridCol w:w="2507"/>
+      </w:tblGrid>
+      <w:tr>
+        <w:tc>
+          <w:tcPr>
+            <w:tcW w:w="2506" w:type="dxa"/>
+          </w:tcPr>
+          <w:p>
+            <w:pPr>
+              <w:tabs>
+                <w:tab w:val="left" w:pos="1728"/>
+              </w:tabs>
+              <w:jc w:val="center"/>
+              <w:rPr>
+                <w:sz w:val="28"/>
+                <w:szCs w:val="28"/>
+              </w:rPr>
+            </w:pPr>
+            <w:r>
+              <w:rPr>
+                <w:sz w:val="28"/>
+                <w:szCs w:val="28"/>
+              </w:rPr>
+              <w:t>Тип объекта</w:t>
+            </w:r>
+          </w:p>
+        </w:tc>
+        <w:tc>
+          <w:tcPr>
+            <w:tcW w:w="2506" w:type="dxa"/>
+          </w:tcPr>
+          <w:p>
+            <w:pPr>
+              <w:tabs>
+                <w:tab w:val="left" w:pos="1728"/>
+              </w:tabs>
+              <w:jc w:val="center"/>
+              <w:rPr>
+                <w:sz w:val="28"/>
+                <w:szCs w:val="28"/>
+              </w:rPr>
+            </w:pPr>
+            <w:r>
+              <w:rPr>
+                <w:sz w:val="28"/>
+                <w:szCs w:val="28"/>
+              </w:rPr>
+              <w:t>Наименование</w:t>
+            </w:r>
+          </w:p>
+        </w:tc>
+        <w:tc>
+          <w:tcPr>
+            <w:tcW w:w="2506" w:type="dxa"/>
+          </w:tcPr>
+          <w:p>
+            <w:pPr>
+              <w:tabs>
+                <w:tab w:val="left" w:pos="1728"/>
+              </w:tabs>
+              <w:jc w:val="center"/>
+              <w:rPr>
+                <w:sz w:val="28"/>
+                <w:szCs w:val="28"/>
+              </w:rPr>
+            </w:pPr>
+            <w:r>
+              <w:rPr>
+                <w:sz w:val="28"/>
+                <w:szCs w:val="28"/>
+              </w:rPr>
+              <w:t>Назначение</w:t>
+            </w:r>
+          </w:p>
+        </w:tc>
+        <w:tc>
+          <w:tcPr>
+            <w:tcW w:w="2507" w:type="dxa"/>
+          </w:tcPr>
+          <w:p>
+            <w:pPr>
+              <w:tabs>
+                <w:tab w:val="left" w:pos="1728"/>
+              </w:tabs>
+              <w:jc w:val="center"/>
+              <w:rPr>
+                <w:sz w:val="28"/>
+                <w:szCs w:val="28"/>
+              </w:rPr>
+            </w:pPr>
+            <w:r>
+              <w:rPr>
+                <w:sz w:val="28"/>
+                <w:szCs w:val="28"/>
+              </w:rPr>
+              <w:t>Зависимые объекты</w:t>
+            </w:r>
+          </w:p>
+        </w:tc>
+      </w:tr>
+      <w:tr>
+        <w:tc>
+          <w:tcPr>
+            <w:tcW w:w="2506" w:type="dxa"/>
+          </w:tcPr>
+          <w:p>
+            <w:pPr>
+              <w:tabs>
+                <w:tab w:val="left" w:pos="1728"/>
+              </w:tabs>
+              <w:rPr>
+                <w:sz w:val="28"/>
+                <w:szCs w:val="28"/>
+                <w:lang w:val="en-US"/>
+              </w:rPr>
+            </w:pPr>
+            <w:r>
+              <w:rPr>
+                <w:sz w:val="28"/>
+                <w:szCs w:val="28"/>
+                <w:lang w:val="en-US"/>
+              </w:rPr>
+              <w:t>FUNCTION</w:t>
+            </w:r>
+          </w:p>
+        </w:tc>
+        <w:tc>
+          <w:tcPr>
+            <w:tcW w:w="2506" w:type="dxa"/>
+          </w:tcPr>
+          <w:p>
+            <w:pPr>
+              <w:tabs>
+                <w:tab w:val="left" w:pos="1728"/>
+              </w:tabs>
+              <w:rPr>
+                <w:sz w:val="28"/>
+                <w:szCs w:val="28"/>
+                <w:lang w:val="en-US"/>
+              </w:rPr>
+            </w:pPr>
+            <w:r>
+              <w:rPr>
+                <w:sz w:val="28"/>
+                <w:szCs w:val="28"/>
+                <w:lang w:val="en-US"/>
+              </w:rPr>
+              <w:t>fn_CanFulfillOrder</w:t>
+            </w:r>
+          </w:p>
+        </w:tc>
+        <w:tc>
+          <w:tcPr>
+            <w:tcW w:w="2506" w:type="dxa"/>
+          </w:tcPr>
+          <w:p>
+            <w:pPr>
+              <w:tabs>
+                <w:tab w:val="left" w:pos="1728"/>
+              </w:tabs>
+              <w:rPr>
+                <w:sz w:val="28"/>
+                <w:szCs w:val="28"/>
+              </w:rPr>
+            </w:pPr>
+            <w:r>
+              <w:rPr>
+                <w:sz w:val="28"/>
+                <w:szCs w:val="28"/>
+              </w:rPr>
+              <w:t>Проверить, возможно ли удовлетворить конкретный заказ</w:t>
+            </w:r>
+            <w:r>
+              <w:rPr>
+                <w:sz w:val="28"/>
+                <w:szCs w:val="28"/>
+              </w:rPr>
+              <w:t>, основываясь на количестве товара на складе</w:t>
+            </w:r>
+          </w:p>
+        </w:tc>
+        <w:tc>
+          <w:tcPr>
+            <w:tcW w:w="2507" w:type="dxa"/>
+          </w:tcPr>
+          <w:p>
+            <w:pPr>
+              <w:tabs>
+                <w:tab w:val="left" w:pos="1728"/>
+              </w:tabs>
+              <w:rPr>
+                <w:sz w:val="28"/>
+                <w:szCs w:val="28"/>
+                <w:lang w:val="en-US"/>
+              </w:rPr>
+            </w:pPr>
+            <w:r>
+              <w:rPr>
+                <w:sz w:val="28"/>
+                <w:szCs w:val="28"/>
+                <w:lang w:val="en-US"/>
+              </w:rPr>
+              <w:t>Products, OrderItems</w:t>
+            </w:r>
+          </w:p>
+        </w:tc>
+      </w:tr>
+      <w:tr>
+        <w:tc>
+          <w:tcPr>
+            <w:tcW w:w="2506" w:type="dxa"/>
+          </w:tcPr>
+          <w:p>
+            <w:pPr>
+              <w:tabs>
+                <w:tab w:val="left" w:pos="1728"/>
+              </w:tabs>
+              <w:rPr>
+                <w:sz w:val="28"/>
+                <w:szCs w:val="28"/>
+              </w:rPr>
+            </w:pPr>
+          </w:p>
+        </w:tc>
+        <w:tc>
+          <w:tcPr>
+            <w:tcW w:w="2506" w:type="dxa"/>
+          </w:tcPr>
+          <w:p>
+            <w:pPr>
+              <w:tabs>
+                <w:tab w:val="left" w:pos="1728"/>
+              </w:tabs>
+              <w:rPr>
+                <w:sz w:val="28"/>
+                <w:szCs w:val="28"/>
+              </w:rPr>
+            </w:pPr>
+          </w:p>
+        </w:tc>
+        <w:tc>
+          <w:tcPr>
+            <w:tcW w:w="2506" w:type="dxa"/>
+          </w:tcPr>
+          <w:p>
+            <w:pPr>
+              <w:tabs>
+                <w:tab w:val="left" w:pos="1728"/>
+              </w:tabs>
+              <w:rPr>
+                <w:sz w:val="28"/>
+                <w:szCs w:val="28"/>
+              </w:rPr>
+            </w:pPr>
+          </w:p>
+        </w:tc>
+        <w:tc>
+          <w:tcPr>
+            <w:tcW w:w="2507" w:type="dxa"/>
+          </w:tcPr>
+          <w:p>
+            <w:pPr>
+              <w:tabs>
+                <w:tab w:val="left" w:pos="1728"/>
+              </w:tabs>
+              <w:rPr>
+                <w:sz w:val="28"/>
+                <w:szCs w:val="28"/>
+              </w:rPr>
+            </w:pPr>
+          </w:p>
+        </w:tc>
+      </w:tr>
+      <w:tr>
+        <w:tc>
+          <w:tcPr>
+            <w:tcW w:w="2506" w:type="dxa"/>
+          </w:tcPr>
+          <w:p>
+            <w:pPr>
+              <w:tabs>
+                <w:tab w:val="left" w:pos="1728"/>
+              </w:tabs>
+              <w:rPr>
+                <w:sz w:val="28"/>
+                <w:szCs w:val="28"/>
+              </w:rPr>
+            </w:pPr>
+          </w:p>
+        </w:tc>
+        <w:tc>
+          <w:tcPr>
+            <w:tcW w:w="2506" w:type="dxa"/>
+          </w:tcPr>
+          <w:p>
+            <w:pPr>
+              <w:tabs>
+                <w:tab w:val="left" w:pos="1728"/>
+              </w:tabs>
+              <w:rPr>
+                <w:sz w:val="28"/>
+                <w:szCs w:val="28"/>
+              </w:rPr>
+            </w:pPr>
+          </w:p>
+        </w:tc>
+        <w:tc>
+          <w:tcPr>
+            <w:tcW w:w="2506" w:type="dxa"/>
+          </w:tcPr>
+          <w:p>
+            <w:pPr>
+              <w:tabs>
+                <w:tab w:val="left" w:pos="1728"/>
+              </w:tabs>
+              <w:rPr>
+                <w:sz w:val="28"/>
+                <w:szCs w:val="28"/>
+              </w:rPr>
+            </w:pPr>
+          </w:p>
+        </w:tc>
+        <w:tc>
+          <w:tcPr>
+            <w:tcW w:w="2507" w:type="dxa"/>
+          </w:tcPr>
+          <w:p>
+            <w:pPr>
+              <w:tabs>
+                <w:tab w:val="left" w:pos="1728"/>
+              </w:tabs>
+              <w:rPr>
+                <w:sz w:val="28"/>
+                <w:szCs w:val="28"/>
+              </w:rPr>
+            </w:pPr>
+          </w:p>
+        </w:tc>
+      </w:tr>
+    </w:tbl>
+    <w:p>
+      <w:pPr>
+        <w:tabs>
+          <w:tab w:val="left" w:pos="1728"/>
+        </w:tabs>
         <w:rPr>
           <w:sz w:val="28"/>
           <w:szCs w:val="28"/>

</xml_diff>

<commit_message>
IADB:lab2 in progress. MSSQL part done. Oracle Sql part in work
</commit_message>
<xml_diff>
--- a/IADB/Code/Lab_2/Report.docx
+++ b/IADB/Code/Lab_2/Report.docx
@@ -442,7 +442,25 @@
           <w:sz w:val="28"/>
           <w:szCs w:val="28"/>
         </w:rPr>
-        <w:t>Преподаватель: Нистюк О.А.</w:t>
+        <w:t xml:space="preserve">Преподаватель: </w:t>
+      </w:r>
+      <w:proofErr w:type="spellStart"/>
+      <w:r>
+        <w:rPr>
+          <w:color w:val="000000"/>
+          <w:sz w:val="28"/>
+          <w:szCs w:val="28"/>
+        </w:rPr>
+        <w:t>Нистюк</w:t>
+      </w:r>
+      <w:proofErr w:type="spellEnd"/>
+      <w:r>
+        <w:rPr>
+          <w:color w:val="000000"/>
+          <w:sz w:val="28"/>
+          <w:szCs w:val="28"/>
+        </w:rPr>
+        <w:t xml:space="preserve"> О.А.</w:t>
       </w:r>
     </w:p>
     <w:p>
@@ -869,6 +887,7 @@
                 <w:lang w:val="en-US"/>
               </w:rPr>
             </w:pPr>
+            <w:proofErr w:type="spellStart"/>
             <w:r>
               <w:rPr>
                 <w:sz w:val="28"/>
@@ -877,6 +896,7 @@
               </w:rPr>
               <w:t>Stock_ID</w:t>
             </w:r>
+            <w:proofErr w:type="spellEnd"/>
           </w:p>
         </w:tc>
         <w:tc>
@@ -1053,6 +1073,7 @@
                 <w:lang w:val="en-US"/>
               </w:rPr>
             </w:pPr>
+            <w:proofErr w:type="spellStart"/>
             <w:r>
               <w:rPr>
                 <w:sz w:val="28"/>
@@ -1061,6 +1082,7 @@
               </w:rPr>
               <w:t>Filled_part</w:t>
             </w:r>
+            <w:proofErr w:type="spellEnd"/>
           </w:p>
         </w:tc>
         <w:tc>
@@ -1186,13 +1208,33 @@
                 <w:lang w:val="en-US"/>
               </w:rPr>
             </w:pPr>
-            <w:r>
-              <w:rPr>
-                <w:sz w:val="28"/>
-                <w:szCs w:val="28"/>
-                <w:lang w:val="en-US"/>
-              </w:rPr>
-              <w:t>Nvarchar(100)</w:t>
+            <w:proofErr w:type="spellStart"/>
+            <w:proofErr w:type="gramStart"/>
+            <w:r>
+              <w:rPr>
+                <w:sz w:val="28"/>
+                <w:szCs w:val="28"/>
+                <w:lang w:val="en-US"/>
+              </w:rPr>
+              <w:t>Nvarchar</w:t>
+            </w:r>
+            <w:proofErr w:type="spellEnd"/>
+            <w:r>
+              <w:rPr>
+                <w:sz w:val="28"/>
+                <w:szCs w:val="28"/>
+                <w:lang w:val="en-US"/>
+              </w:rPr>
+              <w:t>(</w:t>
+            </w:r>
+            <w:proofErr w:type="gramEnd"/>
+            <w:r>
+              <w:rPr>
+                <w:sz w:val="28"/>
+                <w:szCs w:val="28"/>
+                <w:lang w:val="en-US"/>
+              </w:rPr>
+              <w:t>100)</w:t>
             </w:r>
           </w:p>
         </w:tc>
@@ -1423,6 +1465,7 @@
                 <w:lang w:val="en-US"/>
               </w:rPr>
             </w:pPr>
+            <w:proofErr w:type="spellStart"/>
             <w:r>
               <w:rPr>
                 <w:sz w:val="28"/>
@@ -1431,6 +1474,7 @@
               </w:rPr>
               <w:t>User_ID</w:t>
             </w:r>
+            <w:proofErr w:type="spellEnd"/>
           </w:p>
         </w:tc>
         <w:tc>
@@ -1538,13 +1582,23 @@
                 <w:lang w:val="en-US"/>
               </w:rPr>
             </w:pPr>
-            <w:r>
-              <w:rPr>
-                <w:sz w:val="28"/>
-                <w:szCs w:val="28"/>
-                <w:lang w:val="en-US"/>
-              </w:rPr>
-              <w:t>VARCHAR(255)</w:t>
+            <w:proofErr w:type="gramStart"/>
+            <w:r>
+              <w:rPr>
+                <w:sz w:val="28"/>
+                <w:szCs w:val="28"/>
+                <w:lang w:val="en-US"/>
+              </w:rPr>
+              <w:t>VARCHAR(</w:t>
+            </w:r>
+            <w:proofErr w:type="gramEnd"/>
+            <w:r>
+              <w:rPr>
+                <w:sz w:val="28"/>
+                <w:szCs w:val="28"/>
+                <w:lang w:val="en-US"/>
+              </w:rPr>
+              <w:t>255)</w:t>
             </w:r>
           </w:p>
         </w:tc>
@@ -1630,13 +1684,23 @@
                 <w:lang w:val="en-US"/>
               </w:rPr>
             </w:pPr>
-            <w:r>
-              <w:rPr>
-                <w:sz w:val="28"/>
-                <w:szCs w:val="28"/>
-                <w:lang w:val="en-US"/>
-              </w:rPr>
-              <w:t>VARCHAR(30)</w:t>
+            <w:proofErr w:type="gramStart"/>
+            <w:r>
+              <w:rPr>
+                <w:sz w:val="28"/>
+                <w:szCs w:val="28"/>
+                <w:lang w:val="en-US"/>
+              </w:rPr>
+              <w:t>VARCHAR(</w:t>
+            </w:r>
+            <w:proofErr w:type="gramEnd"/>
+            <w:r>
+              <w:rPr>
+                <w:sz w:val="28"/>
+                <w:szCs w:val="28"/>
+                <w:lang w:val="en-US"/>
+              </w:rPr>
+              <w:t>30)</w:t>
             </w:r>
           </w:p>
         </w:tc>
@@ -1841,6 +1905,7 @@
                 <w:lang w:val="en-US"/>
               </w:rPr>
             </w:pPr>
+            <w:proofErr w:type="spellStart"/>
             <w:r>
               <w:rPr>
                 <w:sz w:val="28"/>
@@ -1849,6 +1914,7 @@
               </w:rPr>
               <w:t>Created_at</w:t>
             </w:r>
+            <w:proofErr w:type="spellEnd"/>
           </w:p>
         </w:tc>
         <w:tc>
@@ -1891,7 +1957,25 @@
                 <w:szCs w:val="28"/>
                 <w:lang w:val="en-US"/>
               </w:rPr>
-              <w:t>Default, GETDATE()</w:t>
+              <w:t xml:space="preserve">Default, </w:t>
+            </w:r>
+            <w:proofErr w:type="gramStart"/>
+            <w:r>
+              <w:rPr>
+                <w:sz w:val="28"/>
+                <w:szCs w:val="28"/>
+                <w:lang w:val="en-US"/>
+              </w:rPr>
+              <w:t>GETDATE(</w:t>
+            </w:r>
+            <w:proofErr w:type="gramEnd"/>
+            <w:r>
+              <w:rPr>
+                <w:sz w:val="28"/>
+                <w:szCs w:val="28"/>
+                <w:lang w:val="en-US"/>
+              </w:rPr>
+              <w:t>)</w:t>
             </w:r>
           </w:p>
         </w:tc>
@@ -1929,6 +2013,7 @@
                 <w:lang w:val="en-US"/>
               </w:rPr>
             </w:pPr>
+            <w:proofErr w:type="spellStart"/>
             <w:r>
               <w:rPr>
                 <w:sz w:val="28"/>
@@ -1937,27 +2022,38 @@
               </w:rPr>
               <w:t>Password_hash</w:t>
             </w:r>
-          </w:p>
-        </w:tc>
-        <w:tc>
-          <w:tcPr>
-            <w:tcW w:w="2506" w:type="dxa"/>
-          </w:tcPr>
-          <w:p>
-            <w:pPr>
-              <w:rPr>
-                <w:sz w:val="28"/>
-                <w:szCs w:val="28"/>
-                <w:lang w:val="en-US"/>
-              </w:rPr>
-            </w:pPr>
-            <w:r>
-              <w:rPr>
-                <w:sz w:val="28"/>
-                <w:szCs w:val="28"/>
-                <w:lang w:val="en-US"/>
-              </w:rPr>
-              <w:t>VARBINARY(64)</w:t>
+            <w:proofErr w:type="spellEnd"/>
+          </w:p>
+        </w:tc>
+        <w:tc>
+          <w:tcPr>
+            <w:tcW w:w="2506" w:type="dxa"/>
+          </w:tcPr>
+          <w:p>
+            <w:pPr>
+              <w:rPr>
+                <w:sz w:val="28"/>
+                <w:szCs w:val="28"/>
+                <w:lang w:val="en-US"/>
+              </w:rPr>
+            </w:pPr>
+            <w:proofErr w:type="gramStart"/>
+            <w:r>
+              <w:rPr>
+                <w:sz w:val="28"/>
+                <w:szCs w:val="28"/>
+                <w:lang w:val="en-US"/>
+              </w:rPr>
+              <w:t>VARBINARY(</w:t>
+            </w:r>
+            <w:proofErr w:type="gramEnd"/>
+            <w:r>
+              <w:rPr>
+                <w:sz w:val="28"/>
+                <w:szCs w:val="28"/>
+                <w:lang w:val="en-US"/>
+              </w:rPr>
+              <w:t>64)</w:t>
             </w:r>
           </w:p>
         </w:tc>
@@ -2185,6 +2281,7 @@
                 <w:lang w:val="en-US"/>
               </w:rPr>
             </w:pPr>
+            <w:proofErr w:type="spellStart"/>
             <w:r>
               <w:rPr>
                 <w:sz w:val="28"/>
@@ -2193,6 +2290,7 @@
               </w:rPr>
               <w:t>Product_ID</w:t>
             </w:r>
+            <w:proofErr w:type="spellEnd"/>
           </w:p>
         </w:tc>
         <w:tc>
@@ -2273,6 +2371,7 @@
                 <w:lang w:val="en-US"/>
               </w:rPr>
             </w:pPr>
+            <w:proofErr w:type="spellStart"/>
             <w:r>
               <w:rPr>
                 <w:sz w:val="28"/>
@@ -2281,6 +2380,7 @@
               </w:rPr>
               <w:t>Stock_ID</w:t>
             </w:r>
+            <w:proofErr w:type="spellEnd"/>
           </w:p>
         </w:tc>
         <w:tc>
@@ -2323,7 +2423,25 @@
                 <w:szCs w:val="28"/>
                 <w:lang w:val="en-US"/>
               </w:rPr>
-              <w:t>Not null, Foreign key</w:t>
+              <w:t xml:space="preserve">Not null, </w:t>
+            </w:r>
+            <w:proofErr w:type="gramStart"/>
+            <w:r>
+              <w:rPr>
+                <w:sz w:val="28"/>
+                <w:szCs w:val="28"/>
+                <w:lang w:val="en-US"/>
+              </w:rPr>
+              <w:t>Foreign</w:t>
+            </w:r>
+            <w:proofErr w:type="gramEnd"/>
+            <w:r>
+              <w:rPr>
+                <w:sz w:val="28"/>
+                <w:szCs w:val="28"/>
+                <w:lang w:val="en-US"/>
+              </w:rPr>
+              <w:t xml:space="preserve"> key</w:t>
             </w:r>
           </w:p>
         </w:tc>
@@ -2383,13 +2501,23 @@
                 <w:lang w:val="en-US"/>
               </w:rPr>
             </w:pPr>
-            <w:r>
-              <w:rPr>
-                <w:sz w:val="28"/>
-                <w:szCs w:val="28"/>
-                <w:lang w:val="en-US"/>
-              </w:rPr>
-              <w:t>NVARCHAR(200)</w:t>
+            <w:proofErr w:type="gramStart"/>
+            <w:r>
+              <w:rPr>
+                <w:sz w:val="28"/>
+                <w:szCs w:val="28"/>
+                <w:lang w:val="en-US"/>
+              </w:rPr>
+              <w:t>NVARCHAR(</w:t>
+            </w:r>
+            <w:proofErr w:type="gramEnd"/>
+            <w:r>
+              <w:rPr>
+                <w:sz w:val="28"/>
+                <w:szCs w:val="28"/>
+                <w:lang w:val="en-US"/>
+              </w:rPr>
+              <w:t>200)</w:t>
             </w:r>
           </w:p>
         </w:tc>
@@ -2471,13 +2599,23 @@
                 <w:lang w:val="en-US"/>
               </w:rPr>
             </w:pPr>
-            <w:r>
-              <w:rPr>
-                <w:sz w:val="28"/>
-                <w:szCs w:val="28"/>
-                <w:lang w:val="en-US"/>
-              </w:rPr>
-              <w:t>DECIMAL(19,4)</w:t>
+            <w:proofErr w:type="gramStart"/>
+            <w:r>
+              <w:rPr>
+                <w:sz w:val="28"/>
+                <w:szCs w:val="28"/>
+                <w:lang w:val="en-US"/>
+              </w:rPr>
+              <w:t>DECIMAL(</w:t>
+            </w:r>
+            <w:proofErr w:type="gramEnd"/>
+            <w:r>
+              <w:rPr>
+                <w:sz w:val="28"/>
+                <w:szCs w:val="28"/>
+                <w:lang w:val="en-US"/>
+              </w:rPr>
+              <w:t>19,4)</w:t>
             </w:r>
           </w:p>
         </w:tc>
@@ -2793,6 +2931,7 @@
                 <w:lang w:val="en-US"/>
               </w:rPr>
             </w:pPr>
+            <w:proofErr w:type="spellStart"/>
             <w:r>
               <w:rPr>
                 <w:sz w:val="28"/>
@@ -2801,6 +2940,7 @@
               </w:rPr>
               <w:t>Task_ID</w:t>
             </w:r>
+            <w:proofErr w:type="spellEnd"/>
           </w:p>
         </w:tc>
         <w:tc>
@@ -2885,6 +3025,7 @@
                 <w:lang w:val="en-US"/>
               </w:rPr>
             </w:pPr>
+            <w:proofErr w:type="spellStart"/>
             <w:r>
               <w:rPr>
                 <w:sz w:val="28"/>
@@ -2893,6 +3034,7 @@
               </w:rPr>
               <w:t>User_ID</w:t>
             </w:r>
+            <w:proofErr w:type="spellEnd"/>
           </w:p>
         </w:tc>
         <w:tc>
@@ -2977,6 +3119,7 @@
                 <w:lang w:val="en-US"/>
               </w:rPr>
             </w:pPr>
+            <w:proofErr w:type="spellStart"/>
             <w:r>
               <w:rPr>
                 <w:sz w:val="28"/>
@@ -2985,6 +3128,7 @@
               </w:rPr>
               <w:t>Due_date</w:t>
             </w:r>
+            <w:proofErr w:type="spellEnd"/>
           </w:p>
         </w:tc>
         <w:tc>
@@ -3303,6 +3447,7 @@
                 <w:lang w:val="en-US"/>
               </w:rPr>
             </w:pPr>
+            <w:proofErr w:type="spellStart"/>
             <w:r>
               <w:rPr>
                 <w:sz w:val="28"/>
@@ -3311,6 +3456,7 @@
               </w:rPr>
               <w:t>Is_completed</w:t>
             </w:r>
+            <w:proofErr w:type="spellEnd"/>
           </w:p>
         </w:tc>
         <w:tc>
@@ -3427,13 +3573,23 @@
                 <w:lang w:val="en-US"/>
               </w:rPr>
             </w:pPr>
-            <w:r>
-              <w:rPr>
-                <w:sz w:val="28"/>
-                <w:szCs w:val="28"/>
-                <w:lang w:val="en-US"/>
-              </w:rPr>
-              <w:t>VARCHAR(30)</w:t>
+            <w:proofErr w:type="gramStart"/>
+            <w:r>
+              <w:rPr>
+                <w:sz w:val="28"/>
+                <w:szCs w:val="28"/>
+                <w:lang w:val="en-US"/>
+              </w:rPr>
+              <w:t>VARCHAR(</w:t>
+            </w:r>
+            <w:proofErr w:type="gramEnd"/>
+            <w:r>
+              <w:rPr>
+                <w:sz w:val="28"/>
+                <w:szCs w:val="28"/>
+                <w:lang w:val="en-US"/>
+              </w:rPr>
+              <w:t>30)</w:t>
             </w:r>
           </w:p>
         </w:tc>
@@ -3664,6 +3820,7 @@
                 <w:lang w:val="en-US"/>
               </w:rPr>
             </w:pPr>
+            <w:proofErr w:type="spellStart"/>
             <w:r>
               <w:rPr>
                 <w:sz w:val="28"/>
@@ -3672,6 +3829,7 @@
               </w:rPr>
               <w:t>Order_ID</w:t>
             </w:r>
+            <w:proofErr w:type="spellEnd"/>
           </w:p>
         </w:tc>
         <w:tc>
@@ -3756,6 +3914,7 @@
                 <w:lang w:val="en-US"/>
               </w:rPr>
             </w:pPr>
+            <w:proofErr w:type="spellStart"/>
             <w:r>
               <w:rPr>
                 <w:sz w:val="28"/>
@@ -3764,6 +3923,7 @@
               </w:rPr>
               <w:t>Order_date</w:t>
             </w:r>
+            <w:proofErr w:type="spellEnd"/>
           </w:p>
         </w:tc>
         <w:tc>
@@ -3848,6 +4008,7 @@
                 <w:lang w:val="en-US"/>
               </w:rPr>
             </w:pPr>
+            <w:proofErr w:type="spellStart"/>
             <w:r>
               <w:rPr>
                 <w:sz w:val="28"/>
@@ -3856,28 +4017,39 @@
               </w:rPr>
               <w:t>Order_status</w:t>
             </w:r>
-          </w:p>
-        </w:tc>
-        <w:tc>
-          <w:tcPr>
-            <w:tcW w:w="2506" w:type="dxa"/>
-          </w:tcPr>
-          <w:p>
-            <w:pPr>
-              <w:jc w:val="both"/>
-              <w:rPr>
-                <w:sz w:val="28"/>
-                <w:szCs w:val="28"/>
-                <w:lang w:val="en-US"/>
-              </w:rPr>
-            </w:pPr>
-            <w:r>
-              <w:rPr>
-                <w:sz w:val="28"/>
-                <w:szCs w:val="28"/>
-                <w:lang w:val="en-US"/>
-              </w:rPr>
-              <w:t>VARCHAR(50)</w:t>
+            <w:proofErr w:type="spellEnd"/>
+          </w:p>
+        </w:tc>
+        <w:tc>
+          <w:tcPr>
+            <w:tcW w:w="2506" w:type="dxa"/>
+          </w:tcPr>
+          <w:p>
+            <w:pPr>
+              <w:jc w:val="both"/>
+              <w:rPr>
+                <w:sz w:val="28"/>
+                <w:szCs w:val="28"/>
+                <w:lang w:val="en-US"/>
+              </w:rPr>
+            </w:pPr>
+            <w:proofErr w:type="gramStart"/>
+            <w:r>
+              <w:rPr>
+                <w:sz w:val="28"/>
+                <w:szCs w:val="28"/>
+                <w:lang w:val="en-US"/>
+              </w:rPr>
+              <w:t>VARCHAR(</w:t>
+            </w:r>
+            <w:proofErr w:type="gramEnd"/>
+            <w:r>
+              <w:rPr>
+                <w:sz w:val="28"/>
+                <w:szCs w:val="28"/>
+                <w:lang w:val="en-US"/>
+              </w:rPr>
+              <w:t>50)</w:t>
             </w:r>
           </w:p>
         </w:tc>
@@ -3940,6 +4112,7 @@
                 <w:lang w:val="en-US"/>
               </w:rPr>
             </w:pPr>
+            <w:proofErr w:type="spellStart"/>
             <w:r>
               <w:rPr>
                 <w:sz w:val="28"/>
@@ -3948,28 +4121,39 @@
               </w:rPr>
               <w:t>Total_amount</w:t>
             </w:r>
-          </w:p>
-        </w:tc>
-        <w:tc>
-          <w:tcPr>
-            <w:tcW w:w="2506" w:type="dxa"/>
-          </w:tcPr>
-          <w:p>
-            <w:pPr>
-              <w:jc w:val="both"/>
-              <w:rPr>
-                <w:sz w:val="28"/>
-                <w:szCs w:val="28"/>
-                <w:lang w:val="en-US"/>
-              </w:rPr>
-            </w:pPr>
-            <w:r>
-              <w:rPr>
-                <w:sz w:val="28"/>
-                <w:szCs w:val="28"/>
-                <w:lang w:val="en-US"/>
-              </w:rPr>
-              <w:t>DECIMAL(19,4)</w:t>
+            <w:proofErr w:type="spellEnd"/>
+          </w:p>
+        </w:tc>
+        <w:tc>
+          <w:tcPr>
+            <w:tcW w:w="2506" w:type="dxa"/>
+          </w:tcPr>
+          <w:p>
+            <w:pPr>
+              <w:jc w:val="both"/>
+              <w:rPr>
+                <w:sz w:val="28"/>
+                <w:szCs w:val="28"/>
+                <w:lang w:val="en-US"/>
+              </w:rPr>
+            </w:pPr>
+            <w:proofErr w:type="gramStart"/>
+            <w:r>
+              <w:rPr>
+                <w:sz w:val="28"/>
+                <w:szCs w:val="28"/>
+                <w:lang w:val="en-US"/>
+              </w:rPr>
+              <w:t>DECIMAL(</w:t>
+            </w:r>
+            <w:proofErr w:type="gramEnd"/>
+            <w:r>
+              <w:rPr>
+                <w:sz w:val="28"/>
+                <w:szCs w:val="28"/>
+                <w:lang w:val="en-US"/>
+              </w:rPr>
+              <w:t>19,4)</w:t>
             </w:r>
           </w:p>
         </w:tc>
@@ -4251,6 +4435,7 @@
                 <w:lang w:val="en-US"/>
               </w:rPr>
             </w:pPr>
+            <w:proofErr w:type="spellStart"/>
             <w:r>
               <w:rPr>
                 <w:sz w:val="28"/>
@@ -4259,6 +4444,7 @@
               </w:rPr>
               <w:t>Item_ID</w:t>
             </w:r>
+            <w:proofErr w:type="spellEnd"/>
           </w:p>
         </w:tc>
         <w:tc>
@@ -4343,6 +4529,7 @@
                 <w:lang w:val="en-US"/>
               </w:rPr>
             </w:pPr>
+            <w:proofErr w:type="spellStart"/>
             <w:r>
               <w:rPr>
                 <w:sz w:val="28"/>
@@ -4351,6 +4538,7 @@
               </w:rPr>
               <w:t>Order_ID</w:t>
             </w:r>
+            <w:proofErr w:type="spellEnd"/>
           </w:p>
         </w:tc>
         <w:tc>
@@ -4435,6 +4623,7 @@
                 <w:lang w:val="en-US"/>
               </w:rPr>
             </w:pPr>
+            <w:proofErr w:type="spellStart"/>
             <w:r>
               <w:rPr>
                 <w:sz w:val="28"/>
@@ -4443,6 +4632,7 @@
               </w:rPr>
               <w:t>Product_ID</w:t>
             </w:r>
+            <w:proofErr w:type="spellEnd"/>
           </w:p>
         </w:tc>
         <w:tc>
@@ -4932,6 +5122,7 @@
                 <w:lang w:val="en-US"/>
               </w:rPr>
             </w:pPr>
+            <w:proofErr w:type="spellStart"/>
             <w:r>
               <w:rPr>
                 <w:sz w:val="28"/>
@@ -4940,6 +5131,7 @@
               </w:rPr>
               <w:t>Pack_ID</w:t>
             </w:r>
+            <w:proofErr w:type="spellEnd"/>
           </w:p>
         </w:tc>
         <w:tc>
@@ -5024,6 +5216,7 @@
                 <w:lang w:val="en-US"/>
               </w:rPr>
             </w:pPr>
+            <w:proofErr w:type="spellStart"/>
             <w:r>
               <w:rPr>
                 <w:sz w:val="28"/>
@@ -5032,6 +5225,7 @@
               </w:rPr>
               <w:t>User_ID</w:t>
             </w:r>
+            <w:proofErr w:type="spellEnd"/>
           </w:p>
         </w:tc>
         <w:tc>
@@ -5116,6 +5310,7 @@
                 <w:lang w:val="en-US"/>
               </w:rPr>
             </w:pPr>
+            <w:proofErr w:type="spellStart"/>
             <w:r>
               <w:rPr>
                 <w:sz w:val="28"/>
@@ -5124,6 +5319,7 @@
               </w:rPr>
               <w:t>Order_ID</w:t>
             </w:r>
+            <w:proofErr w:type="spellEnd"/>
           </w:p>
         </w:tc>
         <w:tc>
@@ -5208,6 +5404,7 @@
                 <w:lang w:val="en-US"/>
               </w:rPr>
             </w:pPr>
+            <w:proofErr w:type="spellStart"/>
             <w:r>
               <w:rPr>
                 <w:sz w:val="28"/>
@@ -5216,6 +5413,7 @@
               </w:rPr>
               <w:t>Pack_date</w:t>
             </w:r>
+            <w:proofErr w:type="spellEnd"/>
           </w:p>
         </w:tc>
         <w:tc>
@@ -5300,6 +5498,7 @@
                 <w:lang w:val="en-US"/>
               </w:rPr>
             </w:pPr>
+            <w:proofErr w:type="spellStart"/>
             <w:r>
               <w:rPr>
                 <w:sz w:val="28"/>
@@ -5308,28 +5507,39 @@
               </w:rPr>
               <w:t>Pack_status</w:t>
             </w:r>
-          </w:p>
-        </w:tc>
-        <w:tc>
-          <w:tcPr>
-            <w:tcW w:w="2506" w:type="dxa"/>
-          </w:tcPr>
-          <w:p>
-            <w:pPr>
-              <w:jc w:val="both"/>
-              <w:rPr>
-                <w:sz w:val="28"/>
-                <w:szCs w:val="28"/>
-                <w:lang w:val="en-US"/>
-              </w:rPr>
-            </w:pPr>
-            <w:r>
-              <w:rPr>
-                <w:sz w:val="28"/>
-                <w:szCs w:val="28"/>
-                <w:lang w:val="en-US"/>
-              </w:rPr>
-              <w:t>VARCHAR(50)</w:t>
+            <w:proofErr w:type="spellEnd"/>
+          </w:p>
+        </w:tc>
+        <w:tc>
+          <w:tcPr>
+            <w:tcW w:w="2506" w:type="dxa"/>
+          </w:tcPr>
+          <w:p>
+            <w:pPr>
+              <w:jc w:val="both"/>
+              <w:rPr>
+                <w:sz w:val="28"/>
+                <w:szCs w:val="28"/>
+                <w:lang w:val="en-US"/>
+              </w:rPr>
+            </w:pPr>
+            <w:proofErr w:type="gramStart"/>
+            <w:r>
+              <w:rPr>
+                <w:sz w:val="28"/>
+                <w:szCs w:val="28"/>
+                <w:lang w:val="en-US"/>
+              </w:rPr>
+              <w:t>VARCHAR(</w:t>
+            </w:r>
+            <w:proofErr w:type="gramEnd"/>
+            <w:r>
+              <w:rPr>
+                <w:sz w:val="28"/>
+                <w:szCs w:val="28"/>
+                <w:lang w:val="en-US"/>
+              </w:rPr>
+              <w:t>50)</w:t>
             </w:r>
           </w:p>
         </w:tc>
@@ -5612,6 +5822,7 @@
                 <w:lang w:val="en-US"/>
               </w:rPr>
             </w:pPr>
+            <w:proofErr w:type="spellStart"/>
             <w:r>
               <w:rPr>
                 <w:sz w:val="28"/>
@@ -5620,6 +5831,7 @@
               </w:rPr>
               <w:t>Item_ID</w:t>
             </w:r>
+            <w:proofErr w:type="spellEnd"/>
           </w:p>
         </w:tc>
         <w:tc>
@@ -5704,6 +5916,7 @@
                 <w:lang w:val="en-US"/>
               </w:rPr>
             </w:pPr>
+            <w:proofErr w:type="spellStart"/>
             <w:r>
               <w:rPr>
                 <w:sz w:val="28"/>
@@ -5712,6 +5925,7 @@
               </w:rPr>
               <w:t>Pack_ID</w:t>
             </w:r>
+            <w:proofErr w:type="spellEnd"/>
           </w:p>
         </w:tc>
         <w:tc>
@@ -6027,6 +6241,7 @@
                 <w:lang w:val="en-US"/>
               </w:rPr>
             </w:pPr>
+            <w:proofErr w:type="spellStart"/>
             <w:r>
               <w:rPr>
                 <w:sz w:val="28"/>
@@ -6035,28 +6250,39 @@
               </w:rPr>
               <w:t>Unit_price</w:t>
             </w:r>
-          </w:p>
-        </w:tc>
-        <w:tc>
-          <w:tcPr>
-            <w:tcW w:w="2506" w:type="dxa"/>
-          </w:tcPr>
-          <w:p>
-            <w:pPr>
-              <w:jc w:val="both"/>
-              <w:rPr>
-                <w:sz w:val="28"/>
-                <w:szCs w:val="28"/>
-                <w:lang w:val="en-US"/>
-              </w:rPr>
-            </w:pPr>
-            <w:r>
-              <w:rPr>
-                <w:sz w:val="28"/>
-                <w:szCs w:val="28"/>
-                <w:lang w:val="en-US"/>
-              </w:rPr>
-              <w:t>DECIMAL(19,4)</w:t>
+            <w:proofErr w:type="spellEnd"/>
+          </w:p>
+        </w:tc>
+        <w:tc>
+          <w:tcPr>
+            <w:tcW w:w="2506" w:type="dxa"/>
+          </w:tcPr>
+          <w:p>
+            <w:pPr>
+              <w:jc w:val="both"/>
+              <w:rPr>
+                <w:sz w:val="28"/>
+                <w:szCs w:val="28"/>
+                <w:lang w:val="en-US"/>
+              </w:rPr>
+            </w:pPr>
+            <w:proofErr w:type="gramStart"/>
+            <w:r>
+              <w:rPr>
+                <w:sz w:val="28"/>
+                <w:szCs w:val="28"/>
+                <w:lang w:val="en-US"/>
+              </w:rPr>
+              <w:t>DECIMAL(</w:t>
+            </w:r>
+            <w:proofErr w:type="gramEnd"/>
+            <w:r>
+              <w:rPr>
+                <w:sz w:val="28"/>
+                <w:szCs w:val="28"/>
+                <w:lang w:val="en-US"/>
+              </w:rPr>
+              <w:t>19,4)</w:t>
             </w:r>
           </w:p>
         </w:tc>
@@ -6119,6 +6345,7 @@
                 <w:lang w:val="en-US"/>
               </w:rPr>
             </w:pPr>
+            <w:proofErr w:type="spellStart"/>
             <w:r>
               <w:rPr>
                 <w:sz w:val="28"/>
@@ -6135,6 +6362,7 @@
               </w:rPr>
               <w:t>s</w:t>
             </w:r>
+            <w:proofErr w:type="spellEnd"/>
           </w:p>
         </w:tc>
         <w:tc>
@@ -6392,6 +6620,7 @@
                 <w:szCs w:val="28"/>
               </w:rPr>
             </w:pPr>
+            <w:proofErr w:type="spellStart"/>
             <w:r>
               <w:rPr>
                 <w:sz w:val="28"/>
@@ -6400,6 +6629,7 @@
               </w:rPr>
               <w:t>CompletedOperatorTasks</w:t>
             </w:r>
+            <w:proofErr w:type="spellEnd"/>
           </w:p>
         </w:tc>
         <w:tc>
@@ -6460,6 +6690,7 @@
                 <w:lang w:val="en-US"/>
               </w:rPr>
             </w:pPr>
+            <w:proofErr w:type="spellStart"/>
             <w:r>
               <w:rPr>
                 <w:sz w:val="28"/>
@@ -6468,6 +6699,7 @@
               </w:rPr>
               <w:t>MonthlyFinancialSummary</w:t>
             </w:r>
+            <w:proofErr w:type="spellEnd"/>
           </w:p>
         </w:tc>
         <w:tc>
@@ -6510,8 +6742,18 @@
                 <w:szCs w:val="28"/>
                 <w:lang w:val="en-US"/>
               </w:rPr>
-              <w:t>Products, Pack, Pack_items</w:t>
-            </w:r>
+              <w:t xml:space="preserve">Products, Pack, </w:t>
+            </w:r>
+            <w:proofErr w:type="spellStart"/>
+            <w:r>
+              <w:rPr>
+                <w:sz w:val="28"/>
+                <w:szCs w:val="28"/>
+                <w:lang w:val="en-US"/>
+              </w:rPr>
+              <w:t>Pack_items</w:t>
+            </w:r>
+            <w:proofErr w:type="spellEnd"/>
           </w:p>
         </w:tc>
       </w:tr>
@@ -6724,6 +6966,7 @@
                 <w:szCs w:val="28"/>
               </w:rPr>
             </w:pPr>
+            <w:proofErr w:type="spellStart"/>
             <w:r>
               <w:rPr>
                 <w:sz w:val="28"/>
@@ -6732,6 +6975,7 @@
               </w:rPr>
               <w:t>IX_Users_Email</w:t>
             </w:r>
+            <w:proofErr w:type="spellEnd"/>
           </w:p>
         </w:tc>
         <w:tc>
@@ -6793,6 +7037,7 @@
                 <w:lang w:val="en-US"/>
               </w:rPr>
             </w:pPr>
+            <w:proofErr w:type="spellStart"/>
             <w:r>
               <w:rPr>
                 <w:sz w:val="28"/>
@@ -6802,6 +7047,7 @@
               <w:lastRenderedPageBreak/>
               <w:t>IX_Users_Role</w:t>
             </w:r>
+            <w:proofErr w:type="spellEnd"/>
           </w:p>
         </w:tc>
         <w:tc>
@@ -6864,6 +7110,7 @@
                 <w:lang w:val="en-US"/>
               </w:rPr>
             </w:pPr>
+            <w:proofErr w:type="spellStart"/>
             <w:r>
               <w:rPr>
                 <w:sz w:val="28"/>
@@ -6872,6 +7119,7 @@
               </w:rPr>
               <w:t>IX_Products_StockID</w:t>
             </w:r>
+            <w:proofErr w:type="spellEnd"/>
           </w:p>
         </w:tc>
         <w:tc>
@@ -6934,6 +7182,7 @@
                 <w:lang w:val="en-US"/>
               </w:rPr>
             </w:pPr>
+            <w:proofErr w:type="spellStart"/>
             <w:r>
               <w:rPr>
                 <w:sz w:val="28"/>
@@ -6942,6 +7191,7 @@
               </w:rPr>
               <w:t>IX_Products_Name</w:t>
             </w:r>
+            <w:proofErr w:type="spellEnd"/>
           </w:p>
         </w:tc>
         <w:tc>
@@ -7004,6 +7254,7 @@
                 <w:lang w:val="en-US"/>
               </w:rPr>
             </w:pPr>
+            <w:proofErr w:type="spellStart"/>
             <w:r>
               <w:rPr>
                 <w:sz w:val="28"/>
@@ -7012,6 +7263,7 @@
               </w:rPr>
               <w:t>IX_Tasks_Users_Completed</w:t>
             </w:r>
+            <w:proofErr w:type="spellEnd"/>
           </w:p>
         </w:tc>
         <w:tc>
@@ -7074,6 +7326,7 @@
                 <w:lang w:val="en-US"/>
               </w:rPr>
             </w:pPr>
+            <w:proofErr w:type="spellStart"/>
             <w:r>
               <w:rPr>
                 <w:sz w:val="28"/>
@@ -7082,6 +7335,7 @@
               </w:rPr>
               <w:t>IX_OrderItems_OrderID</w:t>
             </w:r>
+            <w:proofErr w:type="spellEnd"/>
           </w:p>
         </w:tc>
         <w:tc>
@@ -7119,6 +7373,7 @@
                 <w:lang w:val="en-US"/>
               </w:rPr>
             </w:pPr>
+            <w:proofErr w:type="spellStart"/>
             <w:r>
               <w:rPr>
                 <w:sz w:val="28"/>
@@ -7127,6 +7382,7 @@
               </w:rPr>
               <w:t>Order_items</w:t>
             </w:r>
+            <w:proofErr w:type="spellEnd"/>
           </w:p>
         </w:tc>
       </w:tr>
@@ -7144,6 +7400,7 @@
                 <w:lang w:val="de-DE"/>
               </w:rPr>
             </w:pPr>
+            <w:proofErr w:type="spellStart"/>
             <w:r>
               <w:rPr>
                 <w:sz w:val="28"/>
@@ -7152,6 +7409,7 @@
               </w:rPr>
               <w:t>IX_OrderItems_ProductID</w:t>
             </w:r>
+            <w:proofErr w:type="spellEnd"/>
           </w:p>
         </w:tc>
         <w:tc>
@@ -7189,6 +7447,7 @@
                 <w:lang w:val="en-US"/>
               </w:rPr>
             </w:pPr>
+            <w:proofErr w:type="spellStart"/>
             <w:r>
               <w:rPr>
                 <w:sz w:val="28"/>
@@ -7197,6 +7456,7 @@
               </w:rPr>
               <w:t>Order_items</w:t>
             </w:r>
+            <w:proofErr w:type="spellEnd"/>
           </w:p>
         </w:tc>
       </w:tr>
@@ -7341,6 +7601,7 @@
                 <w:szCs w:val="28"/>
               </w:rPr>
             </w:pPr>
+            <w:proofErr w:type="spellStart"/>
             <w:r>
               <w:rPr>
                 <w:rFonts w:eastAsiaTheme="minorHAnsi"/>
@@ -7351,6 +7612,7 @@
               </w:rPr>
               <w:t>trg_UpdateStockCapacity</w:t>
             </w:r>
+            <w:proofErr w:type="spellEnd"/>
           </w:p>
         </w:tc>
         <w:tc>
@@ -7575,6 +7837,7 @@
                 <w:lang w:val="en-US"/>
               </w:rPr>
             </w:pPr>
+            <w:proofErr w:type="spellStart"/>
             <w:r>
               <w:rPr>
                 <w:sz w:val="28"/>
@@ -7583,6 +7846,7 @@
               </w:rPr>
               <w:t>fn_GetStockStatus</w:t>
             </w:r>
+            <w:proofErr w:type="spellEnd"/>
           </w:p>
         </w:tc>
         <w:tc>
@@ -7668,15 +7932,15 @@
         <w:tblLook w:val="04A0" w:firstRow="1" w:lastRow="0" w:firstColumn="1" w:lastColumn="0" w:noHBand="0" w:noVBand="1"/>
       </w:tblPr>
       <w:tblGrid>
-        <w:gridCol w:w="2506"/>
-        <w:gridCol w:w="2506"/>
-        <w:gridCol w:w="2506"/>
-        <w:gridCol w:w="2507"/>
+        <w:gridCol w:w="1704"/>
+        <w:gridCol w:w="4248"/>
+        <w:gridCol w:w="2153"/>
+        <w:gridCol w:w="1920"/>
       </w:tblGrid>
       <w:tr>
         <w:tc>
           <w:tcPr>
-            <w:tcW w:w="2506" w:type="dxa"/>
+            <w:tcW w:w="1950" w:type="dxa"/>
           </w:tcPr>
           <w:p>
             <w:pPr>
@@ -7700,7 +7964,7 @@
         </w:tc>
         <w:tc>
           <w:tcPr>
-            <w:tcW w:w="2506" w:type="dxa"/>
+            <w:tcW w:w="3148" w:type="dxa"/>
           </w:tcPr>
           <w:p>
             <w:pPr>
@@ -7724,7 +7988,7 @@
         </w:tc>
         <w:tc>
           <w:tcPr>
-            <w:tcW w:w="2506" w:type="dxa"/>
+            <w:tcW w:w="3292" w:type="dxa"/>
           </w:tcPr>
           <w:p>
             <w:pPr>
@@ -7748,7 +8012,7 @@
         </w:tc>
         <w:tc>
           <w:tcPr>
-            <w:tcW w:w="2507" w:type="dxa"/>
+            <w:tcW w:w="1635" w:type="dxa"/>
           </w:tcPr>
           <w:p>
             <w:pPr>
@@ -7774,7 +8038,7 @@
       <w:tr>
         <w:tc>
           <w:tcPr>
-            <w:tcW w:w="2506" w:type="dxa"/>
+            <w:tcW w:w="1950" w:type="dxa"/>
           </w:tcPr>
           <w:p>
             <w:pPr>
@@ -7799,7 +8063,7 @@
         </w:tc>
         <w:tc>
           <w:tcPr>
-            <w:tcW w:w="2506" w:type="dxa"/>
+            <w:tcW w:w="3148" w:type="dxa"/>
           </w:tcPr>
           <w:p>
             <w:pPr>
@@ -7812,6 +8076,7 @@
                 <w:lang w:val="en-US"/>
               </w:rPr>
             </w:pPr>
+            <w:proofErr w:type="spellStart"/>
             <w:r>
               <w:rPr>
                 <w:sz w:val="28"/>
@@ -7820,11 +8085,12 @@
               </w:rPr>
               <w:t>fn_CanFulfillOrder</w:t>
             </w:r>
-          </w:p>
-        </w:tc>
-        <w:tc>
-          <w:tcPr>
-            <w:tcW w:w="2506" w:type="dxa"/>
+            <w:proofErr w:type="spellEnd"/>
+          </w:p>
+        </w:tc>
+        <w:tc>
+          <w:tcPr>
+            <w:tcW w:w="3292" w:type="dxa"/>
           </w:tcPr>
           <w:p>
             <w:pPr>
@@ -7854,7 +8120,7 @@
         </w:tc>
         <w:tc>
           <w:tcPr>
-            <w:tcW w:w="2507" w:type="dxa"/>
+            <w:tcW w:w="1635" w:type="dxa"/>
           </w:tcPr>
           <w:p>
             <w:pPr>
@@ -7873,15 +8139,25 @@
                 <w:szCs w:val="28"/>
                 <w:lang w:val="en-US"/>
               </w:rPr>
-              <w:t>Products, OrderItems</w:t>
-            </w:r>
+              <w:t xml:space="preserve">Products, </w:t>
+            </w:r>
+            <w:proofErr w:type="spellStart"/>
+            <w:r>
+              <w:rPr>
+                <w:sz w:val="28"/>
+                <w:szCs w:val="28"/>
+                <w:lang w:val="en-US"/>
+              </w:rPr>
+              <w:t>OrderItems</w:t>
+            </w:r>
+            <w:proofErr w:type="spellEnd"/>
           </w:p>
         </w:tc>
       </w:tr>
       <w:tr>
         <w:tc>
           <w:tcPr>
-            <w:tcW w:w="2506" w:type="dxa"/>
+            <w:tcW w:w="1950" w:type="dxa"/>
           </w:tcPr>
           <w:p>
             <w:pPr>
@@ -7891,13 +8167,22 @@
               <w:rPr>
                 <w:sz w:val="28"/>
                 <w:szCs w:val="28"/>
-              </w:rPr>
-            </w:pPr>
-          </w:p>
-        </w:tc>
-        <w:tc>
-          <w:tcPr>
-            <w:tcW w:w="2506" w:type="dxa"/>
+                <w:lang w:val="en-US"/>
+              </w:rPr>
+            </w:pPr>
+            <w:r>
+              <w:rPr>
+                <w:sz w:val="28"/>
+                <w:szCs w:val="28"/>
+                <w:lang w:val="en-US"/>
+              </w:rPr>
+              <w:t>FUNCTION</w:t>
+            </w:r>
+          </w:p>
+        </w:tc>
+        <w:tc>
+          <w:tcPr>
+            <w:tcW w:w="3148" w:type="dxa"/>
           </w:tcPr>
           <w:p>
             <w:pPr>
@@ -7907,13 +8192,24 @@
               <w:rPr>
                 <w:sz w:val="28"/>
                 <w:szCs w:val="28"/>
-              </w:rPr>
-            </w:pPr>
-          </w:p>
-        </w:tc>
-        <w:tc>
-          <w:tcPr>
-            <w:tcW w:w="2506" w:type="dxa"/>
+                <w:lang w:val="en-US"/>
+              </w:rPr>
+            </w:pPr>
+            <w:proofErr w:type="spellStart"/>
+            <w:r>
+              <w:rPr>
+                <w:sz w:val="28"/>
+                <w:szCs w:val="28"/>
+                <w:lang w:val="en-US"/>
+              </w:rPr>
+              <w:t>fn_CalculateOrderTotal</w:t>
+            </w:r>
+            <w:proofErr w:type="spellEnd"/>
+          </w:p>
+        </w:tc>
+        <w:tc>
+          <w:tcPr>
+            <w:tcW w:w="3292" w:type="dxa"/>
           </w:tcPr>
           <w:p>
             <w:pPr>
@@ -7925,11 +8221,18 @@
                 <w:szCs w:val="28"/>
               </w:rPr>
             </w:pPr>
-          </w:p>
-        </w:tc>
-        <w:tc>
-          <w:tcPr>
-            <w:tcW w:w="2507" w:type="dxa"/>
+            <w:r>
+              <w:rPr>
+                <w:sz w:val="28"/>
+                <w:szCs w:val="28"/>
+              </w:rPr>
+              <w:t>Подсчитать сумму заказа, передаваемого в сборку</w:t>
+            </w:r>
+          </w:p>
+        </w:tc>
+        <w:tc>
+          <w:tcPr>
+            <w:tcW w:w="1635" w:type="dxa"/>
           </w:tcPr>
           <w:p>
             <w:pPr>
@@ -7939,15 +8242,34 @@
               <w:rPr>
                 <w:sz w:val="28"/>
                 <w:szCs w:val="28"/>
-              </w:rPr>
-            </w:pPr>
+                <w:lang w:val="en-US"/>
+              </w:rPr>
+            </w:pPr>
+            <w:r>
+              <w:rPr>
+                <w:sz w:val="28"/>
+                <w:szCs w:val="28"/>
+                <w:lang w:val="en-US"/>
+              </w:rPr>
+              <w:t xml:space="preserve">Pack, </w:t>
+            </w:r>
+            <w:proofErr w:type="spellStart"/>
+            <w:r>
+              <w:rPr>
+                <w:sz w:val="28"/>
+                <w:szCs w:val="28"/>
+                <w:lang w:val="en-US"/>
+              </w:rPr>
+              <w:t>Pack_items</w:t>
+            </w:r>
+            <w:proofErr w:type="spellEnd"/>
           </w:p>
         </w:tc>
       </w:tr>
       <w:tr>
         <w:tc>
           <w:tcPr>
-            <w:tcW w:w="2506" w:type="dxa"/>
+            <w:tcW w:w="1950" w:type="dxa"/>
           </w:tcPr>
           <w:p>
             <w:pPr>
@@ -7957,13 +8279,22 @@
               <w:rPr>
                 <w:sz w:val="28"/>
                 <w:szCs w:val="28"/>
-              </w:rPr>
-            </w:pPr>
-          </w:p>
-        </w:tc>
-        <w:tc>
-          <w:tcPr>
-            <w:tcW w:w="2506" w:type="dxa"/>
+                <w:lang w:val="en-US"/>
+              </w:rPr>
+            </w:pPr>
+            <w:r>
+              <w:rPr>
+                <w:sz w:val="28"/>
+                <w:szCs w:val="28"/>
+                <w:lang w:val="en-US"/>
+              </w:rPr>
+              <w:t>PROCEDURE</w:t>
+            </w:r>
+          </w:p>
+        </w:tc>
+        <w:tc>
+          <w:tcPr>
+            <w:tcW w:w="3148" w:type="dxa"/>
           </w:tcPr>
           <w:p>
             <w:pPr>
@@ -7973,13 +8304,24 @@
               <w:rPr>
                 <w:sz w:val="28"/>
                 <w:szCs w:val="28"/>
-              </w:rPr>
-            </w:pPr>
-          </w:p>
-        </w:tc>
-        <w:tc>
-          <w:tcPr>
-            <w:tcW w:w="2506" w:type="dxa"/>
+                <w:lang w:val="en-US"/>
+              </w:rPr>
+            </w:pPr>
+            <w:proofErr w:type="spellStart"/>
+            <w:r>
+              <w:rPr>
+                <w:sz w:val="28"/>
+                <w:szCs w:val="28"/>
+                <w:lang w:val="en-US"/>
+              </w:rPr>
+              <w:t>sp_DispatchProduct</w:t>
+            </w:r>
+            <w:proofErr w:type="spellEnd"/>
+          </w:p>
+        </w:tc>
+        <w:tc>
+          <w:tcPr>
+            <w:tcW w:w="3292" w:type="dxa"/>
           </w:tcPr>
           <w:p>
             <w:pPr>
@@ -7991,11 +8333,18 @@
                 <w:szCs w:val="28"/>
               </w:rPr>
             </w:pPr>
-          </w:p>
-        </w:tc>
-        <w:tc>
-          <w:tcPr>
-            <w:tcW w:w="2507" w:type="dxa"/>
+            <w:r>
+              <w:rPr>
+                <w:sz w:val="28"/>
+                <w:szCs w:val="28"/>
+              </w:rPr>
+              <w:t>Обновить количество продуктов в стоке при их перемещении оттуда</w:t>
+            </w:r>
+          </w:p>
+        </w:tc>
+        <w:tc>
+          <w:tcPr>
+            <w:tcW w:w="1635" w:type="dxa"/>
           </w:tcPr>
           <w:p>
             <w:pPr>
@@ -8005,17 +8354,547 @@
               <w:rPr>
                 <w:sz w:val="28"/>
                 <w:szCs w:val="28"/>
-              </w:rPr>
-            </w:pPr>
+                <w:lang w:val="en-US"/>
+              </w:rPr>
+            </w:pPr>
+            <w:r>
+              <w:rPr>
+                <w:sz w:val="28"/>
+                <w:szCs w:val="28"/>
+                <w:lang w:val="en-US"/>
+              </w:rPr>
+              <w:t>Products, Stock</w:t>
+            </w:r>
+          </w:p>
+        </w:tc>
+      </w:tr>
+      <w:tr>
+        <w:tc>
+          <w:tcPr>
+            <w:tcW w:w="1950" w:type="dxa"/>
+          </w:tcPr>
+          <w:p>
+            <w:pPr>
+              <w:tabs>
+                <w:tab w:val="left" w:pos="1728"/>
+              </w:tabs>
+              <w:rPr>
+                <w:sz w:val="28"/>
+                <w:szCs w:val="28"/>
+                <w:lang w:val="en-US"/>
+              </w:rPr>
+            </w:pPr>
+            <w:r>
+              <w:rPr>
+                <w:sz w:val="28"/>
+                <w:szCs w:val="28"/>
+                <w:lang w:val="en-US"/>
+              </w:rPr>
+              <w:t>FUNCTION</w:t>
+            </w:r>
+          </w:p>
+        </w:tc>
+        <w:tc>
+          <w:tcPr>
+            <w:tcW w:w="3148" w:type="dxa"/>
+          </w:tcPr>
+          <w:p>
+            <w:pPr>
+              <w:tabs>
+                <w:tab w:val="left" w:pos="1728"/>
+              </w:tabs>
+              <w:rPr>
+                <w:sz w:val="28"/>
+                <w:szCs w:val="28"/>
+                <w:lang w:val="en-US"/>
+              </w:rPr>
+            </w:pPr>
+            <w:proofErr w:type="spellStart"/>
+            <w:r>
+              <w:rPr>
+                <w:sz w:val="28"/>
+                <w:szCs w:val="28"/>
+                <w:lang w:val="en-US"/>
+              </w:rPr>
+              <w:t>fn_GetUsersTasksSummary</w:t>
+            </w:r>
+            <w:proofErr w:type="spellEnd"/>
+          </w:p>
+        </w:tc>
+        <w:tc>
+          <w:tcPr>
+            <w:tcW w:w="3292" w:type="dxa"/>
+          </w:tcPr>
+          <w:p>
+            <w:pPr>
+              <w:tabs>
+                <w:tab w:val="left" w:pos="1728"/>
+              </w:tabs>
+              <w:rPr>
+                <w:sz w:val="28"/>
+                <w:szCs w:val="28"/>
+              </w:rPr>
+            </w:pPr>
+            <w:r>
+              <w:rPr>
+                <w:sz w:val="28"/>
+                <w:szCs w:val="28"/>
+              </w:rPr>
+              <w:t>Получить статистику эффективности пользователя</w:t>
+            </w:r>
+          </w:p>
+        </w:tc>
+        <w:tc>
+          <w:tcPr>
+            <w:tcW w:w="1635" w:type="dxa"/>
+          </w:tcPr>
+          <w:p>
+            <w:pPr>
+              <w:tabs>
+                <w:tab w:val="left" w:pos="1728"/>
+              </w:tabs>
+              <w:rPr>
+                <w:sz w:val="28"/>
+                <w:szCs w:val="28"/>
+                <w:lang w:val="en-US"/>
+              </w:rPr>
+            </w:pPr>
+            <w:r>
+              <w:rPr>
+                <w:sz w:val="28"/>
+                <w:szCs w:val="28"/>
+                <w:lang w:val="en-US"/>
+              </w:rPr>
+              <w:t>Users, Tasks</w:t>
+            </w:r>
+          </w:p>
+        </w:tc>
+      </w:tr>
+      <w:tr>
+        <w:tc>
+          <w:tcPr>
+            <w:tcW w:w="1950" w:type="dxa"/>
+          </w:tcPr>
+          <w:p>
+            <w:pPr>
+              <w:tabs>
+                <w:tab w:val="left" w:pos="1728"/>
+              </w:tabs>
+              <w:rPr>
+                <w:sz w:val="28"/>
+                <w:szCs w:val="28"/>
+                <w:lang w:val="en-US"/>
+              </w:rPr>
+            </w:pPr>
+            <w:r>
+              <w:rPr>
+                <w:sz w:val="28"/>
+                <w:szCs w:val="28"/>
+                <w:lang w:val="en-US"/>
+              </w:rPr>
+              <w:t>PROCEDURE</w:t>
+            </w:r>
+          </w:p>
+        </w:tc>
+        <w:tc>
+          <w:tcPr>
+            <w:tcW w:w="3148" w:type="dxa"/>
+          </w:tcPr>
+          <w:p>
+            <w:pPr>
+              <w:tabs>
+                <w:tab w:val="left" w:pos="1728"/>
+              </w:tabs>
+              <w:rPr>
+                <w:sz w:val="28"/>
+                <w:szCs w:val="28"/>
+                <w:lang w:val="en-US"/>
+              </w:rPr>
+            </w:pPr>
+            <w:proofErr w:type="spellStart"/>
+            <w:r>
+              <w:rPr>
+                <w:sz w:val="28"/>
+                <w:szCs w:val="28"/>
+                <w:lang w:val="en-US"/>
+              </w:rPr>
+              <w:t>sp_AdjustStockCapacity</w:t>
+            </w:r>
+            <w:proofErr w:type="spellEnd"/>
+          </w:p>
+        </w:tc>
+        <w:tc>
+          <w:tcPr>
+            <w:tcW w:w="3292" w:type="dxa"/>
+          </w:tcPr>
+          <w:p>
+            <w:pPr>
+              <w:tabs>
+                <w:tab w:val="left" w:pos="1728"/>
+              </w:tabs>
+              <w:rPr>
+                <w:sz w:val="28"/>
+                <w:szCs w:val="28"/>
+              </w:rPr>
+            </w:pPr>
+            <w:r>
+              <w:rPr>
+                <w:sz w:val="28"/>
+                <w:szCs w:val="28"/>
+              </w:rPr>
+              <w:t>Изменить вместимость хранилища(стока)</w:t>
+            </w:r>
+          </w:p>
+        </w:tc>
+        <w:tc>
+          <w:tcPr>
+            <w:tcW w:w="1635" w:type="dxa"/>
+          </w:tcPr>
+          <w:p>
+            <w:pPr>
+              <w:tabs>
+                <w:tab w:val="left" w:pos="1728"/>
+              </w:tabs>
+              <w:rPr>
+                <w:sz w:val="28"/>
+                <w:szCs w:val="28"/>
+                <w:lang w:val="en-US"/>
+              </w:rPr>
+            </w:pPr>
+            <w:r>
+              <w:rPr>
+                <w:sz w:val="28"/>
+                <w:szCs w:val="28"/>
+                <w:lang w:val="en-US"/>
+              </w:rPr>
+              <w:t>Stocks</w:t>
+            </w:r>
+          </w:p>
+        </w:tc>
+      </w:tr>
+      <w:tr>
+        <w:tc>
+          <w:tcPr>
+            <w:tcW w:w="1950" w:type="dxa"/>
+          </w:tcPr>
+          <w:p>
+            <w:pPr>
+              <w:tabs>
+                <w:tab w:val="left" w:pos="1728"/>
+              </w:tabs>
+              <w:rPr>
+                <w:sz w:val="28"/>
+                <w:szCs w:val="28"/>
+                <w:lang w:val="en-US"/>
+              </w:rPr>
+            </w:pPr>
+            <w:r>
+              <w:rPr>
+                <w:sz w:val="28"/>
+                <w:szCs w:val="28"/>
+                <w:lang w:val="en-US"/>
+              </w:rPr>
+              <w:t>FUNCTION</w:t>
+            </w:r>
+          </w:p>
+        </w:tc>
+        <w:tc>
+          <w:tcPr>
+            <w:tcW w:w="3148" w:type="dxa"/>
+          </w:tcPr>
+          <w:p>
+            <w:pPr>
+              <w:tabs>
+                <w:tab w:val="left" w:pos="1728"/>
+              </w:tabs>
+              <w:rPr>
+                <w:sz w:val="28"/>
+                <w:szCs w:val="28"/>
+                <w:lang w:val="en-US"/>
+              </w:rPr>
+            </w:pPr>
+            <w:proofErr w:type="spellStart"/>
+            <w:r>
+              <w:rPr>
+                <w:sz w:val="28"/>
+                <w:szCs w:val="28"/>
+                <w:lang w:val="en-US"/>
+              </w:rPr>
+              <w:t>Fn_GetMonthlyProductFinancials</w:t>
+            </w:r>
+            <w:proofErr w:type="spellEnd"/>
+          </w:p>
+        </w:tc>
+        <w:tc>
+          <w:tcPr>
+            <w:tcW w:w="3292" w:type="dxa"/>
+          </w:tcPr>
+          <w:p>
+            <w:pPr>
+              <w:tabs>
+                <w:tab w:val="left" w:pos="1728"/>
+              </w:tabs>
+              <w:rPr>
+                <w:sz w:val="28"/>
+                <w:szCs w:val="28"/>
+              </w:rPr>
+            </w:pPr>
+            <w:r>
+              <w:rPr>
+                <w:sz w:val="28"/>
+                <w:szCs w:val="28"/>
+              </w:rPr>
+              <w:t>Получить отчёт по продажам за определённый месяц и год</w:t>
+            </w:r>
+          </w:p>
+        </w:tc>
+        <w:tc>
+          <w:tcPr>
+            <w:tcW w:w="1635" w:type="dxa"/>
+          </w:tcPr>
+          <w:p>
+            <w:pPr>
+              <w:tabs>
+                <w:tab w:val="left" w:pos="1728"/>
+              </w:tabs>
+              <w:rPr>
+                <w:sz w:val="28"/>
+                <w:szCs w:val="28"/>
+                <w:lang w:val="en-US"/>
+              </w:rPr>
+            </w:pPr>
+            <w:r>
+              <w:rPr>
+                <w:sz w:val="28"/>
+                <w:szCs w:val="28"/>
+                <w:lang w:val="en-US"/>
+              </w:rPr>
+              <w:t xml:space="preserve">Products, </w:t>
+            </w:r>
+            <w:proofErr w:type="spellStart"/>
+            <w:r>
+              <w:rPr>
+                <w:sz w:val="28"/>
+                <w:szCs w:val="28"/>
+                <w:lang w:val="en-US"/>
+              </w:rPr>
+              <w:t>Pack_</w:t>
+            </w:r>
+            <w:proofErr w:type="gramStart"/>
+            <w:r>
+              <w:rPr>
+                <w:sz w:val="28"/>
+                <w:szCs w:val="28"/>
+                <w:lang w:val="en-US"/>
+              </w:rPr>
+              <w:t>items,Pack</w:t>
+            </w:r>
+            <w:proofErr w:type="spellEnd"/>
+            <w:proofErr w:type="gramEnd"/>
+          </w:p>
+        </w:tc>
+      </w:tr>
+      <w:tr>
+        <w:tc>
+          <w:tcPr>
+            <w:tcW w:w="1950" w:type="dxa"/>
+          </w:tcPr>
+          <w:p>
+            <w:pPr>
+              <w:tabs>
+                <w:tab w:val="left" w:pos="1728"/>
+              </w:tabs>
+              <w:rPr>
+                <w:sz w:val="28"/>
+                <w:szCs w:val="28"/>
+                <w:lang w:val="en-US"/>
+              </w:rPr>
+            </w:pPr>
+            <w:r>
+              <w:rPr>
+                <w:sz w:val="28"/>
+                <w:szCs w:val="28"/>
+                <w:lang w:val="en-US"/>
+              </w:rPr>
+              <w:t>PROCEDURE</w:t>
+            </w:r>
+          </w:p>
+        </w:tc>
+        <w:tc>
+          <w:tcPr>
+            <w:tcW w:w="3148" w:type="dxa"/>
+          </w:tcPr>
+          <w:p>
+            <w:pPr>
+              <w:tabs>
+                <w:tab w:val="left" w:pos="1728"/>
+              </w:tabs>
+              <w:rPr>
+                <w:sz w:val="28"/>
+                <w:szCs w:val="28"/>
+                <w:lang w:val="en-US"/>
+              </w:rPr>
+            </w:pPr>
+            <w:proofErr w:type="spellStart"/>
+            <w:r>
+              <w:rPr>
+                <w:sz w:val="28"/>
+                <w:szCs w:val="28"/>
+                <w:lang w:val="en-US"/>
+              </w:rPr>
+              <w:t>Sp_GenerateWarehouseFinancialReport</w:t>
+            </w:r>
+            <w:proofErr w:type="spellEnd"/>
+          </w:p>
+        </w:tc>
+        <w:tc>
+          <w:tcPr>
+            <w:tcW w:w="3292" w:type="dxa"/>
+          </w:tcPr>
+          <w:p>
+            <w:pPr>
+              <w:tabs>
+                <w:tab w:val="left" w:pos="1728"/>
+              </w:tabs>
+              <w:rPr>
+                <w:sz w:val="28"/>
+                <w:szCs w:val="28"/>
+              </w:rPr>
+            </w:pPr>
+            <w:r>
+              <w:rPr>
+                <w:sz w:val="28"/>
+                <w:szCs w:val="28"/>
+              </w:rPr>
+              <w:t>Получить полный финансовый отчёт со сравнением показателей</w:t>
+            </w:r>
+          </w:p>
+        </w:tc>
+        <w:tc>
+          <w:tcPr>
+            <w:tcW w:w="1635" w:type="dxa"/>
+          </w:tcPr>
+          <w:p>
+            <w:pPr>
+              <w:tabs>
+                <w:tab w:val="left" w:pos="1728"/>
+              </w:tabs>
+              <w:rPr>
+                <w:sz w:val="28"/>
+                <w:szCs w:val="28"/>
+                <w:lang w:val="en-US"/>
+              </w:rPr>
+            </w:pPr>
+            <w:proofErr w:type="spellStart"/>
+            <w:r>
+              <w:rPr>
+                <w:sz w:val="28"/>
+                <w:szCs w:val="28"/>
+                <w:lang w:val="en-US"/>
+              </w:rPr>
+              <w:t>Pack_items</w:t>
+            </w:r>
+            <w:proofErr w:type="spellEnd"/>
+            <w:r>
+              <w:rPr>
+                <w:sz w:val="28"/>
+                <w:szCs w:val="28"/>
+                <w:lang w:val="en-US"/>
+              </w:rPr>
+              <w:t xml:space="preserve">, Pack, Orders, Products, </w:t>
+            </w:r>
           </w:p>
         </w:tc>
       </w:tr>
     </w:tbl>
     <w:p>
       <w:pPr>
-        <w:tabs>
-          <w:tab w:val="left" w:pos="1728"/>
-        </w:tabs>
+        <w:spacing w:before="240"/>
+        <w:ind w:firstLine="360"/>
+        <w:jc w:val="both"/>
+        <w:rPr>
+          <w:sz w:val="28"/>
+          <w:szCs w:val="28"/>
+        </w:rPr>
+      </w:pPr>
+      <w:r>
+        <w:rPr>
+          <w:sz w:val="28"/>
+          <w:szCs w:val="28"/>
+        </w:rPr>
+        <w:t>Таким образом, были созданы все необходимые объекты: представления для более удобного доступа к данным, триггеры для необходимой обработки событий с данными в БД, а также процедуры и функции, решающие специфические задачи, отличные от добавления, изменения или удаления.</w:t>
+      </w:r>
+    </w:p>
+    <w:p>
+      <w:pPr>
+        <w:pStyle w:val="1"/>
+        <w:numPr>
+          <w:ilvl w:val="0"/>
+          <w:numId w:val="4"/>
+        </w:numPr>
+        <w:rPr>
+          <w:lang w:val="en-US"/>
+        </w:rPr>
+      </w:pPr>
+      <w:r>
+        <w:lastRenderedPageBreak/>
+        <w:t>Работа</w:t>
+      </w:r>
+      <w:r>
+        <w:rPr>
+          <w:lang w:val="en-US"/>
+        </w:rPr>
+        <w:t xml:space="preserve"> </w:t>
+      </w:r>
+      <w:r>
+        <w:t>с</w:t>
+      </w:r>
+      <w:r>
+        <w:rPr>
+          <w:lang w:val="en-US"/>
+        </w:rPr>
+        <w:t xml:space="preserve"> Oracle</w:t>
+      </w:r>
+      <w:r>
+        <w:rPr>
+          <w:lang w:val="en-US"/>
+        </w:rPr>
+        <w:t xml:space="preserve"> </w:t>
+      </w:r>
+      <w:r>
+        <w:rPr>
+          <w:lang w:val="en-US"/>
+        </w:rPr>
+        <w:t>SQL</w:t>
+      </w:r>
+      <w:r>
+        <w:rPr>
+          <w:lang w:val="en-US"/>
+        </w:rPr>
+        <w:t xml:space="preserve"> </w:t>
+      </w:r>
+      <w:r>
+        <w:rPr>
+          <w:lang w:val="en-US"/>
+        </w:rPr>
+        <w:t>Server</w:t>
+      </w:r>
+    </w:p>
+    <w:p>
+      <w:pPr>
+        <w:pStyle w:val="1"/>
+        <w:numPr>
+          <w:ilvl w:val="1"/>
+          <w:numId w:val="4"/>
+        </w:numPr>
+      </w:pPr>
+      <w:r>
+        <w:t>Список таблиц с указанием атрибутов</w:t>
+      </w:r>
+    </w:p>
+    <w:p>
+      <w:pPr>
+        <w:jc w:val="both"/>
         <w:rPr>
           <w:sz w:val="28"/>
           <w:szCs w:val="28"/>
@@ -8495,6 +9374,127 @@
     </w:lvl>
   </w:abstractNum>
   <w:abstractNum w:abstractNumId="4" w15:restartNumberingAfterBreak="0">
+    <w:nsid w:val="6C751AF0"/>
+    <w:multiLevelType w:val="multilevel"/>
+    <w:tmpl w:val="ED30ED98"/>
+    <w:lvl w:ilvl="0">
+      <w:start w:val="1"/>
+      <w:numFmt w:val="decimal"/>
+      <w:lvlText w:val="%1"/>
+      <w:lvlJc w:val="left"/>
+      <w:pPr>
+        <w:ind w:left="720" w:hanging="360"/>
+      </w:pPr>
+      <w:rPr>
+        <w:rFonts w:hint="default"/>
+      </w:rPr>
+    </w:lvl>
+    <w:lvl w:ilvl="1">
+      <w:start w:val="1"/>
+      <w:numFmt w:val="decimal"/>
+      <w:isLgl/>
+      <w:lvlText w:val="%1.%2"/>
+      <w:lvlJc w:val="left"/>
+      <w:pPr>
+        <w:ind w:left="720" w:hanging="360"/>
+      </w:pPr>
+      <w:rPr>
+        <w:rFonts w:hint="default"/>
+      </w:rPr>
+    </w:lvl>
+    <w:lvl w:ilvl="2">
+      <w:start w:val="1"/>
+      <w:numFmt w:val="decimal"/>
+      <w:isLgl/>
+      <w:lvlText w:val="%1.%2.%3"/>
+      <w:lvlJc w:val="left"/>
+      <w:pPr>
+        <w:ind w:left="1080" w:hanging="720"/>
+      </w:pPr>
+      <w:rPr>
+        <w:rFonts w:hint="default"/>
+      </w:rPr>
+    </w:lvl>
+    <w:lvl w:ilvl="3">
+      <w:start w:val="1"/>
+      <w:numFmt w:val="decimal"/>
+      <w:isLgl/>
+      <w:lvlText w:val="%1.%2.%3.%4"/>
+      <w:lvlJc w:val="left"/>
+      <w:pPr>
+        <w:ind w:left="1440" w:hanging="1080"/>
+      </w:pPr>
+      <w:rPr>
+        <w:rFonts w:hint="default"/>
+      </w:rPr>
+    </w:lvl>
+    <w:lvl w:ilvl="4">
+      <w:start w:val="1"/>
+      <w:numFmt w:val="decimal"/>
+      <w:isLgl/>
+      <w:lvlText w:val="%1.%2.%3.%4.%5"/>
+      <w:lvlJc w:val="left"/>
+      <w:pPr>
+        <w:ind w:left="1440" w:hanging="1080"/>
+      </w:pPr>
+      <w:rPr>
+        <w:rFonts w:hint="default"/>
+      </w:rPr>
+    </w:lvl>
+    <w:lvl w:ilvl="5">
+      <w:start w:val="1"/>
+      <w:numFmt w:val="decimal"/>
+      <w:isLgl/>
+      <w:lvlText w:val="%1.%2.%3.%4.%5.%6"/>
+      <w:lvlJc w:val="left"/>
+      <w:pPr>
+        <w:ind w:left="1800" w:hanging="1440"/>
+      </w:pPr>
+      <w:rPr>
+        <w:rFonts w:hint="default"/>
+      </w:rPr>
+    </w:lvl>
+    <w:lvl w:ilvl="6">
+      <w:start w:val="1"/>
+      <w:numFmt w:val="decimal"/>
+      <w:isLgl/>
+      <w:lvlText w:val="%1.%2.%3.%4.%5.%6.%7"/>
+      <w:lvlJc w:val="left"/>
+      <w:pPr>
+        <w:ind w:left="1800" w:hanging="1440"/>
+      </w:pPr>
+      <w:rPr>
+        <w:rFonts w:hint="default"/>
+      </w:rPr>
+    </w:lvl>
+    <w:lvl w:ilvl="7">
+      <w:start w:val="1"/>
+      <w:numFmt w:val="decimal"/>
+      <w:isLgl/>
+      <w:lvlText w:val="%1.%2.%3.%4.%5.%6.%7.%8"/>
+      <w:lvlJc w:val="left"/>
+      <w:pPr>
+        <w:ind w:left="2160" w:hanging="1800"/>
+      </w:pPr>
+      <w:rPr>
+        <w:rFonts w:hint="default"/>
+      </w:rPr>
+    </w:lvl>
+    <w:lvl w:ilvl="8">
+      <w:start w:val="1"/>
+      <w:numFmt w:val="decimal"/>
+      <w:isLgl/>
+      <w:lvlText w:val="%1.%2.%3.%4.%5.%6.%7.%8.%9"/>
+      <w:lvlJc w:val="left"/>
+      <w:pPr>
+        <w:ind w:left="2520" w:hanging="2160"/>
+      </w:pPr>
+      <w:rPr>
+        <w:rFonts w:hint="default"/>
+      </w:rPr>
+    </w:lvl>
+  </w:abstractNum>
+  <w:abstractNum w:abstractNumId="5" w15:restartNumberingAfterBreak="0">
     <w:nsid w:val="72F611D9"/>
     <w:multiLevelType w:val="hybridMultilevel"/>
     <w:tmpl w:val="DF64BA18"/>
@@ -8590,13 +9590,16 @@
     <w:abstractNumId w:val="3"/>
   </w:num>
   <w:num w:numId="3">
-    <w:abstractNumId w:val="4"/>
+    <w:abstractNumId w:val="5"/>
   </w:num>
   <w:num w:numId="4">
     <w:abstractNumId w:val="0"/>
   </w:num>
   <w:num w:numId="5">
     <w:abstractNumId w:val="1"/>
+  </w:num>
+  <w:num w:numId="6">
+    <w:abstractNumId w:val="4"/>
   </w:num>
 </w:numbering>
 </file>

</xml_diff>

<commit_message>
IADB:lab2 in progress. MSSQL db filled with data, fn and sp fixed. Oracle db filled with data, fn and sp debug in progress
</commit_message>
<xml_diff>
--- a/IADB/Code/Lab_2/Report.docx
+++ b/IADB/Code/Lab_2/Report.docx
@@ -106,29 +106,46 @@
     </w:p>
     <w:p>
       <w:pPr>
+        <w:jc w:val="center"/>
+        <w:rPr>
+          <w:color w:val="000000"/>
+          <w:sz w:val="28"/>
+          <w:szCs w:val="28"/>
+        </w:rPr>
+      </w:pPr>
+      <w:r>
+        <w:rPr>
+          <w:color w:val="000000"/>
+          <w:sz w:val="28"/>
+          <w:szCs w:val="28"/>
+        </w:rPr>
+        <w:t xml:space="preserve">Лабораторная работа </w:t>
+      </w:r>
+      <w:r>
+        <w:rPr>
+          <w:color w:val="000000"/>
+          <w:sz w:val="28"/>
+          <w:szCs w:val="28"/>
+        </w:rPr>
+        <w:t>2</w:t>
+      </w:r>
+    </w:p>
+    <w:p>
+      <w:pPr>
         <w:ind w:firstLine="709"/>
         <w:jc w:val="center"/>
         <w:rPr>
+          <w:sz w:val="28"/>
+          <w:szCs w:val="28"/>
+        </w:rPr>
+      </w:pPr>
+      <w:r>
+        <w:rPr>
           <w:color w:val="000000"/>
           <w:sz w:val="28"/>
           <w:szCs w:val="28"/>
         </w:rPr>
-      </w:pPr>
-      <w:r>
-        <w:rPr>
-          <w:color w:val="000000"/>
-          <w:sz w:val="28"/>
-          <w:szCs w:val="28"/>
-        </w:rPr>
-        <w:t xml:space="preserve">Лабораторная работа </w:t>
-      </w:r>
-      <w:r>
-        <w:rPr>
-          <w:color w:val="000000"/>
-          <w:sz w:val="28"/>
-          <w:szCs w:val="28"/>
-        </w:rPr>
-        <w:t>2</w:t>
+        <w:t>По дисциплине «Проектирование и разработка баз данных интернет-приложений»</w:t>
       </w:r>
     </w:p>
     <w:p>
@@ -136,71 +153,73 @@
         <w:ind w:firstLine="709"/>
         <w:jc w:val="center"/>
         <w:rPr>
-          <w:sz w:val="28"/>
-          <w:szCs w:val="28"/>
-        </w:rPr>
-      </w:pPr>
-      <w:r>
-        <w:rPr>
           <w:color w:val="000000"/>
           <w:sz w:val="28"/>
           <w:szCs w:val="28"/>
         </w:rPr>
-        <w:t>По дисциплине «Проектирование и разработка баз данных интернет-приложений»</w:t>
+      </w:pPr>
+      <w:r>
+        <w:rPr>
+          <w:color w:val="000000"/>
+          <w:sz w:val="28"/>
+          <w:szCs w:val="28"/>
+        </w:rPr>
+        <w:t>На тему «</w:t>
+      </w:r>
+      <w:r>
+        <w:rPr>
+          <w:color w:val="000000"/>
+          <w:sz w:val="28"/>
+          <w:szCs w:val="28"/>
+        </w:rPr>
+        <w:t>Реализация базы данных</w:t>
+      </w:r>
+      <w:r>
+        <w:rPr>
+          <w:color w:val="000000"/>
+          <w:sz w:val="28"/>
+          <w:szCs w:val="28"/>
+        </w:rPr>
+        <w:t>»</w:t>
       </w:r>
     </w:p>
     <w:p>
       <w:pPr>
+        <w:jc w:val="center"/>
+        <w:rPr>
+          <w:color w:val="000000"/>
+          <w:sz w:val="28"/>
+          <w:szCs w:val="28"/>
+        </w:rPr>
+      </w:pPr>
+      <w:r>
+        <w:rPr>
+          <w:color w:val="000000"/>
+          <w:sz w:val="28"/>
+          <w:szCs w:val="28"/>
+        </w:rPr>
+        <w:t>Вариант 12</w:t>
+      </w:r>
+    </w:p>
+    <w:p>
+      <w:pPr>
         <w:ind w:firstLine="709"/>
         <w:jc w:val="center"/>
         <w:rPr>
-          <w:color w:val="000000"/>
-          <w:sz w:val="28"/>
-          <w:szCs w:val="28"/>
-        </w:rPr>
-      </w:pPr>
-      <w:r>
-        <w:rPr>
-          <w:color w:val="000000"/>
-          <w:sz w:val="28"/>
-          <w:szCs w:val="28"/>
-        </w:rPr>
-        <w:t>На тему «</w:t>
-      </w:r>
-      <w:r>
-        <w:rPr>
-          <w:color w:val="000000"/>
-          <w:sz w:val="28"/>
-          <w:szCs w:val="28"/>
-        </w:rPr>
-        <w:t>Реализация базы данных</w:t>
-      </w:r>
-      <w:r>
-        <w:rPr>
-          <w:color w:val="000000"/>
-          <w:sz w:val="28"/>
-          <w:szCs w:val="28"/>
-        </w:rPr>
-        <w:t>»</w:t>
-      </w:r>
+          <w:sz w:val="28"/>
+          <w:szCs w:val="28"/>
+        </w:rPr>
+      </w:pPr>
     </w:p>
     <w:p>
       <w:pPr>
+        <w:ind w:firstLine="709"/>
         <w:jc w:val="center"/>
         <w:rPr>
-          <w:color w:val="000000"/>
-          <w:sz w:val="28"/>
-          <w:szCs w:val="28"/>
-        </w:rPr>
-      </w:pPr>
-      <w:r>
-        <w:rPr>
-          <w:color w:val="000000"/>
-          <w:sz w:val="28"/>
-          <w:szCs w:val="28"/>
-        </w:rPr>
-        <w:t>Вариант 12</w:t>
-      </w:r>
+          <w:sz w:val="28"/>
+          <w:szCs w:val="28"/>
+        </w:rPr>
+      </w:pPr>
     </w:p>
     <w:p>
       <w:pPr>
@@ -237,6 +256,7 @@
         <w:ind w:firstLine="709"/>
         <w:jc w:val="center"/>
         <w:rPr>
+          <w:color w:val="000000"/>
           <w:sz w:val="28"/>
           <w:szCs w:val="28"/>
         </w:rPr>
@@ -247,6 +267,7 @@
         <w:ind w:firstLine="709"/>
         <w:jc w:val="center"/>
         <w:rPr>
+          <w:color w:val="000000"/>
           <w:sz w:val="28"/>
           <w:szCs w:val="28"/>
         </w:rPr>
@@ -279,7 +300,6 @@
         <w:ind w:firstLine="709"/>
         <w:jc w:val="center"/>
         <w:rPr>
-          <w:color w:val="000000"/>
           <w:sz w:val="28"/>
           <w:szCs w:val="28"/>
         </w:rPr>
@@ -290,7 +310,6 @@
         <w:ind w:firstLine="709"/>
         <w:jc w:val="center"/>
         <w:rPr>
-          <w:color w:val="000000"/>
           <w:sz w:val="28"/>
           <w:szCs w:val="28"/>
         </w:rPr>
@@ -301,6 +320,7 @@
         <w:ind w:firstLine="709"/>
         <w:jc w:val="center"/>
         <w:rPr>
+          <w:color w:val="000000"/>
           <w:sz w:val="28"/>
           <w:szCs w:val="28"/>
         </w:rPr>
@@ -311,6 +331,7 @@
         <w:ind w:firstLine="709"/>
         <w:jc w:val="center"/>
         <w:rPr>
+          <w:color w:val="000000"/>
           <w:sz w:val="28"/>
           <w:szCs w:val="28"/>
         </w:rPr>
@@ -352,41 +373,57 @@
     <w:p>
       <w:pPr>
         <w:ind w:firstLine="709"/>
-        <w:jc w:val="center"/>
+        <w:jc w:val="right"/>
+        <w:rPr>
+          <w:sz w:val="28"/>
+          <w:szCs w:val="28"/>
+        </w:rPr>
+      </w:pPr>
+      <w:r>
         <w:rPr>
           <w:color w:val="000000"/>
           <w:sz w:val="28"/>
           <w:szCs w:val="28"/>
         </w:rPr>
-      </w:pPr>
+        <w:t>Выполнил:</w:t>
+      </w:r>
     </w:p>
     <w:p>
       <w:pPr>
         <w:ind w:firstLine="709"/>
-        <w:jc w:val="center"/>
+        <w:jc w:val="right"/>
         <w:rPr>
           <w:color w:val="000000"/>
           <w:sz w:val="28"/>
           <w:szCs w:val="28"/>
         </w:rPr>
       </w:pPr>
+      <w:r>
+        <w:rPr>
+          <w:color w:val="000000"/>
+          <w:sz w:val="28"/>
+          <w:szCs w:val="28"/>
+        </w:rPr>
+        <w:t>Студент 3 курса 6 группы</w:t>
+      </w:r>
     </w:p>
     <w:p>
       <w:pPr>
         <w:ind w:firstLine="709"/>
         <w:jc w:val="right"/>
         <w:rPr>
-          <w:sz w:val="28"/>
-          <w:szCs w:val="28"/>
-        </w:rPr>
-      </w:pPr>
-      <w:r>
-        <w:rPr>
           <w:color w:val="000000"/>
           <w:sz w:val="28"/>
           <w:szCs w:val="28"/>
         </w:rPr>
-        <w:t>Выполнил:</w:t>
+      </w:pPr>
+      <w:r>
+        <w:rPr>
+          <w:color w:val="000000"/>
+          <w:sz w:val="28"/>
+          <w:szCs w:val="28"/>
+        </w:rPr>
+        <w:t>Филипюк Илья Андреевич</w:t>
       </w:r>
     </w:p>
     <w:p>
@@ -394,73 +431,17 @@
         <w:ind w:firstLine="709"/>
         <w:jc w:val="right"/>
         <w:rPr>
+          <w:sz w:val="28"/>
+          <w:szCs w:val="28"/>
+        </w:rPr>
+      </w:pPr>
+      <w:r>
+        <w:rPr>
           <w:color w:val="000000"/>
           <w:sz w:val="28"/>
           <w:szCs w:val="28"/>
         </w:rPr>
-      </w:pPr>
-      <w:r>
-        <w:rPr>
-          <w:color w:val="000000"/>
-          <w:sz w:val="28"/>
-          <w:szCs w:val="28"/>
-        </w:rPr>
-        <w:t>Студент 3 курса 6 группы</w:t>
-      </w:r>
-    </w:p>
-    <w:p>
-      <w:pPr>
-        <w:ind w:firstLine="709"/>
-        <w:jc w:val="right"/>
-        <w:rPr>
-          <w:color w:val="000000"/>
-          <w:sz w:val="28"/>
-          <w:szCs w:val="28"/>
-        </w:rPr>
-      </w:pPr>
-      <w:r>
-        <w:rPr>
-          <w:color w:val="000000"/>
-          <w:sz w:val="28"/>
-          <w:szCs w:val="28"/>
-        </w:rPr>
-        <w:t>Филипюк Илья Андреевич</w:t>
-      </w:r>
-    </w:p>
-    <w:p>
-      <w:pPr>
-        <w:ind w:firstLine="709"/>
-        <w:jc w:val="right"/>
-        <w:rPr>
-          <w:sz w:val="28"/>
-          <w:szCs w:val="28"/>
-        </w:rPr>
-      </w:pPr>
-      <w:r>
-        <w:rPr>
-          <w:color w:val="000000"/>
-          <w:sz w:val="28"/>
-          <w:szCs w:val="28"/>
-        </w:rPr>
-        <w:t xml:space="preserve">Преподаватель: </w:t>
-      </w:r>
-      <w:proofErr w:type="spellStart"/>
-      <w:r>
-        <w:rPr>
-          <w:color w:val="000000"/>
-          <w:sz w:val="28"/>
-          <w:szCs w:val="28"/>
-        </w:rPr>
-        <w:t>Нистюк</w:t>
-      </w:r>
-      <w:proofErr w:type="spellEnd"/>
-      <w:r>
-        <w:rPr>
-          <w:color w:val="000000"/>
-          <w:sz w:val="28"/>
-          <w:szCs w:val="28"/>
-        </w:rPr>
-        <w:t xml:space="preserve"> О.А.</w:t>
+        <w:t>Преподаватель: Нистюк О.А.</w:t>
       </w:r>
     </w:p>
     <w:p>
@@ -991,7 +972,6 @@
                 <w:lang w:val="en-US"/>
               </w:rPr>
             </w:pPr>
-            <w:proofErr w:type="spellStart"/>
             <w:r>
               <w:rPr>
                 <w:sz w:val="28"/>
@@ -1000,7 +980,6 @@
               </w:rPr>
               <w:t>Stock_ID</w:t>
             </w:r>
-            <w:proofErr w:type="spellEnd"/>
           </w:p>
         </w:tc>
         <w:tc>
@@ -1223,7 +1202,6 @@
                 <w:lang w:val="en-US"/>
               </w:rPr>
             </w:pPr>
-            <w:proofErr w:type="spellStart"/>
             <w:r>
               <w:rPr>
                 <w:sz w:val="28"/>
@@ -1232,7 +1210,6 @@
               </w:rPr>
               <w:t>Filled_part</w:t>
             </w:r>
-            <w:proofErr w:type="spellEnd"/>
           </w:p>
         </w:tc>
         <w:tc>
@@ -1381,23 +1358,13 @@
                 <w:lang w:val="en-US"/>
               </w:rPr>
             </w:pPr>
-            <w:proofErr w:type="gramStart"/>
-            <w:r>
-              <w:rPr>
-                <w:sz w:val="28"/>
-                <w:szCs w:val="28"/>
-                <w:lang w:val="en-US"/>
-              </w:rPr>
-              <w:t>NVARCHAR(</w:t>
-            </w:r>
-            <w:proofErr w:type="gramEnd"/>
-            <w:r>
-              <w:rPr>
-                <w:sz w:val="28"/>
-                <w:szCs w:val="28"/>
-                <w:lang w:val="en-US"/>
-              </w:rPr>
-              <w:t>100)</w:t>
+            <w:r>
+              <w:rPr>
+                <w:sz w:val="28"/>
+                <w:szCs w:val="28"/>
+                <w:lang w:val="en-US"/>
+              </w:rPr>
+              <w:t>NVARCHAR(100)</w:t>
             </w:r>
           </w:p>
         </w:tc>
@@ -1690,7 +1657,6 @@
                 <w:lang w:val="en-US"/>
               </w:rPr>
             </w:pPr>
-            <w:proofErr w:type="spellStart"/>
             <w:r>
               <w:rPr>
                 <w:sz w:val="28"/>
@@ -1699,7 +1665,6 @@
               </w:rPr>
               <w:t>User_ID</w:t>
             </w:r>
-            <w:proofErr w:type="spellEnd"/>
           </w:p>
         </w:tc>
         <w:tc>
@@ -1988,7 +1953,6 @@
                 <w:lang w:val="en-US"/>
               </w:rPr>
             </w:pPr>
-            <w:proofErr w:type="spellStart"/>
             <w:r>
               <w:rPr>
                 <w:sz w:val="28"/>
@@ -1997,7 +1961,6 @@
               </w:rPr>
               <w:t>Created_at</w:t>
             </w:r>
-            <w:proofErr w:type="spellEnd"/>
           </w:p>
         </w:tc>
         <w:tc>
@@ -2062,25 +2025,7 @@
                 <w:szCs w:val="28"/>
                 <w:lang w:val="en-US"/>
               </w:rPr>
-              <w:t xml:space="preserve">Default, </w:t>
-            </w:r>
-            <w:proofErr w:type="gramStart"/>
-            <w:r>
-              <w:rPr>
-                <w:sz w:val="28"/>
-                <w:szCs w:val="28"/>
-                <w:lang w:val="en-US"/>
-              </w:rPr>
-              <w:t>GETDATE(</w:t>
-            </w:r>
-            <w:proofErr w:type="gramEnd"/>
-            <w:r>
-              <w:rPr>
-                <w:sz w:val="28"/>
-                <w:szCs w:val="28"/>
-                <w:lang w:val="en-US"/>
-              </w:rPr>
-              <w:t>)</w:t>
+              <w:t>Default, GETDATE()</w:t>
             </w:r>
           </w:p>
         </w:tc>
@@ -2118,7 +2063,6 @@
                 <w:lang w:val="en-US"/>
               </w:rPr>
             </w:pPr>
-            <w:proofErr w:type="spellStart"/>
             <w:r>
               <w:rPr>
                 <w:sz w:val="28"/>
@@ -2127,7 +2071,6 @@
               </w:rPr>
               <w:t>Password_hash</w:t>
             </w:r>
-            <w:proofErr w:type="spellEnd"/>
           </w:p>
         </w:tc>
         <w:tc>
@@ -2142,23 +2085,13 @@
                 <w:lang w:val="en-US"/>
               </w:rPr>
             </w:pPr>
-            <w:proofErr w:type="gramStart"/>
-            <w:r>
-              <w:rPr>
-                <w:sz w:val="28"/>
-                <w:szCs w:val="28"/>
-                <w:lang w:val="en-US"/>
-              </w:rPr>
-              <w:t>VARBINARY(</w:t>
-            </w:r>
-            <w:proofErr w:type="gramEnd"/>
-            <w:r>
-              <w:rPr>
-                <w:sz w:val="28"/>
-                <w:szCs w:val="28"/>
-                <w:lang w:val="en-US"/>
-              </w:rPr>
-              <w:t>64)</w:t>
+            <w:r>
+              <w:rPr>
+                <w:sz w:val="28"/>
+                <w:szCs w:val="28"/>
+                <w:lang w:val="en-US"/>
+              </w:rPr>
+              <w:t>VARBINARY(64)</w:t>
             </w:r>
           </w:p>
         </w:tc>
@@ -2174,23 +2107,13 @@
                 <w:lang w:val="en-US"/>
               </w:rPr>
             </w:pPr>
-            <w:proofErr w:type="gramStart"/>
-            <w:r>
-              <w:rPr>
-                <w:sz w:val="28"/>
-                <w:szCs w:val="28"/>
-                <w:lang w:val="en-US"/>
-              </w:rPr>
-              <w:t>RAW(</w:t>
-            </w:r>
-            <w:proofErr w:type="gramEnd"/>
-            <w:r>
-              <w:rPr>
-                <w:sz w:val="28"/>
-                <w:szCs w:val="28"/>
-                <w:lang w:val="en-US"/>
-              </w:rPr>
-              <w:t>64)</w:t>
+            <w:r>
+              <w:rPr>
+                <w:sz w:val="28"/>
+                <w:szCs w:val="28"/>
+                <w:lang w:val="en-US"/>
+              </w:rPr>
+              <w:t>RAW(64)</w:t>
             </w:r>
           </w:p>
         </w:tc>
@@ -2280,23 +2203,13 @@
                 <w:lang w:val="en-US"/>
               </w:rPr>
             </w:pPr>
-            <w:proofErr w:type="gramStart"/>
-            <w:r>
-              <w:rPr>
-                <w:sz w:val="28"/>
-                <w:szCs w:val="28"/>
-                <w:lang w:val="en-US"/>
-              </w:rPr>
-              <w:t>VARCHAR(</w:t>
-            </w:r>
-            <w:proofErr w:type="gramEnd"/>
-            <w:r>
-              <w:rPr>
-                <w:sz w:val="28"/>
-                <w:szCs w:val="28"/>
-                <w:lang w:val="en-US"/>
-              </w:rPr>
-              <w:t>255)</w:t>
+            <w:r>
+              <w:rPr>
+                <w:sz w:val="28"/>
+                <w:szCs w:val="28"/>
+                <w:lang w:val="en-US"/>
+              </w:rPr>
+              <w:t>VARCHAR(255)</w:t>
             </w:r>
           </w:p>
         </w:tc>
@@ -2400,23 +2313,13 @@
                 <w:lang w:val="en-US"/>
               </w:rPr>
             </w:pPr>
-            <w:proofErr w:type="gramStart"/>
-            <w:r>
-              <w:rPr>
-                <w:sz w:val="28"/>
-                <w:szCs w:val="28"/>
-                <w:lang w:val="en-US"/>
-              </w:rPr>
-              <w:t>VARCHAR(</w:t>
-            </w:r>
-            <w:proofErr w:type="gramEnd"/>
-            <w:r>
-              <w:rPr>
-                <w:sz w:val="28"/>
-                <w:szCs w:val="28"/>
-                <w:lang w:val="en-US"/>
-              </w:rPr>
-              <w:t>30)</w:t>
+            <w:r>
+              <w:rPr>
+                <w:sz w:val="28"/>
+                <w:szCs w:val="28"/>
+                <w:lang w:val="en-US"/>
+              </w:rPr>
+              <w:t>VARCHAR(30)</w:t>
             </w:r>
           </w:p>
         </w:tc>
@@ -2705,7 +2608,6 @@
                 <w:lang w:val="en-US"/>
               </w:rPr>
             </w:pPr>
-            <w:proofErr w:type="spellStart"/>
             <w:r>
               <w:rPr>
                 <w:sz w:val="28"/>
@@ -2714,7 +2616,6 @@
               </w:rPr>
               <w:t>Product_ID</w:t>
             </w:r>
-            <w:proofErr w:type="spellEnd"/>
           </w:p>
         </w:tc>
         <w:tc>
@@ -2817,7 +2718,6 @@
                 <w:lang w:val="en-US"/>
               </w:rPr>
             </w:pPr>
-            <w:proofErr w:type="spellStart"/>
             <w:r>
               <w:rPr>
                 <w:sz w:val="28"/>
@@ -2826,7 +2726,6 @@
               </w:rPr>
               <w:t>Stock_ID</w:t>
             </w:r>
-            <w:proofErr w:type="spellEnd"/>
           </w:p>
         </w:tc>
         <w:tc>
@@ -2891,25 +2790,7 @@
                 <w:szCs w:val="28"/>
                 <w:lang w:val="en-US"/>
               </w:rPr>
-              <w:t xml:space="preserve">Not null, </w:t>
-            </w:r>
-            <w:proofErr w:type="gramStart"/>
-            <w:r>
-              <w:rPr>
-                <w:sz w:val="28"/>
-                <w:szCs w:val="28"/>
-                <w:lang w:val="en-US"/>
-              </w:rPr>
-              <w:t>Foreign</w:t>
-            </w:r>
-            <w:proofErr w:type="gramEnd"/>
-            <w:r>
-              <w:rPr>
-                <w:sz w:val="28"/>
-                <w:szCs w:val="28"/>
-                <w:lang w:val="en-US"/>
-              </w:rPr>
-              <w:t xml:space="preserve"> key</w:t>
+              <w:t>Not null, Foreign key</w:t>
             </w:r>
           </w:p>
         </w:tc>
@@ -2969,23 +2850,13 @@
                 <w:lang w:val="en-US"/>
               </w:rPr>
             </w:pPr>
-            <w:proofErr w:type="gramStart"/>
-            <w:r>
-              <w:rPr>
-                <w:sz w:val="28"/>
-                <w:szCs w:val="28"/>
-                <w:lang w:val="en-US"/>
-              </w:rPr>
-              <w:t>NVARCHAR(</w:t>
-            </w:r>
-            <w:proofErr w:type="gramEnd"/>
-            <w:r>
-              <w:rPr>
-                <w:sz w:val="28"/>
-                <w:szCs w:val="28"/>
-                <w:lang w:val="en-US"/>
-              </w:rPr>
-              <w:t>200)</w:t>
+            <w:r>
+              <w:rPr>
+                <w:sz w:val="28"/>
+                <w:szCs w:val="28"/>
+                <w:lang w:val="en-US"/>
+              </w:rPr>
+              <w:t>NVARCHAR(200)</w:t>
             </w:r>
           </w:p>
         </w:tc>
@@ -3089,23 +2960,13 @@
                 <w:lang w:val="en-US"/>
               </w:rPr>
             </w:pPr>
-            <w:proofErr w:type="gramStart"/>
-            <w:r>
-              <w:rPr>
-                <w:sz w:val="28"/>
-                <w:szCs w:val="28"/>
-                <w:lang w:val="en-US"/>
-              </w:rPr>
-              <w:t>DECIMAL(</w:t>
-            </w:r>
-            <w:proofErr w:type="gramEnd"/>
-            <w:r>
-              <w:rPr>
-                <w:sz w:val="28"/>
-                <w:szCs w:val="28"/>
-                <w:lang w:val="en-US"/>
-              </w:rPr>
-              <w:t>19,4)</w:t>
+            <w:r>
+              <w:rPr>
+                <w:sz w:val="28"/>
+                <w:szCs w:val="28"/>
+                <w:lang w:val="en-US"/>
+              </w:rPr>
+              <w:t>DECIMAL(19,4)</w:t>
             </w:r>
           </w:p>
         </w:tc>
@@ -3121,23 +2982,13 @@
                 <w:lang w:val="en-US"/>
               </w:rPr>
             </w:pPr>
-            <w:proofErr w:type="gramStart"/>
-            <w:r>
-              <w:rPr>
-                <w:sz w:val="28"/>
-                <w:szCs w:val="28"/>
-                <w:lang w:val="en-US"/>
-              </w:rPr>
-              <w:t>NUMBER(</w:t>
-            </w:r>
-            <w:proofErr w:type="gramEnd"/>
-            <w:r>
-              <w:rPr>
-                <w:sz w:val="28"/>
-                <w:szCs w:val="28"/>
-                <w:lang w:val="en-US"/>
-              </w:rPr>
-              <w:t>19,4)</w:t>
+            <w:r>
+              <w:rPr>
+                <w:sz w:val="28"/>
+                <w:szCs w:val="28"/>
+                <w:lang w:val="en-US"/>
+              </w:rPr>
+              <w:t>NUMBER(19,4)</w:t>
             </w:r>
           </w:p>
         </w:tc>
@@ -3515,7 +3366,6 @@
                 <w:lang w:val="en-US"/>
               </w:rPr>
             </w:pPr>
-            <w:proofErr w:type="spellStart"/>
             <w:r>
               <w:rPr>
                 <w:sz w:val="28"/>
@@ -3524,7 +3374,6 @@
               </w:rPr>
               <w:t>Task_ID</w:t>
             </w:r>
-            <w:proofErr w:type="spellEnd"/>
           </w:p>
         </w:tc>
         <w:tc>
@@ -3632,7 +3481,6 @@
                 <w:lang w:val="en-US"/>
               </w:rPr>
             </w:pPr>
-            <w:proofErr w:type="spellStart"/>
             <w:r>
               <w:rPr>
                 <w:sz w:val="28"/>
@@ -3641,7 +3489,6 @@
               </w:rPr>
               <w:t>User_ID</w:t>
             </w:r>
-            <w:proofErr w:type="spellEnd"/>
           </w:p>
         </w:tc>
         <w:tc>
@@ -3749,7 +3596,6 @@
                 <w:lang w:val="en-US"/>
               </w:rPr>
             </w:pPr>
-            <w:proofErr w:type="spellStart"/>
             <w:r>
               <w:rPr>
                 <w:sz w:val="28"/>
@@ -3758,7 +3604,6 @@
               </w:rPr>
               <w:t>Due_date</w:t>
             </w:r>
-            <w:proofErr w:type="spellEnd"/>
           </w:p>
         </w:tc>
         <w:tc>
@@ -3981,7 +3826,6 @@
                 <w:lang w:val="en-US"/>
               </w:rPr>
             </w:pPr>
-            <w:proofErr w:type="spellStart"/>
             <w:r>
               <w:rPr>
                 <w:sz w:val="28"/>
@@ -3990,7 +3834,6 @@
               </w:rPr>
               <w:t>Is_completed</w:t>
             </w:r>
-            <w:proofErr w:type="spellEnd"/>
           </w:p>
         </w:tc>
         <w:tc>
@@ -4029,23 +3872,13 @@
                 <w:lang w:val="en-US"/>
               </w:rPr>
             </w:pPr>
-            <w:proofErr w:type="gramStart"/>
-            <w:r>
-              <w:rPr>
-                <w:sz w:val="28"/>
-                <w:szCs w:val="28"/>
-                <w:lang w:val="en-US"/>
-              </w:rPr>
-              <w:t>NUMBER(</w:t>
-            </w:r>
-            <w:proofErr w:type="gramEnd"/>
-            <w:r>
-              <w:rPr>
-                <w:sz w:val="28"/>
-                <w:szCs w:val="28"/>
-                <w:lang w:val="en-US"/>
-              </w:rPr>
-              <w:t>1)</w:t>
+            <w:r>
+              <w:rPr>
+                <w:sz w:val="28"/>
+                <w:szCs w:val="28"/>
+                <w:lang w:val="en-US"/>
+              </w:rPr>
+              <w:t>NUMBER(1)</w:t>
             </w:r>
           </w:p>
         </w:tc>
@@ -4140,23 +3973,13 @@
                 <w:lang w:val="en-US"/>
               </w:rPr>
             </w:pPr>
-            <w:proofErr w:type="gramStart"/>
-            <w:r>
-              <w:rPr>
-                <w:sz w:val="28"/>
-                <w:szCs w:val="28"/>
-                <w:lang w:val="en-US"/>
-              </w:rPr>
-              <w:t>VARCHAR(</w:t>
-            </w:r>
-            <w:proofErr w:type="gramEnd"/>
-            <w:r>
-              <w:rPr>
-                <w:sz w:val="28"/>
-                <w:szCs w:val="28"/>
-                <w:lang w:val="en-US"/>
-              </w:rPr>
-              <w:t>30)</w:t>
+            <w:r>
+              <w:rPr>
+                <w:sz w:val="28"/>
+                <w:szCs w:val="28"/>
+                <w:lang w:val="en-US"/>
+              </w:rPr>
+              <w:t>VARCHAR(30)</w:t>
             </w:r>
           </w:p>
         </w:tc>
@@ -4449,7 +4272,6 @@
                 <w:lang w:val="en-US"/>
               </w:rPr>
             </w:pPr>
-            <w:proofErr w:type="spellStart"/>
             <w:r>
               <w:rPr>
                 <w:sz w:val="28"/>
@@ -4458,7 +4280,6 @@
               </w:rPr>
               <w:t>Order_ID</w:t>
             </w:r>
-            <w:proofErr w:type="spellEnd"/>
           </w:p>
         </w:tc>
         <w:tc>
@@ -4566,7 +4387,6 @@
                 <w:lang w:val="en-US"/>
               </w:rPr>
             </w:pPr>
-            <w:proofErr w:type="spellStart"/>
             <w:r>
               <w:rPr>
                 <w:sz w:val="28"/>
@@ -4575,7 +4395,6 @@
               </w:rPr>
               <w:t>Order_date</w:t>
             </w:r>
-            <w:proofErr w:type="spellEnd"/>
           </w:p>
         </w:tc>
         <w:tc>
@@ -4683,7 +4502,6 @@
                 <w:lang w:val="en-US"/>
               </w:rPr>
             </w:pPr>
-            <w:proofErr w:type="spellStart"/>
             <w:r>
               <w:rPr>
                 <w:sz w:val="28"/>
@@ -4692,7 +4510,6 @@
               </w:rPr>
               <w:t>Order_status</w:t>
             </w:r>
-            <w:proofErr w:type="spellEnd"/>
           </w:p>
         </w:tc>
         <w:tc>
@@ -4708,23 +4525,13 @@
                 <w:lang w:val="en-US"/>
               </w:rPr>
             </w:pPr>
-            <w:proofErr w:type="gramStart"/>
-            <w:r>
-              <w:rPr>
-                <w:sz w:val="28"/>
-                <w:szCs w:val="28"/>
-                <w:lang w:val="en-US"/>
-              </w:rPr>
-              <w:t>VARCHAR(</w:t>
-            </w:r>
-            <w:proofErr w:type="gramEnd"/>
-            <w:r>
-              <w:rPr>
-                <w:sz w:val="28"/>
-                <w:szCs w:val="28"/>
-                <w:lang w:val="en-US"/>
-              </w:rPr>
-              <w:t>50)</w:t>
+            <w:r>
+              <w:rPr>
+                <w:sz w:val="28"/>
+                <w:szCs w:val="28"/>
+                <w:lang w:val="en-US"/>
+              </w:rPr>
+              <w:t>VARCHAR(50)</w:t>
             </w:r>
           </w:p>
         </w:tc>
@@ -4978,7 +4785,6 @@
                 <w:lang w:val="en-US"/>
               </w:rPr>
             </w:pPr>
-            <w:proofErr w:type="spellStart"/>
             <w:r>
               <w:rPr>
                 <w:sz w:val="28"/>
@@ -4987,7 +4793,6 @@
               </w:rPr>
               <w:t>Total_amount</w:t>
             </w:r>
-            <w:proofErr w:type="spellEnd"/>
           </w:p>
         </w:tc>
         <w:tc>
@@ -5003,23 +4808,13 @@
                 <w:lang w:val="en-US"/>
               </w:rPr>
             </w:pPr>
-            <w:proofErr w:type="gramStart"/>
-            <w:r>
-              <w:rPr>
-                <w:sz w:val="28"/>
-                <w:szCs w:val="28"/>
-                <w:lang w:val="en-US"/>
-              </w:rPr>
-              <w:t>DECIMAL(</w:t>
-            </w:r>
-            <w:proofErr w:type="gramEnd"/>
-            <w:r>
-              <w:rPr>
-                <w:sz w:val="28"/>
-                <w:szCs w:val="28"/>
-                <w:lang w:val="en-US"/>
-              </w:rPr>
-              <w:t>19,4)</w:t>
+            <w:r>
+              <w:rPr>
+                <w:sz w:val="28"/>
+                <w:szCs w:val="28"/>
+                <w:lang w:val="en-US"/>
+              </w:rPr>
+              <w:t>DECIMAL(19,4)</w:t>
             </w:r>
           </w:p>
         </w:tc>
@@ -5036,23 +4831,13 @@
                 <w:lang w:val="en-US"/>
               </w:rPr>
             </w:pPr>
-            <w:proofErr w:type="gramStart"/>
-            <w:r>
-              <w:rPr>
-                <w:sz w:val="28"/>
-                <w:szCs w:val="28"/>
-                <w:lang w:val="en-US"/>
-              </w:rPr>
-              <w:t>NUMBER(</w:t>
-            </w:r>
-            <w:proofErr w:type="gramEnd"/>
-            <w:r>
-              <w:rPr>
-                <w:sz w:val="28"/>
-                <w:szCs w:val="28"/>
-                <w:lang w:val="en-US"/>
-              </w:rPr>
-              <w:t>19,4)</w:t>
+            <w:r>
+              <w:rPr>
+                <w:sz w:val="28"/>
+                <w:szCs w:val="28"/>
+                <w:lang w:val="en-US"/>
+              </w:rPr>
+              <w:t>NUMBER(19,4)</w:t>
             </w:r>
           </w:p>
         </w:tc>
@@ -5364,7 +5149,6 @@
                 <w:lang w:val="en-US"/>
               </w:rPr>
             </w:pPr>
-            <w:proofErr w:type="spellStart"/>
             <w:r>
               <w:rPr>
                 <w:sz w:val="28"/>
@@ -5373,7 +5157,6 @@
               </w:rPr>
               <w:t>Item_ID</w:t>
             </w:r>
-            <w:proofErr w:type="spellEnd"/>
           </w:p>
         </w:tc>
         <w:tc>
@@ -5481,7 +5264,6 @@
                 <w:lang w:val="en-US"/>
               </w:rPr>
             </w:pPr>
-            <w:proofErr w:type="spellStart"/>
             <w:r>
               <w:rPr>
                 <w:sz w:val="28"/>
@@ -5490,7 +5272,6 @@
               </w:rPr>
               <w:t>Order_ID</w:t>
             </w:r>
-            <w:proofErr w:type="spellEnd"/>
           </w:p>
         </w:tc>
         <w:tc>
@@ -5598,7 +5379,6 @@
                 <w:lang w:val="en-US"/>
               </w:rPr>
             </w:pPr>
-            <w:proofErr w:type="spellStart"/>
             <w:r>
               <w:rPr>
                 <w:sz w:val="28"/>
@@ -5607,7 +5387,6 @@
               </w:rPr>
               <w:t>Product_ID</w:t>
             </w:r>
-            <w:proofErr w:type="spellEnd"/>
           </w:p>
         </w:tc>
         <w:tc>
@@ -6038,7 +5817,6 @@
                 <w:lang w:val="en-US"/>
               </w:rPr>
             </w:pPr>
-            <w:proofErr w:type="spellStart"/>
             <w:r>
               <w:rPr>
                 <w:sz w:val="28"/>
@@ -6047,7 +5825,6 @@
               </w:rPr>
               <w:t>Pack_ID</w:t>
             </w:r>
-            <w:proofErr w:type="spellEnd"/>
           </w:p>
         </w:tc>
         <w:tc>
@@ -6155,7 +5932,6 @@
                 <w:lang w:val="en-US"/>
               </w:rPr>
             </w:pPr>
-            <w:proofErr w:type="spellStart"/>
             <w:r>
               <w:rPr>
                 <w:sz w:val="28"/>
@@ -6164,7 +5940,6 @@
               </w:rPr>
               <w:t>User_ID</w:t>
             </w:r>
-            <w:proofErr w:type="spellEnd"/>
           </w:p>
         </w:tc>
         <w:tc>
@@ -6439,7 +6214,6 @@
                 <w:lang w:val="en-US"/>
               </w:rPr>
             </w:pPr>
-            <w:proofErr w:type="spellStart"/>
             <w:r>
               <w:rPr>
                 <w:sz w:val="28"/>
@@ -6448,7 +6222,6 @@
               </w:rPr>
               <w:t>Order_ID</w:t>
             </w:r>
-            <w:proofErr w:type="spellEnd"/>
           </w:p>
         </w:tc>
         <w:tc>
@@ -6556,7 +6329,6 @@
                 <w:lang w:val="en-US"/>
               </w:rPr>
             </w:pPr>
-            <w:proofErr w:type="spellStart"/>
             <w:r>
               <w:rPr>
                 <w:sz w:val="28"/>
@@ -6565,7 +6337,6 @@
               </w:rPr>
               <w:t>Pack_date</w:t>
             </w:r>
-            <w:proofErr w:type="spellEnd"/>
           </w:p>
         </w:tc>
         <w:tc>
@@ -6673,7 +6444,6 @@
                 <w:lang w:val="en-US"/>
               </w:rPr>
             </w:pPr>
-            <w:proofErr w:type="spellStart"/>
             <w:r>
               <w:rPr>
                 <w:sz w:val="28"/>
@@ -6682,7 +6452,6 @@
               </w:rPr>
               <w:t>Pack_status</w:t>
             </w:r>
-            <w:proofErr w:type="spellEnd"/>
           </w:p>
         </w:tc>
         <w:tc>
@@ -6698,23 +6467,13 @@
                 <w:lang w:val="en-US"/>
               </w:rPr>
             </w:pPr>
-            <w:proofErr w:type="gramStart"/>
-            <w:r>
-              <w:rPr>
-                <w:sz w:val="28"/>
-                <w:szCs w:val="28"/>
-                <w:lang w:val="en-US"/>
-              </w:rPr>
-              <w:t>VARCHAR(</w:t>
-            </w:r>
-            <w:proofErr w:type="gramEnd"/>
-            <w:r>
-              <w:rPr>
-                <w:sz w:val="28"/>
-                <w:szCs w:val="28"/>
-                <w:lang w:val="en-US"/>
-              </w:rPr>
-              <w:t>50)</w:t>
+            <w:r>
+              <w:rPr>
+                <w:sz w:val="28"/>
+                <w:szCs w:val="28"/>
+                <w:lang w:val="en-US"/>
+              </w:rPr>
+              <w:t>VARCHAR(50)</w:t>
             </w:r>
           </w:p>
         </w:tc>
@@ -7059,7 +6818,6 @@
                 <w:lang w:val="en-US"/>
               </w:rPr>
             </w:pPr>
-            <w:proofErr w:type="spellStart"/>
             <w:r>
               <w:rPr>
                 <w:sz w:val="28"/>
@@ -7068,7 +6826,6 @@
               </w:rPr>
               <w:t>Item_ID</w:t>
             </w:r>
-            <w:proofErr w:type="spellEnd"/>
           </w:p>
         </w:tc>
         <w:tc>
@@ -7176,7 +6933,6 @@
                 <w:lang w:val="en-US"/>
               </w:rPr>
             </w:pPr>
-            <w:proofErr w:type="spellStart"/>
             <w:r>
               <w:rPr>
                 <w:sz w:val="28"/>
@@ -7185,7 +6941,6 @@
               </w:rPr>
               <w:t>Pack_ID</w:t>
             </w:r>
-            <w:proofErr w:type="spellEnd"/>
           </w:p>
         </w:tc>
         <w:tc>
@@ -7408,7 +7163,6 @@
                 <w:lang w:val="en-US"/>
               </w:rPr>
             </w:pPr>
-            <w:proofErr w:type="spellStart"/>
             <w:r>
               <w:rPr>
                 <w:sz w:val="28"/>
@@ -7417,7 +7171,6 @@
               </w:rPr>
               <w:t>Unit_price</w:t>
             </w:r>
-            <w:proofErr w:type="spellEnd"/>
           </w:p>
         </w:tc>
         <w:tc>
@@ -7433,23 +7186,13 @@
                 <w:lang w:val="en-US"/>
               </w:rPr>
             </w:pPr>
-            <w:proofErr w:type="gramStart"/>
-            <w:r>
-              <w:rPr>
-                <w:sz w:val="28"/>
-                <w:szCs w:val="28"/>
-                <w:lang w:val="en-US"/>
-              </w:rPr>
-              <w:t>DECIMAL(</w:t>
-            </w:r>
-            <w:proofErr w:type="gramEnd"/>
-            <w:r>
-              <w:rPr>
-                <w:sz w:val="28"/>
-                <w:szCs w:val="28"/>
-                <w:lang w:val="en-US"/>
-              </w:rPr>
-              <w:t>19,4)</w:t>
+            <w:r>
+              <w:rPr>
+                <w:sz w:val="28"/>
+                <w:szCs w:val="28"/>
+                <w:lang w:val="en-US"/>
+              </w:rPr>
+              <w:t>DECIMAL(19,4)</w:t>
             </w:r>
           </w:p>
         </w:tc>
@@ -7466,23 +7209,13 @@
                 <w:lang w:val="en-US"/>
               </w:rPr>
             </w:pPr>
-            <w:proofErr w:type="gramStart"/>
-            <w:r>
-              <w:rPr>
-                <w:sz w:val="28"/>
-                <w:szCs w:val="28"/>
-                <w:lang w:val="en-US"/>
-              </w:rPr>
-              <w:t>NUMBER(</w:t>
-            </w:r>
-            <w:proofErr w:type="gramEnd"/>
-            <w:r>
-              <w:rPr>
-                <w:sz w:val="28"/>
-                <w:szCs w:val="28"/>
-                <w:lang w:val="en-US"/>
-              </w:rPr>
-              <w:t>19,4)</w:t>
+            <w:r>
+              <w:rPr>
+                <w:sz w:val="28"/>
+                <w:szCs w:val="28"/>
+                <w:lang w:val="en-US"/>
+              </w:rPr>
+              <w:t>NUMBER(19,4)</w:t>
             </w:r>
           </w:p>
         </w:tc>
@@ -7545,7 +7278,6 @@
                 <w:lang w:val="en-US"/>
               </w:rPr>
             </w:pPr>
-            <w:proofErr w:type="spellStart"/>
             <w:r>
               <w:rPr>
                 <w:sz w:val="28"/>
@@ -7554,7 +7286,6 @@
               </w:rPr>
               <w:t>Product_ID</w:t>
             </w:r>
-            <w:proofErr w:type="spellEnd"/>
           </w:p>
         </w:tc>
         <w:tc>
@@ -7836,7 +7567,6 @@
                 <w:szCs w:val="28"/>
               </w:rPr>
             </w:pPr>
-            <w:proofErr w:type="spellStart"/>
             <w:r>
               <w:rPr>
                 <w:sz w:val="28"/>
@@ -7845,7 +7575,6 @@
               </w:rPr>
               <w:t>CompletedOperatorTasks</w:t>
             </w:r>
-            <w:proofErr w:type="spellEnd"/>
           </w:p>
         </w:tc>
         <w:tc>
@@ -7906,7 +7635,6 @@
                 <w:lang w:val="en-US"/>
               </w:rPr>
             </w:pPr>
-            <w:proofErr w:type="spellStart"/>
             <w:r>
               <w:rPr>
                 <w:sz w:val="28"/>
@@ -7915,7 +7643,6 @@
               </w:rPr>
               <w:t>MonthlyFinancialSummary</w:t>
             </w:r>
-            <w:proofErr w:type="spellEnd"/>
           </w:p>
         </w:tc>
         <w:tc>
@@ -7958,18 +7685,8 @@
                 <w:szCs w:val="28"/>
                 <w:lang w:val="en-US"/>
               </w:rPr>
-              <w:t xml:space="preserve">Products, Pack, </w:t>
-            </w:r>
-            <w:proofErr w:type="spellStart"/>
-            <w:r>
-              <w:rPr>
-                <w:sz w:val="28"/>
-                <w:szCs w:val="28"/>
-                <w:lang w:val="en-US"/>
-              </w:rPr>
-              <w:t>Pack_items</w:t>
-            </w:r>
-            <w:proofErr w:type="spellEnd"/>
+              <w:t>Products, Pack, Pack_items</w:t>
+            </w:r>
           </w:p>
         </w:tc>
       </w:tr>
@@ -8182,7 +7899,6 @@
                 <w:szCs w:val="28"/>
               </w:rPr>
             </w:pPr>
-            <w:proofErr w:type="spellStart"/>
             <w:r>
               <w:rPr>
                 <w:sz w:val="28"/>
@@ -8191,7 +7907,6 @@
               </w:rPr>
               <w:t>IX_Users_Email</w:t>
             </w:r>
-            <w:proofErr w:type="spellEnd"/>
           </w:p>
         </w:tc>
         <w:tc>
@@ -8253,7 +7968,6 @@
                 <w:lang w:val="en-US"/>
               </w:rPr>
             </w:pPr>
-            <w:proofErr w:type="spellStart"/>
             <w:r>
               <w:rPr>
                 <w:sz w:val="28"/>
@@ -8262,7 +7976,6 @@
               </w:rPr>
               <w:t>IX_Users_Role</w:t>
             </w:r>
-            <w:proofErr w:type="spellEnd"/>
           </w:p>
         </w:tc>
         <w:tc>
@@ -8325,7 +8038,6 @@
                 <w:lang w:val="en-US"/>
               </w:rPr>
             </w:pPr>
-            <w:proofErr w:type="spellStart"/>
             <w:r>
               <w:rPr>
                 <w:sz w:val="28"/>
@@ -8334,7 +8046,6 @@
               </w:rPr>
               <w:t>IX_Products_StockID</w:t>
             </w:r>
-            <w:proofErr w:type="spellEnd"/>
           </w:p>
         </w:tc>
         <w:tc>
@@ -8397,7 +8108,6 @@
                 <w:lang w:val="en-US"/>
               </w:rPr>
             </w:pPr>
-            <w:proofErr w:type="spellStart"/>
             <w:r>
               <w:rPr>
                 <w:sz w:val="28"/>
@@ -8406,7 +8116,6 @@
               </w:rPr>
               <w:t>IX_Products_Name</w:t>
             </w:r>
-            <w:proofErr w:type="spellEnd"/>
           </w:p>
         </w:tc>
         <w:tc>
@@ -8469,7 +8178,6 @@
                 <w:lang w:val="en-US"/>
               </w:rPr>
             </w:pPr>
-            <w:proofErr w:type="spellStart"/>
             <w:r>
               <w:rPr>
                 <w:sz w:val="28"/>
@@ -8478,7 +8186,6 @@
               </w:rPr>
               <w:t>IX_Tasks_Users_Completed</w:t>
             </w:r>
-            <w:proofErr w:type="spellEnd"/>
           </w:p>
         </w:tc>
         <w:tc>
@@ -8541,7 +8248,6 @@
                 <w:lang w:val="en-US"/>
               </w:rPr>
             </w:pPr>
-            <w:proofErr w:type="spellStart"/>
             <w:r>
               <w:rPr>
                 <w:sz w:val="28"/>
@@ -8550,7 +8256,6 @@
               </w:rPr>
               <w:t>IX_OrderItems_OrderID</w:t>
             </w:r>
-            <w:proofErr w:type="spellEnd"/>
           </w:p>
         </w:tc>
         <w:tc>
@@ -8588,7 +8293,6 @@
                 <w:lang w:val="en-US"/>
               </w:rPr>
             </w:pPr>
-            <w:proofErr w:type="spellStart"/>
             <w:r>
               <w:rPr>
                 <w:sz w:val="28"/>
@@ -8597,7 +8301,6 @@
               </w:rPr>
               <w:t>Order_items</w:t>
             </w:r>
-            <w:proofErr w:type="spellEnd"/>
           </w:p>
         </w:tc>
       </w:tr>
@@ -8615,7 +8318,6 @@
                 <w:lang w:val="de-DE"/>
               </w:rPr>
             </w:pPr>
-            <w:proofErr w:type="spellStart"/>
             <w:r>
               <w:rPr>
                 <w:sz w:val="28"/>
@@ -8624,7 +8326,6 @@
               </w:rPr>
               <w:t>IX_OrderItems_ProductID</w:t>
             </w:r>
-            <w:proofErr w:type="spellEnd"/>
           </w:p>
         </w:tc>
         <w:tc>
@@ -8669,7 +8370,6 @@
                 <w:lang w:val="en-US"/>
               </w:rPr>
             </w:pPr>
-            <w:proofErr w:type="spellStart"/>
             <w:r>
               <w:rPr>
                 <w:sz w:val="28"/>
@@ -8678,7 +8378,6 @@
               </w:rPr>
               <w:t>Order_items</w:t>
             </w:r>
-            <w:proofErr w:type="spellEnd"/>
           </w:p>
         </w:tc>
       </w:tr>
@@ -8818,7 +8517,6 @@
                 <w:szCs w:val="28"/>
               </w:rPr>
             </w:pPr>
-            <w:proofErr w:type="spellStart"/>
             <w:r>
               <w:rPr>
                 <w:rFonts w:eastAsiaTheme="minorHAnsi"/>
@@ -8829,7 +8527,6 @@
               </w:rPr>
               <w:t>trg_UpdateStockCapacity</w:t>
             </w:r>
-            <w:proofErr w:type="spellEnd"/>
           </w:p>
         </w:tc>
         <w:tc>
@@ -9054,7 +8751,6 @@
                 <w:lang w:val="en-US"/>
               </w:rPr>
             </w:pPr>
-            <w:proofErr w:type="spellStart"/>
             <w:r>
               <w:rPr>
                 <w:sz w:val="28"/>
@@ -9063,7 +8759,6 @@
               </w:rPr>
               <w:t>fn_GetStockStatus</w:t>
             </w:r>
-            <w:proofErr w:type="spellEnd"/>
           </w:p>
         </w:tc>
         <w:tc>
@@ -9148,7 +8843,6 @@
                 <w:lang w:val="en-US"/>
               </w:rPr>
             </w:pPr>
-            <w:proofErr w:type="spellStart"/>
             <w:r>
               <w:rPr>
                 <w:sz w:val="28"/>
@@ -9157,7 +8851,6 @@
               </w:rPr>
               <w:t>fn_CanFulfillOrder</w:t>
             </w:r>
-            <w:proofErr w:type="spellEnd"/>
           </w:p>
         </w:tc>
         <w:tc>
@@ -9200,18 +8893,8 @@
                 <w:szCs w:val="28"/>
                 <w:lang w:val="en-US"/>
               </w:rPr>
-              <w:t xml:space="preserve">Products, </w:t>
-            </w:r>
-            <w:proofErr w:type="spellStart"/>
-            <w:r>
-              <w:rPr>
-                <w:sz w:val="28"/>
-                <w:szCs w:val="28"/>
-                <w:lang w:val="en-US"/>
-              </w:rPr>
-              <w:t>OrderItems</w:t>
-            </w:r>
-            <w:proofErr w:type="spellEnd"/>
+              <w:t>Products, OrderItems</w:t>
+            </w:r>
           </w:p>
         </w:tc>
       </w:tr>
@@ -9252,7 +8935,6 @@
                 <w:lang w:val="en-US"/>
               </w:rPr>
             </w:pPr>
-            <w:proofErr w:type="spellStart"/>
             <w:r>
               <w:rPr>
                 <w:sz w:val="28"/>
@@ -9261,7 +8943,6 @@
               </w:rPr>
               <w:t>fn_CalculateOrderTotal</w:t>
             </w:r>
-            <w:proofErr w:type="spellEnd"/>
           </w:p>
         </w:tc>
         <w:tc>
@@ -9304,18 +8985,8 @@
                 <w:szCs w:val="28"/>
                 <w:lang w:val="en-US"/>
               </w:rPr>
-              <w:t xml:space="preserve">Pack, </w:t>
-            </w:r>
-            <w:proofErr w:type="spellStart"/>
-            <w:r>
-              <w:rPr>
-                <w:sz w:val="28"/>
-                <w:szCs w:val="28"/>
-                <w:lang w:val="en-US"/>
-              </w:rPr>
-              <w:t>Pack_items</w:t>
-            </w:r>
-            <w:proofErr w:type="spellEnd"/>
+              <w:t>Pack, Pack_items</w:t>
+            </w:r>
           </w:p>
         </w:tc>
       </w:tr>
@@ -9356,7 +9027,6 @@
                 <w:lang w:val="en-US"/>
               </w:rPr>
             </w:pPr>
-            <w:proofErr w:type="spellStart"/>
             <w:r>
               <w:rPr>
                 <w:sz w:val="28"/>
@@ -9365,7 +9035,6 @@
               </w:rPr>
               <w:t>sp_DispatchProduct</w:t>
             </w:r>
-            <w:proofErr w:type="spellEnd"/>
           </w:p>
         </w:tc>
         <w:tc>
@@ -9620,7 +9289,6 @@
                 <w:lang w:val="en-US"/>
               </w:rPr>
             </w:pPr>
-            <w:proofErr w:type="spellStart"/>
             <w:r>
               <w:rPr>
                 <w:sz w:val="28"/>
@@ -9629,7 +9297,6 @@
               </w:rPr>
               <w:t>fn_GetUsersTasksSummary</w:t>
             </w:r>
-            <w:proofErr w:type="spellEnd"/>
           </w:p>
         </w:tc>
         <w:tc>
@@ -9722,7 +9389,6 @@
                 <w:lang w:val="en-US"/>
               </w:rPr>
             </w:pPr>
-            <w:proofErr w:type="spellStart"/>
             <w:r>
               <w:rPr>
                 <w:sz w:val="28"/>
@@ -9731,7 +9397,6 @@
               </w:rPr>
               <w:t>sp_AdjustStockCapacity</w:t>
             </w:r>
-            <w:proofErr w:type="spellEnd"/>
           </w:p>
         </w:tc>
         <w:tc>
@@ -9824,7 +9489,6 @@
                 <w:lang w:val="en-US"/>
               </w:rPr>
             </w:pPr>
-            <w:proofErr w:type="spellStart"/>
             <w:r>
               <w:rPr>
                 <w:sz w:val="28"/>
@@ -9833,7 +9497,6 @@
               </w:rPr>
               <w:t>Fn_GetMonthlyProductFinancials</w:t>
             </w:r>
-            <w:proofErr w:type="spellEnd"/>
           </w:p>
         </w:tc>
         <w:tc>
@@ -9880,28 +9543,8 @@
                 <w:szCs w:val="28"/>
                 <w:lang w:val="en-US"/>
               </w:rPr>
-              <w:t xml:space="preserve">Products, </w:t>
-            </w:r>
-            <w:proofErr w:type="spellStart"/>
-            <w:r>
-              <w:rPr>
-                <w:sz w:val="28"/>
-                <w:szCs w:val="28"/>
-                <w:lang w:val="en-US"/>
-              </w:rPr>
-              <w:t>Pack_</w:t>
-            </w:r>
-            <w:proofErr w:type="gramStart"/>
-            <w:r>
-              <w:rPr>
-                <w:sz w:val="28"/>
-                <w:szCs w:val="28"/>
-                <w:lang w:val="en-US"/>
-              </w:rPr>
-              <w:t>items,Pack</w:t>
-            </w:r>
-            <w:proofErr w:type="spellEnd"/>
-            <w:proofErr w:type="gramEnd"/>
+              <w:t>Products, Pack_items,Pack</w:t>
+            </w:r>
           </w:p>
         </w:tc>
       </w:tr>
@@ -9946,7 +9589,6 @@
                 <w:lang w:val="en-US"/>
               </w:rPr>
             </w:pPr>
-            <w:proofErr w:type="spellStart"/>
             <w:r>
               <w:rPr>
                 <w:sz w:val="28"/>
@@ -9955,7 +9597,6 @@
               </w:rPr>
               <w:t>Sp_GenerateWarehouseFinancialReport</w:t>
             </w:r>
-            <w:proofErr w:type="spellEnd"/>
           </w:p>
         </w:tc>
         <w:tc>
@@ -9996,23 +9637,13 @@
                 <w:lang w:val="en-US"/>
               </w:rPr>
             </w:pPr>
-            <w:proofErr w:type="spellStart"/>
-            <w:r>
-              <w:rPr>
-                <w:sz w:val="28"/>
-                <w:szCs w:val="28"/>
-                <w:lang w:val="en-US"/>
-              </w:rPr>
-              <w:t>Pack_items</w:t>
-            </w:r>
-            <w:proofErr w:type="spellEnd"/>
-            <w:r>
-              <w:rPr>
-                <w:sz w:val="28"/>
-                <w:szCs w:val="28"/>
-                <w:lang w:val="en-US"/>
-              </w:rPr>
-              <w:t xml:space="preserve">, Pack, Orders, Products, </w:t>
+            <w:r>
+              <w:rPr>
+                <w:sz w:val="28"/>
+                <w:szCs w:val="28"/>
+                <w:lang w:val="en-US"/>
+              </w:rPr>
+              <w:t xml:space="preserve">Pack_items, Pack, Orders, Products, </w:t>
             </w:r>
           </w:p>
         </w:tc>

</xml_diff>

<commit_message>
IADB:lab2 done. Lab3 started
</commit_message>
<xml_diff>
--- a/IADB/Code/Lab_2/Report.docx
+++ b/IADB/Code/Lab_2/Report.docx
@@ -589,6 +589,7 @@
           <w:ilvl w:val="0"/>
           <w:numId w:val="4"/>
         </w:numPr>
+        <w:ind w:left="1069"/>
       </w:pPr>
       <w:r>
         <w:lastRenderedPageBreak/>
@@ -647,6 +648,7 @@
           <w:ilvl w:val="0"/>
           <w:numId w:val="4"/>
         </w:numPr>
+        <w:ind w:left="1069"/>
         <w:rPr>
           <w:lang w:val="en-US"/>
         </w:rPr>
@@ -750,7 +752,7 @@
           <w:numId w:val="4"/>
         </w:numPr>
         <w:spacing w:before="0"/>
-        <w:ind w:left="723"/>
+        <w:ind w:left="1069"/>
       </w:pPr>
       <w:r>
         <w:rPr>
@@ -762,10 +764,9 @@
         <w:t>Список таблиц с указанием атрибутов</w:t>
       </w:r>
     </w:p>
-    <w:p/>
     <w:p>
       <w:pPr>
-        <w:ind w:firstLine="360"/>
+        <w:ind w:firstLine="709"/>
         <w:jc w:val="both"/>
         <w:rPr>
           <w:sz w:val="28"/>
@@ -1445,6 +1446,7 @@
         <w:rPr>
           <w:sz w:val="28"/>
           <w:szCs w:val="28"/>
+          <w:lang w:val="en-US"/>
         </w:rPr>
       </w:pPr>
       <w:r>
@@ -1475,6 +1477,14 @@
           <w:szCs w:val="28"/>
         </w:rPr>
         <w:t>содержит данные пользователей системы и информацию о ролях этих пользователей в системе. Структура данной таблицы представлена в таблице 2.2</w:t>
+      </w:r>
+      <w:r>
+        <w:rPr>
+          <w:sz w:val="28"/>
+          <w:szCs w:val="28"/>
+          <w:lang w:val="en-US"/>
+        </w:rPr>
+        <w:t>.</w:t>
       </w:r>
     </w:p>
     <w:p>
@@ -1774,6 +1784,14 @@
           <w:szCs w:val="28"/>
         </w:rPr>
       </w:pPr>
+    </w:p>
+    <w:p>
+      <w:pPr>
+        <w:rPr>
+          <w:sz w:val="28"/>
+          <w:szCs w:val="28"/>
+        </w:rPr>
+      </w:pPr>
       <w:r>
         <w:rPr>
           <w:sz w:val="28"/>
@@ -7383,7 +7401,7 @@
     <w:p>
       <w:pPr>
         <w:spacing w:before="240"/>
-        <w:ind w:firstLine="363"/>
+        <w:ind w:firstLine="708"/>
         <w:jc w:val="both"/>
         <w:rPr>
           <w:sz w:val="28"/>
@@ -7406,7 +7424,7 @@
           <w:numId w:val="4"/>
         </w:numPr>
         <w:spacing w:before="240"/>
-        <w:ind w:left="723"/>
+        <w:ind w:left="1069"/>
       </w:pPr>
       <w:r>
         <w:lastRenderedPageBreak/>
@@ -7418,7 +7436,7 @@
     </w:p>
     <w:p>
       <w:pPr>
-        <w:ind w:firstLine="363"/>
+        <w:ind w:firstLine="709"/>
         <w:jc w:val="both"/>
         <w:rPr>
           <w:sz w:val="28"/>
@@ -7691,15 +7709,6 @@
         </w:tc>
       </w:tr>
     </w:tbl>
-    <w:p>
-      <w:pPr>
-        <w:jc w:val="both"/>
-        <w:rPr>
-          <w:sz w:val="28"/>
-          <w:szCs w:val="28"/>
-        </w:rPr>
-      </w:pPr>
-    </w:p>
     <w:p>
       <w:pPr>
         <w:spacing w:before="240"/>
@@ -8631,7 +8640,7 @@
       <w:tr>
         <w:tc>
           <w:tcPr>
-            <w:tcW w:w="2506" w:type="dxa"/>
+            <w:tcW w:w="2380" w:type="dxa"/>
           </w:tcPr>
           <w:p>
             <w:pPr>
@@ -8652,7 +8661,7 @@
         </w:tc>
         <w:tc>
           <w:tcPr>
-            <w:tcW w:w="2506" w:type="dxa"/>
+            <w:tcW w:w="2891" w:type="dxa"/>
           </w:tcPr>
           <w:p>
             <w:pPr>
@@ -8673,7 +8682,7 @@
         </w:tc>
         <w:tc>
           <w:tcPr>
-            <w:tcW w:w="2506" w:type="dxa"/>
+            <w:tcW w:w="2443" w:type="dxa"/>
           </w:tcPr>
           <w:p>
             <w:pPr>
@@ -8694,7 +8703,7 @@
         </w:tc>
         <w:tc>
           <w:tcPr>
-            <w:tcW w:w="2507" w:type="dxa"/>
+            <w:tcW w:w="2311" w:type="dxa"/>
           </w:tcPr>
           <w:p>
             <w:pPr>
@@ -8717,7 +8726,7 @@
       <w:tr>
         <w:tc>
           <w:tcPr>
-            <w:tcW w:w="2506" w:type="dxa"/>
+            <w:tcW w:w="2380" w:type="dxa"/>
           </w:tcPr>
           <w:p>
             <w:pPr>
@@ -8740,7 +8749,7 @@
         </w:tc>
         <w:tc>
           <w:tcPr>
-            <w:tcW w:w="2506" w:type="dxa"/>
+            <w:tcW w:w="2891" w:type="dxa"/>
           </w:tcPr>
           <w:p>
             <w:pPr>
@@ -8763,28 +8772,42 @@
         </w:tc>
         <w:tc>
           <w:tcPr>
-            <w:tcW w:w="2506" w:type="dxa"/>
-          </w:tcPr>
-          <w:p>
-            <w:pPr>
-              <w:jc w:val="both"/>
-              <w:rPr>
-                <w:sz w:val="28"/>
-                <w:szCs w:val="28"/>
-              </w:rPr>
-            </w:pPr>
-            <w:r>
-              <w:rPr>
-                <w:sz w:val="28"/>
-                <w:szCs w:val="28"/>
-              </w:rPr>
-              <w:t>Получать информацию о статусе заполнения стока товарами по идентификатору стока</w:t>
-            </w:r>
-          </w:p>
-        </w:tc>
-        <w:tc>
-          <w:tcPr>
-            <w:tcW w:w="2507" w:type="dxa"/>
+            <w:tcW w:w="2443" w:type="dxa"/>
+          </w:tcPr>
+          <w:p>
+            <w:pPr>
+              <w:jc w:val="both"/>
+              <w:rPr>
+                <w:sz w:val="28"/>
+                <w:szCs w:val="28"/>
+              </w:rPr>
+            </w:pPr>
+            <w:r>
+              <w:rPr>
+                <w:sz w:val="28"/>
+                <w:szCs w:val="28"/>
+              </w:rPr>
+              <w:t xml:space="preserve">Получать информацию о статусе заполнения </w:t>
+            </w:r>
+            <w:r>
+              <w:rPr>
+                <w:sz w:val="28"/>
+                <w:szCs w:val="28"/>
+              </w:rPr>
+              <w:t xml:space="preserve">места хранения </w:t>
+            </w:r>
+            <w:r>
+              <w:rPr>
+                <w:sz w:val="28"/>
+                <w:szCs w:val="28"/>
+              </w:rPr>
+              <w:t>товарами по идентификатору стока</w:t>
+            </w:r>
+          </w:p>
+        </w:tc>
+        <w:tc>
+          <w:tcPr>
+            <w:tcW w:w="2311" w:type="dxa"/>
           </w:tcPr>
           <w:p>
             <w:pPr>
@@ -8809,7 +8832,7 @@
       <w:tr>
         <w:tc>
           <w:tcPr>
-            <w:tcW w:w="2506" w:type="dxa"/>
+            <w:tcW w:w="2380" w:type="dxa"/>
           </w:tcPr>
           <w:p>
             <w:pPr>
@@ -8832,7 +8855,7 @@
         </w:tc>
         <w:tc>
           <w:tcPr>
-            <w:tcW w:w="2506" w:type="dxa"/>
+            <w:tcW w:w="2891" w:type="dxa"/>
           </w:tcPr>
           <w:p>
             <w:pPr>
@@ -8855,7 +8878,7 @@
         </w:tc>
         <w:tc>
           <w:tcPr>
-            <w:tcW w:w="2506" w:type="dxa"/>
+            <w:tcW w:w="2443" w:type="dxa"/>
           </w:tcPr>
           <w:p>
             <w:pPr>
@@ -8876,7 +8899,7 @@
         </w:tc>
         <w:tc>
           <w:tcPr>
-            <w:tcW w:w="2507" w:type="dxa"/>
+            <w:tcW w:w="2311" w:type="dxa"/>
           </w:tcPr>
           <w:p>
             <w:pPr>
@@ -8901,99 +8924,7 @@
       <w:tr>
         <w:tc>
           <w:tcPr>
-            <w:tcW w:w="2506" w:type="dxa"/>
-          </w:tcPr>
-          <w:p>
-            <w:pPr>
-              <w:jc w:val="both"/>
-              <w:rPr>
-                <w:sz w:val="28"/>
-                <w:szCs w:val="28"/>
-                <w:lang w:val="en-US"/>
-              </w:rPr>
-            </w:pPr>
-            <w:r>
-              <w:rPr>
-                <w:sz w:val="28"/>
-                <w:szCs w:val="28"/>
-                <w:lang w:val="en-US"/>
-              </w:rPr>
-              <w:t>FUNCTION</w:t>
-            </w:r>
-          </w:p>
-        </w:tc>
-        <w:tc>
-          <w:tcPr>
-            <w:tcW w:w="2506" w:type="dxa"/>
-          </w:tcPr>
-          <w:p>
-            <w:pPr>
-              <w:jc w:val="both"/>
-              <w:rPr>
-                <w:sz w:val="28"/>
-                <w:szCs w:val="28"/>
-                <w:lang w:val="en-US"/>
-              </w:rPr>
-            </w:pPr>
-            <w:r>
-              <w:rPr>
-                <w:sz w:val="28"/>
-                <w:szCs w:val="28"/>
-                <w:lang w:val="en-US"/>
-              </w:rPr>
-              <w:t>fn_CalculateOrderTotal</w:t>
-            </w:r>
-          </w:p>
-        </w:tc>
-        <w:tc>
-          <w:tcPr>
-            <w:tcW w:w="2506" w:type="dxa"/>
-          </w:tcPr>
-          <w:p>
-            <w:pPr>
-              <w:jc w:val="both"/>
-              <w:rPr>
-                <w:sz w:val="28"/>
-                <w:szCs w:val="28"/>
-              </w:rPr>
-            </w:pPr>
-            <w:r>
-              <w:rPr>
-                <w:sz w:val="28"/>
-                <w:szCs w:val="28"/>
-              </w:rPr>
-              <w:t>Подсчитать сумму заказа, передаваемого в сборку</w:t>
-            </w:r>
-          </w:p>
-        </w:tc>
-        <w:tc>
-          <w:tcPr>
-            <w:tcW w:w="2507" w:type="dxa"/>
-          </w:tcPr>
-          <w:p>
-            <w:pPr>
-              <w:jc w:val="both"/>
-              <w:rPr>
-                <w:sz w:val="28"/>
-                <w:szCs w:val="28"/>
-                <w:lang w:val="en-US"/>
-              </w:rPr>
-            </w:pPr>
-            <w:r>
-              <w:rPr>
-                <w:sz w:val="28"/>
-                <w:szCs w:val="28"/>
-                <w:lang w:val="en-US"/>
-              </w:rPr>
-              <w:t>Pack, Pack_items</w:t>
-            </w:r>
-          </w:p>
-        </w:tc>
-      </w:tr>
-      <w:tr>
-        <w:tc>
-          <w:tcPr>
-            <w:tcW w:w="2506" w:type="dxa"/>
+            <w:tcW w:w="2380" w:type="dxa"/>
           </w:tcPr>
           <w:p>
             <w:pPr>
@@ -9016,7 +8947,7 @@
         </w:tc>
         <w:tc>
           <w:tcPr>
-            <w:tcW w:w="2506" w:type="dxa"/>
+            <w:tcW w:w="2891" w:type="dxa"/>
           </w:tcPr>
           <w:p>
             <w:pPr>
@@ -9039,28 +8970,42 @@
         </w:tc>
         <w:tc>
           <w:tcPr>
-            <w:tcW w:w="2506" w:type="dxa"/>
-          </w:tcPr>
-          <w:p>
-            <w:pPr>
-              <w:jc w:val="both"/>
-              <w:rPr>
-                <w:sz w:val="28"/>
-                <w:szCs w:val="28"/>
-              </w:rPr>
-            </w:pPr>
-            <w:r>
-              <w:rPr>
-                <w:sz w:val="28"/>
-                <w:szCs w:val="28"/>
-              </w:rPr>
-              <w:t>Обновить количество продуктов в стоке при их перемещении оттуда</w:t>
-            </w:r>
-          </w:p>
-        </w:tc>
-        <w:tc>
-          <w:tcPr>
-            <w:tcW w:w="2507" w:type="dxa"/>
+            <w:tcW w:w="2443" w:type="dxa"/>
+          </w:tcPr>
+          <w:p>
+            <w:pPr>
+              <w:jc w:val="both"/>
+              <w:rPr>
+                <w:sz w:val="28"/>
+                <w:szCs w:val="28"/>
+              </w:rPr>
+            </w:pPr>
+            <w:r>
+              <w:rPr>
+                <w:sz w:val="28"/>
+                <w:szCs w:val="28"/>
+              </w:rPr>
+              <w:t xml:space="preserve">Обновить количество продуктов в </w:t>
+            </w:r>
+            <w:r>
+              <w:rPr>
+                <w:sz w:val="28"/>
+                <w:szCs w:val="28"/>
+              </w:rPr>
+              <w:t>месте хранения</w:t>
+            </w:r>
+            <w:r>
+              <w:rPr>
+                <w:sz w:val="28"/>
+                <w:szCs w:val="28"/>
+              </w:rPr>
+              <w:t xml:space="preserve"> при их перемещении оттуда</w:t>
+            </w:r>
+          </w:p>
+        </w:tc>
+        <w:tc>
+          <w:tcPr>
+            <w:tcW w:w="2311" w:type="dxa"/>
           </w:tcPr>
           <w:p>
             <w:pPr>
@@ -9088,22 +9033,35 @@
         <w:tabs>
           <w:tab w:val="left" w:pos="1728"/>
         </w:tabs>
-        <w:rPr>
-          <w:sz w:val="28"/>
-          <w:szCs w:val="28"/>
-        </w:rPr>
-      </w:pPr>
-    </w:p>
-    <w:p>
-      <w:pPr>
-        <w:tabs>
-          <w:tab w:val="left" w:pos="1728"/>
-        </w:tabs>
-        <w:rPr>
-          <w:sz w:val="28"/>
-          <w:szCs w:val="28"/>
-        </w:rPr>
-      </w:pPr>
+        <w:spacing w:before="240"/>
+        <w:ind w:firstLine="709"/>
+        <w:jc w:val="both"/>
+        <w:rPr>
+          <w:sz w:val="28"/>
+          <w:szCs w:val="28"/>
+        </w:rPr>
+      </w:pPr>
+      <w:r>
+        <w:rPr>
+          <w:sz w:val="28"/>
+          <w:szCs w:val="28"/>
+        </w:rPr>
+        <w:t>Так как по условию суммарное количество процедур и функций, созданных для реализуемой базы данных должно быть на меньше десяти – опишем оставшиеся далее. Описание оставшихся необходимых процедур и функций представлено</w:t>
+      </w:r>
+      <w:r>
+        <w:rPr>
+          <w:sz w:val="28"/>
+          <w:szCs w:val="28"/>
+        </w:rPr>
+        <w:t xml:space="preserve"> ниже</w:t>
+      </w:r>
+      <w:r>
+        <w:rPr>
+          <w:sz w:val="28"/>
+          <w:szCs w:val="28"/>
+        </w:rPr>
+        <w:t xml:space="preserve"> в продолжении таблицы 2.12.</w:t>
+      </w:r>
     </w:p>
     <w:p>
       <w:pPr>
@@ -9139,18 +9097,19 @@
       <w:tblPr>
         <w:tblStyle w:val="a7"/>
         <w:tblW w:w="0" w:type="auto"/>
+        <w:tblLayout w:type="fixed"/>
         <w:tblLook w:val="04A0" w:firstRow="1" w:lastRow="0" w:firstColumn="1" w:lastColumn="0" w:noHBand="0" w:noVBand="1"/>
       </w:tblPr>
       <w:tblGrid>
-        <w:gridCol w:w="1704"/>
-        <w:gridCol w:w="4248"/>
-        <w:gridCol w:w="2153"/>
-        <w:gridCol w:w="1920"/>
+        <w:gridCol w:w="2122"/>
+        <w:gridCol w:w="4325"/>
+        <w:gridCol w:w="1951"/>
+        <w:gridCol w:w="1627"/>
       </w:tblGrid>
       <w:tr>
         <w:tc>
           <w:tcPr>
-            <w:tcW w:w="1704" w:type="dxa"/>
+            <w:tcW w:w="2122" w:type="dxa"/>
           </w:tcPr>
           <w:p>
             <w:pPr>
@@ -9175,7 +9134,7 @@
         </w:tc>
         <w:tc>
           <w:tcPr>
-            <w:tcW w:w="4248" w:type="dxa"/>
+            <w:tcW w:w="4325" w:type="dxa"/>
           </w:tcPr>
           <w:p>
             <w:pPr>
@@ -9200,7 +9159,7 @@
         </w:tc>
         <w:tc>
           <w:tcPr>
-            <w:tcW w:w="2153" w:type="dxa"/>
+            <w:tcW w:w="1951" w:type="dxa"/>
           </w:tcPr>
           <w:p>
             <w:pPr>
@@ -9224,7 +9183,7 @@
         </w:tc>
         <w:tc>
           <w:tcPr>
-            <w:tcW w:w="1920" w:type="dxa"/>
+            <w:tcW w:w="1627" w:type="dxa"/>
           </w:tcPr>
           <w:p>
             <w:pPr>
@@ -9251,7 +9210,7 @@
       <w:tr>
         <w:tc>
           <w:tcPr>
-            <w:tcW w:w="1704" w:type="dxa"/>
+            <w:tcW w:w="2122" w:type="dxa"/>
           </w:tcPr>
           <w:p>
             <w:pPr>
@@ -9276,7 +9235,7 @@
         </w:tc>
         <w:tc>
           <w:tcPr>
-            <w:tcW w:w="4248" w:type="dxa"/>
+            <w:tcW w:w="4325" w:type="dxa"/>
           </w:tcPr>
           <w:p>
             <w:pPr>
@@ -9295,13 +9254,13 @@
                 <w:szCs w:val="28"/>
                 <w:lang w:val="en-US"/>
               </w:rPr>
-              <w:t>fn_GetUsersTasksSummary</w:t>
-            </w:r>
-          </w:p>
-        </w:tc>
-        <w:tc>
-          <w:tcPr>
-            <w:tcW w:w="2153" w:type="dxa"/>
+              <w:t>Fn_GetMonthlyProductFinancials</w:t>
+            </w:r>
+          </w:p>
+        </w:tc>
+        <w:tc>
+          <w:tcPr>
+            <w:tcW w:w="1951" w:type="dxa"/>
           </w:tcPr>
           <w:p>
             <w:pPr>
@@ -9318,13 +9277,13 @@
                 <w:sz w:val="28"/>
                 <w:szCs w:val="28"/>
               </w:rPr>
-              <w:t>Получить статистику эффективности пользователя</w:t>
-            </w:r>
-          </w:p>
-        </w:tc>
-        <w:tc>
-          <w:tcPr>
-            <w:tcW w:w="1920" w:type="dxa"/>
+              <w:t>Получить отчёт по продажам за определённый месяц и год</w:t>
+            </w:r>
+          </w:p>
+        </w:tc>
+        <w:tc>
+          <w:tcPr>
+            <w:tcW w:w="1627" w:type="dxa"/>
           </w:tcPr>
           <w:p>
             <w:pPr>
@@ -9343,7 +9302,7 @@
                 <w:szCs w:val="28"/>
                 <w:lang w:val="en-US"/>
               </w:rPr>
-              <w:t>Users, Tasks</w:t>
+              <w:t>Products, Pack_items,Pack</w:t>
             </w:r>
           </w:p>
         </w:tc>
@@ -9351,7 +9310,7 @@
       <w:tr>
         <w:tc>
           <w:tcPr>
-            <w:tcW w:w="1704" w:type="dxa"/>
+            <w:tcW w:w="2122" w:type="dxa"/>
           </w:tcPr>
           <w:p>
             <w:pPr>
@@ -9376,7 +9335,7 @@
         </w:tc>
         <w:tc>
           <w:tcPr>
-            <w:tcW w:w="4248" w:type="dxa"/>
+            <w:tcW w:w="4325" w:type="dxa"/>
           </w:tcPr>
           <w:p>
             <w:pPr>
@@ -9395,13 +9354,13 @@
                 <w:szCs w:val="28"/>
                 <w:lang w:val="en-US"/>
               </w:rPr>
-              <w:t>sp_AdjustStockCapacity</w:t>
-            </w:r>
-          </w:p>
-        </w:tc>
-        <w:tc>
-          <w:tcPr>
-            <w:tcW w:w="2153" w:type="dxa"/>
+              <w:t>usp_GenerateWarehouseFinancialReport</w:t>
+            </w:r>
+          </w:p>
+        </w:tc>
+        <w:tc>
+          <w:tcPr>
+            <w:tcW w:w="1951" w:type="dxa"/>
           </w:tcPr>
           <w:p>
             <w:pPr>
@@ -9418,13 +9377,13 @@
                 <w:sz w:val="28"/>
                 <w:szCs w:val="28"/>
               </w:rPr>
-              <w:t>Изменить вместимость хранилища(стока)</w:t>
-            </w:r>
-          </w:p>
-        </w:tc>
-        <w:tc>
-          <w:tcPr>
-            <w:tcW w:w="1920" w:type="dxa"/>
+              <w:t>Получить полный финансовый отчёт со сравнением показателей</w:t>
+            </w:r>
+          </w:p>
+        </w:tc>
+        <w:tc>
+          <w:tcPr>
+            <w:tcW w:w="1627" w:type="dxa"/>
           </w:tcPr>
           <w:p>
             <w:pPr>
@@ -9443,16 +9402,9 @@
                 <w:szCs w:val="28"/>
                 <w:lang w:val="en-US"/>
               </w:rPr>
-              <w:t>Stocks</w:t>
-            </w:r>
-          </w:p>
-        </w:tc>
-      </w:tr>
-      <w:tr>
-        <w:tc>
-          <w:tcPr>
-            <w:tcW w:w="1704" w:type="dxa"/>
-          </w:tcPr>
+              <w:t>Pack_items, Pack, Orders, Products</w:t>
+            </w:r>
+          </w:p>
           <w:p>
             <w:pPr>
               <w:tabs>
@@ -9464,19 +9416,13 @@
                 <w:lang w:val="en-US"/>
               </w:rPr>
             </w:pPr>
-            <w:r>
-              <w:rPr>
-                <w:sz w:val="28"/>
-                <w:szCs w:val="28"/>
-                <w:lang w:val="en-US"/>
-              </w:rPr>
-              <w:t>FUNCTION</w:t>
-            </w:r>
-          </w:p>
-        </w:tc>
-        <w:tc>
-          <w:tcPr>
-            <w:tcW w:w="4248" w:type="dxa"/>
+          </w:p>
+        </w:tc>
+      </w:tr>
+      <w:tr>
+        <w:tc>
+          <w:tcPr>
+            <w:tcW w:w="2122" w:type="dxa"/>
           </w:tcPr>
           <w:p>
             <w:pPr>
@@ -9495,13 +9441,13 @@
                 <w:szCs w:val="28"/>
                 <w:lang w:val="en-US"/>
               </w:rPr>
-              <w:t>Fn_GetMonthlyProductFinancials</w:t>
-            </w:r>
-          </w:p>
-        </w:tc>
-        <w:tc>
-          <w:tcPr>
-            <w:tcW w:w="2153" w:type="dxa"/>
+              <w:t>FUNCTION</w:t>
+            </w:r>
+          </w:p>
+        </w:tc>
+        <w:tc>
+          <w:tcPr>
+            <w:tcW w:w="4325" w:type="dxa"/>
           </w:tcPr>
           <w:p>
             <w:pPr>
@@ -9511,20 +9457,80 @@
               <w:rPr>
                 <w:sz w:val="28"/>
                 <w:szCs w:val="28"/>
-              </w:rPr>
-            </w:pPr>
-            <w:r>
-              <w:rPr>
-                <w:sz w:val="28"/>
-                <w:szCs w:val="28"/>
-              </w:rPr>
-              <w:t>Получить отчёт по продажам за определённый месяц и год</w:t>
-            </w:r>
-          </w:p>
-        </w:tc>
-        <w:tc>
-          <w:tcPr>
-            <w:tcW w:w="1920" w:type="dxa"/>
+                <w:lang w:val="en-US"/>
+              </w:rPr>
+            </w:pPr>
+            <w:r>
+              <w:rPr>
+                <w:sz w:val="28"/>
+                <w:szCs w:val="28"/>
+              </w:rPr>
+              <w:t>fn_</w:t>
+            </w:r>
+            <w:r>
+              <w:rPr>
+                <w:sz w:val="28"/>
+                <w:szCs w:val="28"/>
+                <w:lang w:val="en-US"/>
+              </w:rPr>
+              <w:t>G</w:t>
+            </w:r>
+            <w:r>
+              <w:rPr>
+                <w:sz w:val="28"/>
+                <w:szCs w:val="28"/>
+              </w:rPr>
+              <w:t>et</w:t>
+            </w:r>
+            <w:r>
+              <w:rPr>
+                <w:sz w:val="28"/>
+                <w:szCs w:val="28"/>
+                <w:lang w:val="en-US"/>
+              </w:rPr>
+              <w:t>O</w:t>
+            </w:r>
+            <w:r>
+              <w:rPr>
+                <w:sz w:val="28"/>
+                <w:szCs w:val="28"/>
+              </w:rPr>
+              <w:t>rder</w:t>
+            </w:r>
+            <w:r>
+              <w:rPr>
+                <w:sz w:val="28"/>
+                <w:szCs w:val="28"/>
+              </w:rPr>
+              <w:t>P</w:t>
+            </w:r>
+            <w:r>
+              <w:rPr>
+                <w:sz w:val="28"/>
+                <w:szCs w:val="28"/>
+              </w:rPr>
+              <w:t>ack</w:t>
+            </w:r>
+            <w:r>
+              <w:rPr>
+                <w:sz w:val="28"/>
+                <w:szCs w:val="28"/>
+                <w:lang w:val="en-US"/>
+              </w:rPr>
+              <w:t>P</w:t>
+            </w:r>
+            <w:r>
+              <w:rPr>
+                <w:sz w:val="28"/>
+                <w:szCs w:val="28"/>
+              </w:rPr>
+              <w:t>rogress</w:t>
+            </w:r>
+          </w:p>
+        </w:tc>
+        <w:tc>
+          <w:tcPr>
+            <w:tcW w:w="1951" w:type="dxa"/>
           </w:tcPr>
           <w:p>
             <w:pPr>
@@ -9534,24 +9540,20 @@
               <w:rPr>
                 <w:sz w:val="28"/>
                 <w:szCs w:val="28"/>
-                <w:lang w:val="en-US"/>
-              </w:rPr>
-            </w:pPr>
-            <w:r>
-              <w:rPr>
-                <w:sz w:val="28"/>
-                <w:szCs w:val="28"/>
-                <w:lang w:val="en-US"/>
-              </w:rPr>
-              <w:t>Products, Pack_items,Pack</w:t>
-            </w:r>
-          </w:p>
-        </w:tc>
-      </w:tr>
-      <w:tr>
-        <w:tc>
-          <w:tcPr>
-            <w:tcW w:w="1704" w:type="dxa"/>
+              </w:rPr>
+            </w:pPr>
+            <w:r>
+              <w:rPr>
+                <w:sz w:val="28"/>
+                <w:szCs w:val="28"/>
+              </w:rPr>
+              <w:t>Получить процент завершённости собираемого заказа</w:t>
+            </w:r>
+          </w:p>
+        </w:tc>
+        <w:tc>
+          <w:tcPr>
+            <w:tcW w:w="1627" w:type="dxa"/>
           </w:tcPr>
           <w:p>
             <w:pPr>
@@ -9570,13 +9572,15 @@
                 <w:szCs w:val="28"/>
                 <w:lang w:val="en-US"/>
               </w:rPr>
-              <w:t>PROCEDURE</w:t>
-            </w:r>
-          </w:p>
-        </w:tc>
-        <w:tc>
-          <w:tcPr>
-            <w:tcW w:w="4248" w:type="dxa"/>
+              <w:t>Order_items, Pack_items, Pack</w:t>
+            </w:r>
+          </w:p>
+        </w:tc>
+      </w:tr>
+      <w:tr>
+        <w:tc>
+          <w:tcPr>
+            <w:tcW w:w="2122" w:type="dxa"/>
           </w:tcPr>
           <w:p>
             <w:pPr>
@@ -9595,13 +9599,13 @@
                 <w:szCs w:val="28"/>
                 <w:lang w:val="en-US"/>
               </w:rPr>
-              <w:t>Sp_GenerateWarehouseFinancialReport</w:t>
-            </w:r>
-          </w:p>
-        </w:tc>
-        <w:tc>
-          <w:tcPr>
-            <w:tcW w:w="2153" w:type="dxa"/>
+              <w:t>FUNCTION</w:t>
+            </w:r>
+          </w:p>
+        </w:tc>
+        <w:tc>
+          <w:tcPr>
+            <w:tcW w:w="4325" w:type="dxa"/>
           </w:tcPr>
           <w:p>
             <w:pPr>
@@ -9618,13 +9622,87 @@
                 <w:sz w:val="28"/>
                 <w:szCs w:val="28"/>
               </w:rPr>
-              <w:t>Получить полный финансовый отчёт со сравнением показателей</w:t>
-            </w:r>
-          </w:p>
-        </w:tc>
-        <w:tc>
-          <w:tcPr>
-            <w:tcW w:w="1920" w:type="dxa"/>
+              <w:t>fn_</w:t>
+            </w:r>
+            <w:r>
+              <w:rPr>
+                <w:sz w:val="28"/>
+                <w:szCs w:val="28"/>
+                <w:lang w:val="en-US"/>
+              </w:rPr>
+              <w:t>G</w:t>
+            </w:r>
+            <w:r>
+              <w:rPr>
+                <w:sz w:val="28"/>
+                <w:szCs w:val="28"/>
+              </w:rPr>
+              <w:t>et</w:t>
+            </w:r>
+            <w:r>
+              <w:rPr>
+                <w:sz w:val="28"/>
+                <w:szCs w:val="28"/>
+                <w:lang w:val="en-US"/>
+              </w:rPr>
+              <w:t>S</w:t>
+            </w:r>
+            <w:r>
+              <w:rPr>
+                <w:sz w:val="28"/>
+                <w:szCs w:val="28"/>
+              </w:rPr>
+              <w:t>tock</w:t>
+            </w:r>
+            <w:r>
+              <w:rPr>
+                <w:sz w:val="28"/>
+                <w:szCs w:val="28"/>
+                <w:lang w:val="en-US"/>
+              </w:rPr>
+              <w:t>T</w:t>
+            </w:r>
+            <w:r>
+              <w:rPr>
+                <w:sz w:val="28"/>
+                <w:szCs w:val="28"/>
+              </w:rPr>
+              <w:t>urn</w:t>
+            </w:r>
+            <w:r>
+              <w:rPr>
+                <w:sz w:val="28"/>
+                <w:szCs w:val="28"/>
+              </w:rPr>
+              <w:t>O</w:t>
+            </w:r>
+            <w:r>
+              <w:rPr>
+                <w:sz w:val="28"/>
+                <w:szCs w:val="28"/>
+              </w:rPr>
+              <w:t>ver</w:t>
+            </w:r>
+            <w:r>
+              <w:rPr>
+                <w:sz w:val="28"/>
+                <w:szCs w:val="28"/>
+                <w:lang w:val="en-US"/>
+              </w:rPr>
+              <w:t>R</w:t>
+            </w:r>
+            <w:r>
+              <w:rPr>
+                <w:sz w:val="28"/>
+                <w:szCs w:val="28"/>
+              </w:rPr>
+              <w:t>ate</w:t>
+            </w:r>
+          </w:p>
+        </w:tc>
+        <w:tc>
+          <w:tcPr>
+            <w:tcW w:w="1951" w:type="dxa"/>
           </w:tcPr>
           <w:p>
             <w:pPr>
@@ -9634,16 +9712,324 @@
               <w:rPr>
                 <w:sz w:val="28"/>
                 <w:szCs w:val="28"/>
-                <w:lang w:val="en-US"/>
-              </w:rPr>
-            </w:pPr>
-            <w:r>
-              <w:rPr>
-                <w:sz w:val="28"/>
-                <w:szCs w:val="28"/>
-                <w:lang w:val="en-US"/>
-              </w:rPr>
-              <w:t xml:space="preserve">Pack_items, Pack, Orders, Products, </w:t>
+              </w:rPr>
+            </w:pPr>
+            <w:r>
+              <w:rPr>
+                <w:sz w:val="28"/>
+                <w:szCs w:val="28"/>
+              </w:rPr>
+              <w:t>Количество доставленного в конкретное место хранения за определённый период</w:t>
+            </w:r>
+          </w:p>
+        </w:tc>
+        <w:tc>
+          <w:tcPr>
+            <w:tcW w:w="1627" w:type="dxa"/>
+          </w:tcPr>
+          <w:p>
+            <w:pPr>
+              <w:tabs>
+                <w:tab w:val="left" w:pos="1728"/>
+              </w:tabs>
+              <w:rPr>
+                <w:sz w:val="28"/>
+                <w:szCs w:val="28"/>
+                <w:lang w:val="en-US"/>
+              </w:rPr>
+            </w:pPr>
+            <w:r>
+              <w:rPr>
+                <w:sz w:val="28"/>
+                <w:szCs w:val="28"/>
+                <w:lang w:val="en-US"/>
+              </w:rPr>
+              <w:t>Pack_items, Pack, Products</w:t>
+            </w:r>
+          </w:p>
+        </w:tc>
+      </w:tr>
+      <w:tr>
+        <w:tc>
+          <w:tcPr>
+            <w:tcW w:w="2122" w:type="dxa"/>
+          </w:tcPr>
+          <w:p>
+            <w:pPr>
+              <w:tabs>
+                <w:tab w:val="left" w:pos="1728"/>
+              </w:tabs>
+              <w:rPr>
+                <w:sz w:val="28"/>
+                <w:szCs w:val="28"/>
+                <w:lang w:val="en-US"/>
+              </w:rPr>
+            </w:pPr>
+            <w:r>
+              <w:rPr>
+                <w:sz w:val="28"/>
+                <w:szCs w:val="28"/>
+                <w:lang w:val="en-US"/>
+              </w:rPr>
+              <w:t>PROCEDURE</w:t>
+            </w:r>
+          </w:p>
+        </w:tc>
+        <w:tc>
+          <w:tcPr>
+            <w:tcW w:w="4325" w:type="dxa"/>
+          </w:tcPr>
+          <w:p>
+            <w:pPr>
+              <w:tabs>
+                <w:tab w:val="left" w:pos="1728"/>
+              </w:tabs>
+              <w:rPr>
+                <w:sz w:val="28"/>
+                <w:szCs w:val="28"/>
+              </w:rPr>
+            </w:pPr>
+            <w:r>
+              <w:rPr>
+                <w:sz w:val="28"/>
+                <w:szCs w:val="28"/>
+              </w:rPr>
+              <w:t>sp_</w:t>
+            </w:r>
+            <w:r>
+              <w:rPr>
+                <w:sz w:val="28"/>
+                <w:szCs w:val="28"/>
+                <w:lang w:val="en-US"/>
+              </w:rPr>
+              <w:t>E</w:t>
+            </w:r>
+            <w:r>
+              <w:rPr>
+                <w:sz w:val="28"/>
+                <w:szCs w:val="28"/>
+              </w:rPr>
+              <w:t>scalate</w:t>
+            </w:r>
+            <w:r>
+              <w:rPr>
+                <w:sz w:val="28"/>
+                <w:szCs w:val="28"/>
+              </w:rPr>
+              <w:t>O</w:t>
+            </w:r>
+            <w:r>
+              <w:rPr>
+                <w:sz w:val="28"/>
+                <w:szCs w:val="28"/>
+              </w:rPr>
+              <w:t>verdue</w:t>
+            </w:r>
+            <w:r>
+              <w:rPr>
+                <w:sz w:val="28"/>
+                <w:szCs w:val="28"/>
+                <w:lang w:val="en-US"/>
+              </w:rPr>
+              <w:t>T</w:t>
+            </w:r>
+            <w:r>
+              <w:rPr>
+                <w:sz w:val="28"/>
+                <w:szCs w:val="28"/>
+              </w:rPr>
+              <w:t>asks</w:t>
+            </w:r>
+          </w:p>
+        </w:tc>
+        <w:tc>
+          <w:tcPr>
+            <w:tcW w:w="1951" w:type="dxa"/>
+          </w:tcPr>
+          <w:p>
+            <w:pPr>
+              <w:tabs>
+                <w:tab w:val="left" w:pos="1728"/>
+              </w:tabs>
+              <w:rPr>
+                <w:sz w:val="28"/>
+                <w:szCs w:val="28"/>
+              </w:rPr>
+            </w:pPr>
+            <w:r>
+              <w:rPr>
+                <w:sz w:val="28"/>
+                <w:szCs w:val="28"/>
+              </w:rPr>
+              <w:t>Повысить приоритет просроченных задач</w:t>
+            </w:r>
+          </w:p>
+        </w:tc>
+        <w:tc>
+          <w:tcPr>
+            <w:tcW w:w="1627" w:type="dxa"/>
+          </w:tcPr>
+          <w:p>
+            <w:pPr>
+              <w:tabs>
+                <w:tab w:val="left" w:pos="1728"/>
+              </w:tabs>
+              <w:rPr>
+                <w:sz w:val="28"/>
+                <w:szCs w:val="28"/>
+                <w:lang w:val="en-US"/>
+              </w:rPr>
+            </w:pPr>
+            <w:r>
+              <w:rPr>
+                <w:sz w:val="28"/>
+                <w:szCs w:val="28"/>
+                <w:lang w:val="en-US"/>
+              </w:rPr>
+              <w:t>Tasks</w:t>
+            </w:r>
+          </w:p>
+        </w:tc>
+      </w:tr>
+      <w:tr>
+        <w:tc>
+          <w:tcPr>
+            <w:tcW w:w="2122" w:type="dxa"/>
+          </w:tcPr>
+          <w:p>
+            <w:pPr>
+              <w:tabs>
+                <w:tab w:val="left" w:pos="1728"/>
+              </w:tabs>
+              <w:rPr>
+                <w:sz w:val="28"/>
+                <w:szCs w:val="28"/>
+                <w:lang w:val="en-US"/>
+              </w:rPr>
+            </w:pPr>
+            <w:r>
+              <w:rPr>
+                <w:sz w:val="28"/>
+                <w:szCs w:val="28"/>
+                <w:lang w:val="en-US"/>
+              </w:rPr>
+              <w:t>PROCEDURES</w:t>
+            </w:r>
+          </w:p>
+        </w:tc>
+        <w:tc>
+          <w:tcPr>
+            <w:tcW w:w="4325" w:type="dxa"/>
+          </w:tcPr>
+          <w:p>
+            <w:pPr>
+              <w:tabs>
+                <w:tab w:val="left" w:pos="1728"/>
+              </w:tabs>
+              <w:rPr>
+                <w:sz w:val="28"/>
+                <w:szCs w:val="28"/>
+              </w:rPr>
+            </w:pPr>
+            <w:r>
+              <w:rPr>
+                <w:sz w:val="28"/>
+                <w:szCs w:val="28"/>
+              </w:rPr>
+              <w:t>sp_</w:t>
+            </w:r>
+            <w:r>
+              <w:rPr>
+                <w:sz w:val="28"/>
+                <w:szCs w:val="28"/>
+                <w:lang w:val="en-US"/>
+              </w:rPr>
+              <w:t>C</w:t>
+            </w:r>
+            <w:r>
+              <w:rPr>
+                <w:sz w:val="28"/>
+                <w:szCs w:val="28"/>
+              </w:rPr>
+              <w:t>ancel</w:t>
+            </w:r>
+            <w:r>
+              <w:rPr>
+                <w:sz w:val="28"/>
+                <w:szCs w:val="28"/>
+                <w:lang w:val="en-US"/>
+              </w:rPr>
+              <w:t>S</w:t>
+            </w:r>
+            <w:r>
+              <w:rPr>
+                <w:sz w:val="28"/>
+                <w:szCs w:val="28"/>
+              </w:rPr>
+              <w:t>tale</w:t>
+            </w:r>
+            <w:r>
+              <w:rPr>
+                <w:sz w:val="28"/>
+                <w:szCs w:val="28"/>
+                <w:lang w:val="en-US"/>
+              </w:rPr>
+              <w:t>O</w:t>
+            </w:r>
+            <w:r>
+              <w:rPr>
+                <w:sz w:val="28"/>
+                <w:szCs w:val="28"/>
+              </w:rPr>
+              <w:t>rders</w:t>
+            </w:r>
+          </w:p>
+        </w:tc>
+        <w:tc>
+          <w:tcPr>
+            <w:tcW w:w="1951" w:type="dxa"/>
+          </w:tcPr>
+          <w:p>
+            <w:pPr>
+              <w:tabs>
+                <w:tab w:val="left" w:pos="1728"/>
+              </w:tabs>
+              <w:rPr>
+                <w:sz w:val="28"/>
+                <w:szCs w:val="28"/>
+              </w:rPr>
+            </w:pPr>
+            <w:r>
+              <w:rPr>
+                <w:sz w:val="28"/>
+                <w:szCs w:val="28"/>
+              </w:rPr>
+              <w:t>Отменить заказы, которые слишком долго находятся в статусе «Создан»</w:t>
+            </w:r>
+          </w:p>
+        </w:tc>
+        <w:tc>
+          <w:tcPr>
+            <w:tcW w:w="1627" w:type="dxa"/>
+          </w:tcPr>
+          <w:p>
+            <w:pPr>
+              <w:tabs>
+                <w:tab w:val="left" w:pos="1728"/>
+              </w:tabs>
+              <w:rPr>
+                <w:sz w:val="28"/>
+                <w:szCs w:val="28"/>
+                <w:lang w:val="en-US"/>
+              </w:rPr>
+            </w:pPr>
+            <w:r>
+              <w:rPr>
+                <w:sz w:val="28"/>
+                <w:szCs w:val="28"/>
+                <w:lang w:val="en-US"/>
+              </w:rPr>
+              <w:t>Orders</w:t>
             </w:r>
           </w:p>
         </w:tc>
@@ -9652,7 +10038,195 @@
     <w:p>
       <w:pPr>
         <w:spacing w:before="240"/>
-        <w:ind w:firstLine="360"/>
+        <w:ind w:firstLine="708"/>
+        <w:jc w:val="both"/>
+        <w:rPr>
+          <w:sz w:val="28"/>
+          <w:szCs w:val="28"/>
+        </w:rPr>
+      </w:pPr>
+      <w:r>
+        <w:rPr>
+          <w:sz w:val="28"/>
+          <w:szCs w:val="28"/>
+        </w:rPr>
+        <w:t>И наконец опишем последнюю оставшуюся процедуру, которая логически дополняет все ранее созданные процедуры и функции. Описание данной процедуры представлено в далее: в продолжении таблицы 2.12.</w:t>
+      </w:r>
+    </w:p>
+    <w:p>
+      <w:pPr>
+        <w:spacing w:before="240"/>
+        <w:jc w:val="both"/>
+        <w:rPr>
+          <w:sz w:val="28"/>
+          <w:szCs w:val="28"/>
+        </w:rPr>
+      </w:pPr>
+    </w:p>
+    <w:p>
+      <w:pPr>
+        <w:spacing w:before="240"/>
+        <w:jc w:val="both"/>
+        <w:rPr>
+          <w:sz w:val="28"/>
+          <w:szCs w:val="28"/>
+        </w:rPr>
+      </w:pPr>
+      <w:r>
+        <w:rPr>
+          <w:sz w:val="28"/>
+          <w:szCs w:val="28"/>
+        </w:rPr>
+        <w:lastRenderedPageBreak/>
+        <w:t>Продолжение таблицы 2.12</w:t>
+      </w:r>
+    </w:p>
+    <w:tbl>
+      <w:tblPr>
+        <w:tblStyle w:val="a7"/>
+        <w:tblW w:w="0" w:type="auto"/>
+        <w:tblLayout w:type="fixed"/>
+        <w:tblLook w:val="04A0" w:firstRow="1" w:lastRow="0" w:firstColumn="1" w:lastColumn="0" w:noHBand="0" w:noVBand="1"/>
+      </w:tblPr>
+      <w:tblGrid>
+        <w:gridCol w:w="2122"/>
+        <w:gridCol w:w="4325"/>
+        <w:gridCol w:w="1951"/>
+        <w:gridCol w:w="1627"/>
+      </w:tblGrid>
+      <w:tr>
+        <w:tc>
+          <w:tcPr>
+            <w:tcW w:w="2122" w:type="dxa"/>
+          </w:tcPr>
+          <w:p>
+            <w:pPr>
+              <w:tabs>
+                <w:tab w:val="left" w:pos="1728"/>
+              </w:tabs>
+              <w:rPr>
+                <w:sz w:val="28"/>
+                <w:szCs w:val="28"/>
+                <w:lang w:val="en-US"/>
+              </w:rPr>
+            </w:pPr>
+            <w:r>
+              <w:rPr>
+                <w:sz w:val="28"/>
+                <w:szCs w:val="28"/>
+                <w:lang w:val="en-US"/>
+              </w:rPr>
+              <w:t>PROCEDURE</w:t>
+            </w:r>
+          </w:p>
+        </w:tc>
+        <w:tc>
+          <w:tcPr>
+            <w:tcW w:w="4325" w:type="dxa"/>
+          </w:tcPr>
+          <w:p>
+            <w:pPr>
+              <w:tabs>
+                <w:tab w:val="left" w:pos="1728"/>
+              </w:tabs>
+              <w:rPr>
+                <w:sz w:val="28"/>
+                <w:szCs w:val="28"/>
+              </w:rPr>
+            </w:pPr>
+            <w:r>
+              <w:rPr>
+                <w:sz w:val="28"/>
+                <w:szCs w:val="28"/>
+              </w:rPr>
+              <w:t>sp_</w:t>
+            </w:r>
+            <w:r>
+              <w:rPr>
+                <w:sz w:val="28"/>
+                <w:szCs w:val="28"/>
+                <w:lang w:val="en-US"/>
+              </w:rPr>
+              <w:t>T</w:t>
+            </w:r>
+            <w:r>
+              <w:rPr>
+                <w:sz w:val="28"/>
+                <w:szCs w:val="28"/>
+              </w:rPr>
+              <w:t>ransfer</w:t>
+            </w:r>
+            <w:r>
+              <w:rPr>
+                <w:sz w:val="28"/>
+                <w:szCs w:val="28"/>
+                <w:lang w:val="en-US"/>
+              </w:rPr>
+              <w:t>P</w:t>
+            </w:r>
+            <w:r>
+              <w:rPr>
+                <w:sz w:val="28"/>
+                <w:szCs w:val="28"/>
+              </w:rPr>
+              <w:t>roduct</w:t>
+            </w:r>
+          </w:p>
+        </w:tc>
+        <w:tc>
+          <w:tcPr>
+            <w:tcW w:w="1951" w:type="dxa"/>
+          </w:tcPr>
+          <w:p>
+            <w:pPr>
+              <w:tabs>
+                <w:tab w:val="left" w:pos="1728"/>
+              </w:tabs>
+              <w:rPr>
+                <w:sz w:val="28"/>
+                <w:szCs w:val="28"/>
+              </w:rPr>
+            </w:pPr>
+            <w:r>
+              <w:rPr>
+                <w:sz w:val="28"/>
+                <w:szCs w:val="28"/>
+              </w:rPr>
+              <w:t>Переместить товар между местами хранения с проверкой вместимости</w:t>
+            </w:r>
+          </w:p>
+        </w:tc>
+        <w:tc>
+          <w:tcPr>
+            <w:tcW w:w="1627" w:type="dxa"/>
+          </w:tcPr>
+          <w:p>
+            <w:pPr>
+              <w:tabs>
+                <w:tab w:val="left" w:pos="1728"/>
+              </w:tabs>
+              <w:rPr>
+                <w:sz w:val="28"/>
+                <w:szCs w:val="28"/>
+                <w:lang w:val="en-US"/>
+              </w:rPr>
+            </w:pPr>
+            <w:r>
+              <w:rPr>
+                <w:sz w:val="28"/>
+                <w:szCs w:val="28"/>
+                <w:lang w:val="en-US"/>
+              </w:rPr>
+              <w:t>Stocks, Products</w:t>
+            </w:r>
+          </w:p>
+        </w:tc>
+      </w:tr>
+    </w:tbl>
+    <w:p>
+      <w:pPr>
+        <w:spacing w:before="240"/>
+        <w:ind w:firstLine="708"/>
         <w:jc w:val="both"/>
         <w:rPr>
           <w:sz w:val="28"/>

</xml_diff>